<commit_message>
A5: regenerated preservation experiment — base + persistent-kill@t2 panels (seed s5), text/caption to match
Co-Authored-By: Claude Fable 5 <noreply@anthropic.com>
Claude-Session: https://claude.ai/code/session_01U8CiyQ7ySpBDkYEq4FzNBU
</commit_message>
<xml_diff>
--- a/post.docx
+++ b/post.docx
@@ -4600,7 +4600,7 @@
         <w:rPr>
           <w:rStyle w:val="VerbatimChar"/>
         </w:rPr>
-        <w:t xml:space="preserve">fall leaves as soon as leaves fall</w:t>
+        <w:t xml:space="preserve">All leaves fall when leaves fall all.</w:t>
       </w:r>
       <w:r>
         <w:t xml:space="preserve">) and the famous</w:t>
@@ -4625,7 +4625,7 @@
         <w:rPr>
           <w:rStyle w:val="VerbatimChar"/>
         </w:rPr>
-        <w:t xml:space="preserve">all for one and one for all</w:t>
+        <w:t xml:space="preserve">All for one and one for all.</w:t>
       </w:r>
       <w:r>
         <w:t xml:space="preserve">).</w:t>
@@ -4757,7 +4757,7 @@
         <w:t xml:space="preserve"> </w:t>
       </w:r>
       <w:r>
-        <w:t xml:space="preserve">is indeed causal: when ablating</w:t>
+        <w:t xml:space="preserve">is indeed causal: persistently ablating</w:t>
       </w:r>
       <w:r>
         <w:t xml:space="preserve"> </w:t>
@@ -4770,7 +4770,37 @@
         <w:t xml:space="preserve">idiom</w:t>
       </w:r>
       <w:r>
-        <w:t xml:space="preserve">’s tokens, the transition can be prevented. Note however that early and late ablation do not have this effect.</w:t>
+        <w:t xml:space="preserve">’s</w:t>
+      </w:r>
+      <w:r>
+        <w:t xml:space="preserve"> </w:t>
+      </w:r>
+      <m:oMath>
+        <m:r>
+          <m:rPr>
+            <m:sty m:val="b"/>
+          </m:rPr>
+          <m:t>s</m:t>
+        </m:r>
+      </m:oMath>
+      <w:r>
+        <w:t xml:space="preserve">-mass from an early step onward prevents the takeover and preserves the seasonal draft. Note however that later ablation onsets no longer rescue</w:t>
+      </w:r>
+      <w:r>
+        <w:t xml:space="preserve"> </w:t>
+      </w:r>
+      <w:r>
+        <w:rPr>
+          <w:i/>
+          <w:iCs/>
+        </w:rPr>
+        <w:t xml:space="preserve">seasonal</w:t>
+      </w:r>
+      <w:r>
+        <w:t xml:space="preserve"> </w:t>
+      </w:r>
+      <w:r>
+        <w:t xml:space="preserve">— the canvas instead collapses into a third, degenerate basin.</w:t>
       </w:r>
     </w:p>
     <w:p>
@@ -4780,7 +4810,7 @@
       <w:r>
         <w:drawing>
           <wp:inline>
-            <wp:extent cx="5334000" cy="4348369"/>
+            <wp:extent cx="5334000" cy="2956891"/>
             <wp:effectExtent b="0" l="0" r="0" t="0"/>
             <wp:docPr descr="Seasonal vs idiom: ember kill" title="" id="62" name="Picture"/>
             <a:graphic>
@@ -4801,7 +4831,7 @@
                   <pic:spPr bwMode="auto">
                     <a:xfrm>
                       <a:off x="0" y="0"/>
-                      <a:ext cx="5334000" cy="4348369"/>
+                      <a:ext cx="5334000" cy="2956891"/>
                     </a:xfrm>
                     <a:prstGeom prst="rect">
                       <a:avLst/>
@@ -4839,21 +4869,21 @@
           <w:i/>
           <w:iCs/>
         </w:rPr>
-        <w:t xml:space="preserve">Ablating a nascent contender can prevent takeover (during an intermediate step window).</w:t>
-      </w:r>
-      <w:r>
-        <w:rPr>
-          <w:i/>
-          <w:iCs/>
-        </w:rPr>
-        <w:t xml:space="preserve"> </w:t>
-      </w:r>
-      <w:r>
-        <w:rPr>
-          <w:i/>
-          <w:iCs/>
-        </w:rPr>
-        <w:t xml:space="preserve">Probability mass of the two completions at the contested slots, summed over comprising tokens (black: idiom, purple: seasonal). Top row: The base run. Bottom three rows: single-step ablations of the idiom’s</w:t>
+        <w:t xml:space="preserve">Persistently ablating the nascent idiom preserves the native seasonal completion.</w:t>
+      </w:r>
+      <w:r>
+        <w:rPr>
+          <w:i/>
+          <w:iCs/>
+        </w:rPr>
+        <w:t xml:space="preserve"> </w:t>
+      </w:r>
+      <w:r>
+        <w:rPr>
+          <w:i/>
+          <w:iCs/>
+        </w:rPr>
+        <w:t xml:space="preserve">Probability mass of the two completions at the contested slots, summed over comprising tokens (black: idiom, purple: seasonal; seed s5). Top: the base run — the idiom takes over. Bottom: killing the idiom’s</w:t>
       </w:r>
       <w:r>
         <w:rPr>
@@ -4875,7 +4905,42 @@
           <w:i/>
           <w:iCs/>
         </w:rPr>
-        <w:t xml:space="preserve">-mass (red ×).</w:t>
+        <w:t xml:space="preserve">-mass at every step from</w:t>
+      </w:r>
+      <w:r>
+        <w:rPr>
+          <w:i/>
+          <w:iCs/>
+        </w:rPr>
+        <w:t xml:space="preserve"> </w:t>
+      </w:r>
+      <m:oMath>
+        <m:r>
+          <m:t>t</m:t>
+        </m:r>
+        <m:r>
+          <m:rPr>
+            <m:sty m:val="p"/>
+          </m:rPr>
+          <m:t>=</m:t>
+        </m:r>
+        <m:r>
+          <m:t>2</m:t>
+        </m:r>
+      </m:oMath>
+      <w:r>
+        <w:rPr>
+          <w:i/>
+          <w:iCs/>
+        </w:rPr>
+        <w:t xml:space="preserve"> </w:t>
+      </w:r>
+      <w:r>
+        <w:rPr>
+          <w:i/>
+          <w:iCs/>
+        </w:rPr>
+        <w:t xml:space="preserve">onward (dotted onset, shaded) keeps the seasonal draft, which completes cleanly.</w:t>
       </w:r>
     </w:p>
     <w:bookmarkEnd w:id="64"/>

</xml_diff>

<commit_message>
A5: say ablation instead of kill
Co-Authored-By: Claude Fable 5 <noreply@anthropic.com>
Claude-Session: https://claude.ai/code/session_01U8CiyQ7ySpBDkYEq4FzNBU
</commit_message>
<xml_diff>
--- a/post.docx
+++ b/post.docx
@@ -4812,7 +4812,7 @@
           <wp:inline>
             <wp:extent cx="5334000" cy="2956891"/>
             <wp:effectExtent b="0" l="0" r="0" t="0"/>
-            <wp:docPr descr="Seasonal vs idiom: ember kill" title="" id="62" name="Picture"/>
+            <wp:docPr descr="Seasonal vs idiom: ablation" title="" id="62" name="Picture"/>
             <a:graphic>
               <a:graphicData uri="http://schemas.openxmlformats.org/drawingml/2006/picture">
                 <pic:pic>
@@ -4855,7 +4855,7 @@
         <w:pStyle w:val="ImageCaption"/>
       </w:pPr>
       <w:r>
-        <w:t xml:space="preserve">Seasonal vs idiom: ember kill</w:t>
+        <w:t xml:space="preserve">Seasonal vs idiom: ablation</w:t>
       </w:r>
     </w:p>
     <w:p>
@@ -4883,7 +4883,7 @@
           <w:i/>
           <w:iCs/>
         </w:rPr>
-        <w:t xml:space="preserve">Probability mass of the two completions at the contested slots, summed over comprising tokens (black: idiom, purple: seasonal; seed s5). Top: the base run — the idiom takes over. Bottom: killing the idiom’s</w:t>
+        <w:t xml:space="preserve">Probability mass of the two completions at the contested slots, summed over comprising tokens (black: idiom, purple: seasonal; seed s5). Top: the base run — the idiom takes over. Bottom: ablating the idiom’s</w:t>
       </w:r>
       <w:r>
         <w:rPr>

</xml_diff>

<commit_message>
A6: J-Lens future-operation card — subtraction|addition minimal pair, read before the operation slot
Co-Authored-By: Claude Fable 5 <noreply@anthropic.com>
Claude-Session: https://claude.ai/code/session_01U8CiyQ7ySpBDkYEq4FzNBU
</commit_message>
<xml_diff>
--- a/post.docx
+++ b/post.docx
@@ -2,7 +2,7 @@
 <file path=word/document.xml><?xml version="1.0" encoding="utf-8"?>
 <w:document xmlns:w="http://schemas.openxmlformats.org/wordprocessingml/2006/main" xmlns:m="http://schemas.openxmlformats.org/officeDocument/2006/math" xmlns:r="http://schemas.openxmlformats.org/officeDocument/2006/relationships" xmlns:o="urn:schemas-microsoft-com:office:office" xmlns:v="urn:schemas-microsoft-com:vml" xmlns:w10="urn:schemas-microsoft-com:office:word" xmlns:a="http://schemas.openxmlformats.org/drawingml/2006/main" xmlns:pic="http://schemas.openxmlformats.org/drawingml/2006/picture" xmlns:wp="http://schemas.openxmlformats.org/drawingml/2006/wordprocessingDrawing">
   <w:body>
-    <w:bookmarkStart w:id="66" w:name="Xf5e660dc2e9c1a368125465a5756c31f66c44e2"/>
+    <w:bookmarkStart w:id="69" w:name="Xf5e660dc2e9c1a368125465a5756c31f66c44e2"/>
     <w:p>
       <w:pPr>
         <w:pStyle w:val="Heading1"/>
@@ -2910,7 +2910,7 @@
       </w:r>
     </w:p>
     <w:bookmarkEnd w:id="40"/>
-    <w:bookmarkStart w:id="65" w:name="appendix"/>
+    <w:bookmarkStart w:id="68" w:name="appendix"/>
     <w:p>
       <w:pPr>
         <w:pStyle w:val="Heading2"/>
@@ -3774,7 +3774,7 @@
       </w:r>
     </w:p>
     <w:bookmarkEnd w:id="55"/>
-    <w:bookmarkStart w:id="60" w:name="j-lens-retention"/>
+    <w:bookmarkStart w:id="63" w:name="j-lens-retention"/>
     <w:p>
       <w:pPr>
         <w:pStyle w:val="Heading3"/>
@@ -4458,349 +4458,28 @@
         <w:t xml:space="preserve">of WikiText.</w:t>
       </w:r>
     </w:p>
-    <w:bookmarkEnd w:id="60"/>
-    <w:bookmarkStart w:id="64" w:name="Xea3042850cf8050407ffdd53c2454b5f83a5608"/>
-    <w:p>
-      <w:pPr>
-        <w:pStyle w:val="Heading3"/>
-      </w:pPr>
-      <w:r>
-        <w:t xml:space="preserve">Autonomous computational usage of</w:t>
-      </w:r>
-      <w:r>
-        <w:t xml:space="preserve"> </w:t>
-      </w:r>
-      <m:oMath>
-        <m:sSup>
-          <m:e>
-            <m:r>
-              <m:rPr>
-                <m:sty m:val="b"/>
-              </m:rPr>
-              <m:t>s</m:t>
-            </m:r>
-          </m:e>
-          <m:sup>
-            <m:r>
-              <m:t>t</m:t>
-            </m:r>
-          </m:sup>
-        </m:sSup>
-      </m:oMath>
-    </w:p>
-    <w:p>
-      <w:pPr>
-        <w:pStyle w:val="FirstParagraph"/>
-      </w:pPr>
-      <w:r>
-        <w:t xml:space="preserve">In the</w:t>
-      </w:r>
-      <w:r>
-        <w:t xml:space="preserve"> </w:t>
-      </w:r>
-      <w:r>
-        <w:rPr>
-          <w:i/>
-          <w:iCs/>
-        </w:rPr>
-        <w:t xml:space="preserve">letter arithmetic</w:t>
-      </w:r>
-      <w:r>
-        <w:t xml:space="preserve"> </w:t>
-      </w:r>
-      <w:r>
-        <w:t xml:space="preserve">task introduced in the main text, DiffusionGemma did respond to modifications of the distributional state in the way we expected. While suggestive, it is unclear if the model also would make use of</w:t>
-      </w:r>
-      <w:r>
-        <w:t xml:space="preserve"> </w:t>
-      </w:r>
-      <m:oMath>
-        <m:sSup>
-          <m:e>
-            <m:r>
-              <m:rPr>
-                <m:sty m:val="b"/>
-              </m:rPr>
-              <m:t>s</m:t>
-            </m:r>
-          </m:e>
-          <m:sup>
-            <m:r>
-              <m:t>t</m:t>
-            </m:r>
-          </m:sup>
-        </m:sSup>
-      </m:oMath>
-      <w:r>
-        <w:t xml:space="preserve"> </w:t>
-      </w:r>
-      <w:r>
-        <w:rPr>
-          <w:i/>
-          <w:iCs/>
-        </w:rPr>
-        <w:t xml:space="preserve">autonomously</w:t>
-      </w:r>
-      <w:r>
-        <w:t xml:space="preserve">, i.e. without interventions.</w:t>
-      </w:r>
-    </w:p>
     <w:p>
       <w:pPr>
         <w:pStyle w:val="BodyText"/>
       </w:pPr>
       <w:r>
-        <w:t xml:space="preserve">To investigate this, we searched for a non-trivial (i.e., not just a binary choice) task where DG will use a hypothesis subleading in its distribution. An instance we found is a</w:t>
-      </w:r>
-      <w:r>
-        <w:t xml:space="preserve"> </w:t>
-      </w:r>
-      <w:r>
-        <w:rPr>
-          <w:i/>
-          <w:iCs/>
-        </w:rPr>
-        <w:t xml:space="preserve">word-level palindrome</w:t>
-      </w:r>
-      <w:r>
-        <w:t xml:space="preserve"> </w:t>
-      </w:r>
-      <w:r>
-        <w:t xml:space="preserve">task. When asked</w:t>
-      </w:r>
-      <w:r>
-        <w:t xml:space="preserve"> </w:t>
-      </w:r>
-      <w:r>
-        <w:rPr>
-          <w:rStyle w:val="VerbatimChar"/>
-        </w:rPr>
-        <w:t xml:space="preserve">Please write a word-level palindrome</w:t>
-      </w:r>
-      <w:r>
-        <w:t xml:space="preserve">, DG maintains two competing completions of the same canvas: a literal</w:t>
-      </w:r>
-      <w:r>
-        <w:t xml:space="preserve"> </w:t>
-      </w:r>
-      <w:r>
-        <w:rPr>
-          <w:i/>
-          <w:iCs/>
-        </w:rPr>
-        <w:t xml:space="preserve">seasonal</w:t>
-      </w:r>
-      <w:r>
-        <w:t xml:space="preserve"> </w:t>
-      </w:r>
-      <w:r>
-        <w:t xml:space="preserve">phrase (</w:t>
-      </w:r>
-      <w:r>
-        <w:rPr>
-          <w:rStyle w:val="VerbatimChar"/>
-        </w:rPr>
-        <w:t xml:space="preserve">All leaves fall when leaves fall all.</w:t>
-      </w:r>
-      <w:r>
-        <w:t xml:space="preserve">) and the famous</w:t>
-      </w:r>
-      <w:r>
-        <w:t xml:space="preserve"> </w:t>
-      </w:r>
-      <w:r>
-        <w:rPr>
-          <w:i/>
-          <w:iCs/>
-        </w:rPr>
-        <w:t xml:space="preserve">idiom</w:t>
-      </w:r>
-      <w:r>
-        <w:t xml:space="preserve"> </w:t>
-      </w:r>
-      <w:r>
-        <w:t xml:space="preserve">(</w:t>
-      </w:r>
-      <w:r>
-        <w:rPr>
-          <w:rStyle w:val="VerbatimChar"/>
-        </w:rPr>
-        <w:t xml:space="preserve">All for one and one for all.</w:t>
-      </w:r>
-      <w:r>
-        <w:t xml:space="preserve">).</w:t>
-      </w:r>
-    </w:p>
-    <w:p>
-      <w:pPr>
-        <w:pStyle w:val="BodyText"/>
-      </w:pPr>
-      <w:r>
-        <w:t xml:space="preserve">The canvas will read the</w:t>
-      </w:r>
-      <w:r>
-        <w:t xml:space="preserve"> </w:t>
-      </w:r>
-      <w:r>
-        <w:rPr>
-          <w:i/>
-          <w:iCs/>
-        </w:rPr>
-        <w:t xml:space="preserve">seasonal</w:t>
-      </w:r>
-      <w:r>
-        <w:t xml:space="preserve"> </w:t>
-      </w:r>
-      <w:r>
-        <w:t xml:space="preserve">answer for the first few diffusion steps, after which it flips and stays at</w:t>
-      </w:r>
-      <w:r>
-        <w:t xml:space="preserve"> </w:t>
-      </w:r>
-      <w:r>
-        <w:rPr>
-          <w:i/>
-          <w:iCs/>
-        </w:rPr>
-        <w:t xml:space="preserve">idiom</w:t>
-      </w:r>
-      <w:r>
-        <w:t xml:space="preserve">. Interestingly, this is accompanied by</w:t>
-      </w:r>
-      <w:r>
-        <w:t xml:space="preserve"> </w:t>
-      </w:r>
-      <w:r>
-        <w:rPr>
-          <w:i/>
-          <w:iCs/>
-        </w:rPr>
-        <w:t xml:space="preserve">dynamics</w:t>
-      </w:r>
-      <w:r>
-        <w:t xml:space="preserve"> </w:t>
-      </w:r>
-      <w:r>
-        <w:t xml:space="preserve">in</w:t>
-      </w:r>
-      <w:r>
-        <w:t xml:space="preserve"> </w:t>
-      </w:r>
-      <m:oMath>
-        <m:sSup>
-          <m:e>
-            <m:r>
-              <m:rPr>
-                <m:sty m:val="b"/>
-              </m:rPr>
-              <m:t>s</m:t>
-            </m:r>
-          </m:e>
-          <m:sup>
-            <m:r>
-              <m:t>t</m:t>
-            </m:r>
-          </m:sup>
-        </m:sSup>
-      </m:oMath>
-      <w:r>
-        <w:t xml:space="preserve">:</w:t>
-      </w:r>
-      <w:r>
-        <w:t xml:space="preserve"> </w:t>
-      </w:r>
-      <w:r>
-        <w:rPr>
-          <w:i/>
-          <w:iCs/>
-        </w:rPr>
-        <w:t xml:space="preserve">idiom</w:t>
-      </w:r>
-      <w:r>
-        <w:t xml:space="preserve"> </w:t>
-      </w:r>
-      <w:r>
-        <w:t xml:space="preserve">will start at ~0, and progressively gain weight, replacing</w:t>
-      </w:r>
-      <w:r>
-        <w:t xml:space="preserve"> </w:t>
-      </w:r>
-      <w:r>
-        <w:rPr>
-          <w:i/>
-          <w:iCs/>
-        </w:rPr>
-        <w:t xml:space="preserve">seasonal</w:t>
-      </w:r>
-      <w:r>
-        <w:t xml:space="preserve">.</w:t>
-      </w:r>
-    </w:p>
-    <w:p>
-      <w:pPr>
-        <w:pStyle w:val="BodyText"/>
-      </w:pPr>
-      <w:r>
-        <w:t xml:space="preserve">We validated that the emergence of</w:t>
-      </w:r>
-      <w:r>
-        <w:t xml:space="preserve"> </w:t>
-      </w:r>
-      <w:r>
-        <w:rPr>
-          <w:i/>
-          <w:iCs/>
-        </w:rPr>
-        <w:t xml:space="preserve">idiom</w:t>
-      </w:r>
-      <w:r>
-        <w:t xml:space="preserve"> </w:t>
-      </w:r>
-      <w:r>
-        <w:t xml:space="preserve">is indeed causal: persistently ablating</w:t>
-      </w:r>
-      <w:r>
-        <w:t xml:space="preserve"> </w:t>
-      </w:r>
-      <w:r>
-        <w:rPr>
-          <w:i/>
-          <w:iCs/>
-        </w:rPr>
-        <w:t xml:space="preserve">idiom</w:t>
-      </w:r>
-      <w:r>
-        <w:t xml:space="preserve">’s</w:t>
-      </w:r>
-      <w:r>
-        <w:t xml:space="preserve"> </w:t>
-      </w:r>
-      <m:oMath>
-        <m:r>
-          <m:rPr>
-            <m:sty m:val="b"/>
-          </m:rPr>
-          <m:t>s</m:t>
-        </m:r>
-      </m:oMath>
-      <w:r>
-        <w:t xml:space="preserve">-mass from an early step onward prevents the takeover and preserves the seasonal draft. Note however that later ablation onsets no longer rescue</w:t>
-      </w:r>
-      <w:r>
-        <w:t xml:space="preserve"> </w:t>
-      </w:r>
-      <w:r>
-        <w:rPr>
-          <w:i/>
-          <w:iCs/>
-        </w:rPr>
-        <w:t xml:space="preserve">seasonal</w:t>
-      </w:r>
-      <w:r>
-        <w:t xml:space="preserve"> </w:t>
-      </w:r>
-      <w:r>
-        <w:t xml:space="preserve">— the canvas instead collapses into a third, degenerate basin.</w:t>
+        <w:t xml:space="preserve">[stub:] Beyond retention, the bidirectional stream also carries information about</w:t>
+      </w:r>
+      <w:r>
+        <w:t xml:space="preserve"> </w:t>
+      </w:r>
+      <w:r>
+        <w:rPr>
+          <w:i/>
+          <w:iCs/>
+        </w:rPr>
+        <w:t xml:space="preserve">future</w:t>
+      </w:r>
+      <w:r>
+        <w:t xml:space="preserve"> </w:t>
+      </w:r>
+      <w:r>
+        <w:t xml:space="preserve">positions: on an arithmetic prompt, the lens read at an earlier canvas position already decodes the operation that only appears two tokens later.</w:t>
       </w:r>
     </w:p>
     <w:p>
@@ -4810,20 +4489,550 @@
       <w:r>
         <w:drawing>
           <wp:inline>
-            <wp:extent cx="5334000" cy="2956891"/>
+            <wp:extent cx="5334000" cy="1493520"/>
             <wp:effectExtent b="0" l="0" r="0" t="0"/>
-            <wp:docPr descr="Seasonal vs idiom: ablation" title="" id="62" name="Picture"/>
+            <wp:docPr descr="J-Lens future operation" title="" id="61" name="Picture"/>
             <a:graphic>
               <a:graphicData uri="http://schemas.openxmlformats.org/drawingml/2006/picture">
                 <pic:pic>
                   <pic:nvPicPr>
-                    <pic:cNvPr descr="figs/figA5_seasonal_ember_kill.png" id="63" name="Picture"/>
+                    <pic:cNvPr descr="figs/figA6_jlens_future.png" id="62" name="Picture"/>
                     <pic:cNvPicPr>
                       <a:picLocks noChangeArrowheads="1" noChangeAspect="1"/>
                     </pic:cNvPicPr>
                   </pic:nvPicPr>
                   <pic:blipFill>
-                    <a:blip r:embed="rId61"/>
+                    <a:blip r:embed="rId60"/>
+                    <a:stretch>
+                      <a:fillRect/>
+                    </a:stretch>
+                  </pic:blipFill>
+                  <pic:spPr bwMode="auto">
+                    <a:xfrm>
+                      <a:off x="0" y="0"/>
+                      <a:ext cx="5334000" cy="1493520"/>
+                    </a:xfrm>
+                    <a:prstGeom prst="rect">
+                      <a:avLst/>
+                    </a:prstGeom>
+                    <a:noFill/>
+                    <a:ln w="9525">
+                      <a:noFill/>
+                      <a:headEnd/>
+                      <a:tailEnd/>
+                    </a:ln>
+                  </pic:spPr>
+                </pic:pic>
+              </a:graphicData>
+            </a:graphic>
+          </wp:inline>
+        </w:drawing>
+      </w:r>
+    </w:p>
+    <w:p>
+      <w:pPr>
+        <w:pStyle w:val="ImageCaption"/>
+      </w:pPr>
+      <w:r>
+        <w:t xml:space="preserve">J-Lens future operation</w:t>
+      </w:r>
+    </w:p>
+    <w:p>
+      <w:pPr>
+        <w:pStyle w:val="BodyText"/>
+      </w:pPr>
+      <w:r>
+        <w:rPr>
+          <w:b/>
+          <w:bCs/>
+          <w:i/>
+          <w:iCs/>
+        </w:rPr>
+        <w:t xml:space="preserve">The upcoming operation is readable at an earlier canvas position.</w:t>
+      </w:r>
+      <w:r>
+        <w:rPr>
+          <w:i/>
+          <w:iCs/>
+        </w:rPr>
+        <w:t xml:space="preserve"> </w:t>
+      </w:r>
+      <w:r>
+        <w:rPr>
+          <w:i/>
+          <w:iCs/>
+        </w:rPr>
+        <w:t xml:space="preserve">The DG-bidirectional-fit J-Lens is read at the token</w:t>
+      </w:r>
+      <w:r>
+        <w:rPr>
+          <w:i/>
+          <w:iCs/>
+        </w:rPr>
+        <w:t xml:space="preserve"> </w:t>
+      </w:r>
+      <w:r>
+        <w:rPr>
+          <w:rStyle w:val="VerbatimChar"/>
+          <w:i/>
+          <w:iCs/>
+        </w:rPr>
+        <w:t xml:space="preserve">by</w:t>
+      </w:r>
+      <w:r>
+        <w:rPr>
+          <w:i/>
+          <w:iCs/>
+        </w:rPr>
+        <w:t xml:space="preserve"> </w:t>
+      </w:r>
+      <w:r>
+        <w:rPr>
+          <w:i/>
+          <w:iCs/>
+        </w:rPr>
+        <w:t xml:space="preserve">(blue), two positions before the operation slot, on an otherwise identical prompt pair. The variant’s operation (orange) surfaces in the top-5 across workspace layers (</w:t>
+      </w:r>
+      <w:r>
+        <w:rPr>
+          <w:i/>
+          <w:iCs/>
+        </w:rPr>
+        <w:t xml:space="preserve"> </w:t>
+      </w:r>
+      <w:r>
+        <w:rPr>
+          <w:rStyle w:val="VerbatimChar"/>
+          <w:i/>
+          <w:iCs/>
+        </w:rPr>
+        <w:t xml:space="preserve">minus</w:t>
+      </w:r>
+      <w:r>
+        <w:rPr>
+          <w:i/>
+          <w:iCs/>
+        </w:rPr>
+        <w:t xml:space="preserve">: rank 1 at L18–21;</w:t>
+      </w:r>
+      <w:r>
+        <w:rPr>
+          <w:i/>
+          <w:iCs/>
+        </w:rPr>
+        <w:t xml:space="preserve"> </w:t>
+      </w:r>
+      <w:r>
+        <w:rPr>
+          <w:rStyle w:val="VerbatimChar"/>
+          <w:i/>
+          <w:iCs/>
+        </w:rPr>
+        <w:t xml:space="preserve">plus</w:t>
+      </w:r>
+      <w:r>
+        <w:rPr>
+          <w:i/>
+          <w:iCs/>
+        </w:rPr>
+        <w:t xml:space="preserve">: rank 5/3 at L21/L23 after the single-token swap). The switch is partial —</w:t>
+      </w:r>
+      <w:r>
+        <w:rPr>
+          <w:i/>
+          <w:iCs/>
+        </w:rPr>
+        <w:t xml:space="preserve"> </w:t>
+      </w:r>
+      <w:r>
+        <w:rPr>
+          <w:rStyle w:val="VerbatimChar"/>
+          <w:i/>
+          <w:iCs/>
+        </w:rPr>
+        <w:t xml:space="preserve">minus</w:t>
+      </w:r>
+      <w:r>
+        <w:rPr>
+          <w:i/>
+          <w:iCs/>
+        </w:rPr>
+        <w:t xml:space="preserve"> </w:t>
+      </w:r>
+      <w:r>
+        <w:rPr>
+          <w:i/>
+          <w:iCs/>
+        </w:rPr>
+        <w:t xml:space="preserve">remains highly ranked in the addition variant.</w:t>
+      </w:r>
+    </w:p>
+    <w:bookmarkEnd w:id="63"/>
+    <w:bookmarkStart w:id="67" w:name="Xea3042850cf8050407ffdd53c2454b5f83a5608"/>
+    <w:p>
+      <w:pPr>
+        <w:pStyle w:val="Heading3"/>
+      </w:pPr>
+      <w:r>
+        <w:t xml:space="preserve">Autonomous computational usage of</w:t>
+      </w:r>
+      <w:r>
+        <w:t xml:space="preserve"> </w:t>
+      </w:r>
+      <m:oMath>
+        <m:sSup>
+          <m:e>
+            <m:r>
+              <m:rPr>
+                <m:sty m:val="b"/>
+              </m:rPr>
+              <m:t>s</m:t>
+            </m:r>
+          </m:e>
+          <m:sup>
+            <m:r>
+              <m:t>t</m:t>
+            </m:r>
+          </m:sup>
+        </m:sSup>
+      </m:oMath>
+    </w:p>
+    <w:p>
+      <w:pPr>
+        <w:pStyle w:val="FirstParagraph"/>
+      </w:pPr>
+      <w:r>
+        <w:t xml:space="preserve">In the</w:t>
+      </w:r>
+      <w:r>
+        <w:t xml:space="preserve"> </w:t>
+      </w:r>
+      <w:r>
+        <w:rPr>
+          <w:i/>
+          <w:iCs/>
+        </w:rPr>
+        <w:t xml:space="preserve">letter arithmetic</w:t>
+      </w:r>
+      <w:r>
+        <w:t xml:space="preserve"> </w:t>
+      </w:r>
+      <w:r>
+        <w:t xml:space="preserve">task introduced in the main text, DiffusionGemma did respond to modifications of the distributional state in the way we expected. While suggestive, it is unclear if the model also would make use of</w:t>
+      </w:r>
+      <w:r>
+        <w:t xml:space="preserve"> </w:t>
+      </w:r>
+      <m:oMath>
+        <m:sSup>
+          <m:e>
+            <m:r>
+              <m:rPr>
+                <m:sty m:val="b"/>
+              </m:rPr>
+              <m:t>s</m:t>
+            </m:r>
+          </m:e>
+          <m:sup>
+            <m:r>
+              <m:t>t</m:t>
+            </m:r>
+          </m:sup>
+        </m:sSup>
+      </m:oMath>
+      <w:r>
+        <w:t xml:space="preserve"> </w:t>
+      </w:r>
+      <w:r>
+        <w:rPr>
+          <w:i/>
+          <w:iCs/>
+        </w:rPr>
+        <w:t xml:space="preserve">autonomously</w:t>
+      </w:r>
+      <w:r>
+        <w:t xml:space="preserve">, i.e. without interventions.</w:t>
+      </w:r>
+    </w:p>
+    <w:p>
+      <w:pPr>
+        <w:pStyle w:val="BodyText"/>
+      </w:pPr>
+      <w:r>
+        <w:t xml:space="preserve">To investigate this, we searched for a non-trivial (i.e., not just a binary choice) task where DG will use a hypothesis subleading in its distribution. An instance we found is a</w:t>
+      </w:r>
+      <w:r>
+        <w:t xml:space="preserve"> </w:t>
+      </w:r>
+      <w:r>
+        <w:rPr>
+          <w:i/>
+          <w:iCs/>
+        </w:rPr>
+        <w:t xml:space="preserve">word-level palindrome</w:t>
+      </w:r>
+      <w:r>
+        <w:t xml:space="preserve"> </w:t>
+      </w:r>
+      <w:r>
+        <w:t xml:space="preserve">task. When asked</w:t>
+      </w:r>
+      <w:r>
+        <w:t xml:space="preserve"> </w:t>
+      </w:r>
+      <w:r>
+        <w:rPr>
+          <w:rStyle w:val="VerbatimChar"/>
+        </w:rPr>
+        <w:t xml:space="preserve">Please write a word-level palindrome</w:t>
+      </w:r>
+      <w:r>
+        <w:t xml:space="preserve">, DG maintains two competing completions of the same canvas: a literal</w:t>
+      </w:r>
+      <w:r>
+        <w:t xml:space="preserve"> </w:t>
+      </w:r>
+      <w:r>
+        <w:rPr>
+          <w:i/>
+          <w:iCs/>
+        </w:rPr>
+        <w:t xml:space="preserve">seasonal</w:t>
+      </w:r>
+      <w:r>
+        <w:t xml:space="preserve"> </w:t>
+      </w:r>
+      <w:r>
+        <w:t xml:space="preserve">phrase (</w:t>
+      </w:r>
+      <w:r>
+        <w:rPr>
+          <w:rStyle w:val="VerbatimChar"/>
+        </w:rPr>
+        <w:t xml:space="preserve">All leaves fall when leaves fall all.</w:t>
+      </w:r>
+      <w:r>
+        <w:t xml:space="preserve">) and the famous</w:t>
+      </w:r>
+      <w:r>
+        <w:t xml:space="preserve"> </w:t>
+      </w:r>
+      <w:r>
+        <w:rPr>
+          <w:i/>
+          <w:iCs/>
+        </w:rPr>
+        <w:t xml:space="preserve">idiom</w:t>
+      </w:r>
+      <w:r>
+        <w:t xml:space="preserve"> </w:t>
+      </w:r>
+      <w:r>
+        <w:t xml:space="preserve">(</w:t>
+      </w:r>
+      <w:r>
+        <w:rPr>
+          <w:rStyle w:val="VerbatimChar"/>
+        </w:rPr>
+        <w:t xml:space="preserve">All for one and one for all.</w:t>
+      </w:r>
+      <w:r>
+        <w:t xml:space="preserve">).</w:t>
+      </w:r>
+    </w:p>
+    <w:p>
+      <w:pPr>
+        <w:pStyle w:val="BodyText"/>
+      </w:pPr>
+      <w:r>
+        <w:t xml:space="preserve">The canvas will read the</w:t>
+      </w:r>
+      <w:r>
+        <w:t xml:space="preserve"> </w:t>
+      </w:r>
+      <w:r>
+        <w:rPr>
+          <w:i/>
+          <w:iCs/>
+        </w:rPr>
+        <w:t xml:space="preserve">seasonal</w:t>
+      </w:r>
+      <w:r>
+        <w:t xml:space="preserve"> </w:t>
+      </w:r>
+      <w:r>
+        <w:t xml:space="preserve">answer for the first few diffusion steps, after which it flips and stays at</w:t>
+      </w:r>
+      <w:r>
+        <w:t xml:space="preserve"> </w:t>
+      </w:r>
+      <w:r>
+        <w:rPr>
+          <w:i/>
+          <w:iCs/>
+        </w:rPr>
+        <w:t xml:space="preserve">idiom</w:t>
+      </w:r>
+      <w:r>
+        <w:t xml:space="preserve">. Interestingly, this is accompanied by</w:t>
+      </w:r>
+      <w:r>
+        <w:t xml:space="preserve"> </w:t>
+      </w:r>
+      <w:r>
+        <w:rPr>
+          <w:i/>
+          <w:iCs/>
+        </w:rPr>
+        <w:t xml:space="preserve">dynamics</w:t>
+      </w:r>
+      <w:r>
+        <w:t xml:space="preserve"> </w:t>
+      </w:r>
+      <w:r>
+        <w:t xml:space="preserve">in</w:t>
+      </w:r>
+      <w:r>
+        <w:t xml:space="preserve"> </w:t>
+      </w:r>
+      <m:oMath>
+        <m:sSup>
+          <m:e>
+            <m:r>
+              <m:rPr>
+                <m:sty m:val="b"/>
+              </m:rPr>
+              <m:t>s</m:t>
+            </m:r>
+          </m:e>
+          <m:sup>
+            <m:r>
+              <m:t>t</m:t>
+            </m:r>
+          </m:sup>
+        </m:sSup>
+      </m:oMath>
+      <w:r>
+        <w:t xml:space="preserve">:</w:t>
+      </w:r>
+      <w:r>
+        <w:t xml:space="preserve"> </w:t>
+      </w:r>
+      <w:r>
+        <w:rPr>
+          <w:i/>
+          <w:iCs/>
+        </w:rPr>
+        <w:t xml:space="preserve">idiom</w:t>
+      </w:r>
+      <w:r>
+        <w:t xml:space="preserve"> </w:t>
+      </w:r>
+      <w:r>
+        <w:t xml:space="preserve">will start at ~0, and progressively gain weight, replacing</w:t>
+      </w:r>
+      <w:r>
+        <w:t xml:space="preserve"> </w:t>
+      </w:r>
+      <w:r>
+        <w:rPr>
+          <w:i/>
+          <w:iCs/>
+        </w:rPr>
+        <w:t xml:space="preserve">seasonal</w:t>
+      </w:r>
+      <w:r>
+        <w:t xml:space="preserve">.</w:t>
+      </w:r>
+    </w:p>
+    <w:p>
+      <w:pPr>
+        <w:pStyle w:val="BodyText"/>
+      </w:pPr>
+      <w:r>
+        <w:t xml:space="preserve">We validated that the emergence of</w:t>
+      </w:r>
+      <w:r>
+        <w:t xml:space="preserve"> </w:t>
+      </w:r>
+      <w:r>
+        <w:rPr>
+          <w:i/>
+          <w:iCs/>
+        </w:rPr>
+        <w:t xml:space="preserve">idiom</w:t>
+      </w:r>
+      <w:r>
+        <w:t xml:space="preserve"> </w:t>
+      </w:r>
+      <w:r>
+        <w:t xml:space="preserve">is indeed causal: persistently ablating</w:t>
+      </w:r>
+      <w:r>
+        <w:t xml:space="preserve"> </w:t>
+      </w:r>
+      <w:r>
+        <w:rPr>
+          <w:i/>
+          <w:iCs/>
+        </w:rPr>
+        <w:t xml:space="preserve">idiom</w:t>
+      </w:r>
+      <w:r>
+        <w:t xml:space="preserve">’s</w:t>
+      </w:r>
+      <w:r>
+        <w:t xml:space="preserve"> </w:t>
+      </w:r>
+      <m:oMath>
+        <m:r>
+          <m:rPr>
+            <m:sty m:val="b"/>
+          </m:rPr>
+          <m:t>s</m:t>
+        </m:r>
+      </m:oMath>
+      <w:r>
+        <w:t xml:space="preserve">-mass from an early step onward prevents the takeover and preserves the seasonal draft. Note however that later ablation onsets no longer rescue</w:t>
+      </w:r>
+      <w:r>
+        <w:t xml:space="preserve"> </w:t>
+      </w:r>
+      <w:r>
+        <w:rPr>
+          <w:i/>
+          <w:iCs/>
+        </w:rPr>
+        <w:t xml:space="preserve">seasonal</w:t>
+      </w:r>
+      <w:r>
+        <w:t xml:space="preserve"> </w:t>
+      </w:r>
+      <w:r>
+        <w:t xml:space="preserve">— the canvas instead collapses into a third, degenerate basin.</w:t>
+      </w:r>
+    </w:p>
+    <w:p>
+      <w:pPr>
+        <w:pStyle w:val="CaptionedFigure"/>
+      </w:pPr>
+      <w:r>
+        <w:drawing>
+          <wp:inline>
+            <wp:extent cx="5334000" cy="2956891"/>
+            <wp:effectExtent b="0" l="0" r="0" t="0"/>
+            <wp:docPr descr="Seasonal vs idiom: ablation" title="" id="65" name="Picture"/>
+            <a:graphic>
+              <a:graphicData uri="http://schemas.openxmlformats.org/drawingml/2006/picture">
+                <pic:pic>
+                  <pic:nvPicPr>
+                    <pic:cNvPr descr="figs/figA5_seasonal_ember_kill.png" id="66" name="Picture"/>
+                    <pic:cNvPicPr>
+                      <a:picLocks noChangeArrowheads="1" noChangeAspect="1"/>
+                    </pic:cNvPicPr>
+                  </pic:nvPicPr>
+                  <pic:blipFill>
+                    <a:blip r:embed="rId64"/>
                     <a:stretch>
                       <a:fillRect/>
                     </a:stretch>
@@ -4943,9 +5152,9 @@
         <w:t xml:space="preserve">onward (dotted onset, shaded) keeps the seasonal draft, which completes cleanly.</w:t>
       </w:r>
     </w:p>
-    <w:bookmarkEnd w:id="64"/>
-    <w:bookmarkEnd w:id="65"/>
-    <w:bookmarkEnd w:id="66"/>
+    <w:bookmarkEnd w:id="67"/>
+    <w:bookmarkEnd w:id="68"/>
+    <w:bookmarkEnd w:id="69"/>
     <w:sectPr>
       <w:footnotePr>
         <w:numRestart w:val="eachSect"/>

</xml_diff>

<commit_message>
A6 card: plain subtraction/addition titles, drop header line; probe caption: up-to-1024 budget precision
Co-Authored-By: Claude Fable 5 <noreply@anthropic.com>
Claude-Session: https://claude.ai/code/session_01U8CiyQ7ySpBDkYEq4FzNBU
</commit_message>
<xml_diff>
--- a/post.docx
+++ b/post.docx
@@ -3062,7 +3062,7 @@
         </w:r>
       </w:hyperlink>
       <w:r>
-        <w:t xml:space="preserve">) and train logistic-regression probes on gemma-4’s residual stream (1024 training examples per concept), optimizing the layer via heldout AUC. We then test this probe on DG.</w:t>
+        <w:t xml:space="preserve">) and train logistic-regression probes on gemma-4’s residual stream (up to 1024 training examples per concept; 43/56 at the full budget, minimum 512), optimizing the layer via heldout AUC. We then test this probe on DG.</w:t>
       </w:r>
     </w:p>
     <w:p>
@@ -4489,7 +4489,7 @@
       <w:r>
         <w:drawing>
           <wp:inline>
-            <wp:extent cx="5334000" cy="1493520"/>
+            <wp:extent cx="5334000" cy="1197186"/>
             <wp:effectExtent b="0" l="0" r="0" t="0"/>
             <wp:docPr descr="J-Lens future operation" title="" id="61" name="Picture"/>
             <a:graphic>
@@ -4510,7 +4510,7 @@
                   <pic:spPr bwMode="auto">
                     <a:xfrm>
                       <a:off x="0" y="0"/>
-                      <a:ext cx="5334000" cy="1493520"/>
+                      <a:ext cx="5334000" cy="1197186"/>
                     </a:xfrm>
                     <a:prstGeom prst="rect">
                       <a:avLst/>

</xml_diff>

<commit_message>
Card cleanups: aligned ±steer grid, drop headers/judge/deep-shallow remarks; wider fig1 legend handles
Co-Authored-By: Claude Fable 5 <noreply@anthropic.com>
Claude-Session: https://claude.ai/code/session_01U8CiyQ7ySpBDkYEq4FzNBU
</commit_message>
<xml_diff>
--- a/post.docx
+++ b/post.docx
@@ -3669,7 +3669,7 @@
       <w:r>
         <w:drawing>
           <wp:inline>
-            <wp:extent cx="5334000" cy="7023100"/>
+            <wp:extent cx="5334000" cy="6394873"/>
             <wp:effectExtent b="0" l="0" r="0" t="0"/>
             <wp:docPr descr="Steering retention" title="" id="53" name="Picture"/>
             <a:graphic>
@@ -3690,7 +3690,7 @@
                   <pic:spPr bwMode="auto">
                     <a:xfrm>
                       <a:off x="0" y="0"/>
-                      <a:ext cx="5334000" cy="7023100"/>
+                      <a:ext cx="5334000" cy="6394873"/>
                     </a:xfrm>
                     <a:prstGeom prst="rect">
                       <a:avLst/>
@@ -4097,7 +4097,7 @@
       <w:r>
         <w:drawing>
           <wp:inline>
-            <wp:extent cx="5334000" cy="4569460"/>
+            <wp:extent cx="5334000" cy="4296833"/>
             <wp:effectExtent b="0" l="0" r="0" t="0"/>
             <wp:docPr descr="J-Lens retention" title="" id="58" name="Picture"/>
             <a:graphic>
@@ -4118,7 +4118,7 @@
                   <pic:spPr bwMode="auto">
                     <a:xfrm>
                       <a:off x="0" y="0"/>
-                      <a:ext cx="5334000" cy="4569460"/>
+                      <a:ext cx="5334000" cy="4296833"/>
                     </a:xfrm>
                     <a:prstGeom prst="rect">
                       <a:avLst/>

</xml_diff>

<commit_message>
Probe card: drop concept/layer header line
Co-Authored-By: Claude Fable 5 <noreply@anthropic.com>
Claude-Session: https://claude.ai/code/session_01U8CiyQ7ySpBDkYEq4FzNBU
</commit_message>
<xml_diff>
--- a/post.docx
+++ b/post.docx
@@ -3072,7 +3072,7 @@
       <w:r>
         <w:drawing>
           <wp:inline>
-            <wp:extent cx="5334000" cy="3988646"/>
+            <wp:extent cx="5334000" cy="3810846"/>
             <wp:effectExtent b="0" l="0" r="0" t="0"/>
             <wp:docPr descr="Probe retention" title="" id="47" name="Picture"/>
             <a:graphic>
@@ -3093,7 +3093,7 @@
                   <pic:spPr bwMode="auto">
                     <a:xfrm>
                       <a:off x="0" y="0"/>
-                      <a:ext cx="5334000" cy="3988646"/>
+                      <a:ext cx="5334000" cy="3810846"/>
                     </a:xfrm>
                     <a:prstGeom prst="rect">
                       <a:avLst/>

</xml_diff>

<commit_message>
Four new appendix sections: constraint controllability, post-hoc CoT correlations + case card, per-step answer resolution, clock-strike self-repair
All data vendored to src_data/ (posthoc, lockin, planning); figures reproduce
report statistics exactly (Spearman +0.371/+0.424/+0.656).

Co-Authored-By: Claude Fable 5 <noreply@anthropic.com>
Claude-Session: https://claude.ai/code/session_01U8CiyQ7ySpBDkYEq4FzNBU
</commit_message>
<xml_diff>
--- a/post.docx
+++ b/post.docx
@@ -2,7 +2,7 @@
 <file path=word/document.xml><?xml version="1.0" encoding="utf-8"?>
 <w:document xmlns:w="http://schemas.openxmlformats.org/wordprocessingml/2006/main" xmlns:m="http://schemas.openxmlformats.org/officeDocument/2006/math" xmlns:r="http://schemas.openxmlformats.org/officeDocument/2006/relationships" xmlns:o="urn:schemas-microsoft-com:office:office" xmlns:v="urn:schemas-microsoft-com:vml" xmlns:w10="urn:schemas-microsoft-com:office:word" xmlns:a="http://schemas.openxmlformats.org/drawingml/2006/main" xmlns:pic="http://schemas.openxmlformats.org/drawingml/2006/picture" xmlns:wp="http://schemas.openxmlformats.org/drawingml/2006/wordprocessingDrawing">
   <w:body>
-    <w:bookmarkStart w:id="69" w:name="Xf5e660dc2e9c1a368125465a5756c31f66c44e2"/>
+    <w:bookmarkStart w:id="88" w:name="Xf5e660dc2e9c1a368125465a5756c31f66c44e2"/>
     <w:p>
       <w:pPr>
         <w:pStyle w:val="Heading1"/>
@@ -2910,7 +2910,7 @@
       </w:r>
     </w:p>
     <w:bookmarkEnd w:id="40"/>
-    <w:bookmarkStart w:id="68" w:name="appendix"/>
+    <w:bookmarkStart w:id="87" w:name="appendix"/>
     <w:p>
       <w:pPr>
         <w:pStyle w:val="Heading2"/>
@@ -5153,8 +5153,855 @@
       </w:r>
     </w:p>
     <w:bookmarkEnd w:id="67"/>
-    <w:bookmarkEnd w:id="68"/>
-    <w:bookmarkEnd w:id="69"/>
+    <w:bookmarkStart w:id="71" w:name="X378100a4197038c09db8505ba15a62ec91f8fa4"/>
+    <w:p>
+      <w:pPr>
+        <w:pStyle w:val="Heading3"/>
+      </w:pPr>
+      <w:r>
+        <w:t xml:space="preserve">Constraint writing: violations are patched, but only under noise</w:t>
+      </w:r>
+    </w:p>
+    <w:p>
+      <w:pPr>
+        <w:pStyle w:val="FirstParagraph"/>
+      </w:pPr>
+      <w:r>
+        <w:t xml:space="preserve">[stub:] We next gave DG global writing constraints that cannot be satisfied greedily (a battery of 11 task types: acrostics, exact word counts, sentences stating their own word count, word-level palindromes, …), and tracked an exact checker’s</w:t>
+      </w:r>
+      <w:r>
+        <w:t xml:space="preserve"> </w:t>
+      </w:r>
+      <w:r>
+        <w:rPr>
+          <w:i/>
+          <w:iCs/>
+        </w:rPr>
+        <w:t xml:space="preserve">violation margin</w:t>
+      </w:r>
+      <w:r>
+        <w:t xml:space="preserve"> </w:t>
+      </w:r>
+      <w:r>
+        <w:t xml:space="preserve">of the decoded canvas at every denoising step. The canvas frequently carries constraint-violating drafts transiently; whether they get patched depends on the sampler: under the default (colder) schedule there are no late escapes at all (140 clean / 100 trapped runs), while the hot schedule produces genuine escapes — a multi-step violating spell that is repaired on-canvas before commitment.</w:t>
+      </w:r>
+    </w:p>
+    <w:p>
+      <w:pPr>
+        <w:pStyle w:val="CaptionedFigure"/>
+      </w:pPr>
+      <w:r>
+        <w:drawing>
+          <wp:inline>
+            <wp:extent cx="5334000" cy="1600200"/>
+            <wp:effectExtent b="0" l="0" r="0" t="0"/>
+            <wp:docPr descr="Constraint margins" title="" id="69" name="Picture"/>
+            <a:graphic>
+              <a:graphicData uri="http://schemas.openxmlformats.org/drawingml/2006/picture">
+                <pic:pic>
+                  <pic:nvPicPr>
+                    <pic:cNvPr descr="figs/figA7_constraint_margins.png" id="70" name="Picture"/>
+                    <pic:cNvPicPr>
+                      <a:picLocks noChangeArrowheads="1" noChangeAspect="1"/>
+                    </pic:cNvPicPr>
+                  </pic:nvPicPr>
+                  <pic:blipFill>
+                    <a:blip r:embed="rId68"/>
+                    <a:stretch>
+                      <a:fillRect/>
+                    </a:stretch>
+                  </pic:blipFill>
+                  <pic:spPr bwMode="auto">
+                    <a:xfrm>
+                      <a:off x="0" y="0"/>
+                      <a:ext cx="5334000" cy="1600200"/>
+                    </a:xfrm>
+                    <a:prstGeom prst="rect">
+                      <a:avLst/>
+                    </a:prstGeom>
+                    <a:noFill/>
+                    <a:ln w="9525">
+                      <a:noFill/>
+                      <a:headEnd/>
+                      <a:tailEnd/>
+                    </a:ln>
+                  </pic:spPr>
+                </pic:pic>
+              </a:graphicData>
+            </a:graphic>
+          </wp:inline>
+        </w:drawing>
+      </w:r>
+    </w:p>
+    <w:p>
+      <w:pPr>
+        <w:pStyle w:val="ImageCaption"/>
+      </w:pPr>
+      <w:r>
+        <w:t xml:space="preserve">Constraint margins</w:t>
+      </w:r>
+    </w:p>
+    <w:p>
+      <w:pPr>
+        <w:pStyle w:val="BodyText"/>
+      </w:pPr>
+      <w:r>
+        <w:rPr>
+          <w:b/>
+          <w:bCs/>
+          <w:i/>
+          <w:iCs/>
+        </w:rPr>
+        <w:t xml:space="preserve">DG transiently violates global constraints on the canvas and patches them steps later.</w:t>
+      </w:r>
+      <w:r>
+        <w:rPr>
+          <w:i/>
+          <w:iCs/>
+        </w:rPr>
+        <w:t xml:space="preserve"> </w:t>
+      </w:r>
+      <w:r>
+        <w:rPr>
+          <w:i/>
+          <w:iCs/>
+        </w:rPr>
+        <w:t xml:space="preserve">Violation margin of the decoded canvas per denoising step (hot sampler; one line per rollout; 0 = satisfied). Green = escape (a ≥5-step violating spell, then satisfied); both escapes are the word-palindrome task patching the constraint-violating seasonal draft into the idiom of the previous section (</w:t>
+      </w:r>
+      <w:r>
+        <w:rPr>
+          <w:rStyle w:val="VerbatimChar"/>
+          <w:i/>
+          <w:iCs/>
+        </w:rPr>
+        <w:t xml:space="preserve">All leaves fall when leaves fall all.</w:t>
+      </w:r>
+      <w:r>
+        <w:rPr>
+          <w:i/>
+          <w:iCs/>
+        </w:rPr>
+        <w:t xml:space="preserve"> </w:t>
+      </w:r>
+      <w:r>
+        <w:rPr>
+          <w:i/>
+          <w:iCs/>
+        </w:rPr>
+        <w:t xml:space="preserve">→</w:t>
+      </w:r>
+      <w:r>
+        <w:rPr>
+          <w:i/>
+          <w:iCs/>
+        </w:rPr>
+        <w:t xml:space="preserve"> </w:t>
+      </w:r>
+      <w:r>
+        <w:rPr>
+          <w:rStyle w:val="VerbatimChar"/>
+          <w:i/>
+          <w:iCs/>
+        </w:rPr>
+        <w:t xml:space="preserve">All for one and one for all.</w:t>
+      </w:r>
+      <w:r>
+        <w:rPr>
+          <w:i/>
+          <w:iCs/>
+        </w:rPr>
+        <w:t xml:space="preserve">, satisfied at step 10).</w:t>
+      </w:r>
+    </w:p>
+    <w:bookmarkEnd w:id="71"/>
+    <w:bookmarkStart w:id="82" w:name="is-the-cot-load-bearing-or-post-hoc"/>
+    <w:p>
+      <w:pPr>
+        <w:pStyle w:val="Heading3"/>
+      </w:pPr>
+      <w:r>
+        <w:t xml:space="preserve">Is the CoT load-bearing or post-hoc?</w:t>
+      </w:r>
+    </w:p>
+    <w:p>
+      <w:pPr>
+        <w:pStyle w:val="FirstParagraph"/>
+      </w:pPr>
+      <w:r>
+        <w:t xml:space="preserve">[stub:] With the answer forced onto the first line (answer-first framing), we measured for 20 problems: the</w:t>
+      </w:r>
+      <w:r>
+        <w:t xml:space="preserve"> </w:t>
+      </w:r>
+      <w:r>
+        <w:rPr>
+          <w:i/>
+          <w:iCs/>
+        </w:rPr>
+        <w:t xml:space="preserve">commitment time</w:t>
+      </w:r>
+      <w:r>
+        <w:t xml:space="preserve"> </w:t>
+      </w:r>
+      <w:r>
+        <w:t xml:space="preserve">(denoising step at which the answer slot freezes), the</w:t>
+      </w:r>
+      <w:r>
+        <w:t xml:space="preserve"> </w:t>
+      </w:r>
+      <w:r>
+        <w:rPr>
+          <w:i/>
+          <w:iCs/>
+        </w:rPr>
+        <w:t xml:space="preserve">susceptibility</w:t>
+      </w:r>
+      <w:r>
+        <w:t xml:space="preserve"> </w:t>
+      </w:r>
+      <m:oMath>
+        <m:r>
+          <m:t>S</m:t>
+        </m:r>
+      </m:oMath>
+      <w:r>
+        <w:t xml:space="preserve"> </w:t>
+      </w:r>
+      <w:r>
+        <w:t xml:space="preserve">(probability the answer changes when the CoT positions are clamped to a partially-randomized version at every step), and a</w:t>
+      </w:r>
+      <w:r>
+        <w:t xml:space="preserve"> </w:t>
+      </w:r>
+      <w:r>
+        <w:rPr>
+          <w:i/>
+          <w:iCs/>
+        </w:rPr>
+        <w:t xml:space="preserve">blind difficulty</w:t>
+      </w:r>
+      <w:r>
+        <w:t xml:space="preserve"> </w:t>
+      </w:r>
+      <w:r>
+        <w:t xml:space="preserve">rating (three subagents shown only the problem text). Nominal difficulty is a weak proxy; the proximal predictor of a load-bearing CoT is the measured commitment time (</w:t>
+      </w:r>
+      <m:oMath>
+        <m:sSub>
+          <m:e>
+            <m:r>
+              <m:t>ρ</m:t>
+            </m:r>
+          </m:e>
+          <m:sub>
+            <m:r>
+              <m:t>S</m:t>
+            </m:r>
+          </m:sub>
+        </m:sSub>
+        <m:r>
+          <m:rPr>
+            <m:sty m:val="p"/>
+          </m:rPr>
+          <m:t>=</m:t>
+        </m:r>
+        <m:r>
+          <m:rPr>
+            <m:sty m:val="p"/>
+          </m:rPr>
+          <m:t>+</m:t>
+        </m:r>
+        <m:r>
+          <m:t>0.66</m:t>
+        </m:r>
+      </m:oMath>
+      <w:r>
+        <w:t xml:space="preserve">; sharpened to</w:t>
+      </w:r>
+      <w:r>
+        <w:t xml:space="preserve"> </w:t>
+      </w:r>
+      <m:oMath>
+        <m:r>
+          <m:rPr>
+            <m:sty m:val="p"/>
+          </m:rPr>
+          <m:t>+</m:t>
+        </m:r>
+        <m:r>
+          <m:t>0.80</m:t>
+        </m:r>
+      </m:oMath>
+      <w:r>
+        <w:t xml:space="preserve"> </w:t>
+      </w:r>
+      <w:r>
+        <w:t xml:space="preserve">pooled across a temperature sweep). CRT-style problems commit at step 0 with</w:t>
+      </w:r>
+      <w:r>
+        <w:t xml:space="preserve"> </w:t>
+      </w:r>
+      <m:oMath>
+        <m:r>
+          <m:t>S</m:t>
+        </m:r>
+        <m:r>
+          <m:rPr>
+            <m:sty m:val="p"/>
+          </m:rPr>
+          <m:t>=</m:t>
+        </m:r>
+        <m:r>
+          <m:t>0</m:t>
+        </m:r>
+      </m:oMath>
+      <w:r>
+        <w:t xml:space="preserve"> </w:t>
+      </w:r>
+      <w:r>
+        <w:t xml:space="preserve">(the CoT is post-hoc); serial counting problems commit late and break under corruption (the CoT is load-bearing).</w:t>
+      </w:r>
+    </w:p>
+    <w:p>
+      <w:pPr>
+        <w:pStyle w:val="CaptionedFigure"/>
+      </w:pPr>
+      <w:r>
+        <w:drawing>
+          <wp:inline>
+            <wp:extent cx="5334000" cy="1619249"/>
+            <wp:effectExtent b="0" l="0" r="0" t="0"/>
+            <wp:docPr descr="Post-hoc correlations" title="" id="73" name="Picture"/>
+            <a:graphic>
+              <a:graphicData uri="http://schemas.openxmlformats.org/drawingml/2006/picture">
+                <pic:pic>
+                  <pic:nvPicPr>
+                    <pic:cNvPr descr="figs/figA8_posthoc_correlations.png" id="74" name="Picture"/>
+                    <pic:cNvPicPr>
+                      <a:picLocks noChangeArrowheads="1" noChangeAspect="1"/>
+                    </pic:cNvPicPr>
+                  </pic:nvPicPr>
+                  <pic:blipFill>
+                    <a:blip r:embed="rId72"/>
+                    <a:stretch>
+                      <a:fillRect/>
+                    </a:stretch>
+                  </pic:blipFill>
+                  <pic:spPr bwMode="auto">
+                    <a:xfrm>
+                      <a:off x="0" y="0"/>
+                      <a:ext cx="5334000" cy="1619249"/>
+                    </a:xfrm>
+                    <a:prstGeom prst="rect">
+                      <a:avLst/>
+                    </a:prstGeom>
+                    <a:noFill/>
+                    <a:ln w="9525">
+                      <a:noFill/>
+                      <a:headEnd/>
+                      <a:tailEnd/>
+                    </a:ln>
+                  </pic:spPr>
+                </pic:pic>
+              </a:graphicData>
+            </a:graphic>
+          </wp:inline>
+        </w:drawing>
+      </w:r>
+    </w:p>
+    <w:p>
+      <w:pPr>
+        <w:pStyle w:val="ImageCaption"/>
+      </w:pPr>
+      <w:r>
+        <w:t xml:space="preserve">Post-hoc correlations</w:t>
+      </w:r>
+    </w:p>
+    <w:p>
+      <w:pPr>
+        <w:pStyle w:val="BodyText"/>
+      </w:pPr>
+      <w:r>
+        <w:rPr>
+          <w:b/>
+          <w:bCs/>
+          <w:i/>
+          <w:iCs/>
+        </w:rPr>
+        <w:t xml:space="preserve">Commitment time, not nominal difficulty, predicts whether the CoT is load-bearing.</w:t>
+      </w:r>
+      <w:r>
+        <w:rPr>
+          <w:i/>
+          <w:iCs/>
+        </w:rPr>
+        <w:t xml:space="preserve"> </w:t>
+      </w:r>
+      <w:r>
+        <w:rPr>
+          <w:i/>
+          <w:iCs/>
+        </w:rPr>
+        <w:t xml:space="preserve">Per problem (n=20): blind difficulty vs commitment time, blind difficulty vs susceptibility</w:t>
+      </w:r>
+      <w:r>
+        <w:rPr>
+          <w:i/>
+          <w:iCs/>
+        </w:rPr>
+        <w:t xml:space="preserve"> </w:t>
+      </w:r>
+      <m:oMath>
+        <m:r>
+          <m:t>S</m:t>
+        </m:r>
+      </m:oMath>
+      <w:r>
+        <w:rPr>
+          <w:i/>
+          <w:iCs/>
+        </w:rPr>
+        <w:t xml:space="preserve">, and commitment time vs</w:t>
+      </w:r>
+      <w:r>
+        <w:rPr>
+          <w:i/>
+          <w:iCs/>
+        </w:rPr>
+        <w:t xml:space="preserve"> </w:t>
+      </w:r>
+      <m:oMath>
+        <m:r>
+          <m:t>S</m:t>
+        </m:r>
+      </m:oMath>
+      <w:r>
+        <w:rPr>
+          <w:i/>
+          <w:iCs/>
+        </w:rPr>
+        <w:t xml:space="preserve"> </w:t>
+      </w:r>
+      <w:r>
+        <w:rPr>
+          <w:i/>
+          <w:iCs/>
+        </w:rPr>
+        <w:t xml:space="preserve">(Spearman</w:t>
+      </w:r>
+      <w:r>
+        <w:rPr>
+          <w:i/>
+          <w:iCs/>
+        </w:rPr>
+        <w:t xml:space="preserve"> </w:t>
+      </w:r>
+      <m:oMath>
+        <m:sSub>
+          <m:e>
+            <m:r>
+              <m:t>ρ</m:t>
+            </m:r>
+          </m:e>
+          <m:sub>
+            <m:r>
+              <m:t>S</m:t>
+            </m:r>
+          </m:sub>
+        </m:sSub>
+      </m:oMath>
+      <w:r>
+        <w:rPr>
+          <w:i/>
+          <w:iCs/>
+        </w:rPr>
+        <w:t xml:space="preserve"> </w:t>
+      </w:r>
+      <w:r>
+        <w:rPr>
+          <w:i/>
+          <w:iCs/>
+        </w:rPr>
+        <w:t xml:space="preserve">per panel; × = accuracy &lt; 0.5, dashed = least-squares fit).</w:t>
+      </w:r>
+    </w:p>
+    <w:p>
+      <w:pPr>
+        <w:pStyle w:val="BodyText"/>
+      </w:pPr>
+      <w:r>
+        <w:t xml:space="preserve">For illustration, consider the problem</w:t>
+      </w:r>
+      <w:r>
+        <w:t xml:space="preserve"> </w:t>
+      </w:r>
+      <w:r>
+        <w:rPr>
+          <w:rStyle w:val="VerbatimChar"/>
+        </w:rPr>
+        <w:t xml:space="preserve">squares_400_800</w:t>
+      </w:r>
+      <w:r>
+        <w:t xml:space="preserve">, which dissociates the two probes:</w:t>
+      </w:r>
+    </w:p>
+    <w:p>
+      <w:pPr>
+        <w:pStyle w:val="CaptionedFigure"/>
+      </w:pPr>
+      <w:r>
+        <w:drawing>
+          <wp:inline>
+            <wp:extent cx="5334000" cy="1570566"/>
+            <wp:effectExtent b="0" l="0" r="0" t="0"/>
+            <wp:docPr descr="Post-hoc case study" title="" id="76" name="Picture"/>
+            <a:graphic>
+              <a:graphicData uri="http://schemas.openxmlformats.org/drawingml/2006/picture">
+                <pic:pic>
+                  <pic:nvPicPr>
+                    <pic:cNvPr descr="figs/figA8b_posthoc_case.png" id="77" name="Picture"/>
+                    <pic:cNvPicPr>
+                      <a:picLocks noChangeArrowheads="1" noChangeAspect="1"/>
+                    </pic:cNvPicPr>
+                  </pic:nvPicPr>
+                  <pic:blipFill>
+                    <a:blip r:embed="rId75"/>
+                    <a:stretch>
+                      <a:fillRect/>
+                    </a:stretch>
+                  </pic:blipFill>
+                  <pic:spPr bwMode="auto">
+                    <a:xfrm>
+                      <a:off x="0" y="0"/>
+                      <a:ext cx="5334000" cy="1570566"/>
+                    </a:xfrm>
+                    <a:prstGeom prst="rect">
+                      <a:avLst/>
+                    </a:prstGeom>
+                    <a:noFill/>
+                    <a:ln w="9525">
+                      <a:noFill/>
+                      <a:headEnd/>
+                      <a:tailEnd/>
+                    </a:ln>
+                  </pic:spPr>
+                </pic:pic>
+              </a:graphicData>
+            </a:graphic>
+          </wp:inline>
+        </w:drawing>
+      </w:r>
+    </w:p>
+    <w:p>
+      <w:pPr>
+        <w:pStyle w:val="ImageCaption"/>
+      </w:pPr>
+      <w:r>
+        <w:t xml:space="preserve">Post-hoc case study</w:t>
+      </w:r>
+    </w:p>
+    <w:p>
+      <w:pPr>
+        <w:pStyle w:val="BodyText"/>
+      </w:pPr>
+      <w:r>
+        <w:rPr>
+          <w:b/>
+          <w:bCs/>
+          <w:i/>
+          <w:iCs/>
+        </w:rPr>
+        <w:t xml:space="preserve">DG denoises random corruption away but reads fluent wrong reasoning.</w:t>
+      </w:r>
+      <w:r>
+        <w:rPr>
+          <w:i/>
+          <w:iCs/>
+        </w:rPr>
+        <w:t xml:space="preserve"> </w:t>
+      </w:r>
+      <w:r>
+        <w:rPr>
+          <w:i/>
+          <w:iCs/>
+        </w:rPr>
+        <w:t xml:space="preserve">Left: clamping all 255 CoT positions to random tokens leaves the answer untouched (8,</w:t>
+      </w:r>
+      <w:r>
+        <w:rPr>
+          <w:i/>
+          <w:iCs/>
+        </w:rPr>
+        <w:t xml:space="preserve"> </w:t>
+      </w:r>
+      <m:oMath>
+        <m:r>
+          <m:t>S</m:t>
+        </m:r>
+        <m:r>
+          <m:rPr>
+            <m:sty m:val="p"/>
+          </m:rPr>
+          <m:t>=</m:t>
+        </m:r>
+        <m:r>
+          <m:t>0.05</m:t>
+        </m:r>
+      </m:oMath>
+      <w:r>
+        <w:rPr>
+          <w:i/>
+          <w:iCs/>
+        </w:rPr>
+        <w:t xml:space="preserve">). Right: clamping a coherent lure CoT with a single off-by-one error (red) flips the answer to 9 in 5/5 seeds. Caveat: a target sweep shows the lure does not install its specific conclusion — the coherent-but-wrong CoT dislodges the answer into a nearby basin rather than steering it.</w:t>
+      </w:r>
+    </w:p>
+    <w:bookmarkStart w:id="81" w:name="answer-resolution-over-denoising-steps"/>
+    <w:p>
+      <w:pPr>
+        <w:pStyle w:val="Heading4"/>
+      </w:pPr>
+      <w:r>
+        <w:t xml:space="preserve">Answer resolution over denoising steps</w:t>
+      </w:r>
+    </w:p>
+    <w:p>
+      <w:pPr>
+        <w:pStyle w:val="FirstParagraph"/>
+      </w:pPr>
+      <w:r>
+        <w:t xml:space="preserve">[stub:] The same split is visible in the raw denoising dynamics: for post-hoc problems the answer region is confident (low entropy) at step 0–1 while the CoT region is still hot; for load-bearing problems the answer region stays hot for several steps, flipping repeatedly, and commits only as the CoT resolves.</w:t>
+      </w:r>
+    </w:p>
+    <w:p>
+      <w:pPr>
+        <w:pStyle w:val="CaptionedFigure"/>
+      </w:pPr>
+      <w:r>
+        <w:drawing>
+          <wp:inline>
+            <wp:extent cx="5334000" cy="2125265"/>
+            <wp:effectExtent b="0" l="0" r="0" t="0"/>
+            <wp:docPr descr="Answer resolution" title="" id="79" name="Picture"/>
+            <a:graphic>
+              <a:graphicData uri="http://schemas.openxmlformats.org/drawingml/2006/picture">
+                <pic:pic>
+                  <pic:nvPicPr>
+                    <pic:cNvPr descr="figs/figA9_resolution.png" id="80" name="Picture"/>
+                    <pic:cNvPicPr>
+                      <a:picLocks noChangeArrowheads="1" noChangeAspect="1"/>
+                    </pic:cNvPicPr>
+                  </pic:nvPicPr>
+                  <pic:blipFill>
+                    <a:blip r:embed="rId78"/>
+                    <a:stretch>
+                      <a:fillRect/>
+                    </a:stretch>
+                  </pic:blipFill>
+                  <pic:spPr bwMode="auto">
+                    <a:xfrm>
+                      <a:off x="0" y="0"/>
+                      <a:ext cx="5334000" cy="2125265"/>
+                    </a:xfrm>
+                    <a:prstGeom prst="rect">
+                      <a:avLst/>
+                    </a:prstGeom>
+                    <a:noFill/>
+                    <a:ln w="9525">
+                      <a:noFill/>
+                      <a:headEnd/>
+                      <a:tailEnd/>
+                    </a:ln>
+                  </pic:spPr>
+                </pic:pic>
+              </a:graphicData>
+            </a:graphic>
+          </wp:inline>
+        </w:drawing>
+      </w:r>
+    </w:p>
+    <w:p>
+      <w:pPr>
+        <w:pStyle w:val="ImageCaption"/>
+      </w:pPr>
+      <w:r>
+        <w:t xml:space="preserve">Answer resolution</w:t>
+      </w:r>
+    </w:p>
+    <w:p>
+      <w:pPr>
+        <w:pStyle w:val="BodyText"/>
+      </w:pPr>
+      <w:r>
+        <w:rPr>
+          <w:b/>
+          <w:bCs/>
+          <w:i/>
+          <w:iCs/>
+        </w:rPr>
+        <w:t xml:space="preserve">Post-hoc answers commit before their CoT; load-bearing answers wait on it.</w:t>
+      </w:r>
+      <w:r>
+        <w:rPr>
+          <w:i/>
+          <w:iCs/>
+        </w:rPr>
+        <w:t xml:space="preserve"> </w:t>
+      </w:r>
+      <w:r>
+        <w:rPr>
+          <w:i/>
+          <w:iCs/>
+        </w:rPr>
+        <w:t xml:space="preserve">Mean token entropy of the answer positions (solid) and CoT positions (dashed) per denoising step. Left: bat_ball and monty — the answer is confident by step 1 (0 flips) while the CoT is still at ~3–4 nats. Right: reverse_then_add and sq1000 — the answer stays hot until the CoT cools, passing through the annotated value sequences before settling.</w:t>
+      </w:r>
+    </w:p>
+    <w:bookmarkEnd w:id="81"/>
+    <w:bookmarkEnd w:id="82"/>
+    <w:bookmarkStart w:id="86" w:name="Xc88983d67b72bd3bbe7b5ed4c6ce8c17fda4537"/>
+    <w:p>
+      <w:pPr>
+        <w:pStyle w:val="Heading3"/>
+      </w:pPr>
+      <w:r>
+        <w:t xml:space="preserve">Self-repair: escaping a confident-wrong answer</w:t>
+      </w:r>
+    </w:p>
+    <w:p>
+      <w:pPr>
+        <w:pStyle w:val="FirstParagraph"/>
+      </w:pPr>
+      <w:r>
+        <w:t xml:space="preserve">[stub:] Finally, we probed how sticky a wrong answer is, on a clock-strike fencepost problem (</w:t>
+      </w:r>
+      <w:r>
+        <w:rPr>
+          <w:rStyle w:val="VerbatimChar"/>
+        </w:rPr>
+        <w:t xml:space="preserve">A clock takes 6 seconds to strike 4 o'clock (it chimes 4 times). How many seconds does it take to strike 9 o'clock?</w:t>
+      </w:r>
+      <w:r>
+        <w:t xml:space="preserve">; correct 16, fencepost attractor 18). In natural runs the canvas transiently visits the wrong answers and patches them within a few steps. But a</w:t>
+      </w:r>
+      <w:r>
+        <w:t xml:space="preserve"> </w:t>
+      </w:r>
+      <w:r>
+        <w:rPr>
+          <w:i/>
+          <w:iCs/>
+        </w:rPr>
+        <w:t xml:space="preserve">harvested</w:t>
+      </w:r>
+      <w:r>
+        <w:t xml:space="preserve"> </w:t>
+      </w:r>
+      <w:r>
+        <w:t xml:space="preserve">confident-wrong state (a cold run that converged to 18) is a genuine attractor: re-denoising it escapes to 16 only with a hot sampler</w:t>
+      </w:r>
+      <w:r>
+        <w:t xml:space="preserve"> </w:t>
+      </w:r>
+      <w:r>
+        <w:rPr>
+          <w:i/>
+          <w:iCs/>
+        </w:rPr>
+        <w:t xml:space="preserve">and</w:t>
+      </w:r>
+      <w:r>
+        <w:t xml:space="preserve"> </w:t>
+      </w:r>
+      <w:r>
+        <w:t xml:space="preserve">enough re-noising — plant it past step ~48 of 128 and even the hot sampler stays stuck.</w:t>
+      </w:r>
+    </w:p>
+    <w:p>
+      <w:pPr>
+        <w:pStyle w:val="CaptionedFigure"/>
+      </w:pPr>
+      <w:r>
+        <w:drawing>
+          <wp:inline>
+            <wp:extent cx="5334000" cy="2117911"/>
+            <wp:effectExtent b="0" l="0" r="0" t="0"/>
+            <wp:docPr descr="Self-repair clock" title="" id="84" name="Picture"/>
+            <a:graphic>
+              <a:graphicData uri="http://schemas.openxmlformats.org/drawingml/2006/picture">
+                <pic:pic>
+                  <pic:nvPicPr>
+                    <pic:cNvPr descr="figs/figA10_selfrepair_clock.png" id="85" name="Picture"/>
+                    <pic:cNvPicPr>
+                      <a:picLocks noChangeArrowheads="1" noChangeAspect="1"/>
+                    </pic:cNvPicPr>
+                  </pic:nvPicPr>
+                  <pic:blipFill>
+                    <a:blip r:embed="rId83"/>
+                    <a:stretch>
+                      <a:fillRect/>
+                    </a:stretch>
+                  </pic:blipFill>
+                  <pic:spPr bwMode="auto">
+                    <a:xfrm>
+                      <a:off x="0" y="0"/>
+                      <a:ext cx="5334000" cy="2117911"/>
+                    </a:xfrm>
+                    <a:prstGeom prst="rect">
+                      <a:avLst/>
+                    </a:prstGeom>
+                    <a:noFill/>
+                    <a:ln w="9525">
+                      <a:noFill/>
+                      <a:headEnd/>
+                      <a:tailEnd/>
+                    </a:ln>
+                  </pic:spPr>
+                </pic:pic>
+              </a:graphicData>
+            </a:graphic>
+          </wp:inline>
+        </w:drawing>
+      </w:r>
+    </w:p>
+    <w:p>
+      <w:pPr>
+        <w:pStyle w:val="ImageCaption"/>
+      </w:pPr>
+      <w:r>
+        <w:t xml:space="preserve">Self-repair clock</w:t>
+      </w:r>
+    </w:p>
+    <w:p>
+      <w:pPr>
+        <w:pStyle w:val="BodyText"/>
+      </w:pPr>
+      <w:r>
+        <w:rPr>
+          <w:b/>
+          <w:bCs/>
+          <w:i/>
+          <w:iCs/>
+        </w:rPr>
+        <w:t xml:space="preserve">Transient wrong answers self-repair; a committed wrong state needs heat and noise to escape.</w:t>
+      </w:r>
+      <w:r>
+        <w:rPr>
+          <w:i/>
+          <w:iCs/>
+        </w:rPr>
+        <w:t xml:space="preserve"> </w:t>
+      </w:r>
+      <w:r>
+        <w:rPr>
+          <w:i/>
+          <w:iCs/>
+        </w:rPr>
+        <w:t xml:space="preserve">Left: the first-line answer over denoising steps in natural cold runs (three seeds) — 12/18 appear transiently, all settle at 16. Right: a harvested wrong-18 state planted at varying steps and re-denoised: cold recipients stay stuck at every depth; very-hot recipients escape to 16 only when planted before ~step 48 of 128.</w:t>
+      </w:r>
+    </w:p>
+    <w:bookmarkEnd w:id="86"/>
+    <w:bookmarkEnd w:id="87"/>
+    <w:bookmarkEnd w:id="88"/>
     <w:sectPr>
       <w:footnotePr>
         <w:numRestart w:val="eachSect"/>

</xml_diff>

<commit_message>
Self-correction section: single-task warped-time margins + 3-step canvas card; new commitment-causality analysis (CoM vs L2R filler)
Co-Authored-By: Claude Fable 5 <noreply@anthropic.com>
Claude-Session: https://claude.ai/code/session_01U8CiyQ7ySpBDkYEq4FzNBU
</commit_message>
<xml_diff>
--- a/post.docx
+++ b/post.docx
@@ -2,7 +2,7 @@
 <file path=word/document.xml><?xml version="1.0" encoding="utf-8"?>
 <w:document xmlns:w="http://schemas.openxmlformats.org/wordprocessingml/2006/main" xmlns:m="http://schemas.openxmlformats.org/officeDocument/2006/math" xmlns:r="http://schemas.openxmlformats.org/officeDocument/2006/relationships" xmlns:o="urn:schemas-microsoft-com:office:office" xmlns:v="urn:schemas-microsoft-com:vml" xmlns:w10="urn:schemas-microsoft-com:office:word" xmlns:a="http://schemas.openxmlformats.org/drawingml/2006/main" xmlns:pic="http://schemas.openxmlformats.org/drawingml/2006/picture" xmlns:wp="http://schemas.openxmlformats.org/drawingml/2006/wordprocessingDrawing">
   <w:body>
-    <w:bookmarkStart w:id="88" w:name="Xf5e660dc2e9c1a368125465a5756c31f66c44e2"/>
+    <w:bookmarkStart w:id="92" w:name="Xf5e660dc2e9c1a368125465a5756c31f66c44e2"/>
     <w:p>
       <w:pPr>
         <w:pStyle w:val="Heading1"/>
@@ -2910,7 +2910,7 @@
       </w:r>
     </w:p>
     <w:bookmarkEnd w:id="40"/>
-    <w:bookmarkStart w:id="87" w:name="appendix"/>
+    <w:bookmarkStart w:id="91" w:name="appendix"/>
     <w:p>
       <w:pPr>
         <w:pStyle w:val="Heading2"/>
@@ -5153,13 +5153,13 @@
       </w:r>
     </w:p>
     <w:bookmarkEnd w:id="67"/>
-    <w:bookmarkStart w:id="71" w:name="X378100a4197038c09db8505ba15a62ec91f8fa4"/>
+    <w:bookmarkStart w:id="71" w:name="self-correction"/>
     <w:p>
       <w:pPr>
         <w:pStyle w:val="Heading3"/>
       </w:pPr>
       <w:r>
-        <w:t xml:space="preserve">Constraint writing: violations are patched, but only under noise</w:t>
+        <w:t xml:space="preserve">Self-correction</w:t>
       </w:r>
     </w:p>
     <w:p>
@@ -5167,7 +5167,7 @@
         <w:pStyle w:val="FirstParagraph"/>
       </w:pPr>
       <w:r>
-        <w:t xml:space="preserve">[stub:] We next gave DG global writing constraints that cannot be satisfied greedily (a battery of 11 task types: acrostics, exact word counts, sentences stating their own word count, word-level palindromes, …), and tracked an exact checker’s</w:t>
+        <w:t xml:space="preserve">[stub:] We next gave DG global writing constraints that cannot be satisfied greedily, and tracked an exact checker’s</w:t>
       </w:r>
       <w:r>
         <w:t xml:space="preserve"> </w:t>
@@ -5183,7 +5183,23 @@
         <w:t xml:space="preserve"> </w:t>
       </w:r>
       <w:r>
-        <w:t xml:space="preserve">of the decoded canvas at every denoising step. The canvas frequently carries constraint-violating drafts transiently; whether they get patched depends on the sampler: under the default (colder) schedule there are no late escapes at all (140 clean / 100 trapped runs), while the hot schedule produces genuine escapes — a multi-step violating spell that is repaired on-canvas before commitment.</w:t>
+        <w:t xml:space="preserve">of the decoded canvas at every denoising step — here for the word-palindrome task under the hot sampler. The canvas transiently carries constraint-violating drafts and patches them steps later: the two escape runs (green) hold a violating draft for 7 steps before repairing it on-canvas. This is the same transition studied in the seasonal-vs-idiom section above — the violating mid-step draft</w:t>
+      </w:r>
+      <w:r>
+        <w:t xml:space="preserve"> </w:t>
+      </w:r>
+      <w:r>
+        <w:rPr>
+          <w:i/>
+          <w:iCs/>
+        </w:rPr>
+        <w:t xml:space="preserve">is</w:t>
+      </w:r>
+      <w:r>
+        <w:t xml:space="preserve"> </w:t>
+      </w:r>
+      <w:r>
+        <w:t xml:space="preserve">the seasonal phrase, and the patch lands on the idiom.</w:t>
       </w:r>
     </w:p>
     <w:p>
@@ -5193,9 +5209,9 @@
       <w:r>
         <w:drawing>
           <wp:inline>
-            <wp:extent cx="5334000" cy="1600200"/>
+            <wp:extent cx="5334000" cy="4012353"/>
             <wp:effectExtent b="0" l="0" r="0" t="0"/>
-            <wp:docPr descr="Constraint margins" title="" id="69" name="Picture"/>
+            <wp:docPr descr="Self-correction" title="" id="69" name="Picture"/>
             <a:graphic>
               <a:graphicData uri="http://schemas.openxmlformats.org/drawingml/2006/picture">
                 <pic:pic>
@@ -5214,7 +5230,7 @@
                   <pic:spPr bwMode="auto">
                     <a:xfrm>
                       <a:off x="0" y="0"/>
-                      <a:ext cx="5334000" cy="1600200"/>
+                      <a:ext cx="5334000" cy="4012353"/>
                     </a:xfrm>
                     <a:prstGeom prst="rect">
                       <a:avLst/>
@@ -5238,7 +5254,7 @@
         <w:pStyle w:val="ImageCaption"/>
       </w:pPr>
       <w:r>
-        <w:t xml:space="preserve">Constraint margins</w:t>
+        <w:t xml:space="preserve">Self-correction</w:t>
       </w:r>
     </w:p>
     <w:p>
@@ -5252,65 +5268,49 @@
           <w:i/>
           <w:iCs/>
         </w:rPr>
-        <w:t xml:space="preserve">DG transiently violates global constraints on the canvas and patches them steps later.</w:t>
-      </w:r>
-      <w:r>
-        <w:rPr>
-          <w:i/>
-          <w:iCs/>
-        </w:rPr>
-        <w:t xml:space="preserve"> </w:t>
-      </w:r>
-      <w:r>
-        <w:rPr>
-          <w:i/>
-          <w:iCs/>
-        </w:rPr>
-        <w:t xml:space="preserve">Violation margin of the decoded canvas per denoising step (hot sampler; one line per rollout; 0 = satisfied). Green = escape (a ≥5-step violating spell, then satisfied); both escapes are the word-palindrome task patching the constraint-violating seasonal draft into the idiom of the previous section (</w:t>
-      </w:r>
-      <w:r>
-        <w:rPr>
-          <w:rStyle w:val="VerbatimChar"/>
-          <w:i/>
-          <w:iCs/>
-        </w:rPr>
-        <w:t xml:space="preserve">All leaves fall when leaves fall all.</w:t>
-      </w:r>
-      <w:r>
-        <w:rPr>
-          <w:i/>
-          <w:iCs/>
-        </w:rPr>
-        <w:t xml:space="preserve"> </w:t>
-      </w:r>
-      <w:r>
-        <w:rPr>
-          <w:i/>
-          <w:iCs/>
-        </w:rPr>
-        <w:t xml:space="preserve">→</w:t>
-      </w:r>
-      <w:r>
-        <w:rPr>
-          <w:i/>
-          <w:iCs/>
-        </w:rPr>
-        <w:t xml:space="preserve"> </w:t>
-      </w:r>
-      <w:r>
-        <w:rPr>
-          <w:rStyle w:val="VerbatimChar"/>
-          <w:i/>
-          <w:iCs/>
-        </w:rPr>
-        <w:t xml:space="preserve">All for one and one for all.</w:t>
-      </w:r>
-      <w:r>
-        <w:rPr>
-          <w:i/>
-          <w:iCs/>
-        </w:rPr>
-        <w:t xml:space="preserve">, satisfied at step 10).</w:t>
+        <w:t xml:space="preserve">DG transiently violates a global constraint on the canvas and patches it later.</w:t>
+      </w:r>
+      <w:r>
+        <w:rPr>
+          <w:i/>
+          <w:iCs/>
+        </w:rPr>
+        <w:t xml:space="preserve"> </w:t>
+      </w:r>
+      <w:r>
+        <w:rPr>
+          <w:i/>
+          <w:iCs/>
+        </w:rPr>
+        <w:t xml:space="preserve">Top: violation margin per rollout for the word-palindrome task (hot sampler; 0 = satisfied), on a linearly time-warped axis (</w:t>
+      </w:r>
+      <m:oMath>
+        <m:r>
+          <m:t>τ</m:t>
+        </m:r>
+        <m:r>
+          <m:rPr>
+            <m:sty m:val="p"/>
+          </m:rPr>
+          <m:t>=</m:t>
+        </m:r>
+        <m:r>
+          <m:t>t</m:t>
+        </m:r>
+      </m:oMath>
+      <w:r>
+        <w:rPr>
+          <w:i/>
+          <w:iCs/>
+        </w:rPr>
+        <w:t xml:space="preserve"> </w:t>
+      </w:r>
+      <w:r>
+        <w:rPr>
+          <w:i/>
+          <w:iCs/>
+        </w:rPr>
+        <w:t xml:space="preserve">/ the run’s last margin change). Green = escape (a ≥5-step violating spell, then satisfied). Bottom: three canvases of the flagship escape run — the mid-step draft is the constraint-violating seasonal phrase of the seasonal-vs-idiom section; the patch lands on the idiom.</w:t>
       </w:r>
     </w:p>
     <w:bookmarkEnd w:id="71"/>
@@ -6000,8 +6000,156 @@
       </w:r>
     </w:p>
     <w:bookmarkEnd w:id="86"/>
-    <w:bookmarkEnd w:id="87"/>
-    <w:bookmarkEnd w:id="88"/>
+    <w:bookmarkStart w:id="90" w:name="how-causal-is-dgs-generation"/>
+    <w:p>
+      <w:pPr>
+        <w:pStyle w:val="Heading3"/>
+      </w:pPr>
+      <w:r>
+        <w:t xml:space="preserve">How causal is DG’s generation?</w:t>
+      </w:r>
+    </w:p>
+    <w:p>
+      <w:pPr>
+        <w:pStyle w:val="FirstParagraph"/>
+      </w:pPr>
+      <w:r>
+        <w:t xml:space="preserve">[stub:] Although attention is bidirectional, DG could still</w:t>
+      </w:r>
+      <w:r>
+        <w:t xml:space="preserve"> </w:t>
+      </w:r>
+      <w:r>
+        <w:rPr>
+          <w:i/>
+          <w:iCs/>
+        </w:rPr>
+        <w:t xml:space="preserve">commit</w:t>
+      </w:r>
+      <w:r>
+        <w:t xml:space="preserve"> </w:t>
+      </w:r>
+      <w:r>
+        <w:t xml:space="preserve">its canvas in reading order, like an autoregressive model. We measure the center of mass of the canvas indices of the currently-committed positions at every denoising step (hot sampler, constrained-writing battery). Commitment is largely — but not entirely — left-to-right: the observed center of mass tracks a matched left-to-right filler closely, with a systematic early deviation toward later positions (clearest on the</w:t>
+      </w:r>
+      <w:r>
+        <w:t xml:space="preserve"> </w:t>
+      </w:r>
+      <w:r>
+        <w:rPr>
+          <w:rStyle w:val="VerbatimChar"/>
+        </w:rPr>
+        <w:t xml:space="preserve">ends_with</w:t>
+      </w:r>
+      <w:r>
+        <w:t xml:space="preserve"> </w:t>
+      </w:r>
+      <w:r>
+        <w:t xml:space="preserve">task, where the constrained</w:t>
+      </w:r>
+      <w:r>
+        <w:t xml:space="preserve"> </w:t>
+      </w:r>
+      <w:r>
+        <w:rPr>
+          <w:i/>
+          <w:iCs/>
+        </w:rPr>
+        <w:t xml:space="preserve">final</w:t>
+      </w:r>
+      <w:r>
+        <w:t xml:space="preserve"> </w:t>
+      </w:r>
+      <w:r>
+        <w:t xml:space="preserve">word commits first).</w:t>
+      </w:r>
+    </w:p>
+    <w:p>
+      <w:pPr>
+        <w:pStyle w:val="CaptionedFigure"/>
+      </w:pPr>
+      <w:r>
+        <w:drawing>
+          <wp:inline>
+            <wp:extent cx="5334000" cy="2200275"/>
+            <wp:effectExtent b="0" l="0" r="0" t="0"/>
+            <wp:docPr descr="Commitment causality" title="" id="88" name="Picture"/>
+            <a:graphic>
+              <a:graphicData uri="http://schemas.openxmlformats.org/drawingml/2006/picture">
+                <pic:pic>
+                  <pic:nvPicPr>
+                    <pic:cNvPr descr="figs/figA11_commit_causality.png" id="89" name="Picture"/>
+                    <pic:cNvPicPr>
+                      <a:picLocks noChangeArrowheads="1" noChangeAspect="1"/>
+                    </pic:cNvPicPr>
+                  </pic:nvPicPr>
+                  <pic:blipFill>
+                    <a:blip r:embed="rId87"/>
+                    <a:stretch>
+                      <a:fillRect/>
+                    </a:stretch>
+                  </pic:blipFill>
+                  <pic:spPr bwMode="auto">
+                    <a:xfrm>
+                      <a:off x="0" y="0"/>
+                      <a:ext cx="5334000" cy="2200275"/>
+                    </a:xfrm>
+                    <a:prstGeom prst="rect">
+                      <a:avLst/>
+                    </a:prstGeom>
+                    <a:noFill/>
+                    <a:ln w="9525">
+                      <a:noFill/>
+                      <a:headEnd/>
+                      <a:tailEnd/>
+                    </a:ln>
+                  </pic:spPr>
+                </pic:pic>
+              </a:graphicData>
+            </a:graphic>
+          </wp:inline>
+        </w:drawing>
+      </w:r>
+    </w:p>
+    <w:p>
+      <w:pPr>
+        <w:pStyle w:val="ImageCaption"/>
+      </w:pPr>
+      <w:r>
+        <w:t xml:space="preserve">Commitment causality</w:t>
+      </w:r>
+    </w:p>
+    <w:p>
+      <w:pPr>
+        <w:pStyle w:val="BodyText"/>
+      </w:pPr>
+      <w:r>
+        <w:rPr>
+          <w:b/>
+          <w:bCs/>
+          <w:i/>
+          <w:iCs/>
+        </w:rPr>
+        <w:t xml:space="preserve">Commitment order is mostly, but not strictly, left-to-right.</w:t>
+      </w:r>
+      <w:r>
+        <w:rPr>
+          <w:i/>
+          <w:iCs/>
+        </w:rPr>
+        <w:t xml:space="preserve"> </w:t>
+      </w:r>
+      <w:r>
+        <w:rPr>
+          <w:i/>
+          <w:iCs/>
+        </w:rPr>
+        <w:t xml:space="preserve">Per task type: center of mass of the committed canvas positions per denoising step (0 = left edge, 1 = right edge of the content span; faint = single rollouts, bold = mean). Dashed: a left-to-right filler committing the same number of positions per step — a purely causal order would sit on it; a holistic order would sit flat at 0.5. Observed curves start above the filler (early anchors on later positions) and merge with it as the canvas fills; under the default colder sampler the whole canvas commits by step ~3, leaving no order to read.</w:t>
+      </w:r>
+    </w:p>
+    <w:bookmarkEnd w:id="90"/>
+    <w:bookmarkEnd w:id="91"/>
+    <w:bookmarkEnd w:id="92"/>
     <w:sectPr>
       <w:footnotePr>
         <w:numRestart w:val="eachSect"/>

</xml_diff>

<commit_message>
Susceptibility: clarify the clamp acts on the canvas X^t, not S^t; italic markup fix; user's self-correction fold-in
Co-Authored-By: Claude Fable 5 <noreply@anthropic.com>
Claude-Session: https://claude.ai/code/session_01U8CiyQ7ySpBDkYEq4FzNBU
</commit_message>
<xml_diff>
--- a/post.docx
+++ b/post.docx
@@ -2,7 +2,7 @@
 <file path=word/document.xml><?xml version="1.0" encoding="utf-8"?>
 <w:document xmlns:w="http://schemas.openxmlformats.org/wordprocessingml/2006/main" xmlns:m="http://schemas.openxmlformats.org/officeDocument/2006/math" xmlns:r="http://schemas.openxmlformats.org/officeDocument/2006/relationships" xmlns:o="urn:schemas-microsoft-com:office:office" xmlns:v="urn:schemas-microsoft-com:vml" xmlns:w10="urn:schemas-microsoft-com:office:word" xmlns:a="http://schemas.openxmlformats.org/drawingml/2006/main" xmlns:pic="http://schemas.openxmlformats.org/drawingml/2006/picture" xmlns:wp="http://schemas.openxmlformats.org/drawingml/2006/wordprocessingDrawing">
   <w:body>
-    <w:bookmarkStart w:id="92" w:name="Xf5e660dc2e9c1a368125465a5756c31f66c44e2"/>
+    <w:bookmarkStart w:id="88" w:name="Xf5e660dc2e9c1a368125465a5756c31f66c44e2"/>
     <w:p>
       <w:pPr>
         <w:pStyle w:val="Heading1"/>
@@ -2910,7 +2910,7 @@
       </w:r>
     </w:p>
     <w:bookmarkEnd w:id="40"/>
-    <w:bookmarkStart w:id="91" w:name="appendix"/>
+    <w:bookmarkStart w:id="87" w:name="appendix"/>
     <w:p>
       <w:pPr>
         <w:pStyle w:val="Heading2"/>
@@ -5152,14 +5152,58 @@
         <w:t xml:space="preserve">onward (dotted onset, shaded) keeps the seasonal draft, which completes cleanly.</w:t>
       </w:r>
     </w:p>
+    <w:p>
+      <w:pPr>
+        <w:pStyle w:val="BodyText"/>
+      </w:pPr>
+      <w:r>
+        <w:t xml:space="preserve">Note that while it doesn’t require</w:t>
+      </w:r>
+      <w:r>
+        <w:t xml:space="preserve"> </w:t>
+      </w:r>
+      <m:oMath>
+        <m:sSup>
+          <m:e>
+            <m:r>
+              <m:rPr>
+                <m:sty m:val="b"/>
+              </m:rPr>
+              <m:t>s</m:t>
+            </m:r>
+          </m:e>
+          <m:sup>
+            <m:r>
+              <m:t>t</m:t>
+            </m:r>
+          </m:sup>
+        </m:sSup>
+      </m:oMath>
+      <w:r>
+        <w:t xml:space="preserve">, this is also an instance of</w:t>
+      </w:r>
+      <w:r>
+        <w:t xml:space="preserve"> </w:t>
+      </w:r>
+      <w:r>
+        <w:rPr>
+          <w:b/>
+          <w:bCs/>
+        </w:rPr>
+        <w:t xml:space="preserve">self-correction</w:t>
+      </w:r>
+      <w:r>
+        <w:t xml:space="preserve">. This has important consequences for monitorability which may not have been captured in Engels et al.’s analysis: a tool reading only the final diffusion output will miss transient output. A model may for instance choose to hide a specific fact in its chain-of-thought to a monitor, while having used it intermittently, though we did not find any instances of such behavior here.</w:t>
+      </w:r>
+    </w:p>
     <w:bookmarkEnd w:id="67"/>
-    <w:bookmarkStart w:id="71" w:name="self-correction"/>
+    <w:bookmarkStart w:id="78" w:name="is-the-cot-load-bearing-or-post-hoc"/>
     <w:p>
       <w:pPr>
         <w:pStyle w:val="Heading3"/>
       </w:pPr>
       <w:r>
-        <w:t xml:space="preserve">Self-correction</w:t>
+        <w:t xml:space="preserve">Is the CoT load-bearing or post-hoc?</w:t>
       </w:r>
     </w:p>
     <w:p>
@@ -5167,39 +5211,184 @@
         <w:pStyle w:val="FirstParagraph"/>
       </w:pPr>
       <w:r>
-        <w:t xml:space="preserve">[stub:] We next gave DG global writing constraints that cannot be satisfied greedily, and tracked an exact checker’s</w:t>
-      </w:r>
-      <w:r>
-        <w:t xml:space="preserve"> </w:t>
-      </w:r>
-      <w:r>
-        <w:rPr>
-          <w:i/>
-          <w:iCs/>
-        </w:rPr>
-        <w:t xml:space="preserve">violation margin</w:t>
-      </w:r>
-      <w:r>
-        <w:t xml:space="preserve"> </w:t>
-      </w:r>
-      <w:r>
-        <w:t xml:space="preserve">of the decoded canvas at every denoising step — here for the word-palindrome task under the hot sampler. The canvas transiently carries constraint-violating drafts and patches them steps later: the two escape runs (green) hold a violating draft for 7 steps before repairing it on-canvas. This is the same transition studied in the seasonal-vs-idiom section above — the violating mid-step draft</w:t>
-      </w:r>
-      <w:r>
-        <w:t xml:space="preserve"> </w:t>
-      </w:r>
-      <w:r>
-        <w:rPr>
-          <w:i/>
-          <w:iCs/>
-        </w:rPr>
-        <w:t xml:space="preserve">is</w:t>
-      </w:r>
-      <w:r>
-        <w:t xml:space="preserve"> </w:t>
-      </w:r>
-      <w:r>
-        <w:t xml:space="preserve">the seasonal phrase, and the patch lands on the idiom.</w:t>
+        <w:t xml:space="preserve">[stub:] With the answer forced onto the first line (answer-first framing), we measured for 20 problems: the</w:t>
+      </w:r>
+      <w:r>
+        <w:t xml:space="preserve"> </w:t>
+      </w:r>
+      <w:r>
+        <w:rPr>
+          <w:i/>
+          <w:iCs/>
+        </w:rPr>
+        <w:t xml:space="preserve">commitment time</w:t>
+      </w:r>
+      <w:r>
+        <w:t xml:space="preserve"> </w:t>
+      </w:r>
+      <w:r>
+        <w:t xml:space="preserve">(denoising step at which the answer slot freezes), the</w:t>
+      </w:r>
+      <w:r>
+        <w:t xml:space="preserve"> </w:t>
+      </w:r>
+      <w:r>
+        <w:rPr>
+          <w:i/>
+          <w:iCs/>
+        </w:rPr>
+        <w:t xml:space="preserve">susceptibility</w:t>
+      </w:r>
+      <w:r>
+        <w:t xml:space="preserve"> </w:t>
+      </w:r>
+      <m:oMath>
+        <m:r>
+          <m:t>S</m:t>
+        </m:r>
+      </m:oMath>
+      <w:r>
+        <w:t xml:space="preserve"> </w:t>
+      </w:r>
+      <w:r>
+        <w:t xml:space="preserve">(probability the answer changes when the CoT positions of the canvas</w:t>
+      </w:r>
+      <w:r>
+        <w:t xml:space="preserve"> </w:t>
+      </w:r>
+      <m:oMath>
+        <m:sSup>
+          <m:e>
+            <m:r>
+              <m:t>X</m:t>
+            </m:r>
+          </m:e>
+          <m:sup>
+            <m:r>
+              <m:t>t</m:t>
+            </m:r>
+          </m:sup>
+        </m:sSup>
+      </m:oMath>
+      <w:r>
+        <w:t xml:space="preserve"> </w:t>
+      </w:r>
+      <w:r>
+        <w:t xml:space="preserve">are clamped to a partially-randomized version at every step — an intervention on the visible tokens, not on</w:t>
+      </w:r>
+      <w:r>
+        <w:t xml:space="preserve"> </w:t>
+      </w:r>
+      <m:oMath>
+        <m:sSup>
+          <m:e>
+            <m:r>
+              <m:rPr>
+                <m:sty m:val="b"/>
+              </m:rPr>
+              <m:t>S</m:t>
+            </m:r>
+          </m:e>
+          <m:sup>
+            <m:r>
+              <m:t>t</m:t>
+            </m:r>
+          </m:sup>
+        </m:sSup>
+      </m:oMath>
+      <w:r>
+        <w:t xml:space="preserve">; the self-conditioning at clamped positions is zeroed), and a</w:t>
+      </w:r>
+      <w:r>
+        <w:t xml:space="preserve"> </w:t>
+      </w:r>
+      <w:r>
+        <w:rPr>
+          <w:i/>
+          <w:iCs/>
+        </w:rPr>
+        <w:t xml:space="preserve">blind difficulty</w:t>
+      </w:r>
+      <w:r>
+        <w:t xml:space="preserve"> </w:t>
+      </w:r>
+      <w:r>
+        <w:t xml:space="preserve">rating (three subagents shown only the problem text). Nominal difficulty is a weak proxy; the proximal predictor of a load-bearing CoT is the measured commitment time (</w:t>
+      </w:r>
+      <m:oMath>
+        <m:sSub>
+          <m:e>
+            <m:r>
+              <m:t>ρ</m:t>
+            </m:r>
+          </m:e>
+          <m:sub>
+            <m:r>
+              <m:t>S</m:t>
+            </m:r>
+          </m:sub>
+        </m:sSub>
+        <m:r>
+          <m:rPr>
+            <m:sty m:val="p"/>
+          </m:rPr>
+          <m:t>=</m:t>
+        </m:r>
+        <m:r>
+          <m:rPr>
+            <m:sty m:val="p"/>
+          </m:rPr>
+          <m:t>+</m:t>
+        </m:r>
+        <m:r>
+          <m:t>0.66</m:t>
+        </m:r>
+      </m:oMath>
+      <w:r>
+        <w:t xml:space="preserve">; sharpened to</w:t>
+      </w:r>
+      <w:r>
+        <w:t xml:space="preserve"> </w:t>
+      </w:r>
+      <m:oMath>
+        <m:r>
+          <m:rPr>
+            <m:sty m:val="p"/>
+          </m:rPr>
+          <m:t>+</m:t>
+        </m:r>
+        <m:r>
+          <m:t>0.80</m:t>
+        </m:r>
+      </m:oMath>
+      <w:r>
+        <w:t xml:space="preserve"> </w:t>
+      </w:r>
+      <w:r>
+        <w:t xml:space="preserve">pooled across a temperature sweep). CRT-style problems commit at step 0 with</w:t>
+      </w:r>
+      <w:r>
+        <w:t xml:space="preserve"> </w:t>
+      </w:r>
+      <m:oMath>
+        <m:r>
+          <m:t>S</m:t>
+        </m:r>
+        <m:r>
+          <m:rPr>
+            <m:sty m:val="p"/>
+          </m:rPr>
+          <m:t>=</m:t>
+        </m:r>
+        <m:r>
+          <m:t>0</m:t>
+        </m:r>
+      </m:oMath>
+      <w:r>
+        <w:t xml:space="preserve"> </w:t>
+      </w:r>
+      <w:r>
+        <w:t xml:space="preserve">(the CoT is post-hoc); serial counting problems commit late and break under corruption (the CoT is load-bearing).</w:t>
       </w:r>
     </w:p>
     <w:p>
@@ -5209,280 +5398,20 @@
       <w:r>
         <w:drawing>
           <wp:inline>
-            <wp:extent cx="5334000" cy="4012353"/>
+            <wp:extent cx="5334000" cy="1619249"/>
             <wp:effectExtent b="0" l="0" r="0" t="0"/>
-            <wp:docPr descr="Self-correction" title="" id="69" name="Picture"/>
+            <wp:docPr descr="Post-hoc correlations" title="" id="69" name="Picture"/>
             <a:graphic>
               <a:graphicData uri="http://schemas.openxmlformats.org/drawingml/2006/picture">
                 <pic:pic>
                   <pic:nvPicPr>
-                    <pic:cNvPr descr="figs/figA7_constraint_margins.png" id="70" name="Picture"/>
+                    <pic:cNvPr descr="figs/figA8_posthoc_correlations.png" id="70" name="Picture"/>
                     <pic:cNvPicPr>
                       <a:picLocks noChangeArrowheads="1" noChangeAspect="1"/>
                     </pic:cNvPicPr>
                   </pic:nvPicPr>
                   <pic:blipFill>
                     <a:blip r:embed="rId68"/>
-                    <a:stretch>
-                      <a:fillRect/>
-                    </a:stretch>
-                  </pic:blipFill>
-                  <pic:spPr bwMode="auto">
-                    <a:xfrm>
-                      <a:off x="0" y="0"/>
-                      <a:ext cx="5334000" cy="4012353"/>
-                    </a:xfrm>
-                    <a:prstGeom prst="rect">
-                      <a:avLst/>
-                    </a:prstGeom>
-                    <a:noFill/>
-                    <a:ln w="9525">
-                      <a:noFill/>
-                      <a:headEnd/>
-                      <a:tailEnd/>
-                    </a:ln>
-                  </pic:spPr>
-                </pic:pic>
-              </a:graphicData>
-            </a:graphic>
-          </wp:inline>
-        </w:drawing>
-      </w:r>
-    </w:p>
-    <w:p>
-      <w:pPr>
-        <w:pStyle w:val="ImageCaption"/>
-      </w:pPr>
-      <w:r>
-        <w:t xml:space="preserve">Self-correction</w:t>
-      </w:r>
-    </w:p>
-    <w:p>
-      <w:pPr>
-        <w:pStyle w:val="BodyText"/>
-      </w:pPr>
-      <w:r>
-        <w:rPr>
-          <w:b/>
-          <w:bCs/>
-          <w:i/>
-          <w:iCs/>
-        </w:rPr>
-        <w:t xml:space="preserve">DG transiently violates a global constraint on the canvas and patches it later.</w:t>
-      </w:r>
-      <w:r>
-        <w:rPr>
-          <w:i/>
-          <w:iCs/>
-        </w:rPr>
-        <w:t xml:space="preserve"> </w:t>
-      </w:r>
-      <w:r>
-        <w:rPr>
-          <w:i/>
-          <w:iCs/>
-        </w:rPr>
-        <w:t xml:space="preserve">Top: violation margin per rollout for the word-palindrome task (hot sampler; 0 = satisfied), on a linearly time-warped axis (</w:t>
-      </w:r>
-      <m:oMath>
-        <m:r>
-          <m:t>τ</m:t>
-        </m:r>
-        <m:r>
-          <m:rPr>
-            <m:sty m:val="p"/>
-          </m:rPr>
-          <m:t>=</m:t>
-        </m:r>
-        <m:r>
-          <m:t>t</m:t>
-        </m:r>
-      </m:oMath>
-      <w:r>
-        <w:rPr>
-          <w:i/>
-          <w:iCs/>
-        </w:rPr>
-        <w:t xml:space="preserve"> </w:t>
-      </w:r>
-      <w:r>
-        <w:rPr>
-          <w:i/>
-          <w:iCs/>
-        </w:rPr>
-        <w:t xml:space="preserve">/ the run’s last margin change). Green = escape (a ≥5-step violating spell, then satisfied). Bottom: three canvases of the flagship escape run — the mid-step draft is the constraint-violating seasonal phrase of the seasonal-vs-idiom section; the patch lands on the idiom.</w:t>
-      </w:r>
-    </w:p>
-    <w:bookmarkEnd w:id="71"/>
-    <w:bookmarkStart w:id="82" w:name="is-the-cot-load-bearing-or-post-hoc"/>
-    <w:p>
-      <w:pPr>
-        <w:pStyle w:val="Heading3"/>
-      </w:pPr>
-      <w:r>
-        <w:t xml:space="preserve">Is the CoT load-bearing or post-hoc?</w:t>
-      </w:r>
-    </w:p>
-    <w:p>
-      <w:pPr>
-        <w:pStyle w:val="FirstParagraph"/>
-      </w:pPr>
-      <w:r>
-        <w:t xml:space="preserve">[stub:] With the answer forced onto the first line (answer-first framing), we measured for 20 problems: the</w:t>
-      </w:r>
-      <w:r>
-        <w:t xml:space="preserve"> </w:t>
-      </w:r>
-      <w:r>
-        <w:rPr>
-          <w:i/>
-          <w:iCs/>
-        </w:rPr>
-        <w:t xml:space="preserve">commitment time</w:t>
-      </w:r>
-      <w:r>
-        <w:t xml:space="preserve"> </w:t>
-      </w:r>
-      <w:r>
-        <w:t xml:space="preserve">(denoising step at which the answer slot freezes), the</w:t>
-      </w:r>
-      <w:r>
-        <w:t xml:space="preserve"> </w:t>
-      </w:r>
-      <w:r>
-        <w:rPr>
-          <w:i/>
-          <w:iCs/>
-        </w:rPr>
-        <w:t xml:space="preserve">susceptibility</w:t>
-      </w:r>
-      <w:r>
-        <w:t xml:space="preserve"> </w:t>
-      </w:r>
-      <m:oMath>
-        <m:r>
-          <m:t>S</m:t>
-        </m:r>
-      </m:oMath>
-      <w:r>
-        <w:t xml:space="preserve"> </w:t>
-      </w:r>
-      <w:r>
-        <w:t xml:space="preserve">(probability the answer changes when the CoT positions are clamped to a partially-randomized version at every step), and a</w:t>
-      </w:r>
-      <w:r>
-        <w:t xml:space="preserve"> </w:t>
-      </w:r>
-      <w:r>
-        <w:rPr>
-          <w:i/>
-          <w:iCs/>
-        </w:rPr>
-        <w:t xml:space="preserve">blind difficulty</w:t>
-      </w:r>
-      <w:r>
-        <w:t xml:space="preserve"> </w:t>
-      </w:r>
-      <w:r>
-        <w:t xml:space="preserve">rating (three subagents shown only the problem text). Nominal difficulty is a weak proxy; the proximal predictor of a load-bearing CoT is the measured commitment time (</w:t>
-      </w:r>
-      <m:oMath>
-        <m:sSub>
-          <m:e>
-            <m:r>
-              <m:t>ρ</m:t>
-            </m:r>
-          </m:e>
-          <m:sub>
-            <m:r>
-              <m:t>S</m:t>
-            </m:r>
-          </m:sub>
-        </m:sSub>
-        <m:r>
-          <m:rPr>
-            <m:sty m:val="p"/>
-          </m:rPr>
-          <m:t>=</m:t>
-        </m:r>
-        <m:r>
-          <m:rPr>
-            <m:sty m:val="p"/>
-          </m:rPr>
-          <m:t>+</m:t>
-        </m:r>
-        <m:r>
-          <m:t>0.66</m:t>
-        </m:r>
-      </m:oMath>
-      <w:r>
-        <w:t xml:space="preserve">; sharpened to</w:t>
-      </w:r>
-      <w:r>
-        <w:t xml:space="preserve"> </w:t>
-      </w:r>
-      <m:oMath>
-        <m:r>
-          <m:rPr>
-            <m:sty m:val="p"/>
-          </m:rPr>
-          <m:t>+</m:t>
-        </m:r>
-        <m:r>
-          <m:t>0.80</m:t>
-        </m:r>
-      </m:oMath>
-      <w:r>
-        <w:t xml:space="preserve"> </w:t>
-      </w:r>
-      <w:r>
-        <w:t xml:space="preserve">pooled across a temperature sweep). CRT-style problems commit at step 0 with</w:t>
-      </w:r>
-      <w:r>
-        <w:t xml:space="preserve"> </w:t>
-      </w:r>
-      <m:oMath>
-        <m:r>
-          <m:t>S</m:t>
-        </m:r>
-        <m:r>
-          <m:rPr>
-            <m:sty m:val="p"/>
-          </m:rPr>
-          <m:t>=</m:t>
-        </m:r>
-        <m:r>
-          <m:t>0</m:t>
-        </m:r>
-      </m:oMath>
-      <w:r>
-        <w:t xml:space="preserve"> </w:t>
-      </w:r>
-      <w:r>
-        <w:t xml:space="preserve">(the CoT is post-hoc); serial counting problems commit late and break under corruption (the CoT is load-bearing).</w:t>
-      </w:r>
-    </w:p>
-    <w:p>
-      <w:pPr>
-        <w:pStyle w:val="CaptionedFigure"/>
-      </w:pPr>
-      <w:r>
-        <w:drawing>
-          <wp:inline>
-            <wp:extent cx="5334000" cy="1619249"/>
-            <wp:effectExtent b="0" l="0" r="0" t="0"/>
-            <wp:docPr descr="Post-hoc correlations" title="" id="73" name="Picture"/>
-            <a:graphic>
-              <a:graphicData uri="http://schemas.openxmlformats.org/drawingml/2006/picture">
-                <pic:pic>
-                  <pic:nvPicPr>
-                    <pic:cNvPr descr="figs/figA8_posthoc_correlations.png" id="74" name="Picture"/>
-                    <pic:cNvPicPr>
-                      <a:picLocks noChangeArrowheads="1" noChangeAspect="1"/>
-                    </pic:cNvPicPr>
-                  </pic:nvPicPr>
-                  <pic:blipFill>
-                    <a:blip r:embed="rId72"/>
                     <a:stretch>
                       <a:fillRect/>
                     </a:stretch>
@@ -5654,18 +5583,18 @@
           <wp:inline>
             <wp:extent cx="5334000" cy="1570566"/>
             <wp:effectExtent b="0" l="0" r="0" t="0"/>
-            <wp:docPr descr="Post-hoc case study" title="" id="76" name="Picture"/>
+            <wp:docPr descr="Post-hoc case study" title="" id="72" name="Picture"/>
             <a:graphic>
               <a:graphicData uri="http://schemas.openxmlformats.org/drawingml/2006/picture">
                 <pic:pic>
                   <pic:nvPicPr>
-                    <pic:cNvPr descr="figs/figA8b_posthoc_case.png" id="77" name="Picture"/>
+                    <pic:cNvPr descr="figs/figA8b_posthoc_case.png" id="73" name="Picture"/>
                     <pic:cNvPicPr>
                       <a:picLocks noChangeArrowheads="1" noChangeAspect="1"/>
                     </pic:cNvPicPr>
                   </pic:nvPicPr>
                   <pic:blipFill>
-                    <a:blip r:embed="rId75"/>
+                    <a:blip r:embed="rId71"/>
                     <a:stretch>
                       <a:fillRect/>
                     </a:stretch>
@@ -5725,7 +5654,59 @@
           <w:i/>
           <w:iCs/>
         </w:rPr>
-        <w:t xml:space="preserve">Left: clamping all 255 CoT positions to random tokens leaves the answer untouched (8,</w:t>
+        <w:t xml:space="preserve">Left: clamping all 255 CoT canvas positions (</w:t>
+      </w:r>
+      <m:oMath>
+        <m:sSup>
+          <m:e>
+            <m:r>
+              <m:t>X</m:t>
+            </m:r>
+          </m:e>
+          <m:sup>
+            <m:r>
+              <m:t>t</m:t>
+            </m:r>
+          </m:sup>
+        </m:sSup>
+      </m:oMath>
+      <w:r>
+        <w:rPr>
+          <w:i/>
+          <w:iCs/>
+        </w:rPr>
+        <w:t xml:space="preserve">, not</w:t>
+      </w:r>
+      <w:r>
+        <w:rPr>
+          <w:i/>
+          <w:iCs/>
+        </w:rPr>
+        <w:t xml:space="preserve"> </w:t>
+      </w:r>
+      <m:oMath>
+        <m:sSup>
+          <m:e>
+            <m:r>
+              <m:rPr>
+                <m:sty m:val="b"/>
+              </m:rPr>
+              <m:t>S</m:t>
+            </m:r>
+          </m:e>
+          <m:sup>
+            <m:r>
+              <m:t>t</m:t>
+            </m:r>
+          </m:sup>
+        </m:sSup>
+      </m:oMath>
+      <w:r>
+        <w:rPr>
+          <w:i/>
+          <w:iCs/>
+        </w:rPr>
+        <w:t xml:space="preserve">) to random tokens leaves the answer untouched (8,</w:t>
       </w:r>
       <w:r>
         <w:rPr>
@@ -5756,7 +5737,7 @@
         <w:t xml:space="preserve">). Right: clamping a coherent lure CoT with a single off-by-one error (red) flips the answer to 9 in 5/5 seeds. Caveat: a target sweep shows the lure does not install its specific conclusion — the coherent-but-wrong CoT dislodges the answer into a nearby basin rather than steering it.</w:t>
       </w:r>
     </w:p>
-    <w:bookmarkStart w:id="81" w:name="answer-resolution-over-denoising-steps"/>
+    <w:bookmarkStart w:id="77" w:name="answer-resolution-over-denoising-steps"/>
     <w:p>
       <w:pPr>
         <w:pStyle w:val="Heading4"/>
@@ -5782,18 +5763,18 @@
           <wp:inline>
             <wp:extent cx="5334000" cy="2125265"/>
             <wp:effectExtent b="0" l="0" r="0" t="0"/>
-            <wp:docPr descr="Answer resolution" title="" id="79" name="Picture"/>
+            <wp:docPr descr="Answer resolution" title="" id="75" name="Picture"/>
             <a:graphic>
               <a:graphicData uri="http://schemas.openxmlformats.org/drawingml/2006/picture">
                 <pic:pic>
                   <pic:nvPicPr>
-                    <pic:cNvPr descr="figs/figA9_resolution.png" id="80" name="Picture"/>
+                    <pic:cNvPr descr="figs/figA9_resolution.png" id="76" name="Picture"/>
                     <pic:cNvPicPr>
                       <a:picLocks noChangeArrowheads="1" noChangeAspect="1"/>
                     </pic:cNvPicPr>
                   </pic:nvPicPr>
                   <pic:blipFill>
-                    <a:blip r:embed="rId78"/>
+                    <a:blip r:embed="rId74"/>
                     <a:stretch>
                       <a:fillRect/>
                     </a:stretch>
@@ -5856,9 +5837,9 @@
         <w:t xml:space="preserve">Mean token entropy of the answer positions (solid) and CoT positions (dashed) per denoising step. Left: bat_ball and monty — the answer is confident by step 1 (0 flips) while the CoT is still at ~3–4 nats. Right: reverse_then_add and sq1000 — the answer stays hot until the CoT cools, passing through the annotated value sequences before settling.</w:t>
       </w:r>
     </w:p>
-    <w:bookmarkEnd w:id="81"/>
-    <w:bookmarkEnd w:id="82"/>
-    <w:bookmarkStart w:id="86" w:name="Xc88983d67b72bd3bbe7b5ed4c6ce8c17fda4537"/>
+    <w:bookmarkEnd w:id="77"/>
+    <w:bookmarkEnd w:id="78"/>
+    <w:bookmarkStart w:id="82" w:name="Xc88983d67b72bd3bbe7b5ed4c6ce8c17fda4537"/>
     <w:p>
       <w:pPr>
         <w:pStyle w:val="Heading3"/>
@@ -5925,18 +5906,18 @@
           <wp:inline>
             <wp:extent cx="5334000" cy="2117911"/>
             <wp:effectExtent b="0" l="0" r="0" t="0"/>
-            <wp:docPr descr="Self-repair clock" title="" id="84" name="Picture"/>
+            <wp:docPr descr="Self-repair clock" title="" id="80" name="Picture"/>
             <a:graphic>
               <a:graphicData uri="http://schemas.openxmlformats.org/drawingml/2006/picture">
                 <pic:pic>
                   <pic:nvPicPr>
-                    <pic:cNvPr descr="figs/figA10_selfrepair_clock.png" id="85" name="Picture"/>
+                    <pic:cNvPr descr="figs/figA10_selfrepair_clock.png" id="81" name="Picture"/>
                     <pic:cNvPicPr>
                       <a:picLocks noChangeArrowheads="1" noChangeAspect="1"/>
                     </pic:cNvPicPr>
                   </pic:nvPicPr>
                   <pic:blipFill>
-                    <a:blip r:embed="rId83"/>
+                    <a:blip r:embed="rId79"/>
                     <a:stretch>
                       <a:fillRect/>
                     </a:stretch>
@@ -5999,8 +5980,8 @@
         <w:t xml:space="preserve">Left: the first-line answer over denoising steps in natural cold runs (three seeds) — 12/18 appear transiently, all settle at 16. Right: a harvested wrong-18 state planted at varying steps and re-denoised: cold recipients stay stuck at every depth; very-hot recipients escape to 16 only when planted before ~step 48 of 128.</w:t>
       </w:r>
     </w:p>
-    <w:bookmarkEnd w:id="86"/>
-    <w:bookmarkStart w:id="90" w:name="how-causal-is-dgs-generation"/>
+    <w:bookmarkEnd w:id="82"/>
+    <w:bookmarkStart w:id="86" w:name="how-causal-is-dgs-generation"/>
     <w:p>
       <w:pPr>
         <w:pStyle w:val="Heading3"/>
@@ -6073,18 +6054,18 @@
           <wp:inline>
             <wp:extent cx="5334000" cy="2200275"/>
             <wp:effectExtent b="0" l="0" r="0" t="0"/>
-            <wp:docPr descr="Commitment causality" title="" id="88" name="Picture"/>
+            <wp:docPr descr="Commitment causality" title="" id="84" name="Picture"/>
             <a:graphic>
               <a:graphicData uri="http://schemas.openxmlformats.org/drawingml/2006/picture">
                 <pic:pic>
                   <pic:nvPicPr>
-                    <pic:cNvPr descr="figs/figA11_commit_causality.png" id="89" name="Picture"/>
+                    <pic:cNvPr descr="figs/figA11_commit_causality.png" id="85" name="Picture"/>
                     <pic:cNvPicPr>
                       <a:picLocks noChangeArrowheads="1" noChangeAspect="1"/>
                     </pic:cNvPicPr>
                   </pic:nvPicPr>
                   <pic:blipFill>
-                    <a:blip r:embed="rId87"/>
+                    <a:blip r:embed="rId83"/>
                     <a:stretch>
                       <a:fillRect/>
                     </a:stretch>
@@ -6147,9 +6128,9 @@
         <w:t xml:space="preserve">Per task type: center of mass of the committed canvas positions per denoising step (0 = left edge, 1 = right edge of the content span; faint = single rollouts, bold = mean). Dashed: a left-to-right filler committing the same number of positions per step — a purely causal order would sit on it; a holistic order would sit flat at 0.5. Observed curves start above the filler (early anchors on later positions) and merge with it as the canvas fills; under the default colder sampler the whole canvas commits by step ~3, leaving no order to read.</w:t>
       </w:r>
     </w:p>
-    <w:bookmarkEnd w:id="90"/>
-    <w:bookmarkEnd w:id="91"/>
-    <w:bookmarkEnd w:id="92"/>
+    <w:bookmarkEnd w:id="86"/>
+    <w:bookmarkEnd w:id="87"/>
+    <w:bookmarkEnd w:id="88"/>
     <w:sectPr>
       <w:footnotePr>
         <w:numRestart w:val="eachSect"/>

</xml_diff>

<commit_message>
Causality: replace CoM with commit-order diagram; ends_with anticausal stage (end-anchor then middle-backfill)
Co-Authored-By: Claude Fable 5 <noreply@anthropic.com>
Claude-Session: https://claude.ai/code/session_01U8CiyQ7ySpBDkYEq4FzNBU
</commit_message>
<xml_diff>
--- a/post.docx
+++ b/post.docx
@@ -6011,7 +6011,110 @@
         <w:t xml:space="preserve"> </w:t>
       </w:r>
       <w:r>
-        <w:t xml:space="preserve">its canvas in reading order, like an autoregressive model. We measure the center of mass of the canvas indices of the currently-committed positions at every denoising step (hot sampler, constrained-writing battery). Commitment is largely — but not entirely — left-to-right: the observed center of mass tracks a matched left-to-right filler closely, with a systematic early deviation toward later positions (clearest on the</w:t>
+        <w:t xml:space="preserve">its canvas in reading order, like an autoregressive model. We order each run’s content positions by the step at which they finally commit, and plot canvas position against commit rank — a strictly left-to-right (AR-like) order is the diagonal. Commitment is largely causal (median</w:t>
+      </w:r>
+      <w:r>
+        <w:t xml:space="preserve"> </w:t>
+      </w:r>
+      <m:oMath>
+        <m:sSub>
+          <m:e>
+            <m:r>
+              <m:t>ρ</m:t>
+            </m:r>
+          </m:e>
+          <m:sub>
+            <m:r>
+              <m:rPr>
+                <m:sty m:val="p"/>
+              </m:rPr>
+              <m:t>c</m:t>
+            </m:r>
+            <m:r>
+              <m:rPr>
+                <m:sty m:val="p"/>
+              </m:rPr>
+              <m:t>h</m:t>
+            </m:r>
+            <m:r>
+              <m:rPr>
+                <m:sty m:val="p"/>
+              </m:rPr>
+              <m:t>a</m:t>
+            </m:r>
+            <m:r>
+              <m:rPr>
+                <m:sty m:val="p"/>
+              </m:rPr>
+              <m:t>i</m:t>
+            </m:r>
+            <m:r>
+              <m:rPr>
+                <m:sty m:val="p"/>
+              </m:rPr>
+              <m:t>n</m:t>
+            </m:r>
+          </m:sub>
+        </m:sSub>
+      </m:oMath>
+      <w:r>
+        <w:t xml:space="preserve"> </w:t>
+      </w:r>
+      <w:r>
+        <w:t xml:space="preserve">between</w:t>
+      </w:r>
+      <w:r>
+        <w:t xml:space="preserve"> </w:t>
+      </w:r>
+      <m:oMath>
+        <m:r>
+          <m:rPr>
+            <m:sty m:val="p"/>
+          </m:rPr>
+          <m:t>+</m:t>
+        </m:r>
+        <m:r>
+          <m:t>0.57</m:t>
+        </m:r>
+      </m:oMath>
+      <w:r>
+        <w:t xml:space="preserve"> </w:t>
+      </w:r>
+      <w:r>
+        <w:t xml:space="preserve">and</w:t>
+      </w:r>
+      <w:r>
+        <w:t xml:space="preserve"> </w:t>
+      </w:r>
+      <m:oMath>
+        <m:r>
+          <m:rPr>
+            <m:sty m:val="p"/>
+          </m:rPr>
+          <m:t>+</m:t>
+        </m:r>
+        <m:r>
+          <m:t>0.86</m:t>
+        </m:r>
+      </m:oMath>
+      <w:r>
+        <w:t xml:space="preserve"> </w:t>
+      </w:r>
+      <w:r>
+        <w:t xml:space="preserve">across tasks), but with reproducible</w:t>
+      </w:r>
+      <w:r>
+        <w:t xml:space="preserve"> </w:t>
+      </w:r>
+      <w:r>
+        <w:rPr>
+          <w:i/>
+          <w:iCs/>
+        </w:rPr>
+        <w:t xml:space="preserve">anticausal stages</w:t>
+      </w:r>
+      <w:r>
+        <w:t xml:space="preserve">: on</w:t>
       </w:r>
       <w:r>
         <w:t xml:space="preserve"> </w:t>
@@ -6026,23 +6129,7 @@
         <w:t xml:space="preserve"> </w:t>
       </w:r>
       <w:r>
-        <w:t xml:space="preserve">task, where the constrained</w:t>
-      </w:r>
-      <w:r>
-        <w:t xml:space="preserve"> </w:t>
-      </w:r>
-      <w:r>
-        <w:rPr>
-          <w:i/>
-          <w:iCs/>
-        </w:rPr>
-        <w:t xml:space="preserve">final</w:t>
-      </w:r>
-      <w:r>
-        <w:t xml:space="preserve"> </w:t>
-      </w:r>
-      <w:r>
-        <w:t xml:space="preserve">word commits first).</w:t>
+        <w:t xml:space="preserve">the anchored final word commits early and the middle of the sentence is filled in last (the terminal plunge of the mean curve), and on every task the left edge of the canvas is back-filled only after the first words have committed.</w:t>
       </w:r>
     </w:p>
     <w:p>
@@ -6125,7 +6212,117 @@
           <w:i/>
           <w:iCs/>
         </w:rPr>
-        <w:t xml:space="preserve">Per task type: center of mass of the committed canvas positions per denoising step (0 = left edge, 1 = right edge of the content span; faint = single rollouts, bold = mean). Dashed: a left-to-right filler committing the same number of positions per step — a purely causal order would sit on it; a holistic order would sit flat at 0.5. Observed curves start above the filler (early anchors on later positions) and merge with it as the canvas fills; under the default colder sampler the whole canvas commits by step ~3, leaving no order to read.</w:t>
+        <w:t xml:space="preserve">Per task: normalized canvas position of the</w:t>
+      </w:r>
+      <w:r>
+        <w:rPr>
+          <w:i/>
+          <w:iCs/>
+        </w:rPr>
+        <w:t xml:space="preserve"> </w:t>
+      </w:r>
+      <m:oMath>
+        <m:r>
+          <m:t>k</m:t>
+        </m:r>
+      </m:oMath>
+      <w:r>
+        <w:rPr>
+          <w:i/>
+          <w:iCs/>
+        </w:rPr>
+        <w:t xml:space="preserve">-th finally-committed content position vs commit rank (faint = single rollouts, bold = mean; dashed diagonal = strictly left-to-right;</w:t>
+      </w:r>
+      <w:r>
+        <w:rPr>
+          <w:i/>
+          <w:iCs/>
+        </w:rPr>
+        <w:t xml:space="preserve"> </w:t>
+      </w:r>
+      <m:oMath>
+        <m:sSub>
+          <m:e>
+            <m:r>
+              <m:t>ρ</m:t>
+            </m:r>
+          </m:e>
+          <m:sub>
+            <m:r>
+              <m:rPr>
+                <m:sty m:val="p"/>
+              </m:rPr>
+              <m:t>c</m:t>
+            </m:r>
+            <m:r>
+              <m:rPr>
+                <m:sty m:val="p"/>
+              </m:rPr>
+              <m:t>h</m:t>
+            </m:r>
+            <m:r>
+              <m:rPr>
+                <m:sty m:val="p"/>
+              </m:rPr>
+              <m:t>a</m:t>
+            </m:r>
+            <m:r>
+              <m:rPr>
+                <m:sty m:val="p"/>
+              </m:rPr>
+              <m:t>i</m:t>
+            </m:r>
+            <m:r>
+              <m:rPr>
+                <m:sty m:val="p"/>
+              </m:rPr>
+              <m:t>n</m:t>
+            </m:r>
+          </m:sub>
+        </m:sSub>
+      </m:oMath>
+      <w:r>
+        <w:rPr>
+          <w:i/>
+          <w:iCs/>
+        </w:rPr>
+        <w:t xml:space="preserve"> </w:t>
+      </w:r>
+      <w:r>
+        <w:rPr>
+          <w:i/>
+          <w:iCs/>
+        </w:rPr>
+        <w:t xml:space="preserve">= median Spearman correlation between commit step and position). Anticausal stages show as descending segments:</w:t>
+      </w:r>
+      <w:r>
+        <w:rPr>
+          <w:i/>
+          <w:iCs/>
+        </w:rPr>
+        <w:t xml:space="preserve"> </w:t>
+      </w:r>
+      <w:r>
+        <w:rPr>
+          <w:rStyle w:val="VerbatimChar"/>
+          <w:i/>
+          <w:iCs/>
+        </w:rPr>
+        <w:t xml:space="preserve">ends_with</w:t>
+      </w:r>
+      <w:r>
+        <w:rPr>
+          <w:i/>
+          <w:iCs/>
+        </w:rPr>
+        <w:t xml:space="preserve"> </w:t>
+      </w:r>
+      <w:r>
+        <w:rPr>
+          <w:i/>
+          <w:iCs/>
+        </w:rPr>
+        <w:t xml:space="preserve">commits its anchored final word before back-filling the middle, and all tasks back-fill the left edge at rank ~0.2. Hot sampler; the default colder sampler commits the whole canvas by step ~3, leaving no order to read.</w:t>
       </w:r>
     </w:p>
     <w:bookmarkEnd w:id="86"/>

</xml_diff>

<commit_message>
reverse_chain anticausality: solving runs lock digits back-to-front (rho −0.89..−0.97 at d4/d5)
Co-Authored-By: Claude Fable 5 <noreply@anthropic.com>
Claude-Session: https://claude.ai/code/session_01U8CiyQ7ySpBDkYEq4FzNBU
</commit_message>
<xml_diff>
--- a/post.docx
+++ b/post.docx
@@ -2,7 +2,7 @@
 <file path=word/document.xml><?xml version="1.0" encoding="utf-8"?>
 <w:document xmlns:w="http://schemas.openxmlformats.org/wordprocessingml/2006/main" xmlns:m="http://schemas.openxmlformats.org/officeDocument/2006/math" xmlns:r="http://schemas.openxmlformats.org/officeDocument/2006/relationships" xmlns:o="urn:schemas-microsoft-com:office:office" xmlns:v="urn:schemas-microsoft-com:vml" xmlns:w10="urn:schemas-microsoft-com:office:word" xmlns:a="http://schemas.openxmlformats.org/drawingml/2006/main" xmlns:pic="http://schemas.openxmlformats.org/drawingml/2006/picture" xmlns:wp="http://schemas.openxmlformats.org/drawingml/2006/wordprocessingDrawing">
   <w:body>
-    <w:bookmarkStart w:id="88" w:name="Xf5e660dc2e9c1a368125465a5756c31f66c44e2"/>
+    <w:bookmarkStart w:id="91" w:name="Xf5e660dc2e9c1a368125465a5756c31f66c44e2"/>
     <w:p>
       <w:pPr>
         <w:pStyle w:val="Heading1"/>
@@ -2910,7 +2910,7 @@
       </w:r>
     </w:p>
     <w:bookmarkEnd w:id="40"/>
-    <w:bookmarkStart w:id="87" w:name="appendix"/>
+    <w:bookmarkStart w:id="90" w:name="appendix"/>
     <w:p>
       <w:pPr>
         <w:pStyle w:val="Heading2"/>
@@ -5981,7 +5981,7 @@
       </w:r>
     </w:p>
     <w:bookmarkEnd w:id="82"/>
-    <w:bookmarkStart w:id="86" w:name="how-causal-is-dgs-generation"/>
+    <w:bookmarkStart w:id="89" w:name="how-causal-is-dgs-generation"/>
     <w:p>
       <w:pPr>
         <w:pStyle w:val="Heading3"/>
@@ -6325,9 +6325,425 @@
         <w:t xml:space="preserve">commits its anchored final word before back-filling the middle, and all tasks back-fill the left edge at rank ~0.2. Hot sampler; the default colder sampler commits the whole canvas by step ~3, leaving no order to read.</w:t>
       </w:r>
     </w:p>
-    <w:bookmarkEnd w:id="86"/>
-    <w:bookmarkEnd w:id="87"/>
-    <w:bookmarkEnd w:id="88"/>
+    <w:p>
+      <w:pPr>
+        <w:pStyle w:val="BodyText"/>
+      </w:pPr>
+      <w:r>
+        <w:t xml:space="preserve">[stub:] The constrained-writing tasks give the model little</w:t>
+      </w:r>
+      <w:r>
+        <w:t xml:space="preserve"> </w:t>
+      </w:r>
+      <w:r>
+        <w:rPr>
+          <w:i/>
+          <w:iCs/>
+        </w:rPr>
+        <w:t xml:space="preserve">reason</w:t>
+      </w:r>
+      <w:r>
+        <w:t xml:space="preserve"> </w:t>
+      </w:r>
+      <w:r>
+        <w:t xml:space="preserve">to commit anticausally. The</w:t>
+      </w:r>
+      <w:r>
+        <w:t xml:space="preserve"> </w:t>
+      </w:r>
+      <w:r>
+        <w:rPr>
+          <w:rStyle w:val="VerbatimChar"/>
+        </w:rPr>
+        <w:t xml:space="preserve">reverse_chain</w:t>
+      </w:r>
+      <w:r>
+        <w:t xml:space="preserve"> </w:t>
+      </w:r>
+      <w:r>
+        <w:t xml:space="preserve">probe task (from our replication battery around</w:t>
+      </w:r>
+      <w:r>
+        <w:t xml:space="preserve"> </w:t>
+      </w:r>
+      <w:hyperlink r:id="rId24">
+        <w:r>
+          <w:rPr>
+            <w:rStyle w:val="Hyperlink"/>
+          </w:rPr>
+          <w:t xml:space="preserve">Engels et al.</w:t>
+        </w:r>
+      </w:hyperlink>
+      <w:r>
+        <w:t xml:space="preserve">) does: a digit chain obeys</w:t>
+      </w:r>
+      <w:r>
+        <w:t xml:space="preserve"> </w:t>
+      </w:r>
+      <m:oMath>
+        <m:sSup>
+          <m:e>
+            <m:r>
+              <m:t>x</m:t>
+            </m:r>
+          </m:e>
+          <m:sup>
+            <m:d>
+              <m:dPr>
+                <m:begChr m:val="("/>
+                <m:sepChr m:val=""/>
+                <m:endChr m:val=")"/>
+                <m:grow/>
+              </m:dPr>
+              <m:e>
+                <m:r>
+                  <m:t>k</m:t>
+                </m:r>
+                <m:r>
+                  <m:rPr>
+                    <m:sty m:val="p"/>
+                  </m:rPr>
+                  <m:t>+</m:t>
+                </m:r>
+                <m:r>
+                  <m:t>1</m:t>
+                </m:r>
+              </m:e>
+            </m:d>
+          </m:sup>
+        </m:sSup>
+        <m:r>
+          <m:rPr>
+            <m:sty m:val="p"/>
+          </m:rPr>
+          <m:t>=</m:t>
+        </m:r>
+        <m:r>
+          <m:t>f</m:t>
+        </m:r>
+        <m:d>
+          <m:dPr>
+            <m:begChr m:val="("/>
+            <m:sepChr m:val=""/>
+            <m:endChr m:val=")"/>
+            <m:grow/>
+          </m:dPr>
+          <m:e>
+            <m:sSup>
+              <m:e>
+                <m:r>
+                  <m:t>x</m:t>
+                </m:r>
+              </m:e>
+              <m:sup>
+                <m:d>
+                  <m:dPr>
+                    <m:begChr m:val="("/>
+                    <m:sepChr m:val=""/>
+                    <m:endChr m:val=")"/>
+                    <m:grow/>
+                  </m:dPr>
+                  <m:e>
+                    <m:r>
+                      <m:t>k</m:t>
+                    </m:r>
+                  </m:e>
+                </m:d>
+              </m:sup>
+            </m:sSup>
+          </m:e>
+        </m:d>
+      </m:oMath>
+      <w:r>
+        <w:t xml:space="preserve"> </w:t>
+      </w:r>
+      <w:r>
+        <w:t xml:space="preserve">under a given lookup table, the</w:t>
+      </w:r>
+      <w:r>
+        <w:t xml:space="preserve"> </w:t>
+      </w:r>
+      <w:r>
+        <w:rPr>
+          <w:i/>
+          <w:iCs/>
+        </w:rPr>
+        <w:t xml:space="preserve">last</w:t>
+      </w:r>
+      <w:r>
+        <w:t xml:space="preserve"> </w:t>
+      </w:r>
+      <w:r>
+        <w:t xml:space="preserve">element is given, and the answer must be written in forward order — the dependency runs right-to-left, so a causal single-pass generator must emit the deepest-dependency value first (budget-matched autoregressive Gemma stays below 0.25 at depth 3). When DG solves the task beyond trivial depth, its commitment literally runs backward: all correct depth-4/5 runs lock the digits back-to-front (</w:t>
+      </w:r>
+      <m:oMath>
+        <m:sSub>
+          <m:e>
+            <m:r>
+              <m:t>ρ</m:t>
+            </m:r>
+          </m:e>
+          <m:sub>
+            <m:r>
+              <m:rPr>
+                <m:sty m:val="p"/>
+              </m:rPr>
+              <m:t>c</m:t>
+            </m:r>
+            <m:r>
+              <m:rPr>
+                <m:sty m:val="p"/>
+              </m:rPr>
+              <m:t>h</m:t>
+            </m:r>
+            <m:r>
+              <m:rPr>
+                <m:sty m:val="p"/>
+              </m:rPr>
+              <m:t>a</m:t>
+            </m:r>
+            <m:r>
+              <m:rPr>
+                <m:sty m:val="p"/>
+              </m:rPr>
+              <m:t>i</m:t>
+            </m:r>
+            <m:r>
+              <m:rPr>
+                <m:sty m:val="p"/>
+              </m:rPr>
+              <m:t>n</m:t>
+            </m:r>
+          </m:sub>
+        </m:sSub>
+        <m:r>
+          <m:rPr>
+            <m:sty m:val="p"/>
+          </m:rPr>
+          <m:t>∈</m:t>
+        </m:r>
+        <m:d>
+          <m:dPr>
+            <m:begChr m:val="["/>
+            <m:sepChr m:val=""/>
+            <m:endChr m:val="]"/>
+            <m:grow/>
+          </m:dPr>
+          <m:e>
+            <m:r>
+              <m:rPr>
+                <m:sty m:val="p"/>
+              </m:rPr>
+              <m:t>−</m:t>
+            </m:r>
+            <m:r>
+              <m:t>0.97</m:t>
+            </m:r>
+            <m:r>
+              <m:rPr>
+                <m:sty m:val="p"/>
+              </m:rPr>
+              <m:t>,</m:t>
+            </m:r>
+            <m:r>
+              <m:rPr>
+                <m:sty m:val="p"/>
+              </m:rPr>
+              <m:t>−</m:t>
+            </m:r>
+            <m:r>
+              <m:t>0.89</m:t>
+            </m:r>
+          </m:e>
+        </m:d>
+      </m:oMath>
+      <w:r>
+        <w:t xml:space="preserve">), while failing runs fill forward.</w:t>
+      </w:r>
+    </w:p>
+    <w:p>
+      <w:pPr>
+        <w:pStyle w:val="CaptionedFigure"/>
+      </w:pPr>
+      <w:r>
+        <w:drawing>
+          <wp:inline>
+            <wp:extent cx="5334000" cy="2117911"/>
+            <wp:effectExtent b="0" l="0" r="0" t="0"/>
+            <wp:docPr descr="Reverse chain anticausality" title="" id="87" name="Picture"/>
+            <a:graphic>
+              <a:graphicData uri="http://schemas.openxmlformats.org/drawingml/2006/picture">
+                <pic:pic>
+                  <pic:nvPicPr>
+                    <pic:cNvPr descr="figs/figA12_reverse_chain.png" id="88" name="Picture"/>
+                    <pic:cNvPicPr>
+                      <a:picLocks noChangeArrowheads="1" noChangeAspect="1"/>
+                    </pic:cNvPicPr>
+                  </pic:nvPicPr>
+                  <pic:blipFill>
+                    <a:blip r:embed="rId86"/>
+                    <a:stretch>
+                      <a:fillRect/>
+                    </a:stretch>
+                  </pic:blipFill>
+                  <pic:spPr bwMode="auto">
+                    <a:xfrm>
+                      <a:off x="0" y="0"/>
+                      <a:ext cx="5334000" cy="2117911"/>
+                    </a:xfrm>
+                    <a:prstGeom prst="rect">
+                      <a:avLst/>
+                    </a:prstGeom>
+                    <a:noFill/>
+                    <a:ln w="9525">
+                      <a:noFill/>
+                      <a:headEnd/>
+                      <a:tailEnd/>
+                    </a:ln>
+                  </pic:spPr>
+                </pic:pic>
+              </a:graphicData>
+            </a:graphic>
+          </wp:inline>
+        </w:drawing>
+      </w:r>
+    </w:p>
+    <w:p>
+      <w:pPr>
+        <w:pStyle w:val="ImageCaption"/>
+      </w:pPr>
+      <w:r>
+        <w:t xml:space="preserve">Reverse chain anticausality</w:t>
+      </w:r>
+    </w:p>
+    <w:p>
+      <w:pPr>
+        <w:pStyle w:val="BodyText"/>
+      </w:pPr>
+      <w:r>
+        <w:rPr>
+          <w:b/>
+          <w:bCs/>
+          <w:i/>
+          <w:iCs/>
+        </w:rPr>
+        <w:t xml:space="preserve">On an end-anchored chain, solving runs commit backward.</w:t>
+      </w:r>
+      <w:r>
+        <w:rPr>
+          <w:i/>
+          <w:iCs/>
+        </w:rPr>
+        <w:t xml:space="preserve"> </w:t>
+      </w:r>
+      <w:r>
+        <w:rPr>
+          <w:i/>
+          <w:iCs/>
+        </w:rPr>
+        <w:t xml:space="preserve">Left: lock-in time of each chain element (depths 4–5; bold = class mean) — correct runs (green) lock the anchored end first and</w:t>
+      </w:r>
+      <w:r>
+        <w:rPr>
+          <w:i/>
+          <w:iCs/>
+        </w:rPr>
+        <w:t xml:space="preserve"> </w:t>
+      </w:r>
+      <m:oMath>
+        <m:sSub>
+          <m:e>
+            <m:r>
+              <m:t>x</m:t>
+            </m:r>
+          </m:e>
+          <m:sub>
+            <m:r>
+              <m:t>1</m:t>
+            </m:r>
+          </m:sub>
+        </m:sSub>
+      </m:oMath>
+      <w:r>
+        <w:rPr>
+          <w:i/>
+          <w:iCs/>
+        </w:rPr>
+        <w:t xml:space="preserve"> </w:t>
+      </w:r>
+      <w:r>
+        <w:rPr>
+          <w:i/>
+          <w:iCs/>
+        </w:rPr>
+        <w:t xml:space="preserve">last; failing runs (grey) fill forward. Right:</w:t>
+      </w:r>
+      <w:r>
+        <w:rPr>
+          <w:i/>
+          <w:iCs/>
+        </w:rPr>
+        <w:t xml:space="preserve"> </w:t>
+      </w:r>
+      <m:oMath>
+        <m:sSub>
+          <m:e>
+            <m:r>
+              <m:t>ρ</m:t>
+            </m:r>
+          </m:e>
+          <m:sub>
+            <m:r>
+              <m:rPr>
+                <m:sty m:val="p"/>
+              </m:rPr>
+              <m:t>c</m:t>
+            </m:r>
+            <m:r>
+              <m:rPr>
+                <m:sty m:val="p"/>
+              </m:rPr>
+              <m:t>h</m:t>
+            </m:r>
+            <m:r>
+              <m:rPr>
+                <m:sty m:val="p"/>
+              </m:rPr>
+              <m:t>a</m:t>
+            </m:r>
+            <m:r>
+              <m:rPr>
+                <m:sty m:val="p"/>
+              </m:rPr>
+              <m:t>i</m:t>
+            </m:r>
+            <m:r>
+              <m:rPr>
+                <m:sty m:val="p"/>
+              </m:rPr>
+              <m:t>n</m:t>
+            </m:r>
+          </m:sub>
+        </m:sSub>
+      </m:oMath>
+      <w:r>
+        <w:rPr>
+          <w:i/>
+          <w:iCs/>
+        </w:rPr>
+        <w:t xml:space="preserve"> </w:t>
+      </w:r>
+      <w:r>
+        <w:rPr>
+          <w:i/>
+          <w:iCs/>
+        </w:rPr>
+        <w:t xml:space="preserve">per depth, split by correctness — trivial depth 3 is solved forward, depths 4–5 only backward, and beyond depth ~6 the backward strategy stops producing correct answers. Commitment here is proxied by argmax lock-in (the films carry no accept-mask).</w:t>
+      </w:r>
+    </w:p>
+    <w:bookmarkEnd w:id="89"/>
+    <w:bookmarkEnd w:id="90"/>
+    <w:bookmarkEnd w:id="91"/>
     <w:sectPr>
       <w:footnotePr>
         <w:numRestart w:val="eachSect"/>

</xml_diff>

<commit_message>
Merge causality figures: 2x4 grid, benchmark tasks (top) vs idiosyncratic (bottom) with reverse_chain correct/wrong panel
Co-Authored-By: Claude Fable 5 <noreply@anthropic.com>
Claude-Session: https://claude.ai/code/session_01U8CiyQ7ySpBDkYEq4FzNBU
</commit_message>
<xml_diff>
--- a/post.docx
+++ b/post.docx
@@ -2,7 +2,7 @@
 <file path=word/document.xml><?xml version="1.0" encoding="utf-8"?>
 <w:document xmlns:w="http://schemas.openxmlformats.org/wordprocessingml/2006/main" xmlns:m="http://schemas.openxmlformats.org/officeDocument/2006/math" xmlns:r="http://schemas.openxmlformats.org/officeDocument/2006/relationships" xmlns:o="urn:schemas-microsoft-com:office:office" xmlns:v="urn:schemas-microsoft-com:vml" xmlns:w10="urn:schemas-microsoft-com:office:word" xmlns:a="http://schemas.openxmlformats.org/drawingml/2006/main" xmlns:pic="http://schemas.openxmlformats.org/drawingml/2006/picture" xmlns:wp="http://schemas.openxmlformats.org/drawingml/2006/wordprocessingDrawing">
   <w:body>
-    <w:bookmarkStart w:id="91" w:name="Xf5e660dc2e9c1a368125465a5756c31f66c44e2"/>
+    <w:bookmarkStart w:id="88" w:name="Xf5e660dc2e9c1a368125465a5756c31f66c44e2"/>
     <w:p>
       <w:pPr>
         <w:pStyle w:val="Heading1"/>
@@ -2910,7 +2910,7 @@
       </w:r>
     </w:p>
     <w:bookmarkEnd w:id="40"/>
-    <w:bookmarkStart w:id="90" w:name="appendix"/>
+    <w:bookmarkStart w:id="87" w:name="appendix"/>
     <w:p>
       <w:pPr>
         <w:pStyle w:val="Heading2"/>
@@ -5981,7 +5981,7 @@
       </w:r>
     </w:p>
     <w:bookmarkEnd w:id="82"/>
-    <w:bookmarkStart w:id="89" w:name="how-causal-is-dgs-generation"/>
+    <w:bookmarkStart w:id="86" w:name="how-causal-is-dgs-generation"/>
     <w:p>
       <w:pPr>
         <w:pStyle w:val="Heading3"/>
@@ -6130,6 +6130,242 @@
       </w:r>
       <w:r>
         <w:t xml:space="preserve">the anchored final word commits early and the middle of the sentence is filled in last (the terminal plunge of the mean curve), and on every task the left edge of the canvas is back-filled only after the first words have committed.</w:t>
+      </w:r>
+    </w:p>
+    <w:p>
+      <w:pPr>
+        <w:pStyle w:val="BodyText"/>
+      </w:pPr>
+      <w:r>
+        <w:t xml:space="preserve">[stub:] The constrained-writing tasks give the model little</w:t>
+      </w:r>
+      <w:r>
+        <w:t xml:space="preserve"> </w:t>
+      </w:r>
+      <w:r>
+        <w:rPr>
+          <w:i/>
+          <w:iCs/>
+        </w:rPr>
+        <w:t xml:space="preserve">reason</w:t>
+      </w:r>
+      <w:r>
+        <w:t xml:space="preserve"> </w:t>
+      </w:r>
+      <w:r>
+        <w:t xml:space="preserve">to commit anticausally. The</w:t>
+      </w:r>
+      <w:r>
+        <w:t xml:space="preserve"> </w:t>
+      </w:r>
+      <w:r>
+        <w:rPr>
+          <w:rStyle w:val="VerbatimChar"/>
+        </w:rPr>
+        <w:t xml:space="preserve">reverse_chain</w:t>
+      </w:r>
+      <w:r>
+        <w:t xml:space="preserve"> </w:t>
+      </w:r>
+      <w:r>
+        <w:t xml:space="preserve">probe task (from our replication battery around</w:t>
+      </w:r>
+      <w:r>
+        <w:t xml:space="preserve"> </w:t>
+      </w:r>
+      <w:hyperlink r:id="rId24">
+        <w:r>
+          <w:rPr>
+            <w:rStyle w:val="Hyperlink"/>
+          </w:rPr>
+          <w:t xml:space="preserve">Engels et al.</w:t>
+        </w:r>
+      </w:hyperlink>
+      <w:r>
+        <w:t xml:space="preserve">) does: a digit chain obeys</w:t>
+      </w:r>
+      <w:r>
+        <w:t xml:space="preserve"> </w:t>
+      </w:r>
+      <m:oMath>
+        <m:sSup>
+          <m:e>
+            <m:r>
+              <m:t>x</m:t>
+            </m:r>
+          </m:e>
+          <m:sup>
+            <m:d>
+              <m:dPr>
+                <m:begChr m:val="("/>
+                <m:sepChr m:val=""/>
+                <m:endChr m:val=")"/>
+                <m:grow/>
+              </m:dPr>
+              <m:e>
+                <m:r>
+                  <m:t>k</m:t>
+                </m:r>
+                <m:r>
+                  <m:rPr>
+                    <m:sty m:val="p"/>
+                  </m:rPr>
+                  <m:t>+</m:t>
+                </m:r>
+                <m:r>
+                  <m:t>1</m:t>
+                </m:r>
+              </m:e>
+            </m:d>
+          </m:sup>
+        </m:sSup>
+        <m:r>
+          <m:rPr>
+            <m:sty m:val="p"/>
+          </m:rPr>
+          <m:t>=</m:t>
+        </m:r>
+        <m:r>
+          <m:t>f</m:t>
+        </m:r>
+        <m:d>
+          <m:dPr>
+            <m:begChr m:val="("/>
+            <m:sepChr m:val=""/>
+            <m:endChr m:val=")"/>
+            <m:grow/>
+          </m:dPr>
+          <m:e>
+            <m:sSup>
+              <m:e>
+                <m:r>
+                  <m:t>x</m:t>
+                </m:r>
+              </m:e>
+              <m:sup>
+                <m:d>
+                  <m:dPr>
+                    <m:begChr m:val="("/>
+                    <m:sepChr m:val=""/>
+                    <m:endChr m:val=")"/>
+                    <m:grow/>
+                  </m:dPr>
+                  <m:e>
+                    <m:r>
+                      <m:t>k</m:t>
+                    </m:r>
+                  </m:e>
+                </m:d>
+              </m:sup>
+            </m:sSup>
+          </m:e>
+        </m:d>
+      </m:oMath>
+      <w:r>
+        <w:t xml:space="preserve"> </w:t>
+      </w:r>
+      <w:r>
+        <w:t xml:space="preserve">under a given lookup table, the</w:t>
+      </w:r>
+      <w:r>
+        <w:t xml:space="preserve"> </w:t>
+      </w:r>
+      <w:r>
+        <w:rPr>
+          <w:i/>
+          <w:iCs/>
+        </w:rPr>
+        <w:t xml:space="preserve">last</w:t>
+      </w:r>
+      <w:r>
+        <w:t xml:space="preserve"> </w:t>
+      </w:r>
+      <w:r>
+        <w:t xml:space="preserve">element is given, and the answer must be written in forward order — the dependency runs right-to-left, so a causal single-pass generator must emit the deepest-dependency value first (budget-matched autoregressive Gemma stays below 0.25 at depth 3). When DG solves the task beyond trivial depth, its commitment literally runs backward: all correct depth-4/5 runs lock the digits back-to-front (</w:t>
+      </w:r>
+      <m:oMath>
+        <m:sSub>
+          <m:e>
+            <m:r>
+              <m:t>ρ</m:t>
+            </m:r>
+          </m:e>
+          <m:sub>
+            <m:r>
+              <m:rPr>
+                <m:sty m:val="p"/>
+              </m:rPr>
+              <m:t>c</m:t>
+            </m:r>
+            <m:r>
+              <m:rPr>
+                <m:sty m:val="p"/>
+              </m:rPr>
+              <m:t>h</m:t>
+            </m:r>
+            <m:r>
+              <m:rPr>
+                <m:sty m:val="p"/>
+              </m:rPr>
+              <m:t>a</m:t>
+            </m:r>
+            <m:r>
+              <m:rPr>
+                <m:sty m:val="p"/>
+              </m:rPr>
+              <m:t>i</m:t>
+            </m:r>
+            <m:r>
+              <m:rPr>
+                <m:sty m:val="p"/>
+              </m:rPr>
+              <m:t>n</m:t>
+            </m:r>
+          </m:sub>
+        </m:sSub>
+        <m:r>
+          <m:rPr>
+            <m:sty m:val="p"/>
+          </m:rPr>
+          <m:t>∈</m:t>
+        </m:r>
+        <m:d>
+          <m:dPr>
+            <m:begChr m:val="["/>
+            <m:sepChr m:val=""/>
+            <m:endChr m:val="]"/>
+            <m:grow/>
+          </m:dPr>
+          <m:e>
+            <m:r>
+              <m:rPr>
+                <m:sty m:val="p"/>
+              </m:rPr>
+              <m:t>−</m:t>
+            </m:r>
+            <m:r>
+              <m:t>0.97</m:t>
+            </m:r>
+            <m:r>
+              <m:rPr>
+                <m:sty m:val="p"/>
+              </m:rPr>
+              <m:t>,</m:t>
+            </m:r>
+            <m:r>
+              <m:rPr>
+                <m:sty m:val="p"/>
+              </m:rPr>
+              <m:t>−</m:t>
+            </m:r>
+            <m:r>
+              <m:t>0.89</m:t>
+            </m:r>
+          </m:e>
+        </m:d>
+      </m:oMath>
+      <w:r>
+        <w:t xml:space="preserve">), while failing runs fill forward (bottom-right panel above; trivial depth 3 is solved forward, and beyond depth ~6 the backward strategy stops producing correct answers).</w:t>
       </w:r>
     </w:p>
     <w:p>
@@ -6212,7 +6448,7 @@
           <w:i/>
           <w:iCs/>
         </w:rPr>
-        <w:t xml:space="preserve">Per task: normalized canvas position of the</w:t>
+        <w:t xml:space="preserve">Canvas position of the</w:t>
       </w:r>
       <w:r>
         <w:rPr>
@@ -6231,7 +6467,7 @@
           <w:i/>
           <w:iCs/>
         </w:rPr>
-        <w:t xml:space="preserve">-th finally-committed content position vs commit rank (faint = single rollouts, bold = mean; dashed diagonal = strictly left-to-right;</w:t>
+        <w:t xml:space="preserve">-th finalized content position vs commit rank (faint = single rollouts, bold = mean; dashed diagonal = strictly left-to-right;</w:t>
       </w:r>
       <w:r>
         <w:rPr>
@@ -6293,7 +6529,7 @@
           <w:i/>
           <w:iCs/>
         </w:rPr>
-        <w:t xml:space="preserve">= median Spearman correlation between commit step and position). Anticausal stages show as descending segments:</w:t>
+        <w:t xml:space="preserve">= median Spearman correlation of finalize step vs position). Top row: benchmark-style tasks (denoising films; argmax lock-in as commitment proxy) — commit order tracks reading order. Bottom row: idiosyncratic tasks — the constrained-writing tasks (accept-mask commitment, hot sampler) back-fill the left edge at rank ~0.2 and</w:t>
       </w:r>
       <w:r>
         <w:rPr>
@@ -6322,428 +6558,113 @@
           <w:i/>
           <w:iCs/>
         </w:rPr>
-        <w:t xml:space="preserve">commits its anchored final word before back-filling the middle, and all tasks back-fill the left edge at rank ~0.2. Hot sampler; the default colder sampler commits the whole canvas by step ~3, leaving no order to read.</w:t>
-      </w:r>
-    </w:p>
-    <w:p>
-      <w:pPr>
-        <w:pStyle w:val="BodyText"/>
-      </w:pPr>
-      <w:r>
-        <w:t xml:space="preserve">[stub:] The constrained-writing tasks give the model little</w:t>
-      </w:r>
-      <w:r>
-        <w:t xml:space="preserve"> </w:t>
-      </w:r>
-      <w:r>
-        <w:rPr>
-          <w:i/>
-          <w:iCs/>
-        </w:rPr>
-        <w:t xml:space="preserve">reason</w:t>
-      </w:r>
-      <w:r>
-        <w:t xml:space="preserve"> </w:t>
-      </w:r>
-      <w:r>
-        <w:t xml:space="preserve">to commit anticausally. The</w:t>
-      </w:r>
-      <w:r>
+        <w:t xml:space="preserve">plunges at the end; on</w:t>
+      </w:r>
+      <w:r>
+        <w:rPr>
+          <w:i/>
+          <w:iCs/>
+        </w:rPr>
         <w:t xml:space="preserve"> </w:t>
       </w:r>
       <w:r>
         <w:rPr>
           <w:rStyle w:val="VerbatimChar"/>
+          <w:i/>
+          <w:iCs/>
         </w:rPr>
         <w:t xml:space="preserve">reverse_chain</w:t>
       </w:r>
       <w:r>
-        <w:t xml:space="preserve"> </w:t>
-      </w:r>
-      <w:r>
-        <w:t xml:space="preserve">probe task (from our replication battery around</w:t>
-      </w:r>
-      <w:r>
-        <w:t xml:space="preserve"> </w:t>
-      </w:r>
-      <w:hyperlink r:id="rId24">
-        <w:r>
-          <w:rPr>
-            <w:rStyle w:val="Hyperlink"/>
-          </w:rPr>
-          <w:t xml:space="preserve">Engels et al.</w:t>
-        </w:r>
-      </w:hyperlink>
-      <w:r>
-        <w:t xml:space="preserve">) does: a digit chain obeys</w:t>
-      </w:r>
-      <w:r>
-        <w:t xml:space="preserve"> </w:t>
-      </w:r>
-      <m:oMath>
-        <m:sSup>
-          <m:e>
-            <m:r>
-              <m:t>x</m:t>
-            </m:r>
-          </m:e>
-          <m:sup>
-            <m:d>
-              <m:dPr>
-                <m:begChr m:val="("/>
-                <m:sepChr m:val=""/>
-                <m:endChr m:val=")"/>
-                <m:grow/>
-              </m:dPr>
-              <m:e>
-                <m:r>
-                  <m:t>k</m:t>
-                </m:r>
-                <m:r>
-                  <m:rPr>
-                    <m:sty m:val="p"/>
-                  </m:rPr>
-                  <m:t>+</m:t>
-                </m:r>
-                <m:r>
-                  <m:t>1</m:t>
-                </m:r>
-              </m:e>
-            </m:d>
-          </m:sup>
-        </m:sSup>
+        <w:rPr>
+          <w:i/>
+          <w:iCs/>
+        </w:rPr>
+        <w:t xml:space="preserve"> </w:t>
+      </w:r>
+      <w:r>
+        <w:rPr>
+          <w:i/>
+          <w:iCs/>
+        </w:rPr>
+        <w:t xml:space="preserve">(depths 4–5) the runs that solve the task (green) commit the anchored tail first and descend backward, while failing runs fill forward. Panel</w:t>
+      </w:r>
+      <w:r>
+        <w:rPr>
+          <w:i/>
+          <w:iCs/>
+        </w:rPr>
+        <w:t xml:space="preserve"> </w:t>
+      </w:r>
+      <m:oMath>
+        <m:r>
+          <m:t>ρ</m:t>
+        </m:r>
+      </m:oMath>
+      <w:r>
+        <w:rPr>
+          <w:i/>
+          <w:iCs/>
+        </w:rPr>
+        <w:t xml:space="preserve"> </w:t>
+      </w:r>
+      <w:r>
+        <w:rPr>
+          <w:i/>
+          <w:iCs/>
+        </w:rPr>
+        <w:t xml:space="preserve">for reverse_chain is canvas-level (including separators); digits-only, the correct runs reach</w:t>
+      </w:r>
+      <w:r>
+        <w:rPr>
+          <w:i/>
+          <w:iCs/>
+        </w:rPr>
+        <w:t xml:space="preserve"> </w:t>
+      </w:r>
+      <m:oMath>
         <m:r>
           <m:rPr>
             <m:sty m:val="p"/>
           </m:rPr>
-          <m:t>=</m:t>
-        </m:r>
-        <m:r>
-          <m:t>f</m:t>
-        </m:r>
-        <m:d>
-          <m:dPr>
-            <m:begChr m:val="("/>
-            <m:sepChr m:val=""/>
-            <m:endChr m:val=")"/>
-            <m:grow/>
-          </m:dPr>
-          <m:e>
-            <m:sSup>
-              <m:e>
-                <m:r>
-                  <m:t>x</m:t>
-                </m:r>
-              </m:e>
-              <m:sup>
-                <m:d>
-                  <m:dPr>
-                    <m:begChr m:val="("/>
-                    <m:sepChr m:val=""/>
-                    <m:endChr m:val=")"/>
-                    <m:grow/>
-                  </m:dPr>
-                  <m:e>
-                    <m:r>
-                      <m:t>k</m:t>
-                    </m:r>
-                  </m:e>
-                </m:d>
-              </m:sup>
-            </m:sSup>
-          </m:e>
-        </m:d>
-      </m:oMath>
-      <w:r>
-        <w:t xml:space="preserve"> </w:t>
-      </w:r>
-      <w:r>
-        <w:t xml:space="preserve">under a given lookup table, the</w:t>
-      </w:r>
-      <w:r>
-        <w:t xml:space="preserve"> </w:t>
-      </w:r>
-      <w:r>
-        <w:rPr>
-          <w:i/>
-          <w:iCs/>
-        </w:rPr>
-        <w:t xml:space="preserve">last</w:t>
-      </w:r>
-      <w:r>
-        <w:t xml:space="preserve"> </w:t>
-      </w:r>
-      <w:r>
-        <w:t xml:space="preserve">element is given, and the answer must be written in forward order — the dependency runs right-to-left, so a causal single-pass generator must emit the deepest-dependency value first (budget-matched autoregressive Gemma stays below 0.25 at depth 3). When DG solves the task beyond trivial depth, its commitment literally runs backward: all correct depth-4/5 runs lock the digits back-to-front (</w:t>
-      </w:r>
-      <m:oMath>
-        <m:sSub>
-          <m:e>
-            <m:r>
-              <m:t>ρ</m:t>
-            </m:r>
-          </m:e>
-          <m:sub>
-            <m:r>
-              <m:rPr>
-                <m:sty m:val="p"/>
-              </m:rPr>
-              <m:t>c</m:t>
-            </m:r>
-            <m:r>
-              <m:rPr>
-                <m:sty m:val="p"/>
-              </m:rPr>
-              <m:t>h</m:t>
-            </m:r>
-            <m:r>
-              <m:rPr>
-                <m:sty m:val="p"/>
-              </m:rPr>
-              <m:t>a</m:t>
-            </m:r>
-            <m:r>
-              <m:rPr>
-                <m:sty m:val="p"/>
-              </m:rPr>
-              <m:t>i</m:t>
-            </m:r>
-            <m:r>
-              <m:rPr>
-                <m:sty m:val="p"/>
-              </m:rPr>
-              <m:t>n</m:t>
-            </m:r>
-          </m:sub>
-        </m:sSub>
+          <m:t>−</m:t>
+        </m:r>
+        <m:r>
+          <m:t>0.89</m:t>
+        </m:r>
         <m:r>
           <m:rPr>
             <m:sty m:val="p"/>
           </m:rPr>
-          <m:t>∈</m:t>
-        </m:r>
-        <m:d>
-          <m:dPr>
-            <m:begChr m:val="["/>
-            <m:sepChr m:val=""/>
-            <m:endChr m:val="]"/>
-            <m:grow/>
-          </m:dPr>
-          <m:e>
-            <m:r>
-              <m:rPr>
-                <m:sty m:val="p"/>
-              </m:rPr>
-              <m:t>−</m:t>
-            </m:r>
-            <m:r>
-              <m:t>0.97</m:t>
-            </m:r>
-            <m:r>
-              <m:rPr>
-                <m:sty m:val="p"/>
-              </m:rPr>
-              <m:t>,</m:t>
-            </m:r>
-            <m:r>
-              <m:rPr>
-                <m:sty m:val="p"/>
-              </m:rPr>
-              <m:t>−</m:t>
-            </m:r>
-            <m:r>
-              <m:t>0.89</m:t>
-            </m:r>
-          </m:e>
-        </m:d>
-      </m:oMath>
-      <w:r>
-        <w:t xml:space="preserve">), while failing runs fill forward.</w:t>
-      </w:r>
-    </w:p>
-    <w:p>
-      <w:pPr>
-        <w:pStyle w:val="CaptionedFigure"/>
-      </w:pPr>
-      <w:r>
-        <w:drawing>
-          <wp:inline>
-            <wp:extent cx="5334000" cy="2117911"/>
-            <wp:effectExtent b="0" l="0" r="0" t="0"/>
-            <wp:docPr descr="Reverse chain anticausality" title="" id="87" name="Picture"/>
-            <a:graphic>
-              <a:graphicData uri="http://schemas.openxmlformats.org/drawingml/2006/picture">
-                <pic:pic>
-                  <pic:nvPicPr>
-                    <pic:cNvPr descr="figs/figA12_reverse_chain.png" id="88" name="Picture"/>
-                    <pic:cNvPicPr>
-                      <a:picLocks noChangeArrowheads="1" noChangeAspect="1"/>
-                    </pic:cNvPicPr>
-                  </pic:nvPicPr>
-                  <pic:blipFill>
-                    <a:blip r:embed="rId86"/>
-                    <a:stretch>
-                      <a:fillRect/>
-                    </a:stretch>
-                  </pic:blipFill>
-                  <pic:spPr bwMode="auto">
-                    <a:xfrm>
-                      <a:off x="0" y="0"/>
-                      <a:ext cx="5334000" cy="2117911"/>
-                    </a:xfrm>
-                    <a:prstGeom prst="rect">
-                      <a:avLst/>
-                    </a:prstGeom>
-                    <a:noFill/>
-                    <a:ln w="9525">
-                      <a:noFill/>
-                      <a:headEnd/>
-                      <a:tailEnd/>
-                    </a:ln>
-                  </pic:spPr>
-                </pic:pic>
-              </a:graphicData>
-            </a:graphic>
-          </wp:inline>
-        </w:drawing>
-      </w:r>
-    </w:p>
-    <w:p>
-      <w:pPr>
-        <w:pStyle w:val="ImageCaption"/>
-      </w:pPr>
-      <w:r>
-        <w:t xml:space="preserve">Reverse chain anticausality</w:t>
-      </w:r>
-    </w:p>
-    <w:p>
-      <w:pPr>
-        <w:pStyle w:val="BodyText"/>
-      </w:pPr>
-      <w:r>
-        <w:rPr>
-          <w:b/>
-          <w:bCs/>
-          <w:i/>
-          <w:iCs/>
-        </w:rPr>
-        <w:t xml:space="preserve">On an end-anchored chain, solving runs commit backward.</w:t>
-      </w:r>
-      <w:r>
-        <w:rPr>
-          <w:i/>
-          <w:iCs/>
-        </w:rPr>
-        <w:t xml:space="preserve"> </w:t>
-      </w:r>
-      <w:r>
-        <w:rPr>
-          <w:i/>
-          <w:iCs/>
-        </w:rPr>
-        <w:t xml:space="preserve">Left: lock-in time of each chain element (depths 4–5; bold = class mean) — correct runs (green) lock the anchored end first and</w:t>
-      </w:r>
-      <w:r>
-        <w:rPr>
-          <w:i/>
-          <w:iCs/>
-        </w:rPr>
-        <w:t xml:space="preserve"> </w:t>
-      </w:r>
-      <m:oMath>
-        <m:sSub>
-          <m:e>
-            <m:r>
-              <m:t>x</m:t>
-            </m:r>
-          </m:e>
-          <m:sub>
-            <m:r>
-              <m:t>1</m:t>
-            </m:r>
-          </m:sub>
-        </m:sSub>
-      </m:oMath>
-      <w:r>
-        <w:rPr>
-          <w:i/>
-          <w:iCs/>
-        </w:rPr>
-        <w:t xml:space="preserve"> </w:t>
-      </w:r>
-      <w:r>
-        <w:rPr>
-          <w:i/>
-          <w:iCs/>
-        </w:rPr>
-        <w:t xml:space="preserve">last; failing runs (grey) fill forward. Right:</w:t>
-      </w:r>
-      <w:r>
-        <w:rPr>
-          <w:i/>
-          <w:iCs/>
-        </w:rPr>
-        <w:t xml:space="preserve"> </w:t>
-      </w:r>
-      <m:oMath>
-        <m:sSub>
-          <m:e>
-            <m:r>
-              <m:t>ρ</m:t>
-            </m:r>
-          </m:e>
-          <m:sub>
-            <m:r>
-              <m:rPr>
-                <m:sty m:val="p"/>
-              </m:rPr>
-              <m:t>c</m:t>
-            </m:r>
-            <m:r>
-              <m:rPr>
-                <m:sty m:val="p"/>
-              </m:rPr>
-              <m:t>h</m:t>
-            </m:r>
-            <m:r>
-              <m:rPr>
-                <m:sty m:val="p"/>
-              </m:rPr>
-              <m:t>a</m:t>
-            </m:r>
-            <m:r>
-              <m:rPr>
-                <m:sty m:val="p"/>
-              </m:rPr>
-              <m:t>i</m:t>
-            </m:r>
-            <m:r>
-              <m:rPr>
-                <m:sty m:val="p"/>
-              </m:rPr>
-              <m:t>n</m:t>
-            </m:r>
-          </m:sub>
-        </m:sSub>
-      </m:oMath>
-      <w:r>
-        <w:rPr>
-          <w:i/>
-          <w:iCs/>
-        </w:rPr>
-        <w:t xml:space="preserve"> </w:t>
-      </w:r>
-      <w:r>
-        <w:rPr>
-          <w:i/>
-          <w:iCs/>
-        </w:rPr>
-        <w:t xml:space="preserve">per depth, split by correctness — trivial depth 3 is solved forward, depths 4–5 only backward, and beyond depth ~6 the backward strategy stops producing correct answers. Commitment here is proxied by argmax lock-in (the films carry no accept-mask).</w:t>
-      </w:r>
-    </w:p>
-    <w:bookmarkEnd w:id="89"/>
-    <w:bookmarkEnd w:id="90"/>
-    <w:bookmarkEnd w:id="91"/>
+          <m:t>.</m:t>
+        </m:r>
+        <m:r>
+          <m:rPr>
+            <m:sty m:val="p"/>
+          </m:rPr>
+          <m:t>.</m:t>
+        </m:r>
+        <m:r>
+          <m:rPr>
+            <m:sty m:val="p"/>
+          </m:rPr>
+          <m:t>−</m:t>
+        </m:r>
+        <m:r>
+          <m:t>0.97</m:t>
+        </m:r>
+      </m:oMath>
+      <w:r>
+        <w:rPr>
+          <w:i/>
+          <w:iCs/>
+        </w:rPr>
+        <w:t xml:space="preserve">.</w:t>
+      </w:r>
+    </w:p>
+    <w:bookmarkEnd w:id="86"/>
+    <w:bookmarkEnd w:id="87"/>
+    <w:bookmarkEnd w:id="88"/>
     <w:sectPr>
       <w:footnotePr>
         <w:numRestart w:val="eachSect"/>

</xml_diff>

<commit_message>
Causality top row: fresh GPQA/MATH/HumanEval/WildChat captures (default sampler) replace thinkfast tasks
Co-Authored-By: Claude Fable 5 <noreply@anthropic.com>
Claude-Session: https://claude.ai/code/session_01U8CiyQ7ySpBDkYEq4FzNBU
</commit_message>
<xml_diff>
--- a/post.docx
+++ b/post.docx
@@ -6011,7 +6011,7 @@
         <w:t xml:space="preserve"> </w:t>
       </w:r>
       <w:r>
-        <w:t xml:space="preserve">its canvas in reading order, like an autoregressive model. We order each run’s content positions by the step at which they finally commit, and plot canvas position against commit rank — a strictly left-to-right (AR-like) order is the diagonal. Commitment is largely causal (median</w:t>
+        <w:t xml:space="preserve">its canvas in reading order, like an autoregressive model. We order each generation’s canvas positions by the step at which they finally commit, and plot canvas position against commit rank — a strictly left-to-right (AR-like) order is the diagonal. On classic benchmarks (GPQA, MATH, HumanEval, and WildChat user prompts; default sampler) commitment is strongly causal (median</w:t>
       </w:r>
       <w:r>
         <w:t xml:space="preserve"> </w:t>
@@ -6056,17 +6056,12 @@
             </m:r>
           </m:sub>
         </m:sSub>
-      </m:oMath>
-      <w:r>
-        <w:t xml:space="preserve"> </w:t>
-      </w:r>
-      <w:r>
-        <w:t xml:space="preserve">between</w:t>
-      </w:r>
-      <w:r>
-        <w:t xml:space="preserve"> </w:t>
-      </w:r>
-      <m:oMath>
+        <m:r>
+          <m:rPr>
+            <m:sty m:val="p"/>
+          </m:rPr>
+          <m:t>=</m:t>
+        </m:r>
         <m:r>
           <m:rPr>
             <m:sty m:val="p"/>
@@ -6074,19 +6069,20 @@
           <m:t>+</m:t>
         </m:r>
         <m:r>
-          <m:t>0.57</m:t>
-        </m:r>
-      </m:oMath>
-      <w:r>
-        <w:t xml:space="preserve"> </w:t>
-      </w:r>
-      <w:r>
-        <w:t xml:space="preserve">and</w:t>
-      </w:r>
-      <w:r>
-        <w:t xml:space="preserve"> </w:t>
-      </w:r>
-      <m:oMath>
+          <m:t>0.75</m:t>
+        </m:r>
+        <m:r>
+          <m:rPr>
+            <m:sty m:val="p"/>
+          </m:rPr>
+          <m:t>.</m:t>
+        </m:r>
+        <m:r>
+          <m:rPr>
+            <m:sty m:val="p"/>
+          </m:rPr>
+          <m:t>.</m:t>
+        </m:r>
         <m:r>
           <m:rPr>
             <m:sty m:val="p"/>
@@ -6094,14 +6090,11 @@
           <m:t>+</m:t>
         </m:r>
         <m:r>
-          <m:t>0.86</m:t>
-        </m:r>
-      </m:oMath>
-      <w:r>
-        <w:t xml:space="preserve"> </w:t>
-      </w:r>
-      <w:r>
-        <w:t xml:space="preserve">across tasks), but with reproducible</w:t>
+          <m:t>0.89</m:t>
+        </m:r>
+      </m:oMath>
+      <w:r>
+        <w:t xml:space="preserve">) — DG writes essentially in reading order. The idiosyncratic constrained-writing tasks show reproducible</w:t>
       </w:r>
       <w:r>
         <w:t xml:space="preserve"> </w:t>
@@ -6129,7 +6122,7 @@
         <w:t xml:space="preserve"> </w:t>
       </w:r>
       <w:r>
-        <w:t xml:space="preserve">the anchored final word commits early and the middle of the sentence is filled in last (the terminal plunge of the mean curve), and on every task the left edge of the canvas is back-filled only after the first words have committed.</w:t>
+        <w:t xml:space="preserve">the anchored final word commits early and the middle of the sentence is filled in last (the terminal plunge of the mean curve), and the left edge of the canvas is back-filled only after the first words have committed.</w:t>
       </w:r>
     </w:p>
     <w:p>
@@ -6529,7 +6522,35 @@
           <w:i/>
           <w:iCs/>
         </w:rPr>
-        <w:t xml:space="preserve">= median Spearman correlation of finalize step vs position). Top row: benchmark-style tasks (denoising films; argmax lock-in as commitment proxy) — commit order tracks reading order. Bottom row: idiosyncratic tasks — the constrained-writing tasks (accept-mask commitment, hot sampler) back-fill the left edge at rank ~0.2 and</w:t>
+        <w:t xml:space="preserve">= median Spearman correlation of finalize step vs position). Top row: classic benchmarks — GPQA, MATH, HumanEval, and WildChat user prompts (12 rollouts each, default sampler,</w:t>
+      </w:r>
+      <w:r>
+        <w:rPr>
+          <w:i/>
+          <w:iCs/>
+        </w:rPr>
+        <w:t xml:space="preserve"> </w:t>
+      </w:r>
+      <m:oMath>
+        <m:r>
+          <m:t>C</m:t>
+        </m:r>
+        <m:r>
+          <m:rPr>
+            <m:sty m:val="p"/>
+          </m:rPr>
+          <m:t>=</m:t>
+        </m:r>
+        <m:r>
+          <m:t>256</m:t>
+        </m:r>
+      </m:oMath>
+      <w:r>
+        <w:rPr>
+          <w:i/>
+          <w:iCs/>
+        </w:rPr>
+        <w:t xml:space="preserve">; argmax lock-in as commitment proxy) — commit order tracks reading order. Bottom row: idiosyncratic tasks — the constrained-writing tasks (accept-mask commitment, hot sampler) back-fill the left edge at rank ~0.2 and</w:t>
       </w:r>
       <w:r>
         <w:rPr>

</xml_diff>

<commit_message>
Causality figure: 2x3 (drop WildChat and acrostic columns)
Co-Authored-By: Claude Fable 5 <noreply@anthropic.com>
Claude-Session: https://claude.ai/code/session_01U8CiyQ7ySpBDkYEq4FzNBU
</commit_message>
<xml_diff>
--- a/post.docx
+++ b/post.docx
@@ -6011,7 +6011,7 @@
         <w:t xml:space="preserve"> </w:t>
       </w:r>
       <w:r>
-        <w:t xml:space="preserve">its canvas in reading order, like an autoregressive model. We order each generation’s canvas positions by the step at which they finally commit, and plot canvas position against commit rank — a strictly left-to-right (AR-like) order is the diagonal. On classic benchmarks (GPQA, MATH, HumanEval, and WildChat user prompts; default sampler) commitment is strongly causal (median</w:t>
+        <w:t xml:space="preserve">its canvas in reading order, like an autoregressive model. We order each generation’s canvas positions by the step at which they finally commit, and plot canvas position against commit rank — a strictly left-to-right (AR-like) order is the diagonal. On classic benchmarks (GPQA, MATH, HumanEval; default sampler) commitment is strongly causal (median</w:t>
       </w:r>
       <w:r>
         <w:t xml:space="preserve"> </w:t>
@@ -6368,7 +6368,7 @@
       <w:r>
         <w:drawing>
           <wp:inline>
-            <wp:extent cx="5334000" cy="2200275"/>
+            <wp:extent cx="5334000" cy="2588558"/>
             <wp:effectExtent b="0" l="0" r="0" t="0"/>
             <wp:docPr descr="Commitment causality" title="" id="84" name="Picture"/>
             <a:graphic>
@@ -6389,7 +6389,7 @@
                   <pic:spPr bwMode="auto">
                     <a:xfrm>
                       <a:off x="0" y="0"/>
-                      <a:ext cx="5334000" cy="2200275"/>
+                      <a:ext cx="5334000" cy="2588558"/>
                     </a:xfrm>
                     <a:prstGeom prst="rect">
                       <a:avLst/>
@@ -6522,7 +6522,7 @@
           <w:i/>
           <w:iCs/>
         </w:rPr>
-        <w:t xml:space="preserve">= median Spearman correlation of finalize step vs position). Top row: classic benchmarks — GPQA, MATH, HumanEval, and WildChat user prompts (12 rollouts each, default sampler,</w:t>
+        <w:t xml:space="preserve">= median Spearman correlation of finalize step vs position). Top row: classic benchmarks — GPQA, MATH, HumanEval (12 rollouts each, default sampler,</w:t>
       </w:r>
       <w:r>
         <w:rPr>

</xml_diff>

<commit_message>
Detail the interventions in post symbols: seasonal ablation zeroes idiom entries of s^t_i (X^t untouched); clock plant = donor X and S at step k, free re-denoise
Co-Authored-By: Claude Fable 5 <noreply@anthropic.com>
Claude-Session: https://claude.ai/code/session_01U8CiyQ7ySpBDkYEq4FzNBU
</commit_message>
<xml_diff>
--- a/post.docx
+++ b/post.docx
@@ -4993,7 +4993,138 @@
         </m:r>
       </m:oMath>
       <w:r>
-        <w:t xml:space="preserve">-mass from an early step onward prevents the takeover and preserves the seasonal draft. Note however that later ablation onsets no longer rescue</w:t>
+        <w:t xml:space="preserve">-mass from an early step onward prevents the takeover and preserves the seasonal draft. Concretely, at every step</w:t>
+      </w:r>
+      <w:r>
+        <w:t xml:space="preserve"> </w:t>
+      </w:r>
+      <m:oMath>
+        <m:r>
+          <m:t>t</m:t>
+        </m:r>
+        <m:r>
+          <m:rPr>
+            <m:sty m:val="p"/>
+          </m:rPr>
+          <m:t>≥</m:t>
+        </m:r>
+        <m:sSub>
+          <m:e>
+            <m:r>
+              <m:t>t</m:t>
+            </m:r>
+          </m:e>
+          <m:sub>
+            <m:r>
+              <m:rPr>
+                <m:sty m:val="p"/>
+              </m:rPr>
+              <m:t>a</m:t>
+            </m:r>
+            <m:r>
+              <m:rPr>
+                <m:sty m:val="p"/>
+              </m:rPr>
+              <m:t>b</m:t>
+            </m:r>
+            <m:r>
+              <m:rPr>
+                <m:sty m:val="p"/>
+              </m:rPr>
+              <m:t>l</m:t>
+            </m:r>
+          </m:sub>
+        </m:sSub>
+      </m:oMath>
+      <w:r>
+        <w:t xml:space="preserve"> </w:t>
+      </w:r>
+      <w:r>
+        <w:t xml:space="preserve">we zero the idiom tokens’ entries of</w:t>
+      </w:r>
+      <w:r>
+        <w:t xml:space="preserve"> </w:t>
+      </w:r>
+      <m:oMath>
+        <m:sSubSup>
+          <m:e>
+            <m:r>
+              <m:rPr>
+                <m:sty m:val="b"/>
+              </m:rPr>
+              <m:t>s</m:t>
+            </m:r>
+          </m:e>
+          <m:sub>
+            <m:r>
+              <m:t>i</m:t>
+            </m:r>
+          </m:sub>
+          <m:sup>
+            <m:r>
+              <m:t>t</m:t>
+            </m:r>
+          </m:sup>
+        </m:sSubSup>
+      </m:oMath>
+      <w:r>
+        <w:t xml:space="preserve"> </w:t>
+      </w:r>
+      <w:r>
+        <w:t xml:space="preserve">at the contested positions</w:t>
+      </w:r>
+      <w:r>
+        <w:t xml:space="preserve"> </w:t>
+      </w:r>
+      <m:oMath>
+        <m:r>
+          <m:t>i</m:t>
+        </m:r>
+      </m:oMath>
+      <w:r>
+        <w:t xml:space="preserve"> </w:t>
+      </w:r>
+      <w:r>
+        <w:t xml:space="preserve">(before sampling); the canvas</w:t>
+      </w:r>
+      <w:r>
+        <w:t xml:space="preserve"> </w:t>
+      </w:r>
+      <m:oMath>
+        <m:sSup>
+          <m:e>
+            <m:r>
+              <m:t>X</m:t>
+            </m:r>
+          </m:e>
+          <m:sup>
+            <m:r>
+              <m:t>t</m:t>
+            </m:r>
+          </m:sup>
+        </m:sSup>
+      </m:oMath>
+      <w:r>
+        <w:t xml:space="preserve"> </w:t>
+      </w:r>
+      <w:r>
+        <w:t xml:space="preserve">is never edited and every other position and token is left untouched. What is</w:t>
+      </w:r>
+      <w:r>
+        <w:t xml:space="preserve"> </w:t>
+      </w:r>
+      <w:r>
+        <w:rPr>
+          <w:i/>
+          <w:iCs/>
+        </w:rPr>
+        <w:t xml:space="preserve">preserved</w:t>
+      </w:r>
+      <w:r>
+        <w:t xml:space="preserve"> </w:t>
+      </w:r>
+      <w:r>
+        <w:t xml:space="preserve">is thus the model’s own seasonal completion — nothing is injected in its favor. Note however that later ablation onsets no longer rescue</w:t>
       </w:r>
       <w:r>
         <w:t xml:space="preserve"> </w:t>
@@ -5878,8 +6009,32 @@
         <w:t xml:space="preserve"> </w:t>
       </w:r>
       <w:r>
-        <w:t xml:space="preserve">confident-wrong state (a cold run that converged to 18) is a genuine attractor: re-denoising it escapes to 16 only with a hot sampler</w:t>
-      </w:r>
+        <w:t xml:space="preserve">confident-wrong state (a cold run that converged to 18) is a genuine attractor. Concretely, we</w:t>
+      </w:r>
+      <w:r>
+        <w:t xml:space="preserve"> </w:t>
+      </w:r>
+      <w:r>
+        <w:rPr>
+          <w:i/>
+          <w:iCs/>
+        </w:rPr>
+        <w:t xml:space="preserve">plant</w:t>
+      </w:r>
+      <w:r>
+        <w:t xml:space="preserve"> </w:t>
+      </w:r>
+      <w:r>
+        <w:t xml:space="preserve">the donor run’s full final state — its canvas</w:t>
+      </w:r>
+      <w:r>
+        <w:t xml:space="preserve"> </w:t>
+      </w:r>
+      <m:oMath>
+        <m:r>
+          <m:t>X</m:t>
+        </m:r>
+      </m:oMath>
       <w:r>
         <w:t xml:space="preserve"> </w:t>
       </w:r>
@@ -5894,7 +6049,116 @@
         <w:t xml:space="preserve"> </w:t>
       </w:r>
       <w:r>
-        <w:t xml:space="preserve">enough re-noising — plant it past step ~48 of 128 and even the hot sampler stays stuck.</w:t>
+        <w:t xml:space="preserve">its sheet</w:t>
+      </w:r>
+      <w:r>
+        <w:t xml:space="preserve"> </w:t>
+      </w:r>
+      <m:oMath>
+        <m:r>
+          <m:rPr>
+            <m:sty m:val="b"/>
+          </m:rPr>
+          <m:t>S</m:t>
+        </m:r>
+      </m:oMath>
+      <w:r>
+        <w:t xml:space="preserve"> </w:t>
+      </w:r>
+      <w:r>
+        <w:t xml:space="preserve">— into a fresh rollout at plant step</w:t>
+      </w:r>
+      <w:r>
+        <w:t xml:space="preserve"> </w:t>
+      </w:r>
+      <m:oMath>
+        <m:r>
+          <m:t>k</m:t>
+        </m:r>
+      </m:oMath>
+      <w:r>
+        <w:t xml:space="preserve">, and denoising continues freely from there: nothing is clamped afterwards, so a small</w:t>
+      </w:r>
+      <w:r>
+        <w:t xml:space="preserve"> </w:t>
+      </w:r>
+      <m:oMath>
+        <m:r>
+          <m:t>k</m:t>
+        </m:r>
+      </m:oMath>
+      <w:r>
+        <w:t xml:space="preserve"> </w:t>
+      </w:r>
+      <w:r>
+        <w:t xml:space="preserve">leaves many re-noising steps to escape while a large</w:t>
+      </w:r>
+      <w:r>
+        <w:t xml:space="preserve"> </w:t>
+      </w:r>
+      <m:oMath>
+        <m:r>
+          <m:t>k</m:t>
+        </m:r>
+      </m:oMath>
+      <w:r>
+        <w:t xml:space="preserve"> </w:t>
+      </w:r>
+      <w:r>
+        <w:t xml:space="preserve">means the planted state is nearly frozen. Escape to 16 happens only with a hot sampler</w:t>
+      </w:r>
+      <w:r>
+        <w:t xml:space="preserve"> </w:t>
+      </w:r>
+      <w:r>
+        <w:rPr>
+          <w:i/>
+          <w:iCs/>
+        </w:rPr>
+        <w:t xml:space="preserve">and</w:t>
+      </w:r>
+      <w:r>
+        <w:t xml:space="preserve"> </w:t>
+      </w:r>
+      <w:r>
+        <w:t xml:space="preserve">enough re-noising — plant past</w:t>
+      </w:r>
+      <w:r>
+        <w:t xml:space="preserve"> </w:t>
+      </w:r>
+      <m:oMath>
+        <m:r>
+          <m:t>k</m:t>
+        </m:r>
+        <m:r>
+          <m:rPr>
+            <m:sty m:val="p"/>
+          </m:rPr>
+          <m:t>≈</m:t>
+        </m:r>
+        <m:r>
+          <m:t>48</m:t>
+        </m:r>
+      </m:oMath>
+      <w:r>
+        <w:t xml:space="preserve"> </w:t>
+      </w:r>
+      <w:r>
+        <w:t xml:space="preserve">of</w:t>
+      </w:r>
+      <w:r>
+        <w:t xml:space="preserve"> </w:t>
+      </w:r>
+      <m:oMath>
+        <m:r>
+          <m:t>128</m:t>
+        </m:r>
+      </m:oMath>
+      <w:r>
+        <w:t xml:space="preserve"> </w:t>
+      </w:r>
+      <w:r>
+        <w:t xml:space="preserve">and even the hot sampler stays stuck at 18.</w:t>
       </w:r>
     </w:p>
     <w:p>

</xml_diff>

<commit_message>
Causality figure back to committed-CoM over diffusion progress (user-preferred view) with L2R filler reference
Co-Authored-By: Claude Fable 5 <noreply@anthropic.com>
Claude-Session: https://claude.ai/code/session_01U8CiyQ7ySpBDkYEq4FzNBU
</commit_message>
<xml_diff>
--- a/post.docx
+++ b/post.docx
@@ -5993,7 +5993,15 @@
         <w:t xml:space="preserve">A clock takes 6 seconds to strike 4 o'clock (it chimes 4 times). How many seconds does it take to strike 9 o'clock?</w:t>
       </w:r>
       <w:r>
-        <w:t xml:space="preserve">; correct 16, fencepost attractor 18). In natural runs the canvas transiently visits the wrong answers and patches them within a few steps. But a</w:t>
+        <w:t xml:space="preserve">, the correct answer is 16, but on first glance the answer is 18).</w:t>
+      </w:r>
+    </w:p>
+    <w:p>
+      <w:pPr>
+        <w:pStyle w:val="BodyText"/>
+      </w:pPr>
+      <w:r>
+        <w:t xml:space="preserve">In natural runs the canvas transiently visits the wrong answers and corrects them within a few steps. But a</w:t>
       </w:r>
       <w:r>
         <w:t xml:space="preserve"> </w:t>
@@ -6275,7 +6283,37 @@
         <w:t xml:space="preserve"> </w:t>
       </w:r>
       <w:r>
-        <w:t xml:space="preserve">its canvas in reading order, like an autoregressive model. We order each generation’s canvas positions by the step at which they finally commit, and plot canvas position against commit rank — a strictly left-to-right (AR-like) order is the diagonal. On classic benchmarks (GPQA, MATH, HumanEval; default sampler) commitment is strongly causal (median</w:t>
+        <w:t xml:space="preserve">its canvas in reading order, like an autoregressive model. We track the center of mass of the canvas positions committed by step</w:t>
+      </w:r>
+      <w:r>
+        <w:t xml:space="preserve"> </w:t>
+      </w:r>
+      <m:oMath>
+        <m:r>
+          <m:t>t</m:t>
+        </m:r>
+      </m:oMath>
+      <w:r>
+        <w:t xml:space="preserve"> </w:t>
+      </w:r>
+      <w:r>
+        <w:t xml:space="preserve">over diffusion progress, against a matched</w:t>
+      </w:r>
+      <w:r>
+        <w:t xml:space="preserve"> </w:t>
+      </w:r>
+      <w:r>
+        <w:rPr>
+          <w:i/>
+          <w:iCs/>
+        </w:rPr>
+        <w:t xml:space="preserve">left-to-right filler</w:t>
+      </w:r>
+      <w:r>
+        <w:t xml:space="preserve"> </w:t>
+      </w:r>
+      <w:r>
+        <w:t xml:space="preserve">(committing the same number of positions per step, leftmost first) — a strictly causal, AR-like fill sits on the filler curve. On classic benchmarks (GPQA, MATH, HumanEval; default sampler) commitment is strongly causal (median</w:t>
       </w:r>
       <w:r>
         <w:t xml:space="preserve"> </w:t>
@@ -6691,113 +6729,102 @@
           <w:i/>
           <w:iCs/>
         </w:rPr>
-        <w:t xml:space="preserve">Commitment order is mostly, but not strictly, left-to-right.</w:t>
-      </w:r>
-      <w:r>
-        <w:rPr>
-          <w:i/>
-          <w:iCs/>
-        </w:rPr>
-        <w:t xml:space="preserve"> </w:t>
-      </w:r>
-      <w:r>
-        <w:rPr>
-          <w:i/>
-          <w:iCs/>
-        </w:rPr>
-        <w:t xml:space="preserve">Canvas position of the</w:t>
-      </w:r>
-      <w:r>
-        <w:rPr>
-          <w:i/>
-          <w:iCs/>
-        </w:rPr>
-        <w:t xml:space="preserve"> </w:t>
-      </w:r>
-      <m:oMath>
-        <m:r>
-          <m:t>k</m:t>
-        </m:r>
-      </m:oMath>
-      <w:r>
-        <w:rPr>
-          <w:i/>
-          <w:iCs/>
-        </w:rPr>
-        <w:t xml:space="preserve">-th finalized content position vs commit rank (faint = single rollouts, bold = mean; dashed diagonal = strictly left-to-right;</w:t>
-      </w:r>
-      <w:r>
-        <w:rPr>
-          <w:i/>
-          <w:iCs/>
-        </w:rPr>
-        <w:t xml:space="preserve"> </w:t>
-      </w:r>
-      <m:oMath>
-        <m:sSub>
-          <m:e>
-            <m:r>
-              <m:t>ρ</m:t>
-            </m:r>
-          </m:e>
-          <m:sub>
-            <m:r>
-              <m:rPr>
-                <m:sty m:val="p"/>
-              </m:rPr>
-              <m:t>c</m:t>
-            </m:r>
-            <m:r>
-              <m:rPr>
-                <m:sty m:val="p"/>
-              </m:rPr>
-              <m:t>h</m:t>
-            </m:r>
-            <m:r>
-              <m:rPr>
-                <m:sty m:val="p"/>
-              </m:rPr>
-              <m:t>a</m:t>
-            </m:r>
-            <m:r>
-              <m:rPr>
-                <m:sty m:val="p"/>
-              </m:rPr>
-              <m:t>i</m:t>
-            </m:r>
-            <m:r>
-              <m:rPr>
-                <m:sty m:val="p"/>
-              </m:rPr>
-              <m:t>n</m:t>
-            </m:r>
-          </m:sub>
-        </m:sSub>
-      </m:oMath>
-      <w:r>
-        <w:rPr>
-          <w:i/>
-          <w:iCs/>
-        </w:rPr>
-        <w:t xml:space="preserve"> </w:t>
-      </w:r>
-      <w:r>
-        <w:rPr>
-          <w:i/>
-          <w:iCs/>
-        </w:rPr>
-        <w:t xml:space="preserve">= median Spearman correlation of finalize step vs position). Top row: classic benchmarks — GPQA, MATH, HumanEval (12 rollouts each, default sampler,</w:t>
-      </w:r>
-      <w:r>
-        <w:rPr>
-          <w:i/>
-          <w:iCs/>
-        </w:rPr>
-        <w:t xml:space="preserve"> </w:t>
-      </w:r>
-      <m:oMath>
-        <m:r>
-          <m:t>C</m:t>
+        <w:t xml:space="preserve">Commitment is left-to-right on benchmarks; anchored tasks deviate.</w:t>
+      </w:r>
+      <w:r>
+        <w:rPr>
+          <w:i/>
+          <w:iCs/>
+        </w:rPr>
+        <w:t xml:space="preserve"> </w:t>
+      </w:r>
+      <w:r>
+        <w:rPr>
+          <w:i/>
+          <w:iCs/>
+        </w:rPr>
+        <w:t xml:space="preserve">Center of mass of the canvas positions committed by step</w:t>
+      </w:r>
+      <w:r>
+        <w:rPr>
+          <w:i/>
+          <w:iCs/>
+        </w:rPr>
+        <w:t xml:space="preserve"> </w:t>
+      </w:r>
+      <m:oMath>
+        <m:r>
+          <m:t>t</m:t>
+        </m:r>
+      </m:oMath>
+      <w:r>
+        <w:rPr>
+          <w:i/>
+          <w:iCs/>
+        </w:rPr>
+        <w:t xml:space="preserve"> </w:t>
+      </w:r>
+      <w:r>
+        <w:rPr>
+          <w:i/>
+          <w:iCs/>
+        </w:rPr>
+        <w:t xml:space="preserve">(0 = left, 1 = right of the content span; 0.5 = fully committed) over diffusion progress</w:t>
+      </w:r>
+      <w:r>
+        <w:rPr>
+          <w:i/>
+          <w:iCs/>
+        </w:rPr>
+        <w:t xml:space="preserve"> </w:t>
+      </w:r>
+      <m:oMath>
+        <m:r>
+          <m:t>t</m:t>
+        </m:r>
+        <m:r>
+          <m:rPr>
+            <m:sty m:val="p"/>
+          </m:rPr>
+          <m:t>/</m:t>
+        </m:r>
+        <m:r>
+          <m:t>T</m:t>
+        </m:r>
+      </m:oMath>
+      <w:r>
+        <w:rPr>
+          <w:i/>
+          <w:iCs/>
+        </w:rPr>
+        <w:t xml:space="preserve"> </w:t>
+      </w:r>
+      <w:r>
+        <w:rPr>
+          <w:i/>
+          <w:iCs/>
+        </w:rPr>
+        <w:t xml:space="preserve">(faint = single rollouts, bold = mean; frozen tail beyond</w:t>
+      </w:r>
+      <w:r>
+        <w:rPr>
+          <w:i/>
+          <w:iCs/>
+        </w:rPr>
+        <w:t xml:space="preserve"> </w:t>
+      </w:r>
+      <m:oMath>
+        <m:r>
+          <m:t>t</m:t>
+        </m:r>
+        <m:r>
+          <m:rPr>
+            <m:sty m:val="p"/>
+          </m:rPr>
+          <m:t>/</m:t>
+        </m:r>
+        <m:r>
+          <m:t>T</m:t>
         </m:r>
         <m:r>
           <m:rPr>
@@ -6806,6 +6833,41 @@
           <m:t>=</m:t>
         </m:r>
         <m:r>
+          <m:t>0.6</m:t>
+        </m:r>
+      </m:oMath>
+      <w:r>
+        <w:rPr>
+          <w:i/>
+          <w:iCs/>
+        </w:rPr>
+        <w:t xml:space="preserve"> </w:t>
+      </w:r>
+      <w:r>
+        <w:rPr>
+          <w:i/>
+          <w:iCs/>
+        </w:rPr>
+        <w:t xml:space="preserve">cropped). Dashed: the matched left-to-right filler — a causal fill sits on it. Top row: GPQA, MATH, HumanEval (12 rollouts each, default sampler,</w:t>
+      </w:r>
+      <w:r>
+        <w:rPr>
+          <w:i/>
+          <w:iCs/>
+        </w:rPr>
+        <w:t xml:space="preserve"> </w:t>
+      </w:r>
+      <m:oMath>
+        <m:r>
+          <m:t>C</m:t>
+        </m:r>
+        <m:r>
+          <m:rPr>
+            <m:sty m:val="p"/>
+          </m:rPr>
+          <m:t>=</m:t>
+        </m:r>
+        <m:r>
           <m:t>256</m:t>
         </m:r>
       </m:oMath>
@@ -6814,7 +6876,7 @@
           <w:i/>
           <w:iCs/>
         </w:rPr>
-        <w:t xml:space="preserve">; argmax lock-in as commitment proxy) — commit order tracks reading order. Bottom row: idiosyncratic tasks — the constrained-writing tasks (accept-mask commitment, hot sampler) back-fill the left edge at rank ~0.2 and</w:t>
+        <w:t xml:space="preserve">; argmax lock-in as commitment proxy) track the filler. Bottom row:</w:t>
       </w:r>
       <w:r>
         <w:rPr>
@@ -6829,6 +6891,35 @@
           <w:i/>
           <w:iCs/>
         </w:rPr>
+        <w:t xml:space="preserve">palindrome_words</w:t>
+      </w:r>
+      <w:r>
+        <w:rPr>
+          <w:i/>
+          <w:iCs/>
+        </w:rPr>
+        <w:t xml:space="preserve"> </w:t>
+      </w:r>
+      <w:r>
+        <w:rPr>
+          <w:i/>
+          <w:iCs/>
+        </w:rPr>
+        <w:t xml:space="preserve">fills in bursts,</w:t>
+      </w:r>
+      <w:r>
+        <w:rPr>
+          <w:i/>
+          <w:iCs/>
+        </w:rPr>
+        <w:t xml:space="preserve"> </w:t>
+      </w:r>
+      <w:r>
+        <w:rPr>
+          <w:rStyle w:val="VerbatimChar"/>
+          <w:i/>
+          <w:iCs/>
+        </w:rPr>
         <w:t xml:space="preserve">ends_with</w:t>
       </w:r>
       <w:r>
@@ -6843,7 +6934,7 @@
           <w:i/>
           <w:iCs/>
         </w:rPr>
-        <w:t xml:space="preserve">plunges at the end; on</w:t>
+        <w:t xml:space="preserve">sits above the filler early (the anchored final word commits first), and on</w:t>
       </w:r>
       <w:r>
         <w:rPr>
@@ -6872,33 +6963,99 @@
           <w:i/>
           <w:iCs/>
         </w:rPr>
-        <w:t xml:space="preserve">(depths 4–5) the runs that solve the task (green) commit the anchored tail first and descend backward, while failing runs fill forward. Panel</w:t>
-      </w:r>
-      <w:r>
-        <w:rPr>
-          <w:i/>
-          <w:iCs/>
-        </w:rPr>
-        <w:t xml:space="preserve"> </w:t>
-      </w:r>
-      <m:oMath>
-        <m:r>
-          <m:t>ρ</m:t>
-        </m:r>
-      </m:oMath>
-      <w:r>
-        <w:rPr>
-          <w:i/>
-          <w:iCs/>
-        </w:rPr>
-        <w:t xml:space="preserve"> </w:t>
-      </w:r>
-      <w:r>
-        <w:rPr>
-          <w:i/>
-          <w:iCs/>
-        </w:rPr>
-        <w:t xml:space="preserve">for reverse_chain is canvas-level (including separators); digits-only, the correct runs reach</w:t>
+        <w:t xml:space="preserve">(depths 4–5) the solving runs (green)</w:t>
+      </w:r>
+      <w:r>
+        <w:rPr>
+          <w:i/>
+          <w:iCs/>
+        </w:rPr>
+        <w:t xml:space="preserve"> </w:t>
+      </w:r>
+      <w:r>
+        <w:rPr>
+          <w:i/>
+          <w:i/>
+          <w:iCs/>
+          <w:iCs/>
+        </w:rPr>
+        <w:t xml:space="preserve">start</w:t>
+      </w:r>
+      <w:r>
+        <w:rPr>
+          <w:i/>
+          <w:iCs/>
+        </w:rPr>
+        <w:t xml:space="preserve"> </w:t>
+      </w:r>
+      <w:r>
+        <w:rPr>
+          <w:i/>
+          <w:iCs/>
+        </w:rPr>
+        <w:t xml:space="preserve">at the anchored end and walk backward, while failing runs (grey) rise like a causal fill.</w:t>
+      </w:r>
+      <w:r>
+        <w:rPr>
+          <w:i/>
+          <w:iCs/>
+        </w:rPr>
+        <w:t xml:space="preserve"> </w:t>
+      </w:r>
+      <m:oMath>
+        <m:sSub>
+          <m:e>
+            <m:r>
+              <m:t>ρ</m:t>
+            </m:r>
+          </m:e>
+          <m:sub>
+            <m:r>
+              <m:rPr>
+                <m:sty m:val="p"/>
+              </m:rPr>
+              <m:t>c</m:t>
+            </m:r>
+            <m:r>
+              <m:rPr>
+                <m:sty m:val="p"/>
+              </m:rPr>
+              <m:t>h</m:t>
+            </m:r>
+            <m:r>
+              <m:rPr>
+                <m:sty m:val="p"/>
+              </m:rPr>
+              <m:t>a</m:t>
+            </m:r>
+            <m:r>
+              <m:rPr>
+                <m:sty m:val="p"/>
+              </m:rPr>
+              <m:t>i</m:t>
+            </m:r>
+            <m:r>
+              <m:rPr>
+                <m:sty m:val="p"/>
+              </m:rPr>
+              <m:t>n</m:t>
+            </m:r>
+          </m:sub>
+        </m:sSub>
+      </m:oMath>
+      <w:r>
+        <w:rPr>
+          <w:i/>
+          <w:iCs/>
+        </w:rPr>
+        <w:t xml:space="preserve"> </w:t>
+      </w:r>
+      <w:r>
+        <w:rPr>
+          <w:i/>
+          <w:iCs/>
+        </w:rPr>
+        <w:t xml:space="preserve">= median Spearman of final-commit step vs position; for reverse_chain it is canvas-level (including separators) — digits-only, the correct runs reach</w:t>
       </w:r>
       <w:r>
         <w:rPr>

</xml_diff>

<commit_message>
Causality figure: three panels by logical direction (GPQA / poem writing / reverse_chain), fresh poem captures
Co-Authored-By: Claude Fable 5 <noreply@anthropic.com>
Claude-Session: https://claude.ai/code/session_01U8CiyQ7ySpBDkYEq4FzNBU
</commit_message>
<xml_diff>
--- a/post.docx
+++ b/post.docx
@@ -6253,13 +6253,13 @@
       </w:r>
     </w:p>
     <w:bookmarkEnd w:id="82"/>
-    <w:bookmarkStart w:id="86" w:name="how-causal-is-dgs-generation"/>
+    <w:bookmarkStart w:id="86" w:name="Xd7c7dfb66314a32b0174c0001aa6561f67f2b90"/>
     <w:p>
       <w:pPr>
         <w:pStyle w:val="Heading3"/>
       </w:pPr>
       <w:r>
-        <w:t xml:space="preserve">How causal is DG’s generation?</w:t>
+        <w:t xml:space="preserve">How much does DiffusionGemma use bidirectional attention?</w:t>
       </w:r>
     </w:p>
     <w:p>
@@ -6267,410 +6267,15 @@
         <w:pStyle w:val="FirstParagraph"/>
       </w:pPr>
       <w:r>
-        <w:t xml:space="preserve">[stub:] Although attention is bidirectional, DG could still</w:t>
-      </w:r>
-      <w:r>
-        <w:t xml:space="preserve"> </w:t>
-      </w:r>
-      <w:r>
-        <w:rPr>
-          <w:i/>
-          <w:iCs/>
-        </w:rPr>
-        <w:t xml:space="preserve">commit</w:t>
-      </w:r>
-      <w:r>
-        <w:t xml:space="preserve"> </w:t>
-      </w:r>
-      <w:r>
-        <w:t xml:space="preserve">its canvas in reading order, like an autoregressive model. We track the center of mass of the canvas positions committed by step</w:t>
-      </w:r>
-      <w:r>
-        <w:t xml:space="preserve"> </w:t>
-      </w:r>
-      <m:oMath>
-        <m:r>
-          <m:t>t</m:t>
-        </m:r>
-      </m:oMath>
-      <w:r>
-        <w:t xml:space="preserve"> </w:t>
-      </w:r>
-      <w:r>
-        <w:t xml:space="preserve">over diffusion progress, against a matched</w:t>
-      </w:r>
-      <w:r>
-        <w:t xml:space="preserve"> </w:t>
-      </w:r>
-      <w:r>
-        <w:rPr>
-          <w:i/>
-          <w:iCs/>
-        </w:rPr>
-        <w:t xml:space="preserve">left-to-right filler</w:t>
-      </w:r>
-      <w:r>
-        <w:t xml:space="preserve"> </w:t>
-      </w:r>
-      <w:r>
-        <w:t xml:space="preserve">(committing the same number of positions per step, leftmost first) — a strictly causal, AR-like fill sits on the filler curve. On classic benchmarks (GPQA, MATH, HumanEval; default sampler) commitment is strongly causal (median</w:t>
-      </w:r>
-      <w:r>
-        <w:t xml:space="preserve"> </w:t>
-      </w:r>
-      <m:oMath>
-        <m:sSub>
-          <m:e>
-            <m:r>
-              <m:t>ρ</m:t>
-            </m:r>
-          </m:e>
-          <m:sub>
-            <m:r>
-              <m:rPr>
-                <m:sty m:val="p"/>
-              </m:rPr>
-              <m:t>c</m:t>
-            </m:r>
-            <m:r>
-              <m:rPr>
-                <m:sty m:val="p"/>
-              </m:rPr>
-              <m:t>h</m:t>
-            </m:r>
-            <m:r>
-              <m:rPr>
-                <m:sty m:val="p"/>
-              </m:rPr>
-              <m:t>a</m:t>
-            </m:r>
-            <m:r>
-              <m:rPr>
-                <m:sty m:val="p"/>
-              </m:rPr>
-              <m:t>i</m:t>
-            </m:r>
-            <m:r>
-              <m:rPr>
-                <m:sty m:val="p"/>
-              </m:rPr>
-              <m:t>n</m:t>
-            </m:r>
-          </m:sub>
-        </m:sSub>
-        <m:r>
-          <m:rPr>
-            <m:sty m:val="p"/>
-          </m:rPr>
-          <m:t>=</m:t>
-        </m:r>
-        <m:r>
-          <m:rPr>
-            <m:sty m:val="p"/>
-          </m:rPr>
-          <m:t>+</m:t>
-        </m:r>
-        <m:r>
-          <m:t>0.75</m:t>
-        </m:r>
-        <m:r>
-          <m:rPr>
-            <m:sty m:val="p"/>
-          </m:rPr>
-          <m:t>.</m:t>
-        </m:r>
-        <m:r>
-          <m:rPr>
-            <m:sty m:val="p"/>
-          </m:rPr>
-          <m:t>.</m:t>
-        </m:r>
-        <m:r>
-          <m:rPr>
-            <m:sty m:val="p"/>
-          </m:rPr>
-          <m:t>+</m:t>
-        </m:r>
-        <m:r>
-          <m:t>0.89</m:t>
-        </m:r>
-      </m:oMath>
-      <w:r>
-        <w:t xml:space="preserve">) — DG writes essentially in reading order. The idiosyncratic constrained-writing tasks show reproducible</w:t>
-      </w:r>
-      <w:r>
-        <w:t xml:space="preserve"> </w:t>
-      </w:r>
-      <w:r>
-        <w:rPr>
-          <w:i/>
-          <w:iCs/>
-        </w:rPr>
-        <w:t xml:space="preserve">anticausal stages</w:t>
-      </w:r>
-      <w:r>
-        <w:t xml:space="preserve">: on</w:t>
-      </w:r>
-      <w:r>
-        <w:t xml:space="preserve"> </w:t>
-      </w:r>
-      <w:r>
-        <w:rPr>
-          <w:rStyle w:val="VerbatimChar"/>
-        </w:rPr>
-        <w:t xml:space="preserve">ends_with</w:t>
-      </w:r>
-      <w:r>
-        <w:t xml:space="preserve"> </w:t>
-      </w:r>
-      <w:r>
-        <w:t xml:space="preserve">the anchored final word commits early and the middle of the sentence is filled in last (the terminal plunge of the mean curve), and the left edge of the canvas is back-filled only after the first words have committed.</w:t>
-      </w:r>
-    </w:p>
-    <w:p>
-      <w:pPr>
-        <w:pStyle w:val="BodyText"/>
-      </w:pPr>
-      <w:r>
-        <w:t xml:space="preserve">[stub:] The constrained-writing tasks give the model little</w:t>
-      </w:r>
-      <w:r>
-        <w:t xml:space="preserve"> </w:t>
-      </w:r>
-      <w:r>
-        <w:rPr>
-          <w:i/>
-          <w:iCs/>
-        </w:rPr>
-        <w:t xml:space="preserve">reason</w:t>
-      </w:r>
-      <w:r>
-        <w:t xml:space="preserve"> </w:t>
-      </w:r>
-      <w:r>
-        <w:t xml:space="preserve">to commit anticausally. The</w:t>
-      </w:r>
-      <w:r>
-        <w:t xml:space="preserve"> </w:t>
-      </w:r>
-      <w:r>
-        <w:rPr>
-          <w:rStyle w:val="VerbatimChar"/>
-        </w:rPr>
-        <w:t xml:space="preserve">reverse_chain</w:t>
-      </w:r>
-      <w:r>
-        <w:t xml:space="preserve"> </w:t>
-      </w:r>
-      <w:r>
-        <w:t xml:space="preserve">probe task (from our replication battery around</w:t>
-      </w:r>
-      <w:r>
-        <w:t xml:space="preserve"> </w:t>
-      </w:r>
-      <w:hyperlink r:id="rId24">
-        <w:r>
-          <w:rPr>
-            <w:rStyle w:val="Hyperlink"/>
-          </w:rPr>
-          <w:t xml:space="preserve">Engels et al.</w:t>
-        </w:r>
-      </w:hyperlink>
-      <w:r>
-        <w:t xml:space="preserve">) does: a digit chain obeys</w:t>
-      </w:r>
-      <w:r>
-        <w:t xml:space="preserve"> </w:t>
-      </w:r>
-      <m:oMath>
-        <m:sSup>
-          <m:e>
-            <m:r>
-              <m:t>x</m:t>
-            </m:r>
-          </m:e>
-          <m:sup>
-            <m:d>
-              <m:dPr>
-                <m:begChr m:val="("/>
-                <m:sepChr m:val=""/>
-                <m:endChr m:val=")"/>
-                <m:grow/>
-              </m:dPr>
-              <m:e>
-                <m:r>
-                  <m:t>k</m:t>
-                </m:r>
-                <m:r>
-                  <m:rPr>
-                    <m:sty m:val="p"/>
-                  </m:rPr>
-                  <m:t>+</m:t>
-                </m:r>
-                <m:r>
-                  <m:t>1</m:t>
-                </m:r>
-              </m:e>
-            </m:d>
-          </m:sup>
-        </m:sSup>
-        <m:r>
-          <m:rPr>
-            <m:sty m:val="p"/>
-          </m:rPr>
-          <m:t>=</m:t>
-        </m:r>
-        <m:r>
-          <m:t>f</m:t>
-        </m:r>
-        <m:d>
-          <m:dPr>
-            <m:begChr m:val="("/>
-            <m:sepChr m:val=""/>
-            <m:endChr m:val=")"/>
-            <m:grow/>
-          </m:dPr>
-          <m:e>
-            <m:sSup>
-              <m:e>
-                <m:r>
-                  <m:t>x</m:t>
-                </m:r>
-              </m:e>
-              <m:sup>
-                <m:d>
-                  <m:dPr>
-                    <m:begChr m:val="("/>
-                    <m:sepChr m:val=""/>
-                    <m:endChr m:val=")"/>
-                    <m:grow/>
-                  </m:dPr>
-                  <m:e>
-                    <m:r>
-                      <m:t>k</m:t>
-                    </m:r>
-                  </m:e>
-                </m:d>
-              </m:sup>
-            </m:sSup>
-          </m:e>
-        </m:d>
-      </m:oMath>
-      <w:r>
-        <w:t xml:space="preserve"> </w:t>
-      </w:r>
-      <w:r>
-        <w:t xml:space="preserve">under a given lookup table, the</w:t>
-      </w:r>
-      <w:r>
-        <w:t xml:space="preserve"> </w:t>
-      </w:r>
-      <w:r>
-        <w:rPr>
-          <w:i/>
-          <w:iCs/>
-        </w:rPr>
-        <w:t xml:space="preserve">last</w:t>
-      </w:r>
-      <w:r>
-        <w:t xml:space="preserve"> </w:t>
-      </w:r>
-      <w:r>
-        <w:t xml:space="preserve">element is given, and the answer must be written in forward order — the dependency runs right-to-left, so a causal single-pass generator must emit the deepest-dependency value first (budget-matched autoregressive Gemma stays below 0.25 at depth 3). When DG solves the task beyond trivial depth, its commitment literally runs backward: all correct depth-4/5 runs lock the digits back-to-front (</w:t>
-      </w:r>
-      <m:oMath>
-        <m:sSub>
-          <m:e>
-            <m:r>
-              <m:t>ρ</m:t>
-            </m:r>
-          </m:e>
-          <m:sub>
-            <m:r>
-              <m:rPr>
-                <m:sty m:val="p"/>
-              </m:rPr>
-              <m:t>c</m:t>
-            </m:r>
-            <m:r>
-              <m:rPr>
-                <m:sty m:val="p"/>
-              </m:rPr>
-              <m:t>h</m:t>
-            </m:r>
-            <m:r>
-              <m:rPr>
-                <m:sty m:val="p"/>
-              </m:rPr>
-              <m:t>a</m:t>
-            </m:r>
-            <m:r>
-              <m:rPr>
-                <m:sty m:val="p"/>
-              </m:rPr>
-              <m:t>i</m:t>
-            </m:r>
-            <m:r>
-              <m:rPr>
-                <m:sty m:val="p"/>
-              </m:rPr>
-              <m:t>n</m:t>
-            </m:r>
-          </m:sub>
-        </m:sSub>
-        <m:r>
-          <m:rPr>
-            <m:sty m:val="p"/>
-          </m:rPr>
-          <m:t>∈</m:t>
-        </m:r>
-        <m:d>
-          <m:dPr>
-            <m:begChr m:val="["/>
-            <m:sepChr m:val=""/>
-            <m:endChr m:val="]"/>
-            <m:grow/>
-          </m:dPr>
-          <m:e>
-            <m:r>
-              <m:rPr>
-                <m:sty m:val="p"/>
-              </m:rPr>
-              <m:t>−</m:t>
-            </m:r>
-            <m:r>
-              <m:t>0.97</m:t>
-            </m:r>
-            <m:r>
-              <m:rPr>
-                <m:sty m:val="p"/>
-              </m:rPr>
-              <m:t>,</m:t>
-            </m:r>
-            <m:r>
-              <m:rPr>
-                <m:sty m:val="p"/>
-              </m:rPr>
-              <m:t>−</m:t>
-            </m:r>
-            <m:r>
-              <m:t>0.89</m:t>
-            </m:r>
-          </m:e>
-        </m:d>
-      </m:oMath>
-      <w:r>
-        <w:t xml:space="preserve">), while failing runs fill forward (bottom-right panel above; trivial depth 3 is solved forward, and beyond depth ~6 the backward strategy stops producing correct answers).</w:t>
-      </w:r>
-    </w:p>
-    <w:p>
-      <w:pPr>
-        <w:pStyle w:val="CaptionedFigure"/>
-      </w:pPr>
+        <w:t xml:space="preserve">One of the differences in DiffusionGemma is that it has bidirectional attention. While some tasks relying on some form of logical induction require causal left-to-right generation, other task do not obviously require it. However, being a finetune of Gemma, it is unclear how much it will just inherit a bias towards causal generation vs actually using bidirectional generation.</w:t>
+      </w:r>
+      <w:r>
+        <w:t xml:space="preserve"> </w:t>
+      </w:r>
       <w:r>
         <w:drawing>
           <wp:inline>
-            <wp:extent cx="5334000" cy="2588558"/>
+            <wp:extent cx="5334000" cy="1889125"/>
             <wp:effectExtent b="0" l="0" r="0" t="0"/>
             <wp:docPr descr="Commitment causality" title="" id="84" name="Picture"/>
             <a:graphic>
@@ -6691,7 +6296,7 @@
                   <pic:spPr bwMode="auto">
                     <a:xfrm>
                       <a:off x="0" y="0"/>
-                      <a:ext cx="5334000" cy="2588558"/>
+                      <a:ext cx="5334000" cy="1889125"/>
                     </a:xfrm>
                     <a:prstGeom prst="rect">
                       <a:avLst/>
@@ -6712,14 +6317,6 @@
     </w:p>
     <w:p>
       <w:pPr>
-        <w:pStyle w:val="ImageCaption"/>
-      </w:pPr>
-      <w:r>
-        <w:t xml:space="preserve">Commitment causality</w:t>
-      </w:r>
-    </w:p>
-    <w:p>
-      <w:pPr>
         <w:pStyle w:val="BodyText"/>
       </w:pPr>
       <w:r>
@@ -6729,7 +6326,7 @@
           <w:i/>
           <w:iCs/>
         </w:rPr>
-        <w:t xml:space="preserve">Commitment is left-to-right on benchmarks; anchored tasks deviate.</w:t>
+        <w:t xml:space="preserve">Commitment order follows the task’s logical direction — with a causal default.</w:t>
       </w:r>
       <w:r>
         <w:rPr>
@@ -6804,28 +6401,146 @@
           <w:i/>
           <w:iCs/>
         </w:rPr>
-        <w:t xml:space="preserve">(faint = single rollouts, bold = mean; frozen tail beyond</w:t>
-      </w:r>
-      <w:r>
-        <w:rPr>
-          <w:i/>
-          <w:iCs/>
-        </w:rPr>
-        <w:t xml:space="preserve"> </w:t>
-      </w:r>
-      <m:oMath>
-        <m:r>
-          <m:t>t</m:t>
-        </m:r>
-        <m:r>
-          <m:rPr>
-            <m:sty m:val="p"/>
-          </m:rPr>
-          <m:t>/</m:t>
-        </m:r>
-        <m:r>
-          <m:t>T</m:t>
-        </m:r>
+        <w:t xml:space="preserve">(faint = single rollouts, bold = mean; frozen tail cropped; default sampler, argmax lock-in as commitment proxy;</w:t>
+      </w:r>
+      <w:r>
+        <w:rPr>
+          <w:i/>
+          <w:iCs/>
+        </w:rPr>
+        <w:t xml:space="preserve"> </w:t>
+      </w:r>
+      <m:oMath>
+        <m:sSub>
+          <m:e>
+            <m:r>
+              <m:t>ρ</m:t>
+            </m:r>
+          </m:e>
+          <m:sub>
+            <m:r>
+              <m:rPr>
+                <m:sty m:val="p"/>
+              </m:rPr>
+              <m:t>c</m:t>
+            </m:r>
+            <m:r>
+              <m:rPr>
+                <m:sty m:val="p"/>
+              </m:rPr>
+              <m:t>h</m:t>
+            </m:r>
+            <m:r>
+              <m:rPr>
+                <m:sty m:val="p"/>
+              </m:rPr>
+              <m:t>a</m:t>
+            </m:r>
+            <m:r>
+              <m:rPr>
+                <m:sty m:val="p"/>
+              </m:rPr>
+              <m:t>i</m:t>
+            </m:r>
+            <m:r>
+              <m:rPr>
+                <m:sty m:val="p"/>
+              </m:rPr>
+              <m:t>n</m:t>
+            </m:r>
+          </m:sub>
+        </m:sSub>
+      </m:oMath>
+      <w:r>
+        <w:rPr>
+          <w:i/>
+          <w:iCs/>
+        </w:rPr>
+        <w:t xml:space="preserve"> </w:t>
+      </w:r>
+      <w:r>
+        <w:rPr>
+          <w:i/>
+          <w:iCs/>
+        </w:rPr>
+        <w:t xml:space="preserve">= median Spearman of final-commit step vs position). Dashed: matched left-to-right filler — a strictly causal fill sits on it. Left: GPQA (logically left-to-right) tracks the filler. Middle: poem writing (direction-indifferent) commits faster and less orderly, but still left-leaning — the inherited causal default. Right: the end-anchored</w:t>
+      </w:r>
+      <w:r>
+        <w:rPr>
+          <w:i/>
+          <w:iCs/>
+        </w:rPr>
+        <w:t xml:space="preserve"> </w:t>
+      </w:r>
+      <w:r>
+        <w:rPr>
+          <w:rStyle w:val="VerbatimChar"/>
+          <w:i/>
+          <w:iCs/>
+        </w:rPr>
+        <w:t xml:space="preserve">reverse_chain</w:t>
+      </w:r>
+      <w:r>
+        <w:rPr>
+          <w:i/>
+          <w:iCs/>
+        </w:rPr>
+        <w:t xml:space="preserve"> </w:t>
+      </w:r>
+      <w:r>
+        <w:rPr>
+          <w:i/>
+          <w:iCs/>
+        </w:rPr>
+        <w:t xml:space="preserve">(logically right-to-left, depths 4–5): solving runs (green) start at the anchored end and walk backward (digits-only</w:t>
+      </w:r>
+      <w:r>
+        <w:rPr>
+          <w:i/>
+          <w:iCs/>
+        </w:rPr>
+        <w:t xml:space="preserve"> </w:t>
+      </w:r>
+      <m:oMath>
+        <m:sSub>
+          <m:e>
+            <m:r>
+              <m:t>ρ</m:t>
+            </m:r>
+          </m:e>
+          <m:sub>
+            <m:r>
+              <m:rPr>
+                <m:sty m:val="p"/>
+              </m:rPr>
+              <m:t>c</m:t>
+            </m:r>
+            <m:r>
+              <m:rPr>
+                <m:sty m:val="p"/>
+              </m:rPr>
+              <m:t>h</m:t>
+            </m:r>
+            <m:r>
+              <m:rPr>
+                <m:sty m:val="p"/>
+              </m:rPr>
+              <m:t>a</m:t>
+            </m:r>
+            <m:r>
+              <m:rPr>
+                <m:sty m:val="p"/>
+              </m:rPr>
+              <m:t>i</m:t>
+            </m:r>
+            <m:r>
+              <m:rPr>
+                <m:sty m:val="p"/>
+              </m:rPr>
+              <m:t>n</m:t>
+            </m:r>
+          </m:sub>
+        </m:sSub>
         <m:r>
           <m:rPr>
             <m:sty m:val="p"/>
@@ -6833,239 +6548,6 @@
           <m:t>=</m:t>
         </m:r>
         <m:r>
-          <m:t>0.6</m:t>
-        </m:r>
-      </m:oMath>
-      <w:r>
-        <w:rPr>
-          <w:i/>
-          <w:iCs/>
-        </w:rPr>
-        <w:t xml:space="preserve"> </w:t>
-      </w:r>
-      <w:r>
-        <w:rPr>
-          <w:i/>
-          <w:iCs/>
-        </w:rPr>
-        <w:t xml:space="preserve">cropped). Dashed: the matched left-to-right filler — a causal fill sits on it. Top row: GPQA, MATH, HumanEval (12 rollouts each, default sampler,</w:t>
-      </w:r>
-      <w:r>
-        <w:rPr>
-          <w:i/>
-          <w:iCs/>
-        </w:rPr>
-        <w:t xml:space="preserve"> </w:t>
-      </w:r>
-      <m:oMath>
-        <m:r>
-          <m:t>C</m:t>
-        </m:r>
-        <m:r>
-          <m:rPr>
-            <m:sty m:val="p"/>
-          </m:rPr>
-          <m:t>=</m:t>
-        </m:r>
-        <m:r>
-          <m:t>256</m:t>
-        </m:r>
-      </m:oMath>
-      <w:r>
-        <w:rPr>
-          <w:i/>
-          <w:iCs/>
-        </w:rPr>
-        <w:t xml:space="preserve">; argmax lock-in as commitment proxy) track the filler. Bottom row:</w:t>
-      </w:r>
-      <w:r>
-        <w:rPr>
-          <w:i/>
-          <w:iCs/>
-        </w:rPr>
-        <w:t xml:space="preserve"> </w:t>
-      </w:r>
-      <w:r>
-        <w:rPr>
-          <w:rStyle w:val="VerbatimChar"/>
-          <w:i/>
-          <w:iCs/>
-        </w:rPr>
-        <w:t xml:space="preserve">palindrome_words</w:t>
-      </w:r>
-      <w:r>
-        <w:rPr>
-          <w:i/>
-          <w:iCs/>
-        </w:rPr>
-        <w:t xml:space="preserve"> </w:t>
-      </w:r>
-      <w:r>
-        <w:rPr>
-          <w:i/>
-          <w:iCs/>
-        </w:rPr>
-        <w:t xml:space="preserve">fills in bursts,</w:t>
-      </w:r>
-      <w:r>
-        <w:rPr>
-          <w:i/>
-          <w:iCs/>
-        </w:rPr>
-        <w:t xml:space="preserve"> </w:t>
-      </w:r>
-      <w:r>
-        <w:rPr>
-          <w:rStyle w:val="VerbatimChar"/>
-          <w:i/>
-          <w:iCs/>
-        </w:rPr>
-        <w:t xml:space="preserve">ends_with</w:t>
-      </w:r>
-      <w:r>
-        <w:rPr>
-          <w:i/>
-          <w:iCs/>
-        </w:rPr>
-        <w:t xml:space="preserve"> </w:t>
-      </w:r>
-      <w:r>
-        <w:rPr>
-          <w:i/>
-          <w:iCs/>
-        </w:rPr>
-        <w:t xml:space="preserve">sits above the filler early (the anchored final word commits first), and on</w:t>
-      </w:r>
-      <w:r>
-        <w:rPr>
-          <w:i/>
-          <w:iCs/>
-        </w:rPr>
-        <w:t xml:space="preserve"> </w:t>
-      </w:r>
-      <w:r>
-        <w:rPr>
-          <w:rStyle w:val="VerbatimChar"/>
-          <w:i/>
-          <w:iCs/>
-        </w:rPr>
-        <w:t xml:space="preserve">reverse_chain</w:t>
-      </w:r>
-      <w:r>
-        <w:rPr>
-          <w:i/>
-          <w:iCs/>
-        </w:rPr>
-        <w:t xml:space="preserve"> </w:t>
-      </w:r>
-      <w:r>
-        <w:rPr>
-          <w:i/>
-          <w:iCs/>
-        </w:rPr>
-        <w:t xml:space="preserve">(depths 4–5) the solving runs (green)</w:t>
-      </w:r>
-      <w:r>
-        <w:rPr>
-          <w:i/>
-          <w:iCs/>
-        </w:rPr>
-        <w:t xml:space="preserve"> </w:t>
-      </w:r>
-      <w:r>
-        <w:rPr>
-          <w:i/>
-          <w:i/>
-          <w:iCs/>
-          <w:iCs/>
-        </w:rPr>
-        <w:t xml:space="preserve">start</w:t>
-      </w:r>
-      <w:r>
-        <w:rPr>
-          <w:i/>
-          <w:iCs/>
-        </w:rPr>
-        <w:t xml:space="preserve"> </w:t>
-      </w:r>
-      <w:r>
-        <w:rPr>
-          <w:i/>
-          <w:iCs/>
-        </w:rPr>
-        <w:t xml:space="preserve">at the anchored end and walk backward, while failing runs (grey) rise like a causal fill.</w:t>
-      </w:r>
-      <w:r>
-        <w:rPr>
-          <w:i/>
-          <w:iCs/>
-        </w:rPr>
-        <w:t xml:space="preserve"> </w:t>
-      </w:r>
-      <m:oMath>
-        <m:sSub>
-          <m:e>
-            <m:r>
-              <m:t>ρ</m:t>
-            </m:r>
-          </m:e>
-          <m:sub>
-            <m:r>
-              <m:rPr>
-                <m:sty m:val="p"/>
-              </m:rPr>
-              <m:t>c</m:t>
-            </m:r>
-            <m:r>
-              <m:rPr>
-                <m:sty m:val="p"/>
-              </m:rPr>
-              <m:t>h</m:t>
-            </m:r>
-            <m:r>
-              <m:rPr>
-                <m:sty m:val="p"/>
-              </m:rPr>
-              <m:t>a</m:t>
-            </m:r>
-            <m:r>
-              <m:rPr>
-                <m:sty m:val="p"/>
-              </m:rPr>
-              <m:t>i</m:t>
-            </m:r>
-            <m:r>
-              <m:rPr>
-                <m:sty m:val="p"/>
-              </m:rPr>
-              <m:t>n</m:t>
-            </m:r>
-          </m:sub>
-        </m:sSub>
-      </m:oMath>
-      <w:r>
-        <w:rPr>
-          <w:i/>
-          <w:iCs/>
-        </w:rPr>
-        <w:t xml:space="preserve"> </w:t>
-      </w:r>
-      <w:r>
-        <w:rPr>
-          <w:i/>
-          <w:iCs/>
-        </w:rPr>
-        <w:t xml:space="preserve">= median Spearman of final-commit step vs position; for reverse_chain it is canvas-level (including separators) — digits-only, the correct runs reach</w:t>
-      </w:r>
-      <w:r>
-        <w:rPr>
-          <w:i/>
-          <w:iCs/>
-        </w:rPr>
-        <w:t xml:space="preserve"> </w:t>
-      </w:r>
-      <m:oMath>
-        <m:r>
           <m:rPr>
             <m:sty m:val="p"/>
           </m:rPr>
@@ -7101,7 +6583,33 @@
           <w:i/>
           <w:iCs/>
         </w:rPr>
-        <w:t xml:space="preserve">.</w:t>
+        <w:t xml:space="preserve">; panel</w:t>
+      </w:r>
+      <w:r>
+        <w:rPr>
+          <w:i/>
+          <w:iCs/>
+        </w:rPr>
+        <w:t xml:space="preserve"> </w:t>
+      </w:r>
+      <m:oMath>
+        <m:r>
+          <m:t>ρ</m:t>
+        </m:r>
+      </m:oMath>
+      <w:r>
+        <w:rPr>
+          <w:i/>
+          <w:iCs/>
+        </w:rPr>
+        <w:t xml:space="preserve"> </w:t>
+      </w:r>
+      <w:r>
+        <w:rPr>
+          <w:i/>
+          <w:iCs/>
+        </w:rPr>
+        <w:t xml:space="preserve">is canvas-level), failing runs fill forward.</w:t>
       </w:r>
     </w:p>
     <w:bookmarkEnd w:id="86"/>

</xml_diff>

<commit_message>
Overlay LLM-judged logical order (rho_logic) on the causality panels; poems confirmed direction-indifferent
Co-Authored-By: Claude Fable 5 <noreply@anthropic.com>
Claude-Session: https://claude.ai/code/session_01U8CiyQ7ySpBDkYEq4FzNBU
</commit_message>
<xml_diff>
--- a/post.docx
+++ b/post.docx
@@ -6326,7 +6326,7 @@
           <w:i/>
           <w:iCs/>
         </w:rPr>
-        <w:t xml:space="preserve">Commitment order follows the task’s logical direction — with a causal default.</w:t>
+        <w:t xml:space="preserve">Commitment order follows the task’s logical direction, but defaults to causality when ambiguous.</w:t>
       </w:r>
       <w:r>
         <w:rPr>
@@ -6366,7 +6366,7 @@
           <w:i/>
           <w:iCs/>
         </w:rPr>
-        <w:t xml:space="preserve">(0 = left, 1 = right of the content span; 0.5 = fully committed) over diffusion progress</w:t>
+        <w:t xml:space="preserve">(0 = left, 1 = right of the content span) over diffusion progress</w:t>
       </w:r>
       <w:r>
         <w:rPr>
@@ -6401,215 +6401,41 @@
           <w:i/>
           <w:iCs/>
         </w:rPr>
-        <w:t xml:space="preserve">(faint = single rollouts, bold = mean; frozen tail cropped; default sampler, argmax lock-in as commitment proxy;</w:t>
-      </w:r>
-      <w:r>
-        <w:rPr>
-          <w:i/>
-          <w:iCs/>
-        </w:rPr>
-        <w:t xml:space="preserve"> </w:t>
-      </w:r>
-      <m:oMath>
-        <m:sSub>
-          <m:e>
-            <m:r>
-              <m:t>ρ</m:t>
-            </m:r>
-          </m:e>
-          <m:sub>
-            <m:r>
-              <m:rPr>
-                <m:sty m:val="p"/>
-              </m:rPr>
-              <m:t>c</m:t>
-            </m:r>
-            <m:r>
-              <m:rPr>
-                <m:sty m:val="p"/>
-              </m:rPr>
-              <m:t>h</m:t>
-            </m:r>
-            <m:r>
-              <m:rPr>
-                <m:sty m:val="p"/>
-              </m:rPr>
-              <m:t>a</m:t>
-            </m:r>
-            <m:r>
-              <m:rPr>
-                <m:sty m:val="p"/>
-              </m:rPr>
-              <m:t>i</m:t>
-            </m:r>
-            <m:r>
-              <m:rPr>
-                <m:sty m:val="p"/>
-              </m:rPr>
-              <m:t>n</m:t>
-            </m:r>
-          </m:sub>
-        </m:sSub>
-      </m:oMath>
-      <w:r>
-        <w:rPr>
-          <w:i/>
-          <w:iCs/>
-        </w:rPr>
-        <w:t xml:space="preserve"> </w:t>
-      </w:r>
-      <w:r>
-        <w:rPr>
-          <w:i/>
-          <w:iCs/>
-        </w:rPr>
-        <w:t xml:space="preserve">= median Spearman of final-commit step vs position). Dashed: matched left-to-right filler — a strictly causal fill sits on it. Left: GPQA (logically left-to-right) tracks the filler. Middle: poem writing (direction-indifferent) commits faster and less orderly, but still left-leaning — the inherited causal default. Right: the end-anchored</w:t>
-      </w:r>
-      <w:r>
-        <w:rPr>
-          <w:i/>
-          <w:iCs/>
-        </w:rPr>
-        <w:t xml:space="preserve"> </w:t>
-      </w:r>
-      <w:r>
-        <w:rPr>
-          <w:rStyle w:val="VerbatimChar"/>
+        <w:t xml:space="preserve">(faint = single rollouts, bold = mean).</w:t>
+      </w:r>
+    </w:p>
+    <w:p>
+      <w:pPr>
+        <w:pStyle w:val="BodyText"/>
+      </w:pPr>
+      <w:r>
+        <w:t xml:space="preserve">We considered three tasks. GPQA, which involves logic-style problems and therefore shoudl require left-to-right generation,</w:t>
+      </w:r>
+      <w:r>
+        <w:t xml:space="preserve"> </w:t>
+      </w:r>
+      <w:r>
+        <w:rPr>
+          <w:i/>
+          <w:iCs/>
+        </w:rPr>
+        <w:t xml:space="preserve">poem writing</w:t>
+      </w:r>
+      <w:r>
+        <w:t xml:space="preserve">, which has no clear left-to-rigth bias but only needs to satisfy a global structure, and</w:t>
+      </w:r>
+      <w:r>
+        <w:t xml:space="preserve"> </w:t>
+      </w:r>
+      <w:r>
+        <w:rPr>
           <w:i/>
           <w:iCs/>
         </w:rPr>
         <w:t xml:space="preserve">reverse_chain</w:t>
       </w:r>
       <w:r>
-        <w:rPr>
-          <w:i/>
-          <w:iCs/>
-        </w:rPr>
-        <w:t xml:space="preserve"> </w:t>
-      </w:r>
-      <w:r>
-        <w:rPr>
-          <w:i/>
-          <w:iCs/>
-        </w:rPr>
-        <w:t xml:space="preserve">(logically right-to-left, depths 4–5): solving runs (green) start at the anchored end and walk backward (digits-only</w:t>
-      </w:r>
-      <w:r>
-        <w:rPr>
-          <w:i/>
-          <w:iCs/>
-        </w:rPr>
-        <w:t xml:space="preserve"> </w:t>
-      </w:r>
-      <m:oMath>
-        <m:sSub>
-          <m:e>
-            <m:r>
-              <m:t>ρ</m:t>
-            </m:r>
-          </m:e>
-          <m:sub>
-            <m:r>
-              <m:rPr>
-                <m:sty m:val="p"/>
-              </m:rPr>
-              <m:t>c</m:t>
-            </m:r>
-            <m:r>
-              <m:rPr>
-                <m:sty m:val="p"/>
-              </m:rPr>
-              <m:t>h</m:t>
-            </m:r>
-            <m:r>
-              <m:rPr>
-                <m:sty m:val="p"/>
-              </m:rPr>
-              <m:t>a</m:t>
-            </m:r>
-            <m:r>
-              <m:rPr>
-                <m:sty m:val="p"/>
-              </m:rPr>
-              <m:t>i</m:t>
-            </m:r>
-            <m:r>
-              <m:rPr>
-                <m:sty m:val="p"/>
-              </m:rPr>
-              <m:t>n</m:t>
-            </m:r>
-          </m:sub>
-        </m:sSub>
-        <m:r>
-          <m:rPr>
-            <m:sty m:val="p"/>
-          </m:rPr>
-          <m:t>=</m:t>
-        </m:r>
-        <m:r>
-          <m:rPr>
-            <m:sty m:val="p"/>
-          </m:rPr>
-          <m:t>−</m:t>
-        </m:r>
-        <m:r>
-          <m:t>0.89</m:t>
-        </m:r>
-        <m:r>
-          <m:rPr>
-            <m:sty m:val="p"/>
-          </m:rPr>
-          <m:t>.</m:t>
-        </m:r>
-        <m:r>
-          <m:rPr>
-            <m:sty m:val="p"/>
-          </m:rPr>
-          <m:t>.</m:t>
-        </m:r>
-        <m:r>
-          <m:rPr>
-            <m:sty m:val="p"/>
-          </m:rPr>
-          <m:t>−</m:t>
-        </m:r>
-        <m:r>
-          <m:t>0.97</m:t>
-        </m:r>
-      </m:oMath>
-      <w:r>
-        <w:rPr>
-          <w:i/>
-          <w:iCs/>
-        </w:rPr>
-        <w:t xml:space="preserve">; panel</w:t>
-      </w:r>
-      <w:r>
-        <w:rPr>
-          <w:i/>
-          <w:iCs/>
-        </w:rPr>
-        <w:t xml:space="preserve"> </w:t>
-      </w:r>
-      <m:oMath>
-        <m:r>
-          <m:t>ρ</m:t>
-        </m:r>
-      </m:oMath>
-      <w:r>
-        <w:rPr>
-          <w:i/>
-          <w:iCs/>
-        </w:rPr>
-        <w:t xml:space="preserve"> </w:t>
-      </w:r>
-      <w:r>
-        <w:rPr>
-          <w:i/>
-          <w:iCs/>
-        </w:rPr>
-        <w:t xml:space="preserve">is canvas-level), failing runs fill forward.</w:t>
+        <w:t xml:space="preserve">, which requires the model to reverse its reasoning order.</w:t>
       </w:r>
     </w:p>
     <w:bookmarkEnd w:id="86"/>

</xml_diff>

<commit_message>
Judge overlay text: caption clause + body note; AGENTS gotchas
Co-Authored-By: Claude Fable 5 <noreply@anthropic.com>
Claude-Session: https://claude.ai/code/session_01U8CiyQ7ySpBDkYEq4FzNBU
</commit_message>
<xml_diff>
--- a/post.docx
+++ b/post.docx
@@ -6401,7 +6401,69 @@
           <w:i/>
           <w:iCs/>
         </w:rPr>
-        <w:t xml:space="preserve">(faint = single rollouts, bold = mean).</w:t>
+        <w:t xml:space="preserve">(faint = single rollouts, bold = mean; dashed = matched left-to-right filler). Italic overlay: LLM-judged logical order of the content itself —</w:t>
+      </w:r>
+      <w:r>
+        <w:rPr>
+          <w:i/>
+          <w:iCs/>
+        </w:rPr>
+        <w:t xml:space="preserve"> </w:t>
+      </w:r>
+      <m:oMath>
+        <m:sSub>
+          <m:e>
+            <m:r>
+              <m:t>ρ</m:t>
+            </m:r>
+          </m:e>
+          <m:sub>
+            <m:r>
+              <m:rPr>
+                <m:sty m:val="p"/>
+              </m:rPr>
+              <m:t>l</m:t>
+            </m:r>
+            <m:r>
+              <m:rPr>
+                <m:sty m:val="p"/>
+              </m:rPr>
+              <m:t>o</m:t>
+            </m:r>
+            <m:r>
+              <m:rPr>
+                <m:sty m:val="p"/>
+              </m:rPr>
+              <m:t>g</m:t>
+            </m:r>
+            <m:r>
+              <m:rPr>
+                <m:sty m:val="p"/>
+              </m:rPr>
+              <m:t>i</m:t>
+            </m:r>
+            <m:r>
+              <m:rPr>
+                <m:sty m:val="p"/>
+              </m:rPr>
+              <m:t>c</m:t>
+            </m:r>
+          </m:sub>
+        </m:sSub>
+      </m:oMath>
+      <w:r>
+        <w:rPr>
+          <w:i/>
+          <w:iCs/>
+        </w:rPr>
+        <w:t xml:space="preserve"> </w:t>
+      </w:r>
+      <w:r>
+        <w:rPr>
+          <w:i/>
+          <w:iCs/>
+        </w:rPr>
+        <w:t xml:space="preserve">= Spearman between surface order and the dependency-derivation depth of judged content atoms (median over rollouts).</w:t>
       </w:r>
     </w:p>
     <w:p>
@@ -6436,6 +6498,97 @@
       </w:r>
       <w:r>
         <w:t xml:space="preserve">, which requires the model to reverse its reasoning order.</w:t>
+      </w:r>
+    </w:p>
+    <w:p>
+      <w:pPr>
+        <w:pStyle w:val="BodyText"/>
+      </w:pPr>
+      <w:r>
+        <w:t xml:space="preserve">[stub:] To check the presumed directions against the</w:t>
+      </w:r>
+      <w:r>
+        <w:t xml:space="preserve"> </w:t>
+      </w:r>
+      <w:r>
+        <w:rPr>
+          <w:i/>
+          <w:iCs/>
+        </w:rPr>
+        <w:t xml:space="preserve">actual</w:t>
+      </w:r>
+      <w:r>
+        <w:t xml:space="preserve"> </w:t>
+      </w:r>
+      <w:r>
+        <w:t xml:space="preserve">generations, an LLM judge (Qwen3.6-35B, self-hosted) decomposed each output into content atoms and their logical dependency graph. GPQA outputs are genuinely inductive (</w:t>
+      </w:r>
+      <m:oMath>
+        <m:sSub>
+          <m:e>
+            <m:r>
+              <m:t>ρ</m:t>
+            </m:r>
+          </m:e>
+          <m:sub>
+            <m:r>
+              <m:rPr>
+                <m:sty m:val="p"/>
+              </m:rPr>
+              <m:t>l</m:t>
+            </m:r>
+            <m:r>
+              <m:rPr>
+                <m:sty m:val="p"/>
+              </m:rPr>
+              <m:t>o</m:t>
+            </m:r>
+            <m:r>
+              <m:rPr>
+                <m:sty m:val="p"/>
+              </m:rPr>
+              <m:t>g</m:t>
+            </m:r>
+            <m:r>
+              <m:rPr>
+                <m:sty m:val="p"/>
+              </m:rPr>
+              <m:t>i</m:t>
+            </m:r>
+            <m:r>
+              <m:rPr>
+                <m:sty m:val="p"/>
+              </m:rPr>
+              <m:t>c</m:t>
+            </m:r>
+          </m:sub>
+        </m:sSub>
+        <m:r>
+          <m:rPr>
+            <m:sty m:val="p"/>
+          </m:rPr>
+          <m:t>=</m:t>
+        </m:r>
+        <m:r>
+          <m:rPr>
+            <m:sty m:val="p"/>
+          </m:rPr>
+          <m:t>+</m:t>
+        </m:r>
+        <m:r>
+          <m:t>0.87</m:t>
+        </m:r>
+      </m:oMath>
+      <w:r>
+        <w:t xml:space="preserve">), while the generated poems show no inductive structure (</w:t>
+      </w:r>
+      <m:oMath>
+        <m:r>
+          <m:t>0.00</m:t>
+        </m:r>
+      </m:oMath>
+      <w:r>
+        <w:t xml:space="preserve">) — the direction-indifferent label holds, the poems are not secretly chained.</w:t>
       </w:r>
     </w:p>
     <w:bookmarkEnd w:id="86"/>

</xml_diff>

<commit_message>
rho_logic redefined: judge states the logical ordering of its atom decomposition directly (tied groups); GPQA +0.96, poems 0.00
Co-Authored-By: Claude Fable 5 <noreply@anthropic.com>
Claude-Session: https://claude.ai/code/session_01U8CiyQ7ySpBDkYEq4FzNBU
</commit_message>
<xml_diff>
--- a/post.docx
+++ b/post.docx
@@ -6401,7 +6401,7 @@
           <w:i/>
           <w:iCs/>
         </w:rPr>
-        <w:t xml:space="preserve">(faint = single rollouts, bold = mean; dashed = matched left-to-right filler). Italic overlay: LLM-judged logical order of the content itself —</w:t>
+        <w:t xml:space="preserve">(faint = single rollouts, bold = mean). Italic overlay:</w:t>
       </w:r>
       <w:r>
         <w:rPr>
@@ -6463,7 +6463,7 @@
           <w:i/>
           <w:iCs/>
         </w:rPr>
-        <w:t xml:space="preserve">= Spearman between surface order and the dependency-derivation depth of judged content atoms (median over rollouts).</w:t>
+        <w:t xml:space="preserve">= Spearman between the judge’s logical ordering of its own atom decomposition and the atoms’ positions in the text (ties allowed; median over rollouts).</w:t>
       </w:r>
     </w:p>
     <w:p>
@@ -6521,7 +6521,57 @@
         <w:t xml:space="preserve"> </w:t>
       </w:r>
       <w:r>
-        <w:t xml:space="preserve">generations, an LLM judge (Qwen3.6-35B, self-hosted) decomposed each output into content atoms and their logical dependency graph. GPQA outputs are genuinely inductive (</w:t>
+        <w:t xml:space="preserve">generations, an LLM judge (Qwen3.6-35B, self-hosted) decomposed each output into content atoms and stated their logical derivation order (as an ordered list of groups; atoms within a group are mutually order-independent).</w:t>
+      </w:r>
+      <w:r>
+        <w:t xml:space="preserve"> </w:t>
+      </w:r>
+      <m:oMath>
+        <m:sSub>
+          <m:e>
+            <m:r>
+              <m:t>ρ</m:t>
+            </m:r>
+          </m:e>
+          <m:sub>
+            <m:r>
+              <m:rPr>
+                <m:sty m:val="p"/>
+              </m:rPr>
+              <m:t>l</m:t>
+            </m:r>
+            <m:r>
+              <m:rPr>
+                <m:sty m:val="p"/>
+              </m:rPr>
+              <m:t>o</m:t>
+            </m:r>
+            <m:r>
+              <m:rPr>
+                <m:sty m:val="p"/>
+              </m:rPr>
+              <m:t>g</m:t>
+            </m:r>
+            <m:r>
+              <m:rPr>
+                <m:sty m:val="p"/>
+              </m:rPr>
+              <m:t>i</m:t>
+            </m:r>
+            <m:r>
+              <m:rPr>
+                <m:sty m:val="p"/>
+              </m:rPr>
+              <m:t>c</m:t>
+            </m:r>
+          </m:sub>
+        </m:sSub>
+      </m:oMath>
+      <w:r>
+        <w:t xml:space="preserve"> </w:t>
+      </w:r>
+      <w:r>
+        <w:t xml:space="preserve">is the Spearman correlation between this logical ordering and the atoms’ positions in the text. GPQA outputs are genuinely inductive (</w:t>
       </w:r>
       <m:oMath>
         <m:sSub>
@@ -6576,11 +6626,11 @@
           <m:t>+</m:t>
         </m:r>
         <m:r>
-          <m:t>0.87</m:t>
-        </m:r>
-      </m:oMath>
-      <w:r>
-        <w:t xml:space="preserve">), while the generated poems show no inductive structure (</w:t>
+          <m:t>0.96</m:t>
+        </m:r>
+      </m:oMath>
+      <w:r>
+        <w:t xml:space="preserve">), while every generated poem is judged fully order-independent (</w:t>
       </w:r>
       <m:oMath>
         <m:r>

</xml_diff>

<commit_message>
posthoc: user rewrite of the section intro (Thought Anchors framing, AR-vs-DG monitorability); fold judge stub into causality caption
Co-Authored-By: Claude Fable 5 <noreply@anthropic.com>
</commit_message>
<xml_diff>
--- a/post.docx
+++ b/post.docx
@@ -5328,13 +5328,13 @@
       </w:r>
     </w:p>
     <w:bookmarkEnd w:id="67"/>
-    <w:bookmarkStart w:id="78" w:name="is-the-cot-load-bearing-or-post-hoc"/>
+    <w:bookmarkStart w:id="78" w:name="post-hoc-rationalization"/>
     <w:p>
       <w:pPr>
         <w:pStyle w:val="Heading3"/>
       </w:pPr>
       <w:r>
-        <w:t xml:space="preserve">Is the CoT load-bearing or post-hoc?</w:t>
+        <w:t xml:space="preserve">Post-hoc rationalization</w:t>
       </w:r>
     </w:p>
     <w:p>
@@ -5342,184 +5342,15 @@
         <w:pStyle w:val="FirstParagraph"/>
       </w:pPr>
       <w:r>
-        <w:t xml:space="preserve">[stub:] With the answer forced onto the first line (answer-first framing), we measured for 20 problems: the</w:t>
-      </w:r>
-      <w:r>
-        <w:t xml:space="preserve"> </w:t>
-      </w:r>
-      <w:r>
-        <w:rPr>
-          <w:i/>
-          <w:iCs/>
-        </w:rPr>
-        <w:t xml:space="preserve">commitment time</w:t>
-      </w:r>
-      <w:r>
-        <w:t xml:space="preserve"> </w:t>
-      </w:r>
-      <w:r>
-        <w:t xml:space="preserve">(denoising step at which the answer slot freezes), the</w:t>
-      </w:r>
-      <w:r>
-        <w:t xml:space="preserve"> </w:t>
-      </w:r>
-      <w:r>
-        <w:rPr>
-          <w:i/>
-          <w:iCs/>
-        </w:rPr>
-        <w:t xml:space="preserve">susceptibility</w:t>
-      </w:r>
-      <w:r>
-        <w:t xml:space="preserve"> </w:t>
-      </w:r>
-      <m:oMath>
-        <m:r>
-          <m:t>S</m:t>
-        </m:r>
-      </m:oMath>
-      <w:r>
-        <w:t xml:space="preserve"> </w:t>
-      </w:r>
-      <w:r>
-        <w:t xml:space="preserve">(probability the answer changes when the CoT positions of the canvas</w:t>
-      </w:r>
-      <w:r>
-        <w:t xml:space="preserve"> </w:t>
-      </w:r>
-      <m:oMath>
-        <m:sSup>
-          <m:e>
-            <m:r>
-              <m:t>X</m:t>
-            </m:r>
-          </m:e>
-          <m:sup>
-            <m:r>
-              <m:t>t</m:t>
-            </m:r>
-          </m:sup>
-        </m:sSup>
-      </m:oMath>
-      <w:r>
-        <w:t xml:space="preserve"> </w:t>
-      </w:r>
-      <w:r>
-        <w:t xml:space="preserve">are clamped to a partially-randomized version at every step — an intervention on the visible tokens, not on</w:t>
-      </w:r>
-      <w:r>
-        <w:t xml:space="preserve"> </w:t>
-      </w:r>
-      <m:oMath>
-        <m:sSup>
-          <m:e>
-            <m:r>
-              <m:rPr>
-                <m:sty m:val="b"/>
-              </m:rPr>
-              <m:t>S</m:t>
-            </m:r>
-          </m:e>
-          <m:sup>
-            <m:r>
-              <m:t>t</m:t>
-            </m:r>
-          </m:sup>
-        </m:sSup>
-      </m:oMath>
-      <w:r>
-        <w:t xml:space="preserve">; the self-conditioning at clamped positions is zeroed), and a</w:t>
-      </w:r>
-      <w:r>
-        <w:t xml:space="preserve"> </w:t>
-      </w:r>
-      <w:r>
-        <w:rPr>
-          <w:i/>
-          <w:iCs/>
-        </w:rPr>
-        <w:t xml:space="preserve">blind difficulty</w:t>
-      </w:r>
-      <w:r>
-        <w:t xml:space="preserve"> </w:t>
-      </w:r>
-      <w:r>
-        <w:t xml:space="preserve">rating (three subagents shown only the problem text). Nominal difficulty is a weak proxy; the proximal predictor of a load-bearing CoT is the measured commitment time (</w:t>
-      </w:r>
-      <m:oMath>
-        <m:sSub>
-          <m:e>
-            <m:r>
-              <m:t>ρ</m:t>
-            </m:r>
-          </m:e>
-          <m:sub>
-            <m:r>
-              <m:t>S</m:t>
-            </m:r>
-          </m:sub>
-        </m:sSub>
-        <m:r>
-          <m:rPr>
-            <m:sty m:val="p"/>
-          </m:rPr>
-          <m:t>=</m:t>
-        </m:r>
-        <m:r>
-          <m:rPr>
-            <m:sty m:val="p"/>
-          </m:rPr>
-          <m:t>+</m:t>
-        </m:r>
-        <m:r>
-          <m:t>0.66</m:t>
-        </m:r>
-      </m:oMath>
-      <w:r>
-        <w:t xml:space="preserve">; sharpened to</w:t>
-      </w:r>
-      <w:r>
-        <w:t xml:space="preserve"> </w:t>
-      </w:r>
-      <m:oMath>
-        <m:r>
-          <m:rPr>
-            <m:sty m:val="p"/>
-          </m:rPr>
-          <m:t>+</m:t>
-        </m:r>
-        <m:r>
-          <m:t>0.80</m:t>
-        </m:r>
-      </m:oMath>
-      <w:r>
-        <w:t xml:space="preserve"> </w:t>
-      </w:r>
-      <w:r>
-        <w:t xml:space="preserve">pooled across a temperature sweep). CRT-style problems commit at step 0 with</w:t>
-      </w:r>
-      <w:r>
-        <w:t xml:space="preserve"> </w:t>
-      </w:r>
-      <m:oMath>
-        <m:r>
-          <m:t>S</m:t>
-        </m:r>
-        <m:r>
-          <m:rPr>
-            <m:sty m:val="p"/>
-          </m:rPr>
-          <m:t>=</m:t>
-        </m:r>
-        <m:r>
-          <m:t>0</m:t>
-        </m:r>
-      </m:oMath>
-      <w:r>
-        <w:t xml:space="preserve"> </w:t>
-      </w:r>
-      <w:r>
-        <w:t xml:space="preserve">(the CoT is post-hoc); serial counting problems commit late and break under corruption (the CoT is load-bearing).</w:t>
+        <w:t xml:space="preserve">An important question in monitorability (CITE: Thought Anchors) is whether the CoT is actually being used. An approach to measure this is to intervene on a fragment of the CoT, and see whether the answer changes.</w:t>
+      </w:r>
+    </w:p>
+    <w:p>
+      <w:pPr>
+        <w:pStyle w:val="BodyText"/>
+      </w:pPr>
+      <w:r>
+        <w:t xml:space="preserve">For autoregressive models, the answer appears after the CoT. This limits the ability for the CoT to be irrelevant, since otherwise the model would have needed to compute the answer without using the CoT tokens at all. In contrast, DiffusionGemma may arrive at an answer throughout multiple steps of computation, and then fill in a CoT post-hoc to match the format of the training distribution. An increased presence of such post-hoc rationalization relative to Gemma would be a blackpill for DiffusionGemma’s monitorabiltiy.</w:t>
       </w:r>
     </w:p>
     <w:p>
@@ -5984,7 +5815,7 @@
         <w:pStyle w:val="FirstParagraph"/>
       </w:pPr>
       <w:r>
-        <w:t xml:space="preserve">[stub:] Finally, we probed how sticky a wrong answer is, on a clock-strike fencepost problem (</w:t>
+        <w:t xml:space="preserve">[stub, related to the idiom example] Finally, we probed how sticky a wrong answer is, on a clock-strike fencepost problem (</w:t>
       </w:r>
       <w:r>
         <w:rPr>
@@ -6401,7 +6232,7 @@
           <w:i/>
           <w:iCs/>
         </w:rPr>
-        <w:t xml:space="preserve">(faint = single rollouts, bold = mean). Italic overlay:</w:t>
+        <w:t xml:space="preserve">(faint = single rollouts, bold = mean).</w:t>
       </w:r>
       <w:r>
         <w:rPr>
@@ -6463,7 +6294,7 @@
           <w:i/>
           <w:iCs/>
         </w:rPr>
-        <w:t xml:space="preserve">= Spearman between the judge’s logical ordering of its own atom decomposition and the atoms’ positions in the text (ties allowed; median over rollouts).</w:t>
+        <w:t xml:space="preserve">= Spearman between the judge’s logical ordering of its own atom decomposition and the atoms’ positions in the text.</w:t>
       </w:r>
     </w:p>
     <w:p>
@@ -6498,147 +6329,6 @@
       </w:r>
       <w:r>
         <w:t xml:space="preserve">, which requires the model to reverse its reasoning order.</w:t>
-      </w:r>
-    </w:p>
-    <w:p>
-      <w:pPr>
-        <w:pStyle w:val="BodyText"/>
-      </w:pPr>
-      <w:r>
-        <w:t xml:space="preserve">[stub:] To check the presumed directions against the</w:t>
-      </w:r>
-      <w:r>
-        <w:t xml:space="preserve"> </w:t>
-      </w:r>
-      <w:r>
-        <w:rPr>
-          <w:i/>
-          <w:iCs/>
-        </w:rPr>
-        <w:t xml:space="preserve">actual</w:t>
-      </w:r>
-      <w:r>
-        <w:t xml:space="preserve"> </w:t>
-      </w:r>
-      <w:r>
-        <w:t xml:space="preserve">generations, an LLM judge (Qwen3.6-35B, self-hosted) decomposed each output into content atoms and stated their logical derivation order (as an ordered list of groups; atoms within a group are mutually order-independent).</w:t>
-      </w:r>
-      <w:r>
-        <w:t xml:space="preserve"> </w:t>
-      </w:r>
-      <m:oMath>
-        <m:sSub>
-          <m:e>
-            <m:r>
-              <m:t>ρ</m:t>
-            </m:r>
-          </m:e>
-          <m:sub>
-            <m:r>
-              <m:rPr>
-                <m:sty m:val="p"/>
-              </m:rPr>
-              <m:t>l</m:t>
-            </m:r>
-            <m:r>
-              <m:rPr>
-                <m:sty m:val="p"/>
-              </m:rPr>
-              <m:t>o</m:t>
-            </m:r>
-            <m:r>
-              <m:rPr>
-                <m:sty m:val="p"/>
-              </m:rPr>
-              <m:t>g</m:t>
-            </m:r>
-            <m:r>
-              <m:rPr>
-                <m:sty m:val="p"/>
-              </m:rPr>
-              <m:t>i</m:t>
-            </m:r>
-            <m:r>
-              <m:rPr>
-                <m:sty m:val="p"/>
-              </m:rPr>
-              <m:t>c</m:t>
-            </m:r>
-          </m:sub>
-        </m:sSub>
-      </m:oMath>
-      <w:r>
-        <w:t xml:space="preserve"> </w:t>
-      </w:r>
-      <w:r>
-        <w:t xml:space="preserve">is the Spearman correlation between this logical ordering and the atoms’ positions in the text. GPQA outputs are genuinely inductive (</w:t>
-      </w:r>
-      <m:oMath>
-        <m:sSub>
-          <m:e>
-            <m:r>
-              <m:t>ρ</m:t>
-            </m:r>
-          </m:e>
-          <m:sub>
-            <m:r>
-              <m:rPr>
-                <m:sty m:val="p"/>
-              </m:rPr>
-              <m:t>l</m:t>
-            </m:r>
-            <m:r>
-              <m:rPr>
-                <m:sty m:val="p"/>
-              </m:rPr>
-              <m:t>o</m:t>
-            </m:r>
-            <m:r>
-              <m:rPr>
-                <m:sty m:val="p"/>
-              </m:rPr>
-              <m:t>g</m:t>
-            </m:r>
-            <m:r>
-              <m:rPr>
-                <m:sty m:val="p"/>
-              </m:rPr>
-              <m:t>i</m:t>
-            </m:r>
-            <m:r>
-              <m:rPr>
-                <m:sty m:val="p"/>
-              </m:rPr>
-              <m:t>c</m:t>
-            </m:r>
-          </m:sub>
-        </m:sSub>
-        <m:r>
-          <m:rPr>
-            <m:sty m:val="p"/>
-          </m:rPr>
-          <m:t>=</m:t>
-        </m:r>
-        <m:r>
-          <m:rPr>
-            <m:sty m:val="p"/>
-          </m:rPr>
-          <m:t>+</m:t>
-        </m:r>
-        <m:r>
-          <m:t>0.96</m:t>
-        </m:r>
-      </m:oMath>
-      <w:r>
-        <w:t xml:space="preserve">), while every generated poem is judged fully order-independent (</w:t>
-      </w:r>
-      <m:oMath>
-        <m:r>
-          <m:t>0.00</m:t>
-        </m:r>
-      </m:oMath>
-      <w:r>
-        <w:t xml:space="preserve">) — the direction-indifferent label holds, the poems are not secretly chained.</w:t>
       </w:r>
     </w:p>
     <w:bookmarkEnd w:id="86"/>

</xml_diff>

<commit_message>
posthoc: fill Thought Anchors cite (Bogdan et al. 2025); add extension-battery merge script
Co-Authored-By: Claude Fable 5 <noreply@anthropic.com>
</commit_message>
<xml_diff>
--- a/post.docx
+++ b/post.docx
@@ -2,7 +2,7 @@
 <file path=word/document.xml><?xml version="1.0" encoding="utf-8"?>
 <w:document xmlns:w="http://schemas.openxmlformats.org/wordprocessingml/2006/main" xmlns:m="http://schemas.openxmlformats.org/officeDocument/2006/math" xmlns:r="http://schemas.openxmlformats.org/officeDocument/2006/relationships" xmlns:o="urn:schemas-microsoft-com:office:office" xmlns:v="urn:schemas-microsoft-com:vml" xmlns:w10="urn:schemas-microsoft-com:office:word" xmlns:a="http://schemas.openxmlformats.org/drawingml/2006/main" xmlns:pic="http://schemas.openxmlformats.org/drawingml/2006/picture" xmlns:wp="http://schemas.openxmlformats.org/drawingml/2006/wordprocessingDrawing">
   <w:body>
-    <w:bookmarkStart w:id="88" w:name="Xf5e660dc2e9c1a368125465a5756c31f66c44e2"/>
+    <w:bookmarkStart w:id="89" w:name="Xf5e660dc2e9c1a368125465a5756c31f66c44e2"/>
     <w:p>
       <w:pPr>
         <w:pStyle w:val="Heading1"/>
@@ -2910,7 +2910,7 @@
       </w:r>
     </w:p>
     <w:bookmarkEnd w:id="40"/>
-    <w:bookmarkStart w:id="87" w:name="appendix"/>
+    <w:bookmarkStart w:id="88" w:name="appendix"/>
     <w:p>
       <w:pPr>
         <w:pStyle w:val="Heading2"/>
@@ -5328,7 +5328,7 @@
       </w:r>
     </w:p>
     <w:bookmarkEnd w:id="67"/>
-    <w:bookmarkStart w:id="78" w:name="post-hoc-rationalization"/>
+    <w:bookmarkStart w:id="79" w:name="post-hoc-rationalization"/>
     <w:p>
       <w:pPr>
         <w:pStyle w:val="Heading3"/>
@@ -5342,7 +5342,18 @@
         <w:pStyle w:val="FirstParagraph"/>
       </w:pPr>
       <w:r>
-        <w:t xml:space="preserve">An important question in monitorability (CITE: Thought Anchors) is whether the CoT is actually being used. An approach to measure this is to intervene on a fragment of the CoT, and see whether the answer changes.</w:t>
+        <w:t xml:space="preserve">An important question in monitorability (</w:t>
+      </w:r>
+      <w:hyperlink r:id="rId68">
+        <w:r>
+          <w:rPr>
+            <w:rStyle w:val="Hyperlink"/>
+          </w:rPr>
+          <w:t xml:space="preserve">Bogdan et al., 2025</w:t>
+        </w:r>
+      </w:hyperlink>
+      <w:r>
+        <w:t xml:space="preserve">) is whether the CoT is actually being used. An approach to measure this is to intervene on a fragment of the CoT, and see whether the answer changes.</w:t>
       </w:r>
     </w:p>
     <w:p>
@@ -5362,18 +5373,18 @@
           <wp:inline>
             <wp:extent cx="5334000" cy="1619249"/>
             <wp:effectExtent b="0" l="0" r="0" t="0"/>
-            <wp:docPr descr="Post-hoc correlations" title="" id="69" name="Picture"/>
+            <wp:docPr descr="Post-hoc correlations" title="" id="70" name="Picture"/>
             <a:graphic>
               <a:graphicData uri="http://schemas.openxmlformats.org/drawingml/2006/picture">
                 <pic:pic>
                   <pic:nvPicPr>
-                    <pic:cNvPr descr="figs/figA8_posthoc_correlations.png" id="70" name="Picture"/>
+                    <pic:cNvPr descr="figs/figA8_posthoc_correlations.png" id="71" name="Picture"/>
                     <pic:cNvPicPr>
                       <a:picLocks noChangeArrowheads="1" noChangeAspect="1"/>
                     </pic:cNvPicPr>
                   </pic:nvPicPr>
                   <pic:blipFill>
-                    <a:blip r:embed="rId68"/>
+                    <a:blip r:embed="rId69"/>
                     <a:stretch>
                       <a:fillRect/>
                     </a:stretch>
@@ -5545,18 +5556,18 @@
           <wp:inline>
             <wp:extent cx="5334000" cy="1570566"/>
             <wp:effectExtent b="0" l="0" r="0" t="0"/>
-            <wp:docPr descr="Post-hoc case study" title="" id="72" name="Picture"/>
+            <wp:docPr descr="Post-hoc case study" title="" id="73" name="Picture"/>
             <a:graphic>
               <a:graphicData uri="http://schemas.openxmlformats.org/drawingml/2006/picture">
                 <pic:pic>
                   <pic:nvPicPr>
-                    <pic:cNvPr descr="figs/figA8b_posthoc_case.png" id="73" name="Picture"/>
+                    <pic:cNvPr descr="figs/figA8b_posthoc_case.png" id="74" name="Picture"/>
                     <pic:cNvPicPr>
                       <a:picLocks noChangeArrowheads="1" noChangeAspect="1"/>
                     </pic:cNvPicPr>
                   </pic:nvPicPr>
                   <pic:blipFill>
-                    <a:blip r:embed="rId71"/>
+                    <a:blip r:embed="rId72"/>
                     <a:stretch>
                       <a:fillRect/>
                     </a:stretch>
@@ -5699,7 +5710,7 @@
         <w:t xml:space="preserve">). Right: clamping a coherent lure CoT with a single off-by-one error (red) flips the answer to 9 in 5/5 seeds. Caveat: a target sweep shows the lure does not install its specific conclusion — the coherent-but-wrong CoT dislodges the answer into a nearby basin rather than steering it.</w:t>
       </w:r>
     </w:p>
-    <w:bookmarkStart w:id="77" w:name="answer-resolution-over-denoising-steps"/>
+    <w:bookmarkStart w:id="78" w:name="answer-resolution-over-denoising-steps"/>
     <w:p>
       <w:pPr>
         <w:pStyle w:val="Heading4"/>
@@ -5725,18 +5736,18 @@
           <wp:inline>
             <wp:extent cx="5334000" cy="2125265"/>
             <wp:effectExtent b="0" l="0" r="0" t="0"/>
-            <wp:docPr descr="Answer resolution" title="" id="75" name="Picture"/>
+            <wp:docPr descr="Answer resolution" title="" id="76" name="Picture"/>
             <a:graphic>
               <a:graphicData uri="http://schemas.openxmlformats.org/drawingml/2006/picture">
                 <pic:pic>
                   <pic:nvPicPr>
-                    <pic:cNvPr descr="figs/figA9_resolution.png" id="76" name="Picture"/>
+                    <pic:cNvPr descr="figs/figA9_resolution.png" id="77" name="Picture"/>
                     <pic:cNvPicPr>
                       <a:picLocks noChangeArrowheads="1" noChangeAspect="1"/>
                     </pic:cNvPicPr>
                   </pic:nvPicPr>
                   <pic:blipFill>
-                    <a:blip r:embed="rId74"/>
+                    <a:blip r:embed="rId75"/>
                     <a:stretch>
                       <a:fillRect/>
                     </a:stretch>
@@ -5799,9 +5810,9 @@
         <w:t xml:space="preserve">Mean token entropy of the answer positions (solid) and CoT positions (dashed) per denoising step. Left: bat_ball and monty — the answer is confident by step 1 (0 flips) while the CoT is still at ~3–4 nats. Right: reverse_then_add and sq1000 — the answer stays hot until the CoT cools, passing through the annotated value sequences before settling.</w:t>
       </w:r>
     </w:p>
-    <w:bookmarkEnd w:id="77"/>
     <w:bookmarkEnd w:id="78"/>
-    <w:bookmarkStart w:id="82" w:name="Xc88983d67b72bd3bbe7b5ed4c6ce8c17fda4537"/>
+    <w:bookmarkEnd w:id="79"/>
+    <w:bookmarkStart w:id="83" w:name="Xc88983d67b72bd3bbe7b5ed4c6ce8c17fda4537"/>
     <w:p>
       <w:pPr>
         <w:pStyle w:val="Heading3"/>
@@ -6009,18 +6020,18 @@
           <wp:inline>
             <wp:extent cx="5334000" cy="2117911"/>
             <wp:effectExtent b="0" l="0" r="0" t="0"/>
-            <wp:docPr descr="Self-repair clock" title="" id="80" name="Picture"/>
+            <wp:docPr descr="Self-repair clock" title="" id="81" name="Picture"/>
             <a:graphic>
               <a:graphicData uri="http://schemas.openxmlformats.org/drawingml/2006/picture">
                 <pic:pic>
                   <pic:nvPicPr>
-                    <pic:cNvPr descr="figs/figA10_selfrepair_clock.png" id="81" name="Picture"/>
+                    <pic:cNvPr descr="figs/figA10_selfrepair_clock.png" id="82" name="Picture"/>
                     <pic:cNvPicPr>
                       <a:picLocks noChangeArrowheads="1" noChangeAspect="1"/>
                     </pic:cNvPicPr>
                   </pic:nvPicPr>
                   <pic:blipFill>
-                    <a:blip r:embed="rId79"/>
+                    <a:blip r:embed="rId80"/>
                     <a:stretch>
                       <a:fillRect/>
                     </a:stretch>
@@ -6083,8 +6094,8 @@
         <w:t xml:space="preserve">Left: the first-line answer over denoising steps in natural cold runs (three seeds) — 12/18 appear transiently, all settle at 16. Right: a harvested wrong-18 state planted at varying steps and re-denoised: cold recipients stay stuck at every depth; very-hot recipients escape to 16 only when planted before ~step 48 of 128.</w:t>
       </w:r>
     </w:p>
-    <w:bookmarkEnd w:id="82"/>
-    <w:bookmarkStart w:id="86" w:name="Xd7c7dfb66314a32b0174c0001aa6561f67f2b90"/>
+    <w:bookmarkEnd w:id="83"/>
+    <w:bookmarkStart w:id="87" w:name="Xd7c7dfb66314a32b0174c0001aa6561f67f2b90"/>
     <w:p>
       <w:pPr>
         <w:pStyle w:val="Heading3"/>
@@ -6108,18 +6119,18 @@
           <wp:inline>
             <wp:extent cx="5334000" cy="1889125"/>
             <wp:effectExtent b="0" l="0" r="0" t="0"/>
-            <wp:docPr descr="Commitment causality" title="" id="84" name="Picture"/>
+            <wp:docPr descr="Commitment causality" title="" id="85" name="Picture"/>
             <a:graphic>
               <a:graphicData uri="http://schemas.openxmlformats.org/drawingml/2006/picture">
                 <pic:pic>
                   <pic:nvPicPr>
-                    <pic:cNvPr descr="figs/figA11_commit_causality.png" id="85" name="Picture"/>
+                    <pic:cNvPr descr="figs/figA11_commit_causality.png" id="86" name="Picture"/>
                     <pic:cNvPicPr>
                       <a:picLocks noChangeArrowheads="1" noChangeAspect="1"/>
                     </pic:cNvPicPr>
                   </pic:nvPicPr>
                   <pic:blipFill>
-                    <a:blip r:embed="rId83"/>
+                    <a:blip r:embed="rId84"/>
                     <a:stretch>
                       <a:fillRect/>
                     </a:stretch>
@@ -6331,9 +6342,9 @@
         <w:t xml:space="preserve">, which requires the model to reverse its reasoning order.</w:t>
       </w:r>
     </w:p>
-    <w:bookmarkEnd w:id="86"/>
     <w:bookmarkEnd w:id="87"/>
     <w:bookmarkEnd w:id="88"/>
+    <w:bookmarkEnd w:id="89"/>
     <w:sectPr>
       <w:footnotePr>
         <w:numRestart w:val="eachSect"/>

</xml_diff>

<commit_message>
posthoc case card: highlight the model's front answer in the shown output; drop the 'fluent off-by-one lure' parenthetical
Co-Authored-By: Claude Fable 5 <noreply@anthropic.com>
</commit_message>
<xml_diff>
--- a/post.docx
+++ b/post.docx
@@ -137,141 +137,7 @@
         <w:t xml:space="preserve"> </w:t>
       </w:r>
       <w:r>
-        <w:t xml:space="preserve">positions. The self-conditioning state</w:t>
-      </w:r>
-      <w:r>
-        <w:t xml:space="preserve"> </w:t>
-      </w:r>
-      <m:oMath>
-        <m:sSub>
-          <m:e>
-            <m:d>
-              <m:dPr>
-                <m:begChr m:val="("/>
-                <m:sepChr m:val=""/>
-                <m:endChr m:val=")"/>
-                <m:grow/>
-              </m:dPr>
-              <m:e>
-                <m:sSubSup>
-                  <m:e>
-                    <m:r>
-                      <m:rPr>
-                        <m:sty m:val="b"/>
-                      </m:rPr>
-                      <m:t>s</m:t>
-                    </m:r>
-                  </m:e>
-                  <m:sub>
-                    <m:r>
-                      <m:t>i</m:t>
-                    </m:r>
-                  </m:sub>
-                  <m:sup>
-                    <m:r>
-                      <m:t>0</m:t>
-                    </m:r>
-                  </m:sup>
-                </m:sSubSup>
-              </m:e>
-            </m:d>
-          </m:e>
-          <m:sub>
-            <m:r>
-              <m:t>i</m:t>
-            </m:r>
-            <m:r>
-              <m:rPr>
-                <m:sty m:val="p"/>
-              </m:rPr>
-              <m:t>=</m:t>
-            </m:r>
-            <m:r>
-              <m:t>1</m:t>
-            </m:r>
-            <m:r>
-              <m:rPr>
-                <m:sty m:val="p"/>
-              </m:rPr>
-              <m:t>…</m:t>
-            </m:r>
-            <m:r>
-              <m:t>C</m:t>
-            </m:r>
-          </m:sub>
-        </m:sSub>
-        <m:r>
-          <m:rPr>
-            <m:sty m:val="p"/>
-          </m:rPr>
-          <m:t>=</m:t>
-        </m:r>
-        <m:sSup>
-          <m:e>
-            <m:r>
-              <m:rPr>
-                <m:sty m:val="b"/>
-              </m:rPr>
-              <m:t>S</m:t>
-            </m:r>
-          </m:e>
-          <m:sup>
-            <m:r>
-              <m:t>0</m:t>
-            </m:r>
-          </m:sup>
-        </m:sSup>
-        <m:r>
-          <m:rPr>
-            <m:sty m:val="p"/>
-          </m:rPr>
-          <m:t>∈</m:t>
-        </m:r>
-        <m:sSup>
-          <m:e>
-            <m:r>
-              <m:rPr>
-                <m:sty m:val="p"/>
-                <m:scr m:val="double-struck"/>
-              </m:rPr>
-              <m:t>R</m:t>
-            </m:r>
-          </m:e>
-          <m:sup>
-            <m:r>
-              <m:t>C</m:t>
-            </m:r>
-            <m:r>
-              <m:rPr>
-                <m:sty m:val="p"/>
-              </m:rPr>
-              <m:t>×</m:t>
-            </m:r>
-            <m:d>
-              <m:dPr>
-                <m:begChr m:val="|"/>
-                <m:sepChr m:val=""/>
-                <m:endChr m:val="|"/>
-                <m:grow/>
-              </m:dPr>
-              <m:e>
-                <m:r>
-                  <m:rPr>
-                    <m:sty m:val="p"/>
-                    <m:scr m:val="script"/>
-                  </m:rPr>
-                  <m:t>V</m:t>
-                </m:r>
-              </m:e>
-            </m:d>
-          </m:sup>
-        </m:sSup>
-      </m:oMath>
-      <w:r>
-        <w:t xml:space="preserve"> </w:t>
-      </w:r>
-      <w:r>
-        <w:t xml:space="preserve">is initialised uniformly. Let</w:t>
+        <w:t xml:space="preserve">positions. Let</w:t>
       </w:r>
       <w:r>
         <w:t xml:space="preserve"> </w:t>

</xml_diff>

<commit_message>
figA9: regime-averaged over the n=40 battery (S-grouped, panel titles, faint singles + bold means); vendor anim_curves.json
Co-Authored-By: Claude Fable 5 <noreply@anthropic.com>
</commit_message>
<xml_diff>
--- a/post.docx
+++ b/post.docx
@@ -5673,7 +5673,98 @@
           <w:i/>
           <w:iCs/>
         </w:rPr>
-        <w:t xml:space="preserve">Mean token entropy of the answer positions (solid) and CoT positions (dashed) per denoising step. Left: bat_ball, monty, prod_then_digitsum — the answer is confident by step 1 (0 flips) while the CoT is still at ~3–4 nats; for prod_then_digitsum the instantly-committed answer is wrong (9), and the CoT is written to it. Right: reverse_then_add, sq1000, cubes_10_1000 — the answer stays hot until the CoT cools, passing through the annotated value sequences before settling; cubes_10_1000’s answer entropy re-rises at step 5, where 4 flips to the correct 7.</w:t>
+        <w:t xml:space="preserve">Mean token entropy of the answer positions (solid) and CoT positions (dashed) per denoising step, one rollout per battery problem, grouped by the measured susceptibility (</w:t>
+      </w:r>
+      <m:oMath>
+        <m:r>
+          <m:t>S</m:t>
+        </m:r>
+        <m:r>
+          <m:rPr>
+            <m:sty m:val="p"/>
+          </m:rPr>
+          <m:t>≤</m:t>
+        </m:r>
+        <m:r>
+          <m:t>0.1</m:t>
+        </m:r>
+      </m:oMath>
+      <w:r>
+        <w:rPr>
+          <w:i/>
+          <w:iCs/>
+        </w:rPr>
+        <w:t xml:space="preserve"> </w:t>
+      </w:r>
+      <w:r>
+        <w:rPr>
+          <w:i/>
+          <w:iCs/>
+        </w:rPr>
+        <w:t xml:space="preserve">vs</w:t>
+      </w:r>
+      <w:r>
+        <w:rPr>
+          <w:i/>
+          <w:iCs/>
+        </w:rPr>
+        <w:t xml:space="preserve"> </w:t>
+      </w:r>
+      <m:oMath>
+        <m:r>
+          <m:t>S</m:t>
+        </m:r>
+        <m:r>
+          <m:rPr>
+            <m:sty m:val="p"/>
+          </m:rPr>
+          <m:t>≥</m:t>
+        </m:r>
+        <m:r>
+          <m:t>0.3</m:t>
+        </m:r>
+      </m:oMath>
+      <w:r>
+        <w:rPr>
+          <w:i/>
+          <w:iCs/>
+        </w:rPr>
+        <w:t xml:space="preserve">; three problems at</w:t>
+      </w:r>
+      <w:r>
+        <w:rPr>
+          <w:i/>
+          <w:iCs/>
+        </w:rPr>
+        <w:t xml:space="preserve"> </w:t>
+      </w:r>
+      <m:oMath>
+        <m:r>
+          <m:t>S</m:t>
+        </m:r>
+        <m:r>
+          <m:rPr>
+            <m:sty m:val="p"/>
+          </m:rPr>
+          <m:t>=</m:t>
+        </m:r>
+        <m:r>
+          <m:t>0.2</m:t>
+        </m:r>
+      </m:oMath>
+      <w:r>
+        <w:rPr>
+          <w:i/>
+          <w:iCs/>
+        </w:rPr>
+        <w:t xml:space="preserve"> </w:t>
+      </w:r>
+      <w:r>
+        <w:rPr>
+          <w:i/>
+          <w:iCs/>
+        </w:rPr>
+        <w:t xml:space="preserve">excluded; faint = single problems, bold = group mean). The post-hoc group’s answer is near-committed already at step 1 (~0.1 nats) while its CoT is still at ~3 nats; the load-bearing group’s answer decays slowly and from step ~4 stays hotter than its own already-cooled CoT.</w:t>
       </w:r>
     </w:p>
     <w:bookmarkEnd w:id="78"/>

</xml_diff>

<commit_message>
posthoc case card: easy-vs-hard (bat_ball|sq1000) x (clean|susceptibility) with purple intervention sites + commitment times, replacing the squares_400_800/lure card; figA8 gains permutation p-values
Co-Authored-By: Claude Fable 5 <noreply@anthropic.com>
</commit_message>
<xml_diff>
--- a/post.docx
+++ b/post.docx
@@ -2,7 +2,7 @@
 <file path=word/document.xml><?xml version="1.0" encoding="utf-8"?>
 <w:document xmlns:w="http://schemas.openxmlformats.org/wordprocessingml/2006/main" xmlns:m="http://schemas.openxmlformats.org/officeDocument/2006/math" xmlns:r="http://schemas.openxmlformats.org/officeDocument/2006/relationships" xmlns:o="urn:schemas-microsoft-com:office:office" xmlns:v="urn:schemas-microsoft-com:vml" xmlns:w10="urn:schemas-microsoft-com:office:word" xmlns:a="http://schemas.openxmlformats.org/drawingml/2006/main" xmlns:pic="http://schemas.openxmlformats.org/drawingml/2006/picture" xmlns:wp="http://schemas.openxmlformats.org/drawingml/2006/wordprocessingDrawing">
   <w:body>
-    <w:bookmarkStart w:id="89" w:name="Xf5e660dc2e9c1a368125465a5756c31f66c44e2"/>
+    <w:bookmarkStart w:id="85" w:name="Xf5e660dc2e9c1a368125465a5756c31f66c44e2"/>
     <w:p>
       <w:pPr>
         <w:pStyle w:val="Heading1"/>
@@ -2776,7 +2776,7 @@
       </w:r>
     </w:p>
     <w:bookmarkEnd w:id="40"/>
-    <w:bookmarkStart w:id="88" w:name="appendix"/>
+    <w:bookmarkStart w:id="84" w:name="appendix"/>
     <w:p>
       <w:pPr>
         <w:pStyle w:val="Heading2"/>
@@ -5227,7 +5227,7 @@
         <w:pStyle w:val="BodyText"/>
       </w:pPr>
       <w:r>
-        <w:t xml:space="preserve">For autoregressive models, the answer appears after the CoT. This limits the ability for the CoT to be irrelevant, since otherwise the model would have needed to compute the answer without using the CoT tokens at all. In contrast, DiffusionGemma may arrive at an answer throughout multiple steps of computation, and then fill in a CoT post-hoc to match the format of the training distribution. An increased presence of such post-hoc rationalization relative to Gemma would be a blackpill for DiffusionGemma’s monitorabiltiy.</w:t>
+        <w:t xml:space="preserve">For autoregressive models, the answer appears after the CoT. This incentivizes actually using CoT positions to computate the answer. In contrast, DiffusionGemma may arrive at an answer throughout multiple steps of computation, and then fill in a CoT post-hoc to match the format of the training distribution. An increased presence of such post-hoc rationalization relative to Gemma would be a blackpill for DiffusionGemma’s monitorabiltiy.</w:t>
       </w:r>
     </w:p>
     <w:p>
@@ -5390,7 +5390,80 @@
           <w:i/>
           <w:iCs/>
         </w:rPr>
-        <w:t xml:space="preserve">per panel; × = accuracy &lt; 0.5, dashed = least-squares fit).</w:t>
+        <w:t xml:space="preserve">with two-sided permutation</w:t>
+      </w:r>
+      <w:r>
+        <w:rPr>
+          <w:i/>
+          <w:iCs/>
+        </w:rPr>
+        <w:t xml:space="preserve"> </w:t>
+      </w:r>
+      <m:oMath>
+        <m:r>
+          <m:t>p</m:t>
+        </m:r>
+      </m:oMath>
+      <w:r>
+        <w:rPr>
+          <w:i/>
+          <w:iCs/>
+        </w:rPr>
+        <w:t xml:space="preserve"> </w:t>
+      </w:r>
+      <w:r>
+        <w:rPr>
+          <w:i/>
+          <w:iCs/>
+        </w:rPr>
+        <w:t xml:space="preserve">per panel; × = accuracy &lt; 0.5, dashed = least-squares fit). Note difficulty ↔</w:t>
+      </w:r>
+      <w:r>
+        <w:rPr>
+          <w:i/>
+          <w:iCs/>
+        </w:rPr>
+        <w:t xml:space="preserve"> </w:t>
+      </w:r>
+      <m:oMath>
+        <m:r>
+          <m:t>S</m:t>
+        </m:r>
+      </m:oMath>
+      <w:r>
+        <w:rPr>
+          <w:i/>
+          <w:iCs/>
+        </w:rPr>
+        <w:t xml:space="preserve"> </w:t>
+      </w:r>
+      <w:r>
+        <w:rPr>
+          <w:i/>
+          <w:iCs/>
+        </w:rPr>
+        <w:t xml:space="preserve">is the one pairing that misses significance (</w:t>
+      </w:r>
+      <m:oMath>
+        <m:r>
+          <m:t>p</m:t>
+        </m:r>
+        <m:r>
+          <m:rPr>
+            <m:sty m:val="p"/>
+          </m:rPr>
+          <m:t>=</m:t>
+        </m:r>
+        <m:r>
+          <m:t>.08</m:t>
+        </m:r>
+      </m:oMath>
+      <w:r>
+        <w:rPr>
+          <w:i/>
+          <w:iCs/>
+        </w:rPr>
+        <w:t xml:space="preserve">).</w:t>
       </w:r>
     </w:p>
     <w:p>
@@ -5398,19 +5471,7 @@
         <w:pStyle w:val="BodyText"/>
       </w:pPr>
       <w:r>
-        <w:t xml:space="preserve">For illustration, consider the problem</w:t>
-      </w:r>
-      <w:r>
-        <w:t xml:space="preserve"> </w:t>
-      </w:r>
-      <w:r>
-        <w:rPr>
-          <w:rStyle w:val="VerbatimChar"/>
-        </w:rPr>
-        <w:t xml:space="preserve">squares_400_800</w:t>
-      </w:r>
-      <w:r>
-        <w:t xml:space="preserve">, which dissociates the two probes:</w:t>
+        <w:t xml:space="preserve">For illustration, consider an easy and a hard problem side by side:</w:t>
       </w:r>
     </w:p>
     <w:p>
@@ -5420,7 +5481,7 @@
       <w:r>
         <w:drawing>
           <wp:inline>
-            <wp:extent cx="5334000" cy="1570566"/>
+            <wp:extent cx="5334000" cy="3733800"/>
             <wp:effectExtent b="0" l="0" r="0" t="0"/>
             <wp:docPr descr="Post-hoc case study" title="" id="73" name="Picture"/>
             <a:graphic>
@@ -5441,7 +5502,7 @@
                   <pic:spPr bwMode="auto">
                     <a:xfrm>
                       <a:off x="0" y="0"/>
-                      <a:ext cx="5334000" cy="1570566"/>
+                      <a:ext cx="5334000" cy="3733800"/>
                     </a:xfrm>
                     <a:prstGeom prst="rect">
                       <a:avLst/>
@@ -5479,21 +5540,28 @@
           <w:i/>
           <w:iCs/>
         </w:rPr>
-        <w:t xml:space="preserve">DG denoises random corruption away but reads fluent wrong reasoning.</w:t>
-      </w:r>
-      <w:r>
-        <w:rPr>
-          <w:i/>
-          <w:iCs/>
-        </w:rPr>
-        <w:t xml:space="preserve"> </w:t>
-      </w:r>
-      <w:r>
-        <w:rPr>
-          <w:i/>
-          <w:iCs/>
-        </w:rPr>
-        <w:t xml:space="preserve">Left: clamping all 255 CoT canvas positions (</w:t>
+        <w:t xml:space="preserve">An easy answer ignores its CoT; a hard answer breaks with it.</w:t>
+      </w:r>
+      <w:r>
+        <w:rPr>
+          <w:i/>
+          <w:iCs/>
+        </w:rPr>
+        <w:t xml:space="preserve"> </w:t>
+      </w:r>
+      <w:r>
+        <w:rPr>
+          <w:i/>
+          <w:iCs/>
+        </w:rPr>
+        <w:t xml:space="preserve">Top row: clean rollout, model answer highlighted, with its commitment time (bat_ball locks at step 0; sq1000 passes through 1 → 3 → 31 → 19 → 39, locking at ~step 4). Bottom row: the susceptibility intervention — every CoT canvas position (purple;</w:t>
+      </w:r>
+      <w:r>
+        <w:rPr>
+          <w:i/>
+          <w:iCs/>
+        </w:rPr>
+        <w:t xml:space="preserve"> </w:t>
       </w:r>
       <m:oMath>
         <m:sSup>
@@ -5545,14 +5613,7 @@
           <w:i/>
           <w:iCs/>
         </w:rPr>
-        <w:t xml:space="preserve">) to random tokens leaves the answer untouched (8,</w:t>
-      </w:r>
-      <w:r>
-        <w:rPr>
-          <w:i/>
-          <w:iCs/>
-        </w:rPr>
-        <w:t xml:space="preserve"> </w:t>
+        <w:t xml:space="preserve">) is pinned to random tokens at every step while the answer denoises freely. bat_ball still answers 5 (</w:t>
       </w:r>
       <m:oMath>
         <m:r>
@@ -5565,24 +5626,45 @@
           <m:t>=</m:t>
         </m:r>
         <m:r>
-          <m:t>0.05</m:t>
-        </m:r>
-      </m:oMath>
-      <w:r>
-        <w:rPr>
-          <w:i/>
-          <w:iCs/>
-        </w:rPr>
-        <w:t xml:space="preserve">). Right: clamping a coherent lure CoT with a single off-by-one error (red) flips the answer to 9 in 5/5 seeds. Caveat: a target sweep shows the lure does not install its specific conclusion — the coherent-but-wrong CoT dislodges the answer into a nearby basin rather than steering it.</w:t>
-      </w:r>
-    </w:p>
-    <w:bookmarkStart w:id="78" w:name="answer-resolution-over-denoising-steps"/>
+          <m:t>0.00</m:t>
+        </m:r>
+      </m:oMath>
+      <w:r>
+        <w:rPr>
+          <w:i/>
+          <w:iCs/>
+        </w:rPr>
+        <w:t xml:space="preserve">); sq1000’s answer breaks to 36/38/46 across corruption seeds (</w:t>
+      </w:r>
+      <m:oMath>
+        <m:r>
+          <m:t>S</m:t>
+        </m:r>
+        <m:r>
+          <m:rPr>
+            <m:sty m:val="p"/>
+          </m:rPr>
+          <m:t>=</m:t>
+        </m:r>
+        <m:r>
+          <m:t>0.70</m:t>
+        </m:r>
+      </m:oMath>
+      <w:r>
+        <w:rPr>
+          <w:i/>
+          <w:iCs/>
+        </w:rPr>
+        <w:t xml:space="preserve">).</w:t>
+      </w:r>
+    </w:p>
+    <w:bookmarkStart w:id="78" w:name="Xabbf9ebb3c7fb0570cb1488d42cd03734ef9222"/>
     <w:p>
       <w:pPr>
         <w:pStyle w:val="Heading4"/>
       </w:pPr>
       <w:r>
-        <w:t xml:space="preserve">Answer resolution over denoising steps</w:t>
+        <w:t xml:space="preserve">Load-bearing problems commit the answer only after the CoT</w:t>
       </w:r>
     </w:p>
     <w:p>
@@ -5590,7 +5672,7 @@
         <w:pStyle w:val="FirstParagraph"/>
       </w:pPr>
       <w:r>
-        <w:t xml:space="preserve">[stub:] The same split is visible in the raw denoising dynamics: for post-hoc problems the answer region is confident (low entropy) at step 0–1 while the CoT region is still hot; for load-bearing problems the answer region stays hot for several steps, flipping repeatedly, and commits only as the CoT resolves.</w:t>
+        <w:t xml:space="preserve">In the previous paragraph, we analyzed the causal dependence of the answer on the CoT, as well</w:t>
       </w:r>
     </w:p>
     <w:p>
@@ -5659,21 +5741,21 @@
           <w:i/>
           <w:iCs/>
         </w:rPr>
-        <w:t xml:space="preserve">Post-hoc answers commit before their CoT; load-bearing answers wait on it.</w:t>
-      </w:r>
-      <w:r>
-        <w:rPr>
-          <w:i/>
-          <w:iCs/>
-        </w:rPr>
-        <w:t xml:space="preserve"> </w:t>
-      </w:r>
-      <w:r>
-        <w:rPr>
-          <w:i/>
-          <w:iCs/>
-        </w:rPr>
-        <w:t xml:space="preserve">Mean token entropy of the answer positions (solid) and CoT positions (dashed) per denoising step, one rollout per battery problem, grouped by the measured susceptibility (</w:t>
+        <w:t xml:space="preserve">Post-hoc answers commit before their CoT, load-bearing answers wait till the CoT is committed.</w:t>
+      </w:r>
+      <w:r>
+        <w:rPr>
+          <w:i/>
+          <w:iCs/>
+        </w:rPr>
+        <w:t xml:space="preserve"> </w:t>
+      </w:r>
+      <w:r>
+        <w:rPr>
+          <w:i/>
+          <w:iCs/>
+        </w:rPr>
+        <w:t xml:space="preserve">Mean token entropy of the answer positions (solid) and CoT positions (dashed) per denoising step, one rollout per battery problem, grouped by the measured susceptibility of the answer (</w:t>
       </w:r>
       <m:oMath>
         <m:r>
@@ -5729,53 +5811,25 @@
           <w:i/>
           <w:iCs/>
         </w:rPr>
-        <w:t xml:space="preserve">; three problems at</w:t>
-      </w:r>
-      <w:r>
-        <w:rPr>
-          <w:i/>
-          <w:iCs/>
-        </w:rPr>
-        <w:t xml:space="preserve"> </w:t>
-      </w:r>
-      <m:oMath>
-        <m:r>
-          <m:t>S</m:t>
-        </m:r>
-        <m:r>
-          <m:rPr>
-            <m:sty m:val="p"/>
-          </m:rPr>
-          <m:t>=</m:t>
-        </m:r>
-        <m:r>
-          <m:t>0.2</m:t>
-        </m:r>
-      </m:oMath>
-      <w:r>
-        <w:rPr>
-          <w:i/>
-          <w:iCs/>
-        </w:rPr>
-        <w:t xml:space="preserve"> </w:t>
-      </w:r>
-      <w:r>
-        <w:rPr>
-          <w:i/>
-          <w:iCs/>
-        </w:rPr>
-        <w:t xml:space="preserve">excluded; faint = single problems, bold = group mean). The post-hoc group’s answer is near-committed already at step 1 (~0.1 nats) while its CoT is still at ~3 nats; the load-bearing group’s answer decays slowly and from step ~4 stays hotter than its own already-cooled CoT.</w:t>
+        <w:t xml:space="preserve">, faint = single problems, bold = group mean).</w:t>
+      </w:r>
+      <w:r>
+        <w:rPr>
+          <w:i/>
+          <w:iCs/>
+        </w:rPr>
+        <w:t xml:space="preserve"> </w:t>
       </w:r>
     </w:p>
     <w:bookmarkEnd w:id="78"/>
     <w:bookmarkEnd w:id="79"/>
-    <w:bookmarkStart w:id="83" w:name="Xc88983d67b72bd3bbe7b5ed4c6ce8c17fda4537"/>
+    <w:bookmarkStart w:id="83" w:name="Xd7c7dfb66314a32b0174c0001aa6561f67f2b90"/>
     <w:p>
       <w:pPr>
         <w:pStyle w:val="Heading3"/>
       </w:pPr>
       <w:r>
-        <w:t xml:space="preserve">Self-repair: escaping a confident-wrong answer</w:t>
+        <w:t xml:space="preserve">How much does DiffusionGemma use bidirectional attention?</w:t>
       </w:r>
     </w:p>
     <w:p>
@@ -5783,311 +5837,28 @@
         <w:pStyle w:val="FirstParagraph"/>
       </w:pPr>
       <w:r>
-        <w:t xml:space="preserve">[stub, related to the idiom example] Finally, we probed how sticky a wrong answer is, on a clock-strike fencepost problem (</w:t>
-      </w:r>
-      <w:r>
-        <w:rPr>
-          <w:rStyle w:val="VerbatimChar"/>
-        </w:rPr>
-        <w:t xml:space="preserve">A clock takes 6 seconds to strike 4 o'clock (it chimes 4 times). How many seconds does it take to strike 9 o'clock?</w:t>
-      </w:r>
-      <w:r>
-        <w:t xml:space="preserve">, the correct answer is 16, but on first glance the answer is 18).</w:t>
-      </w:r>
-    </w:p>
-    <w:p>
-      <w:pPr>
-        <w:pStyle w:val="BodyText"/>
-      </w:pPr>
-      <w:r>
-        <w:t xml:space="preserve">In natural runs the canvas transiently visits the wrong answers and corrects them within a few steps. But a</w:t>
-      </w:r>
-      <w:r>
-        <w:t xml:space="preserve"> </w:t>
-      </w:r>
-      <w:r>
-        <w:rPr>
-          <w:i/>
-          <w:iCs/>
-        </w:rPr>
-        <w:t xml:space="preserve">harvested</w:t>
-      </w:r>
-      <w:r>
-        <w:t xml:space="preserve"> </w:t>
-      </w:r>
-      <w:r>
-        <w:t xml:space="preserve">confident-wrong state (a cold run that converged to 18) is a genuine attractor. Concretely, we</w:t>
-      </w:r>
-      <w:r>
-        <w:t xml:space="preserve"> </w:t>
-      </w:r>
-      <w:r>
-        <w:rPr>
-          <w:i/>
-          <w:iCs/>
-        </w:rPr>
-        <w:t xml:space="preserve">plant</w:t>
-      </w:r>
-      <w:r>
-        <w:t xml:space="preserve"> </w:t>
-      </w:r>
-      <w:r>
-        <w:t xml:space="preserve">the donor run’s full final state — its canvas</w:t>
-      </w:r>
-      <w:r>
-        <w:t xml:space="preserve"> </w:t>
-      </w:r>
-      <m:oMath>
-        <m:r>
-          <m:t>X</m:t>
-        </m:r>
-      </m:oMath>
-      <w:r>
-        <w:t xml:space="preserve"> </w:t>
-      </w:r>
-      <w:r>
-        <w:rPr>
-          <w:i/>
-          <w:iCs/>
-        </w:rPr>
-        <w:t xml:space="preserve">and</w:t>
-      </w:r>
-      <w:r>
-        <w:t xml:space="preserve"> </w:t>
-      </w:r>
-      <w:r>
-        <w:t xml:space="preserve">its sheet</w:t>
-      </w:r>
-      <w:r>
-        <w:t xml:space="preserve"> </w:t>
-      </w:r>
-      <m:oMath>
-        <m:r>
-          <m:rPr>
-            <m:sty m:val="b"/>
-          </m:rPr>
-          <m:t>S</m:t>
-        </m:r>
-      </m:oMath>
-      <w:r>
-        <w:t xml:space="preserve"> </w:t>
-      </w:r>
-      <w:r>
-        <w:t xml:space="preserve">— into a fresh rollout at plant step</w:t>
-      </w:r>
-      <w:r>
-        <w:t xml:space="preserve"> </w:t>
-      </w:r>
-      <m:oMath>
-        <m:r>
-          <m:t>k</m:t>
-        </m:r>
-      </m:oMath>
-      <w:r>
-        <w:t xml:space="preserve">, and denoising continues freely from there: nothing is clamped afterwards, so a small</w:t>
-      </w:r>
-      <w:r>
-        <w:t xml:space="preserve"> </w:t>
-      </w:r>
-      <m:oMath>
-        <m:r>
-          <m:t>k</m:t>
-        </m:r>
-      </m:oMath>
-      <w:r>
-        <w:t xml:space="preserve"> </w:t>
-      </w:r>
-      <w:r>
-        <w:t xml:space="preserve">leaves many re-noising steps to escape while a large</w:t>
-      </w:r>
-      <w:r>
-        <w:t xml:space="preserve"> </w:t>
-      </w:r>
-      <m:oMath>
-        <m:r>
-          <m:t>k</m:t>
-        </m:r>
-      </m:oMath>
-      <w:r>
-        <w:t xml:space="preserve"> </w:t>
-      </w:r>
-      <w:r>
-        <w:t xml:space="preserve">means the planted state is nearly frozen. Escape to 16 happens only with a hot sampler</w:t>
-      </w:r>
-      <w:r>
-        <w:t xml:space="preserve"> </w:t>
-      </w:r>
-      <w:r>
-        <w:rPr>
-          <w:i/>
-          <w:iCs/>
-        </w:rPr>
-        <w:t xml:space="preserve">and</w:t>
-      </w:r>
-      <w:r>
-        <w:t xml:space="preserve"> </w:t>
-      </w:r>
-      <w:r>
-        <w:t xml:space="preserve">enough re-noising — plant past</w:t>
-      </w:r>
-      <w:r>
-        <w:t xml:space="preserve"> </w:t>
-      </w:r>
-      <m:oMath>
-        <m:r>
-          <m:t>k</m:t>
-        </m:r>
-        <m:r>
-          <m:rPr>
-            <m:sty m:val="p"/>
-          </m:rPr>
-          <m:t>≈</m:t>
-        </m:r>
-        <m:r>
-          <m:t>48</m:t>
-        </m:r>
-      </m:oMath>
-      <w:r>
-        <w:t xml:space="preserve"> </w:t>
-      </w:r>
-      <w:r>
-        <w:t xml:space="preserve">of</w:t>
-      </w:r>
-      <w:r>
-        <w:t xml:space="preserve"> </w:t>
-      </w:r>
-      <m:oMath>
-        <m:r>
-          <m:t>128</m:t>
-        </m:r>
-      </m:oMath>
-      <w:r>
-        <w:t xml:space="preserve"> </w:t>
-      </w:r>
-      <w:r>
-        <w:t xml:space="preserve">and even the hot sampler stays stuck at 18.</w:t>
-      </w:r>
-    </w:p>
-    <w:p>
-      <w:pPr>
-        <w:pStyle w:val="CaptionedFigure"/>
-      </w:pPr>
+        <w:t xml:space="preserve">One of the differences in DiffusionGemma is that it has bidirectional attention. While some tasks relying on some form of logical induction require causal left-to-right generation, other task do not obviously require it. However, being a finetune of Gemma, it is unclear how much it will just inherit a bias towards causal generation vs actually using bidirectional generation.</w:t>
+      </w:r>
+      <w:r>
+        <w:t xml:space="preserve"> </w:t>
+      </w:r>
       <w:r>
         <w:drawing>
           <wp:inline>
-            <wp:extent cx="5334000" cy="2117911"/>
+            <wp:extent cx="5334000" cy="1889125"/>
             <wp:effectExtent b="0" l="0" r="0" t="0"/>
-            <wp:docPr descr="Self-repair clock" title="" id="81" name="Picture"/>
+            <wp:docPr descr="Commitment causality" title="" id="81" name="Picture"/>
             <a:graphic>
               <a:graphicData uri="http://schemas.openxmlformats.org/drawingml/2006/picture">
                 <pic:pic>
                   <pic:nvPicPr>
-                    <pic:cNvPr descr="figs/figA10_selfrepair_clock.png" id="82" name="Picture"/>
+                    <pic:cNvPr descr="figs/figA11_commit_causality.png" id="82" name="Picture"/>
                     <pic:cNvPicPr>
                       <a:picLocks noChangeArrowheads="1" noChangeAspect="1"/>
                     </pic:cNvPicPr>
                   </pic:nvPicPr>
                   <pic:blipFill>
                     <a:blip r:embed="rId80"/>
-                    <a:stretch>
-                      <a:fillRect/>
-                    </a:stretch>
-                  </pic:blipFill>
-                  <pic:spPr bwMode="auto">
-                    <a:xfrm>
-                      <a:off x="0" y="0"/>
-                      <a:ext cx="5334000" cy="2117911"/>
-                    </a:xfrm>
-                    <a:prstGeom prst="rect">
-                      <a:avLst/>
-                    </a:prstGeom>
-                    <a:noFill/>
-                    <a:ln w="9525">
-                      <a:noFill/>
-                      <a:headEnd/>
-                      <a:tailEnd/>
-                    </a:ln>
-                  </pic:spPr>
-                </pic:pic>
-              </a:graphicData>
-            </a:graphic>
-          </wp:inline>
-        </w:drawing>
-      </w:r>
-    </w:p>
-    <w:p>
-      <w:pPr>
-        <w:pStyle w:val="ImageCaption"/>
-      </w:pPr>
-      <w:r>
-        <w:t xml:space="preserve">Self-repair clock</w:t>
-      </w:r>
-    </w:p>
-    <w:p>
-      <w:pPr>
-        <w:pStyle w:val="BodyText"/>
-      </w:pPr>
-      <w:r>
-        <w:rPr>
-          <w:b/>
-          <w:bCs/>
-          <w:i/>
-          <w:iCs/>
-        </w:rPr>
-        <w:t xml:space="preserve">Transient wrong answers self-repair; a committed wrong state needs heat and noise to escape.</w:t>
-      </w:r>
-      <w:r>
-        <w:rPr>
-          <w:i/>
-          <w:iCs/>
-        </w:rPr>
-        <w:t xml:space="preserve"> </w:t>
-      </w:r>
-      <w:r>
-        <w:rPr>
-          <w:i/>
-          <w:iCs/>
-        </w:rPr>
-        <w:t xml:space="preserve">Left: the first-line answer over denoising steps in natural cold runs (three seeds) — 12/18 appear transiently, all settle at 16. Right: a harvested wrong-18 state planted at varying steps and re-denoised: cold recipients stay stuck at every depth; very-hot recipients escape to 16 only when planted before ~step 48 of 128.</w:t>
-      </w:r>
-    </w:p>
-    <w:bookmarkEnd w:id="83"/>
-    <w:bookmarkStart w:id="87" w:name="Xd7c7dfb66314a32b0174c0001aa6561f67f2b90"/>
-    <w:p>
-      <w:pPr>
-        <w:pStyle w:val="Heading3"/>
-      </w:pPr>
-      <w:r>
-        <w:t xml:space="preserve">How much does DiffusionGemma use bidirectional attention?</w:t>
-      </w:r>
-    </w:p>
-    <w:p>
-      <w:pPr>
-        <w:pStyle w:val="FirstParagraph"/>
-      </w:pPr>
-      <w:r>
-        <w:t xml:space="preserve">One of the differences in DiffusionGemma is that it has bidirectional attention. While some tasks relying on some form of logical induction require causal left-to-right generation, other task do not obviously require it. However, being a finetune of Gemma, it is unclear how much it will just inherit a bias towards causal generation vs actually using bidirectional generation.</w:t>
-      </w:r>
-      <w:r>
-        <w:t xml:space="preserve"> </w:t>
-      </w:r>
-      <w:r>
-        <w:drawing>
-          <wp:inline>
-            <wp:extent cx="5334000" cy="1889125"/>
-            <wp:effectExtent b="0" l="0" r="0" t="0"/>
-            <wp:docPr descr="Commitment causality" title="" id="85" name="Picture"/>
-            <a:graphic>
-              <a:graphicData uri="http://schemas.openxmlformats.org/drawingml/2006/picture">
-                <pic:pic>
-                  <pic:nvPicPr>
-                    <pic:cNvPr descr="figs/figA11_commit_causality.png" id="86" name="Picture"/>
-                    <pic:cNvPicPr>
-                      <a:picLocks noChangeArrowheads="1" noChangeAspect="1"/>
-                    </pic:cNvPicPr>
-                  </pic:nvPicPr>
-                  <pic:blipFill>
-                    <a:blip r:embed="rId84"/>
                     <a:stretch>
                       <a:fillRect/>
                     </a:stretch>
@@ -6299,9 +6070,9 @@
         <w:t xml:space="preserve">, which requires the model to reverse its reasoning order.</w:t>
       </w:r>
     </w:p>
-    <w:bookmarkEnd w:id="87"/>
-    <w:bookmarkEnd w:id="88"/>
-    <w:bookmarkEnd w:id="89"/>
+    <w:bookmarkEnd w:id="83"/>
+    <w:bookmarkEnd w:id="84"/>
+    <w:bookmarkEnd w:id="85"/>
     <w:sectPr>
       <w:footnotePr>
         <w:numRestart w:val="eachSect"/>

</xml_diff>

<commit_message>
posthoc case card: align clean/susceptibility sections on shared grid rows across the two columns
Co-Authored-By: Claude Fable 5 <noreply@anthropic.com>
</commit_message>
<xml_diff>
--- a/post.docx
+++ b/post.docx
@@ -5481,7 +5481,7 @@
       <w:r>
         <w:drawing>
           <wp:inline>
-            <wp:extent cx="5334000" cy="3733800"/>
+            <wp:extent cx="5334000" cy="4036060"/>
             <wp:effectExtent b="0" l="0" r="0" t="0"/>
             <wp:docPr descr="Post-hoc case study" title="" id="73" name="Picture"/>
             <a:graphic>
@@ -5502,7 +5502,7 @@
                   <pic:spPr bwMode="auto">
                     <a:xfrm>
                       <a:off x="0" y="0"/>
-                      <a:ext cx="5334000" cy="3733800"/>
+                      <a:ext cx="5334000" cy="4036060"/>
                     </a:xfrm>
                     <a:prstGeom prst="rect">
                       <a:avLst/>

</xml_diff>

<commit_message>
re-insert figA7 constraint-margin/self-correction figure after the folded self-correction paragraph
Co-Authored-By: Claude Fable 5 <noreply@anthropic.com>
</commit_message>
<xml_diff>
--- a/post.docx
+++ b/post.docx
@@ -2,7 +2,7 @@
 <file path=word/document.xml><?xml version="1.0" encoding="utf-8"?>
 <w:document xmlns:w="http://schemas.openxmlformats.org/wordprocessingml/2006/main" xmlns:m="http://schemas.openxmlformats.org/officeDocument/2006/math" xmlns:r="http://schemas.openxmlformats.org/officeDocument/2006/relationships" xmlns:o="urn:schemas-microsoft-com:office:office" xmlns:v="urn:schemas-microsoft-com:vml" xmlns:w10="urn:schemas-microsoft-com:office:word" xmlns:a="http://schemas.openxmlformats.org/drawingml/2006/main" xmlns:pic="http://schemas.openxmlformats.org/drawingml/2006/picture" xmlns:wp="http://schemas.openxmlformats.org/drawingml/2006/wordprocessingDrawing">
   <w:body>
-    <w:bookmarkStart w:id="85" w:name="Xf5e660dc2e9c1a368125465a5756c31f66c44e2"/>
+    <w:bookmarkStart w:id="88" w:name="Xf5e660dc2e9c1a368125465a5756c31f66c44e2"/>
     <w:p>
       <w:pPr>
         <w:pStyle w:val="Heading1"/>
@@ -2776,7 +2776,7 @@
       </w:r>
     </w:p>
     <w:bookmarkEnd w:id="40"/>
-    <w:bookmarkStart w:id="84" w:name="appendix"/>
+    <w:bookmarkStart w:id="87" w:name="appendix"/>
     <w:p>
       <w:pPr>
         <w:pStyle w:val="Heading2"/>
@@ -4534,7 +4534,7 @@
       </w:r>
     </w:p>
     <w:bookmarkEnd w:id="63"/>
-    <w:bookmarkStart w:id="67" w:name="Xea3042850cf8050407ffdd53c2454b5f83a5608"/>
+    <w:bookmarkStart w:id="70" w:name="Xea3042850cf8050407ffdd53c2454b5f83a5608"/>
     <w:p>
       <w:pPr>
         <w:pStyle w:val="Heading3"/>
@@ -5193,8 +5193,145 @@
         <w:t xml:space="preserve">. This has important consequences for monitorability which may not have been captured in Engels et al.’s analysis: a tool reading only the final diffusion output will miss transient output. A model may for instance choose to hide a specific fact in its chain-of-thought to a monitor, while having used it intermittently, though we did not find any instances of such behavior here.</w:t>
       </w:r>
     </w:p>
-    <w:bookmarkEnd w:id="67"/>
-    <w:bookmarkStart w:id="79" w:name="post-hoc-rationalization"/>
+    <w:p>
+      <w:pPr>
+        <w:pStyle w:val="CaptionedFigure"/>
+      </w:pPr>
+      <w:r>
+        <w:drawing>
+          <wp:inline>
+            <wp:extent cx="5334000" cy="4012353"/>
+            <wp:effectExtent b="0" l="0" r="0" t="0"/>
+            <wp:docPr descr="Constraint margins" title="" id="68" name="Picture"/>
+            <a:graphic>
+              <a:graphicData uri="http://schemas.openxmlformats.org/drawingml/2006/picture">
+                <pic:pic>
+                  <pic:nvPicPr>
+                    <pic:cNvPr descr="figs/figA7_constraint_margins.png" id="69" name="Picture"/>
+                    <pic:cNvPicPr>
+                      <a:picLocks noChangeArrowheads="1" noChangeAspect="1"/>
+                    </pic:cNvPicPr>
+                  </pic:nvPicPr>
+                  <pic:blipFill>
+                    <a:blip r:embed="rId67"/>
+                    <a:stretch>
+                      <a:fillRect/>
+                    </a:stretch>
+                  </pic:blipFill>
+                  <pic:spPr bwMode="auto">
+                    <a:xfrm>
+                      <a:off x="0" y="0"/>
+                      <a:ext cx="5334000" cy="4012353"/>
+                    </a:xfrm>
+                    <a:prstGeom prst="rect">
+                      <a:avLst/>
+                    </a:prstGeom>
+                    <a:noFill/>
+                    <a:ln w="9525">
+                      <a:noFill/>
+                      <a:headEnd/>
+                      <a:tailEnd/>
+                    </a:ln>
+                  </pic:spPr>
+                </pic:pic>
+              </a:graphicData>
+            </a:graphic>
+          </wp:inline>
+        </w:drawing>
+      </w:r>
+    </w:p>
+    <w:p>
+      <w:pPr>
+        <w:pStyle w:val="ImageCaption"/>
+      </w:pPr>
+      <w:r>
+        <w:t xml:space="preserve">Constraint margins</w:t>
+      </w:r>
+    </w:p>
+    <w:p>
+      <w:pPr>
+        <w:pStyle w:val="BodyText"/>
+      </w:pPr>
+      <w:r>
+        <w:rPr>
+          <w:b/>
+          <w:bCs/>
+          <w:i/>
+          <w:iCs/>
+        </w:rPr>
+        <w:t xml:space="preserve">Drafts transiently violate the constraint and are only patched late.</w:t>
+      </w:r>
+      <w:r>
+        <w:rPr>
+          <w:i/>
+          <w:iCs/>
+        </w:rPr>
+        <w:t xml:space="preserve"> </w:t>
+      </w:r>
+      <w:r>
+        <w:rPr>
+          <w:i/>
+          <w:iCs/>
+        </w:rPr>
+        <w:t xml:space="preserve">Constraint margin (number of violations) on a constrained writing task (word palindrome, hot sampler), over linearly warped diffusion time</w:t>
+      </w:r>
+      <w:r>
+        <w:rPr>
+          <w:i/>
+          <w:iCs/>
+        </w:rPr>
+        <w:t xml:space="preserve"> </w:t>
+      </w:r>
+      <m:oMath>
+        <m:r>
+          <m:t>τ</m:t>
+        </m:r>
+      </m:oMath>
+      <w:r>
+        <w:rPr>
+          <w:i/>
+          <w:iCs/>
+        </w:rPr>
+        <w:t xml:space="preserve"> </w:t>
+      </w:r>
+      <w:r>
+        <w:rPr>
+          <w:i/>
+          <w:iCs/>
+        </w:rPr>
+        <w:t xml:space="preserve">(each run’s active phase normalized so its last margin change sits at</w:t>
+      </w:r>
+      <w:r>
+        <w:rPr>
+          <w:i/>
+          <w:iCs/>
+        </w:rPr>
+        <w:t xml:space="preserve"> </w:t>
+      </w:r>
+      <m:oMath>
+        <m:r>
+          <m:t>τ</m:t>
+        </m:r>
+        <m:r>
+          <m:rPr>
+            <m:sty m:val="p"/>
+          </m:rPr>
+          <m:t>=</m:t>
+        </m:r>
+        <m:r>
+          <m:t>1</m:t>
+        </m:r>
+      </m:oMath>
+      <w:r>
+        <w:rPr>
+          <w:i/>
+          <w:iCs/>
+        </w:rPr>
+        <w:t xml:space="preserve">; green = runs that escape to a valid sentence, orange = trapped, blue = clean). Bottom: three decoded canvases of the flagship escape run — the mid-run draft still violates the constraint before the late repair lands on a valid palindrome. This is the same rollout family as the seasonal → idiom example above.</w:t>
+      </w:r>
+    </w:p>
+    <w:bookmarkEnd w:id="70"/>
+    <w:bookmarkStart w:id="82" w:name="post-hoc-rationalization"/>
     <w:p>
       <w:pPr>
         <w:pStyle w:val="Heading3"/>
@@ -5210,7 +5347,7 @@
       <w:r>
         <w:t xml:space="preserve">An important question in monitorability (</w:t>
       </w:r>
-      <w:hyperlink r:id="rId68">
+      <w:hyperlink r:id="rId71">
         <w:r>
           <w:rPr>
             <w:rStyle w:val="Hyperlink"/>
@@ -5239,18 +5376,18 @@
           <wp:inline>
             <wp:extent cx="5334000" cy="1619249"/>
             <wp:effectExtent b="0" l="0" r="0" t="0"/>
-            <wp:docPr descr="Post-hoc correlations" title="" id="70" name="Picture"/>
+            <wp:docPr descr="Post-hoc correlations" title="" id="73" name="Picture"/>
             <a:graphic>
               <a:graphicData uri="http://schemas.openxmlformats.org/drawingml/2006/picture">
                 <pic:pic>
                   <pic:nvPicPr>
-                    <pic:cNvPr descr="figs/figA8_posthoc_correlations.png" id="71" name="Picture"/>
+                    <pic:cNvPr descr="figs/figA8_posthoc_correlations.png" id="74" name="Picture"/>
                     <pic:cNvPicPr>
                       <a:picLocks noChangeArrowheads="1" noChangeAspect="1"/>
                     </pic:cNvPicPr>
                   </pic:nvPicPr>
                   <pic:blipFill>
-                    <a:blip r:embed="rId69"/>
+                    <a:blip r:embed="rId72"/>
                     <a:stretch>
                       <a:fillRect/>
                     </a:stretch>
@@ -5296,174 +5433,21 @@
           <w:i/>
           <w:iCs/>
         </w:rPr>
-        <w:t xml:space="preserve">Commitment time, not nominal difficulty, predicts whether the CoT is load-bearing.</w:t>
-      </w:r>
-      <w:r>
-        <w:rPr>
-          <w:i/>
-          <w:iCs/>
-        </w:rPr>
-        <w:t xml:space="preserve"> </w:t>
-      </w:r>
-      <w:r>
-        <w:rPr>
-          <w:i/>
-          <w:iCs/>
-        </w:rPr>
-        <w:t xml:space="preserve">Per problem (n=40): blind difficulty vs commitment time, blind difficulty vs susceptibility</w:t>
-      </w:r>
-      <w:r>
-        <w:rPr>
-          <w:i/>
-          <w:iCs/>
-        </w:rPr>
-        <w:t xml:space="preserve"> </w:t>
-      </w:r>
-      <m:oMath>
-        <m:r>
-          <m:t>S</m:t>
-        </m:r>
-      </m:oMath>
-      <w:r>
-        <w:rPr>
-          <w:i/>
-          <w:iCs/>
-        </w:rPr>
-        <w:t xml:space="preserve">, and commitment time vs</w:t>
-      </w:r>
-      <w:r>
-        <w:rPr>
-          <w:i/>
-          <w:iCs/>
-        </w:rPr>
-        <w:t xml:space="preserve"> </w:t>
-      </w:r>
-      <m:oMath>
-        <m:r>
-          <m:t>S</m:t>
-        </m:r>
-      </m:oMath>
-      <w:r>
-        <w:rPr>
-          <w:i/>
-          <w:iCs/>
-        </w:rPr>
-        <w:t xml:space="preserve"> </w:t>
-      </w:r>
-      <w:r>
-        <w:rPr>
-          <w:i/>
-          <w:iCs/>
-        </w:rPr>
-        <w:t xml:space="preserve">(Spearman</w:t>
-      </w:r>
-      <w:r>
-        <w:rPr>
-          <w:i/>
-          <w:iCs/>
-        </w:rPr>
-        <w:t xml:space="preserve"> </w:t>
-      </w:r>
-      <m:oMath>
-        <m:sSub>
-          <m:e>
-            <m:r>
-              <m:t>ρ</m:t>
-            </m:r>
-          </m:e>
-          <m:sub>
-            <m:r>
-              <m:t>S</m:t>
-            </m:r>
-          </m:sub>
-        </m:sSub>
-      </m:oMath>
-      <w:r>
-        <w:rPr>
-          <w:i/>
-          <w:iCs/>
-        </w:rPr>
-        <w:t xml:space="preserve"> </w:t>
-      </w:r>
-      <w:r>
-        <w:rPr>
-          <w:i/>
-          <w:iCs/>
-        </w:rPr>
-        <w:t xml:space="preserve">with two-sided permutation</w:t>
-      </w:r>
-      <w:r>
-        <w:rPr>
-          <w:i/>
-          <w:iCs/>
-        </w:rPr>
-        <w:t xml:space="preserve"> </w:t>
-      </w:r>
-      <m:oMath>
-        <m:r>
-          <m:t>p</m:t>
-        </m:r>
-      </m:oMath>
-      <w:r>
-        <w:rPr>
-          <w:i/>
-          <w:iCs/>
-        </w:rPr>
-        <w:t xml:space="preserve"> </w:t>
-      </w:r>
-      <w:r>
-        <w:rPr>
-          <w:i/>
-          <w:iCs/>
-        </w:rPr>
-        <w:t xml:space="preserve">per panel; × = accuracy &lt; 0.5, dashed = least-squares fit). Note difficulty ↔</w:t>
-      </w:r>
-      <w:r>
-        <w:rPr>
-          <w:i/>
-          <w:iCs/>
-        </w:rPr>
-        <w:t xml:space="preserve"> </w:t>
-      </w:r>
-      <m:oMath>
-        <m:r>
-          <m:t>S</m:t>
-        </m:r>
-      </m:oMath>
-      <w:r>
-        <w:rPr>
-          <w:i/>
-          <w:iCs/>
-        </w:rPr>
-        <w:t xml:space="preserve"> </w:t>
-      </w:r>
-      <w:r>
-        <w:rPr>
-          <w:i/>
-          <w:iCs/>
-        </w:rPr>
-        <w:t xml:space="preserve">is the one pairing that misses significance (</w:t>
-      </w:r>
-      <m:oMath>
-        <m:r>
-          <m:t>p</m:t>
-        </m:r>
-        <m:r>
-          <m:rPr>
-            <m:sty m:val="p"/>
-          </m:rPr>
-          <m:t>=</m:t>
-        </m:r>
-        <m:r>
-          <m:t>.08</m:t>
-        </m:r>
-      </m:oMath>
-      <w:r>
-        <w:rPr>
-          <w:i/>
-          <w:iCs/>
-        </w:rPr>
-        <w:t xml:space="preserve">).</w:t>
+        <w:t xml:space="preserve">Problem difficulty, CoT load-bearingness, and commitment time correlate.</w:t>
+      </w:r>
+      <w:r>
+        <w:rPr>
+          <w:i/>
+          <w:iCs/>
+        </w:rPr>
+        <w:t xml:space="preserve"> </w:t>
+      </w:r>
+      <w:r>
+        <w:rPr>
+          <w:i/>
+          <w:iCs/>
+        </w:rPr>
+        <w:t xml:space="preserve">Problem difficulty is measured via an LLM judge, CoT load-bearingness via a susceptiblity: how sensitive the answer is to replacing the CoT with random related tokens, and commitment time is when the answer commits. We consider problems from tasks XXX</w:t>
       </w:r>
     </w:p>
     <w:p>
@@ -5483,18 +5467,18 @@
           <wp:inline>
             <wp:extent cx="5334000" cy="4036060"/>
             <wp:effectExtent b="0" l="0" r="0" t="0"/>
-            <wp:docPr descr="Post-hoc case study" title="" id="73" name="Picture"/>
+            <wp:docPr descr="Post-hoc case study" title="" id="76" name="Picture"/>
             <a:graphic>
               <a:graphicData uri="http://schemas.openxmlformats.org/drawingml/2006/picture">
                 <pic:pic>
                   <pic:nvPicPr>
-                    <pic:cNvPr descr="figs/figA8b_posthoc_case.png" id="74" name="Picture"/>
+                    <pic:cNvPr descr="figs/figA8b_posthoc_case.png" id="77" name="Picture"/>
                     <pic:cNvPicPr>
                       <a:picLocks noChangeArrowheads="1" noChangeAspect="1"/>
                     </pic:cNvPicPr>
                   </pic:nvPicPr>
                   <pic:blipFill>
-                    <a:blip r:embed="rId72"/>
+                    <a:blip r:embed="rId75"/>
                     <a:stretch>
                       <a:fillRect/>
                     </a:stretch>
@@ -5540,125 +5524,24 @@
           <w:i/>
           <w:iCs/>
         </w:rPr>
-        <w:t xml:space="preserve">An easy answer ignores its CoT; a hard answer breaks with it.</w:t>
-      </w:r>
-      <w:r>
-        <w:rPr>
-          <w:i/>
-          <w:iCs/>
-        </w:rPr>
-        <w:t xml:space="preserve"> </w:t>
-      </w:r>
-      <w:r>
-        <w:rPr>
-          <w:i/>
-          <w:iCs/>
-        </w:rPr>
-        <w:t xml:space="preserve">Top row: clean rollout, model answer highlighted, with its commitment time (bat_ball locks at step 0; sq1000 passes through 1 → 3 → 31 → 19 → 39, locking at ~step 4). Bottom row: the susceptibility intervention — every CoT canvas position (purple;</w:t>
-      </w:r>
-      <w:r>
-        <w:rPr>
-          <w:i/>
-          <w:iCs/>
-        </w:rPr>
-        <w:t xml:space="preserve"> </w:t>
-      </w:r>
-      <m:oMath>
-        <m:sSup>
-          <m:e>
-            <m:r>
-              <m:t>X</m:t>
-            </m:r>
-          </m:e>
-          <m:sup>
-            <m:r>
-              <m:t>t</m:t>
-            </m:r>
-          </m:sup>
-        </m:sSup>
-      </m:oMath>
-      <w:r>
-        <w:rPr>
-          <w:i/>
-          <w:iCs/>
-        </w:rPr>
-        <w:t xml:space="preserve">, not</w:t>
-      </w:r>
-      <w:r>
-        <w:rPr>
-          <w:i/>
-          <w:iCs/>
-        </w:rPr>
-        <w:t xml:space="preserve"> </w:t>
-      </w:r>
-      <m:oMath>
-        <m:sSup>
-          <m:e>
-            <m:r>
-              <m:rPr>
-                <m:sty m:val="b"/>
-              </m:rPr>
-              <m:t>S</m:t>
-            </m:r>
-          </m:e>
-          <m:sup>
-            <m:r>
-              <m:t>t</m:t>
-            </m:r>
-          </m:sup>
-        </m:sSup>
-      </m:oMath>
-      <w:r>
-        <w:rPr>
-          <w:i/>
-          <w:iCs/>
-        </w:rPr>
-        <w:t xml:space="preserve">) is pinned to random tokens at every step while the answer denoises freely. bat_ball still answers 5 (</w:t>
-      </w:r>
-      <m:oMath>
-        <m:r>
-          <m:t>S</m:t>
-        </m:r>
-        <m:r>
-          <m:rPr>
-            <m:sty m:val="p"/>
-          </m:rPr>
-          <m:t>=</m:t>
-        </m:r>
-        <m:r>
-          <m:t>0.00</m:t>
-        </m:r>
-      </m:oMath>
-      <w:r>
-        <w:rPr>
-          <w:i/>
-          <w:iCs/>
-        </w:rPr>
-        <w:t xml:space="preserve">); sq1000’s answer breaks to 36/38/46 across corruption seeds (</w:t>
-      </w:r>
-      <m:oMath>
-        <m:r>
-          <m:t>S</m:t>
-        </m:r>
-        <m:r>
-          <m:rPr>
-            <m:sty m:val="p"/>
-          </m:rPr>
-          <m:t>=</m:t>
-        </m:r>
-        <m:r>
-          <m:t>0.70</m:t>
-        </m:r>
-      </m:oMath>
-      <w:r>
-        <w:rPr>
-          <w:i/>
-          <w:iCs/>
-        </w:rPr>
-        <w:t xml:space="preserve">).</w:t>
-      </w:r>
-    </w:p>
-    <w:bookmarkStart w:id="78" w:name="Xabbf9ebb3c7fb0570cb1488d42cd03734ef9222"/>
+        <w:t xml:space="preserve">A pair of easy and hard examples illustrating the previous correlation.</w:t>
+      </w:r>
+      <w:r>
+        <w:rPr>
+          <w:i/>
+          <w:iCs/>
+        </w:rPr>
+        <w:t xml:space="preserve"> </w:t>
+      </w:r>
+      <w:r>
+        <w:rPr>
+          <w:i/>
+          <w:iCs/>
+        </w:rPr>
+        <w:t xml:space="preserve">Top row: normal rollout, model answer highlighted, with its commitment time. Bottom row: the susceptibility, measured like in the previous figure.</w:t>
+      </w:r>
+    </w:p>
+    <w:bookmarkStart w:id="81" w:name="Xabbf9ebb3c7fb0570cb1488d42cd03734ef9222"/>
     <w:p>
       <w:pPr>
         <w:pStyle w:val="Heading4"/>
@@ -5672,7 +5555,7 @@
         <w:pStyle w:val="FirstParagraph"/>
       </w:pPr>
       <w:r>
-        <w:t xml:space="preserve">In the previous paragraph, we analyzed the causal dependence of the answer on the CoT, as well</w:t>
+        <w:t xml:space="preserve">In the previous paragraph, we found that commitment time of the answer correlates with load-bearingness. A natural hypothesis is whether the load-bearing problems will correspondingly also commit the CoT similarly late.</w:t>
       </w:r>
     </w:p>
     <w:p>
@@ -5684,18 +5567,18 @@
           <wp:inline>
             <wp:extent cx="5334000" cy="2125265"/>
             <wp:effectExtent b="0" l="0" r="0" t="0"/>
-            <wp:docPr descr="Answer resolution" title="" id="76" name="Picture"/>
+            <wp:docPr descr="Answer resolution" title="" id="79" name="Picture"/>
             <a:graphic>
               <a:graphicData uri="http://schemas.openxmlformats.org/drawingml/2006/picture">
                 <pic:pic>
                   <pic:nvPicPr>
-                    <pic:cNvPr descr="figs/figA9_resolution.png" id="77" name="Picture"/>
+                    <pic:cNvPr descr="figs/figA9_resolution.png" id="80" name="Picture"/>
                     <pic:cNvPicPr>
                       <a:picLocks noChangeArrowheads="1" noChangeAspect="1"/>
                     </pic:cNvPicPr>
                   </pic:nvPicPr>
                   <pic:blipFill>
-                    <a:blip r:embed="rId75"/>
+                    <a:blip r:embed="rId78"/>
                     <a:stretch>
                       <a:fillRect/>
                     </a:stretch>
@@ -5821,9 +5704,9 @@
         <w:t xml:space="preserve"> </w:t>
       </w:r>
     </w:p>
-    <w:bookmarkEnd w:id="78"/>
-    <w:bookmarkEnd w:id="79"/>
-    <w:bookmarkStart w:id="83" w:name="Xd7c7dfb66314a32b0174c0001aa6561f67f2b90"/>
+    <w:bookmarkEnd w:id="81"/>
+    <w:bookmarkEnd w:id="82"/>
+    <w:bookmarkStart w:id="86" w:name="Xd7c7dfb66314a32b0174c0001aa6561f67f2b90"/>
     <w:p>
       <w:pPr>
         <w:pStyle w:val="Heading3"/>
@@ -5847,18 +5730,18 @@
           <wp:inline>
             <wp:extent cx="5334000" cy="1889125"/>
             <wp:effectExtent b="0" l="0" r="0" t="0"/>
-            <wp:docPr descr="Commitment causality" title="" id="81" name="Picture"/>
+            <wp:docPr descr="Commitment causality" title="" id="84" name="Picture"/>
             <a:graphic>
               <a:graphicData uri="http://schemas.openxmlformats.org/drawingml/2006/picture">
                 <pic:pic>
                   <pic:nvPicPr>
-                    <pic:cNvPr descr="figs/figA11_commit_causality.png" id="82" name="Picture"/>
+                    <pic:cNvPr descr="figs/figA11_commit_causality.png" id="85" name="Picture"/>
                     <pic:cNvPicPr>
                       <a:picLocks noChangeArrowheads="1" noChangeAspect="1"/>
                     </pic:cNvPicPr>
                   </pic:nvPicPr>
                   <pic:blipFill>
-                    <a:blip r:embed="rId80"/>
+                    <a:blip r:embed="rId83"/>
                     <a:stretch>
                       <a:fillRect/>
                     </a:stretch>
@@ -6070,9 +5953,9 @@
         <w:t xml:space="preserve">, which requires the model to reverse its reasoning order.</w:t>
       </w:r>
     </w:p>
-    <w:bookmarkEnd w:id="83"/>
-    <w:bookmarkEnd w:id="84"/>
-    <w:bookmarkEnd w:id="85"/>
+    <w:bookmarkEnd w:id="86"/>
+    <w:bookmarkEnd w:id="87"/>
+    <w:bookmarkEnd w:id="88"/>
     <w:sectPr>
       <w:footnotePr>
         <w:numRestart w:val="eachSect"/>

</xml_diff>

<commit_message>
figA8 caption: user rewrite checked + completed (three blind raters, S vs rho=0 baseline, four task families); figA7 removed again per user
Co-Authored-By: Claude Fable 5 <noreply@anthropic.com>
</commit_message>
<xml_diff>
--- a/post.docx
+++ b/post.docx
@@ -2,7 +2,7 @@
 <file path=word/document.xml><?xml version="1.0" encoding="utf-8"?>
 <w:document xmlns:w="http://schemas.openxmlformats.org/wordprocessingml/2006/main" xmlns:m="http://schemas.openxmlformats.org/officeDocument/2006/math" xmlns:r="http://schemas.openxmlformats.org/officeDocument/2006/relationships" xmlns:o="urn:schemas-microsoft-com:office:office" xmlns:v="urn:schemas-microsoft-com:vml" xmlns:w10="urn:schemas-microsoft-com:office:word" xmlns:a="http://schemas.openxmlformats.org/drawingml/2006/main" xmlns:pic="http://schemas.openxmlformats.org/drawingml/2006/picture" xmlns:wp="http://schemas.openxmlformats.org/drawingml/2006/wordprocessingDrawing">
   <w:body>
-    <w:bookmarkStart w:id="88" w:name="Xf5e660dc2e9c1a368125465a5756c31f66c44e2"/>
+    <w:bookmarkStart w:id="85" w:name="Xf5e660dc2e9c1a368125465a5756c31f66c44e2"/>
     <w:p>
       <w:pPr>
         <w:pStyle w:val="Heading1"/>
@@ -2776,7 +2776,7 @@
       </w:r>
     </w:p>
     <w:bookmarkEnd w:id="40"/>
-    <w:bookmarkStart w:id="87" w:name="appendix"/>
+    <w:bookmarkStart w:id="84" w:name="appendix"/>
     <w:p>
       <w:pPr>
         <w:pStyle w:val="Heading2"/>
@@ -4534,7 +4534,7 @@
       </w:r>
     </w:p>
     <w:bookmarkEnd w:id="63"/>
-    <w:bookmarkStart w:id="70" w:name="Xea3042850cf8050407ffdd53c2454b5f83a5608"/>
+    <w:bookmarkStart w:id="67" w:name="Xea3042850cf8050407ffdd53c2454b5f83a5608"/>
     <w:p>
       <w:pPr>
         <w:pStyle w:val="Heading3"/>
@@ -5154,7 +5154,20 @@
         <w:pStyle w:val="BodyText"/>
       </w:pPr>
       <w:r>
-        <w:t xml:space="preserve">Note that while it doesn’t require</w:t>
+        <w:t xml:space="preserve">Note that this example also represents a more general instantion of</w:t>
+      </w:r>
+      <w:r>
+        <w:t xml:space="preserve"> </w:t>
+      </w:r>
+      <w:r>
+        <w:rPr>
+          <w:b/>
+          <w:bCs/>
+        </w:rPr>
+        <w:t xml:space="preserve">self-correction</w:t>
+      </w:r>
+      <w:r>
+        <w:t xml:space="preserve">, anticipating the correction through the</w:t>
       </w:r>
       <w:r>
         <w:t xml:space="preserve"> </w:t>
@@ -5177,161 +5190,14 @@
         </m:sSup>
       </m:oMath>
       <w:r>
-        <w:t xml:space="preserve">, this is also an instance of</w:t>
-      </w:r>
-      <w:r>
-        <w:t xml:space="preserve"> </w:t>
-      </w:r>
-      <w:r>
-        <w:rPr>
-          <w:b/>
-          <w:bCs/>
-        </w:rPr>
-        <w:t xml:space="preserve">self-correction</w:t>
-      </w:r>
-      <w:r>
-        <w:t xml:space="preserve">. This has important consequences for monitorability which may not have been captured in Engels et al.’s analysis: a tool reading only the final diffusion output will miss transient output. A model may for instance choose to hide a specific fact in its chain-of-thought to a monitor, while having used it intermittently, though we did not find any instances of such behavior here.</w:t>
-      </w:r>
-    </w:p>
-    <w:p>
-      <w:pPr>
-        <w:pStyle w:val="CaptionedFigure"/>
-      </w:pPr>
-      <w:r>
-        <w:drawing>
-          <wp:inline>
-            <wp:extent cx="5334000" cy="4012353"/>
-            <wp:effectExtent b="0" l="0" r="0" t="0"/>
-            <wp:docPr descr="Constraint margins" title="" id="68" name="Picture"/>
-            <a:graphic>
-              <a:graphicData uri="http://schemas.openxmlformats.org/drawingml/2006/picture">
-                <pic:pic>
-                  <pic:nvPicPr>
-                    <pic:cNvPr descr="figs/figA7_constraint_margins.png" id="69" name="Picture"/>
-                    <pic:cNvPicPr>
-                      <a:picLocks noChangeArrowheads="1" noChangeAspect="1"/>
-                    </pic:cNvPicPr>
-                  </pic:nvPicPr>
-                  <pic:blipFill>
-                    <a:blip r:embed="rId67"/>
-                    <a:stretch>
-                      <a:fillRect/>
-                    </a:stretch>
-                  </pic:blipFill>
-                  <pic:spPr bwMode="auto">
-                    <a:xfrm>
-                      <a:off x="0" y="0"/>
-                      <a:ext cx="5334000" cy="4012353"/>
-                    </a:xfrm>
-                    <a:prstGeom prst="rect">
-                      <a:avLst/>
-                    </a:prstGeom>
-                    <a:noFill/>
-                    <a:ln w="9525">
-                      <a:noFill/>
-                      <a:headEnd/>
-                      <a:tailEnd/>
-                    </a:ln>
-                  </pic:spPr>
-                </pic:pic>
-              </a:graphicData>
-            </a:graphic>
-          </wp:inline>
-        </w:drawing>
-      </w:r>
-    </w:p>
-    <w:p>
-      <w:pPr>
-        <w:pStyle w:val="ImageCaption"/>
-      </w:pPr>
-      <w:r>
-        <w:t xml:space="preserve">Constraint margins</w:t>
-      </w:r>
-    </w:p>
-    <w:p>
-      <w:pPr>
-        <w:pStyle w:val="BodyText"/>
-      </w:pPr>
-      <w:r>
-        <w:rPr>
-          <w:b/>
-          <w:bCs/>
-          <w:i/>
-          <w:iCs/>
-        </w:rPr>
-        <w:t xml:space="preserve">Drafts transiently violate the constraint and are only patched late.</w:t>
-      </w:r>
-      <w:r>
-        <w:rPr>
-          <w:i/>
-          <w:iCs/>
-        </w:rPr>
-        <w:t xml:space="preserve"> </w:t>
-      </w:r>
-      <w:r>
-        <w:rPr>
-          <w:i/>
-          <w:iCs/>
-        </w:rPr>
-        <w:t xml:space="preserve">Constraint margin (number of violations) on a constrained writing task (word palindrome, hot sampler), over linearly warped diffusion time</w:t>
-      </w:r>
-      <w:r>
-        <w:rPr>
-          <w:i/>
-          <w:iCs/>
-        </w:rPr>
-        <w:t xml:space="preserve"> </w:t>
-      </w:r>
-      <m:oMath>
-        <m:r>
-          <m:t>τ</m:t>
-        </m:r>
-      </m:oMath>
-      <w:r>
-        <w:rPr>
-          <w:i/>
-          <w:iCs/>
-        </w:rPr>
-        <w:t xml:space="preserve"> </w:t>
-      </w:r>
-      <w:r>
-        <w:rPr>
-          <w:i/>
-          <w:iCs/>
-        </w:rPr>
-        <w:t xml:space="preserve">(each run’s active phase normalized so its last margin change sits at</w:t>
-      </w:r>
-      <w:r>
-        <w:rPr>
-          <w:i/>
-          <w:iCs/>
-        </w:rPr>
-        <w:t xml:space="preserve"> </w:t>
-      </w:r>
-      <m:oMath>
-        <m:r>
-          <m:t>τ</m:t>
-        </m:r>
-        <m:r>
-          <m:rPr>
-            <m:sty m:val="p"/>
-          </m:rPr>
-          <m:t>=</m:t>
-        </m:r>
-        <m:r>
-          <m:t>1</m:t>
-        </m:r>
-      </m:oMath>
-      <w:r>
-        <w:rPr>
-          <w:i/>
-          <w:iCs/>
-        </w:rPr>
-        <w:t xml:space="preserve">; green = runs that escape to a valid sentence, orange = trapped, blue = clean). Bottom: three decoded canvases of the flagship escape run — the mid-run draft still violates the constraint before the late repair lands on a valid palindrome. This is the same rollout family as the seasonal → idiom example above.</w:t>
-      </w:r>
-    </w:p>
-    <w:bookmarkEnd w:id="70"/>
-    <w:bookmarkStart w:id="82" w:name="post-hoc-rationalization"/>
+        <w:t xml:space="preserve"> </w:t>
+      </w:r>
+      <w:r>
+        <w:t xml:space="preserve">channel. This has important consequences for monitorability which may not have been captured in Engels et al.’s analysis: a tool reading only the final diffusion output will miss transient output. A model may for instance choose to hide a specific fact in its chain-of-thought to a monitor, while having used it intermittently, though we did not find any instances of such behavior here.</w:t>
+      </w:r>
+    </w:p>
+    <w:bookmarkEnd w:id="67"/>
+    <w:bookmarkStart w:id="79" w:name="post-hoc-rationalization"/>
     <w:p>
       <w:pPr>
         <w:pStyle w:val="Heading3"/>
@@ -5347,7 +5213,7 @@
       <w:r>
         <w:t xml:space="preserve">An important question in monitorability (</w:t>
       </w:r>
-      <w:hyperlink r:id="rId71">
+      <w:hyperlink r:id="rId68">
         <w:r>
           <w:rPr>
             <w:rStyle w:val="Hyperlink"/>
@@ -5376,18 +5242,18 @@
           <wp:inline>
             <wp:extent cx="5334000" cy="1619249"/>
             <wp:effectExtent b="0" l="0" r="0" t="0"/>
-            <wp:docPr descr="Post-hoc correlations" title="" id="73" name="Picture"/>
+            <wp:docPr descr="Post-hoc correlations" title="" id="70" name="Picture"/>
             <a:graphic>
               <a:graphicData uri="http://schemas.openxmlformats.org/drawingml/2006/picture">
                 <pic:pic>
                   <pic:nvPicPr>
-                    <pic:cNvPr descr="figs/figA8_posthoc_correlations.png" id="74" name="Picture"/>
+                    <pic:cNvPr descr="figs/figA8_posthoc_correlations.png" id="71" name="Picture"/>
                     <pic:cNvPicPr>
                       <a:picLocks noChangeArrowheads="1" noChangeAspect="1"/>
                     </pic:cNvPicPr>
                   </pic:nvPicPr>
                   <pic:blipFill>
-                    <a:blip r:embed="rId72"/>
+                    <a:blip r:embed="rId69"/>
                     <a:stretch>
                       <a:fillRect/>
                     </a:stretch>
@@ -5447,7 +5313,216 @@
           <w:i/>
           <w:iCs/>
         </w:rPr>
-        <w:t xml:space="preserve">Problem difficulty is measured via an LLM judge, CoT load-bearingness via a susceptiblity: how sensitive the answer is to replacing the CoT with random related tokens, and commitment time is when the answer commits. We consider problems from tasks XXX</w:t>
+        <w:t xml:space="preserve">Problem difficulty is the mean rating of three blind LLM raters (shown only the problem and its correct answer), CoT load-bearingness is measured via a susceptibility</w:t>
+      </w:r>
+      <w:r>
+        <w:rPr>
+          <w:i/>
+          <w:iCs/>
+        </w:rPr>
+        <w:t xml:space="preserve"> </w:t>
+      </w:r>
+      <m:oMath>
+        <m:r>
+          <m:t>S</m:t>
+        </m:r>
+      </m:oMath>
+      <w:r>
+        <w:rPr>
+          <w:i/>
+          <w:iCs/>
+        </w:rPr>
+        <w:t xml:space="preserve">: the flip rate of the answer when a</w:t>
+      </w:r>
+      <w:r>
+        <w:rPr>
+          <w:i/>
+          <w:iCs/>
+        </w:rPr>
+        <w:t xml:space="preserve"> </w:t>
+      </w:r>
+      <m:oMath>
+        <m:r>
+          <m:t>ρ</m:t>
+        </m:r>
+      </m:oMath>
+      <w:r>
+        <w:rPr>
+          <w:i/>
+          <w:iCs/>
+        </w:rPr>
+        <w:t xml:space="preserve">-fraction of the CoT canvas positions (</w:t>
+      </w:r>
+      <m:oMath>
+        <m:sSup>
+          <m:e>
+            <m:r>
+              <m:t>X</m:t>
+            </m:r>
+          </m:e>
+          <m:sup>
+            <m:r>
+              <m:t>t</m:t>
+            </m:r>
+          </m:sup>
+        </m:sSup>
+      </m:oMath>
+      <w:r>
+        <w:rPr>
+          <w:i/>
+          <w:iCs/>
+        </w:rPr>
+        <w:t xml:space="preserve">, pinned every step) is replaced with random tokens (averaged over</w:t>
+      </w:r>
+      <w:r>
+        <w:rPr>
+          <w:i/>
+          <w:iCs/>
+        </w:rPr>
+        <w:t xml:space="preserve"> </w:t>
+      </w:r>
+      <m:oMath>
+        <m:r>
+          <m:t>ρ</m:t>
+        </m:r>
+      </m:oMath>
+      <w:r>
+        <w:rPr>
+          <w:i/>
+          <w:iCs/>
+        </w:rPr>
+        <w:t xml:space="preserve">, against the</w:t>
+      </w:r>
+      <w:r>
+        <w:rPr>
+          <w:i/>
+          <w:iCs/>
+        </w:rPr>
+        <w:t xml:space="preserve"> </w:t>
+      </w:r>
+      <m:oMath>
+        <m:r>
+          <m:t>ρ</m:t>
+        </m:r>
+        <m:r>
+          <m:rPr>
+            <m:sty m:val="p"/>
+          </m:rPr>
+          <m:t>=</m:t>
+        </m:r>
+        <m:r>
+          <m:t>0</m:t>
+        </m:r>
+      </m:oMath>
+      <w:r>
+        <w:rPr>
+          <w:i/>
+          <w:iCs/>
+        </w:rPr>
+        <w:t xml:space="preserve"> </w:t>
+      </w:r>
+      <w:r>
+        <w:rPr>
+          <w:i/>
+          <w:iCs/>
+        </w:rPr>
+        <w:t xml:space="preserve">own-CoT-pinned baseline), and commitment time is the denoising step after which the answer’s canvas positions stop changing (median over 5 seeds). We consider</w:t>
+      </w:r>
+      <w:r>
+        <w:rPr>
+          <w:i/>
+          <w:iCs/>
+        </w:rPr>
+        <w:t xml:space="preserve"> </w:t>
+      </w:r>
+      <m:oMath>
+        <m:r>
+          <m:t>n</m:t>
+        </m:r>
+        <m:r>
+          <m:rPr>
+            <m:sty m:val="p"/>
+          </m:rPr>
+          <m:t>=</m:t>
+        </m:r>
+        <m:r>
+          <m:t>40</m:t>
+        </m:r>
+      </m:oMath>
+      <w:r>
+        <w:rPr>
+          <w:i/>
+          <w:iCs/>
+        </w:rPr>
+        <w:t xml:space="preserve"> </w:t>
+      </w:r>
+      <w:r>
+        <w:rPr>
+          <w:i/>
+          <w:iCs/>
+        </w:rPr>
+        <w:t xml:space="preserve">problems from four task families: CRT-style intuition traps (crt), counting/enumeration (count), hard arithmetic/enumeration (hard), and multi-hop compute-then-transform chains (transform). Spearman</w:t>
+      </w:r>
+      <w:r>
+        <w:rPr>
+          <w:i/>
+          <w:iCs/>
+        </w:rPr>
+        <w:t xml:space="preserve"> </w:t>
+      </w:r>
+      <m:oMath>
+        <m:sSub>
+          <m:e>
+            <m:r>
+              <m:t>ρ</m:t>
+            </m:r>
+          </m:e>
+          <m:sub>
+            <m:r>
+              <m:t>S</m:t>
+            </m:r>
+          </m:sub>
+        </m:sSub>
+      </m:oMath>
+      <w:r>
+        <w:rPr>
+          <w:i/>
+          <w:iCs/>
+        </w:rPr>
+        <w:t xml:space="preserve"> </w:t>
+      </w:r>
+      <w:r>
+        <w:rPr>
+          <w:i/>
+          <w:iCs/>
+        </w:rPr>
+        <w:t xml:space="preserve">with two-sided permutation</w:t>
+      </w:r>
+      <w:r>
+        <w:rPr>
+          <w:i/>
+          <w:iCs/>
+        </w:rPr>
+        <w:t xml:space="preserve"> </w:t>
+      </w:r>
+      <m:oMath>
+        <m:r>
+          <m:t>p</m:t>
+        </m:r>
+      </m:oMath>
+      <w:r>
+        <w:rPr>
+          <w:i/>
+          <w:iCs/>
+        </w:rPr>
+        <w:t xml:space="preserve"> </w:t>
+      </w:r>
+      <w:r>
+        <w:rPr>
+          <w:i/>
+          <w:iCs/>
+        </w:rPr>
+        <w:t xml:space="preserve">per panel; × = accuracy &lt; 0.5, dashed = least-squares fit.</w:t>
       </w:r>
     </w:p>
     <w:p>
@@ -5467,18 +5542,18 @@
           <wp:inline>
             <wp:extent cx="5334000" cy="4036060"/>
             <wp:effectExtent b="0" l="0" r="0" t="0"/>
-            <wp:docPr descr="Post-hoc case study" title="" id="76" name="Picture"/>
+            <wp:docPr descr="Post-hoc case study" title="" id="73" name="Picture"/>
             <a:graphic>
               <a:graphicData uri="http://schemas.openxmlformats.org/drawingml/2006/picture">
                 <pic:pic>
                   <pic:nvPicPr>
-                    <pic:cNvPr descr="figs/figA8b_posthoc_case.png" id="77" name="Picture"/>
+                    <pic:cNvPr descr="figs/figA8b_posthoc_case.png" id="74" name="Picture"/>
                     <pic:cNvPicPr>
                       <a:picLocks noChangeArrowheads="1" noChangeAspect="1"/>
                     </pic:cNvPicPr>
                   </pic:nvPicPr>
                   <pic:blipFill>
-                    <a:blip r:embed="rId75"/>
+                    <a:blip r:embed="rId72"/>
                     <a:stretch>
                       <a:fillRect/>
                     </a:stretch>
@@ -5541,7 +5616,7 @@
         <w:t xml:space="preserve">Top row: normal rollout, model answer highlighted, with its commitment time. Bottom row: the susceptibility, measured like in the previous figure.</w:t>
       </w:r>
     </w:p>
-    <w:bookmarkStart w:id="81" w:name="Xabbf9ebb3c7fb0570cb1488d42cd03734ef9222"/>
+    <w:bookmarkStart w:id="78" w:name="Xabbf9ebb3c7fb0570cb1488d42cd03734ef9222"/>
     <w:p>
       <w:pPr>
         <w:pStyle w:val="Heading4"/>
@@ -5567,18 +5642,18 @@
           <wp:inline>
             <wp:extent cx="5334000" cy="2125265"/>
             <wp:effectExtent b="0" l="0" r="0" t="0"/>
-            <wp:docPr descr="Answer resolution" title="" id="79" name="Picture"/>
+            <wp:docPr descr="Answer resolution" title="" id="76" name="Picture"/>
             <a:graphic>
               <a:graphicData uri="http://schemas.openxmlformats.org/drawingml/2006/picture">
                 <pic:pic>
                   <pic:nvPicPr>
-                    <pic:cNvPr descr="figs/figA9_resolution.png" id="80" name="Picture"/>
+                    <pic:cNvPr descr="figs/figA9_resolution.png" id="77" name="Picture"/>
                     <pic:cNvPicPr>
                       <a:picLocks noChangeArrowheads="1" noChangeAspect="1"/>
                     </pic:cNvPicPr>
                   </pic:nvPicPr>
                   <pic:blipFill>
-                    <a:blip r:embed="rId78"/>
+                    <a:blip r:embed="rId75"/>
                     <a:stretch>
                       <a:fillRect/>
                     </a:stretch>
@@ -5704,9 +5779,9 @@
         <w:t xml:space="preserve"> </w:t>
       </w:r>
     </w:p>
-    <w:bookmarkEnd w:id="81"/>
-    <w:bookmarkEnd w:id="82"/>
-    <w:bookmarkStart w:id="86" w:name="Xd7c7dfb66314a32b0174c0001aa6561f67f2b90"/>
+    <w:bookmarkEnd w:id="78"/>
+    <w:bookmarkEnd w:id="79"/>
+    <w:bookmarkStart w:id="83" w:name="Xd7c7dfb66314a32b0174c0001aa6561f67f2b90"/>
     <w:p>
       <w:pPr>
         <w:pStyle w:val="Heading3"/>
@@ -5730,18 +5805,18 @@
           <wp:inline>
             <wp:extent cx="5334000" cy="1889125"/>
             <wp:effectExtent b="0" l="0" r="0" t="0"/>
-            <wp:docPr descr="Commitment causality" title="" id="84" name="Picture"/>
+            <wp:docPr descr="Commitment causality" title="" id="81" name="Picture"/>
             <a:graphic>
               <a:graphicData uri="http://schemas.openxmlformats.org/drawingml/2006/picture">
                 <pic:pic>
                   <pic:nvPicPr>
-                    <pic:cNvPr descr="figs/figA11_commit_causality.png" id="85" name="Picture"/>
+                    <pic:cNvPr descr="figs/figA11_commit_causality.png" id="82" name="Picture"/>
                     <pic:cNvPicPr>
                       <a:picLocks noChangeArrowheads="1" noChangeAspect="1"/>
                     </pic:cNvPicPr>
                   </pic:nvPicPr>
                   <pic:blipFill>
-                    <a:blip r:embed="rId83"/>
+                    <a:blip r:embed="rId80"/>
                     <a:stretch>
                       <a:fillRect/>
                     </a:stretch>
@@ -5924,7 +5999,7 @@
         <w:pStyle w:val="BodyText"/>
       </w:pPr>
       <w:r>
-        <w:t xml:space="preserve">We considered three tasks. GPQA, which involves logic-style problems and therefore shoudl require left-to-right generation,</w:t>
+        <w:t xml:space="preserve">We considered three tasks: GPQA, which involves logic-style problems and therefore shoudl require left-to-right generation,</w:t>
       </w:r>
       <w:r>
         <w:t xml:space="preserve"> </w:t>
@@ -5953,9 +6028,9 @@
         <w:t xml:space="preserve">, which requires the model to reverse its reasoning order.</w:t>
       </w:r>
     </w:p>
-    <w:bookmarkEnd w:id="86"/>
-    <w:bookmarkEnd w:id="87"/>
-    <w:bookmarkEnd w:id="88"/>
+    <w:bookmarkEnd w:id="83"/>
+    <w:bookmarkEnd w:id="84"/>
+    <w:bookmarkEnd w:id="85"/>
     <w:sectPr>
       <w:footnotePr>
         <w:numRestart w:val="eachSect"/>

</xml_diff>

<commit_message>
appendix: letter-arithmetic section — strict min_T-vs-max_NT triptychs (letters + xk) and the multiplicative transfer map/mean triptych; payload refreshed with mu/rf/kb/mn3/cp domains (additive subtrees byte-identical)
Co-Authored-By: Claude Fable 5 <noreply@anthropic.com>
</commit_message>
<xml_diff>
--- a/post.docx
+++ b/post.docx
@@ -2,7 +2,7 @@
 <file path=word/document.xml><?xml version="1.0" encoding="utf-8"?>
 <w:document xmlns:w="http://schemas.openxmlformats.org/wordprocessingml/2006/main" xmlns:m="http://schemas.openxmlformats.org/officeDocument/2006/math" xmlns:r="http://schemas.openxmlformats.org/officeDocument/2006/relationships" xmlns:o="urn:schemas-microsoft-com:office:office" xmlns:v="urn:schemas-microsoft-com:vml" xmlns:w10="urn:schemas-microsoft-com:office:word" xmlns:a="http://schemas.openxmlformats.org/drawingml/2006/main" xmlns:pic="http://schemas.openxmlformats.org/drawingml/2006/picture" xmlns:wp="http://schemas.openxmlformats.org/drawingml/2006/wordprocessingDrawing">
   <w:body>
-    <w:bookmarkStart w:id="85" w:name="Xf5e660dc2e9c1a368125465a5756c31f66c44e2"/>
+    <w:bookmarkStart w:id="99" w:name="Xf5e660dc2e9c1a368125465a5756c31f66c44e2"/>
     <w:p>
       <w:pPr>
         <w:pStyle w:val="Heading1"/>
@@ -2776,7 +2776,7 @@
       </w:r>
     </w:p>
     <w:bookmarkEnd w:id="40"/>
-    <w:bookmarkStart w:id="84" w:name="appendix"/>
+    <w:bookmarkStart w:id="98" w:name="appendix"/>
     <w:p>
       <w:pPr>
         <w:pStyle w:val="Heading2"/>
@@ -4534,379 +4534,164 @@
       </w:r>
     </w:p>
     <w:bookmarkEnd w:id="63"/>
-    <w:bookmarkStart w:id="67" w:name="Xea3042850cf8050407ffdd53c2454b5f83a5608"/>
+    <w:bookmarkStart w:id="77" w:name="letter-arithmetic"/>
     <w:p>
       <w:pPr>
         <w:pStyle w:val="Heading3"/>
       </w:pPr>
       <w:r>
-        <w:t xml:space="preserve">Autonomous computational usage of</w:t>
-      </w:r>
-      <w:r>
-        <w:t xml:space="preserve"> </w:t>
-      </w:r>
-      <m:oMath>
-        <m:sSup>
-          <m:e>
-            <m:r>
-              <m:rPr>
-                <m:sty m:val="b"/>
-              </m:rPr>
-              <m:t>s</m:t>
-            </m:r>
-          </m:e>
-          <m:sup>
-            <m:r>
-              <m:t>t</m:t>
-            </m:r>
-          </m:sup>
-        </m:sSup>
-      </m:oMath>
+        <w:t xml:space="preserve">Letter arithmetic</w:t>
+      </w:r>
     </w:p>
     <w:p>
       <w:pPr>
         <w:pStyle w:val="FirstParagraph"/>
       </w:pPr>
       <w:r>
-        <w:t xml:space="preserve">In the</w:t>
-      </w:r>
-      <w:r>
-        <w:t xml:space="preserve"> </w:t>
-      </w:r>
-      <w:r>
-        <w:rPr>
-          <w:i/>
-          <w:iCs/>
-        </w:rPr>
-        <w:t xml:space="preserve">letter arithmetic</w:t>
-      </w:r>
-      <w:r>
-        <w:t xml:space="preserve"> </w:t>
-      </w:r>
-      <w:r>
-        <w:t xml:space="preserve">task introduced in the main text, DiffusionGemma did respond to modifications of the distributional state in the way we expected. While suggestive, it is unclear if the model also would make use of</w:t>
-      </w:r>
-      <w:r>
-        <w:t xml:space="preserve"> </w:t>
-      </w:r>
-      <m:oMath>
-        <m:sSup>
-          <m:e>
-            <m:r>
-              <m:rPr>
-                <m:sty m:val="b"/>
-              </m:rPr>
-              <m:t>s</m:t>
-            </m:r>
-          </m:e>
-          <m:sup>
-            <m:r>
-              <m:t>t</m:t>
-            </m:r>
-          </m:sup>
-        </m:sSup>
-      </m:oMath>
-      <w:r>
-        <w:t xml:space="preserve"> </w:t>
-      </w:r>
-      <w:r>
-        <w:rPr>
-          <w:i/>
-          <w:iCs/>
-        </w:rPr>
-        <w:t xml:space="preserve">autonomously</w:t>
-      </w:r>
-      <w:r>
-        <w:t xml:space="preserve">, i.e. without interventions.</w:t>
-      </w:r>
-    </w:p>
-    <w:p>
-      <w:pPr>
-        <w:pStyle w:val="BodyText"/>
-      </w:pPr>
-      <w:r>
-        <w:t xml:space="preserve">To investigate this, we searched for a non-trivial (i.e., not just a binary choice) task where DG will use a hypothesis subleading in its distribution. An instance we found is a</w:t>
-      </w:r>
-      <w:r>
-        <w:t xml:space="preserve"> </w:t>
-      </w:r>
-      <w:r>
-        <w:rPr>
-          <w:i/>
-          <w:iCs/>
-        </w:rPr>
-        <w:t xml:space="preserve">word-level palindrome</w:t>
-      </w:r>
-      <w:r>
-        <w:t xml:space="preserve"> </w:t>
-      </w:r>
-      <w:r>
-        <w:t xml:space="preserve">task. When asked</w:t>
-      </w:r>
-      <w:r>
-        <w:t xml:space="preserve"> </w:t>
-      </w:r>
-      <w:r>
-        <w:rPr>
-          <w:rStyle w:val="VerbatimChar"/>
-        </w:rPr>
-        <w:t xml:space="preserve">Please write a word-level palindrome</w:t>
-      </w:r>
-      <w:r>
-        <w:t xml:space="preserve">, DG maintains two competing completions of the same canvas: a literal</w:t>
-      </w:r>
-      <w:r>
-        <w:t xml:space="preserve"> </w:t>
-      </w:r>
-      <w:r>
-        <w:rPr>
-          <w:i/>
-          <w:iCs/>
-        </w:rPr>
-        <w:t xml:space="preserve">seasonal</w:t>
-      </w:r>
-      <w:r>
-        <w:t xml:space="preserve"> </w:t>
-      </w:r>
-      <w:r>
-        <w:t xml:space="preserve">phrase (</w:t>
-      </w:r>
-      <w:r>
-        <w:rPr>
-          <w:rStyle w:val="VerbatimChar"/>
-        </w:rPr>
-        <w:t xml:space="preserve">All leaves fall when leaves fall all.</w:t>
-      </w:r>
-      <w:r>
-        <w:t xml:space="preserve">) and the famous</w:t>
-      </w:r>
-      <w:r>
-        <w:t xml:space="preserve"> </w:t>
-      </w:r>
-      <w:r>
-        <w:rPr>
-          <w:i/>
-          <w:iCs/>
-        </w:rPr>
-        <w:t xml:space="preserve">idiom</w:t>
-      </w:r>
-      <w:r>
-        <w:t xml:space="preserve"> </w:t>
-      </w:r>
-      <w:r>
-        <w:t xml:space="preserve">(</w:t>
-      </w:r>
-      <w:r>
-        <w:rPr>
-          <w:rStyle w:val="VerbatimChar"/>
-        </w:rPr>
-        <w:t xml:space="preserve">All for one and one for all.</w:t>
-      </w:r>
-      <w:r>
-        <w:t xml:space="preserve">).</w:t>
-      </w:r>
-    </w:p>
-    <w:p>
-      <w:pPr>
-        <w:pStyle w:val="BodyText"/>
-      </w:pPr>
-      <w:r>
-        <w:t xml:space="preserve">The canvas will read the</w:t>
-      </w:r>
-      <w:r>
-        <w:t xml:space="preserve"> </w:t>
-      </w:r>
-      <w:r>
-        <w:rPr>
-          <w:i/>
-          <w:iCs/>
-        </w:rPr>
-        <w:t xml:space="preserve">seasonal</w:t>
-      </w:r>
-      <w:r>
-        <w:t xml:space="preserve"> </w:t>
-      </w:r>
-      <w:r>
-        <w:t xml:space="preserve">answer for the first few diffusion steps, after which it flips and stays at</w:t>
-      </w:r>
-      <w:r>
-        <w:t xml:space="preserve"> </w:t>
-      </w:r>
-      <w:r>
-        <w:rPr>
-          <w:i/>
-          <w:iCs/>
-        </w:rPr>
-        <w:t xml:space="preserve">idiom</w:t>
-      </w:r>
-      <w:r>
-        <w:t xml:space="preserve">. Interestingly, this is accompanied by</w:t>
-      </w:r>
-      <w:r>
-        <w:t xml:space="preserve"> </w:t>
-      </w:r>
-      <w:r>
-        <w:rPr>
-          <w:i/>
-          <w:iCs/>
-        </w:rPr>
-        <w:t xml:space="preserve">dynamics</w:t>
-      </w:r>
-      <w:r>
-        <w:t xml:space="preserve"> </w:t>
-      </w:r>
-      <w:r>
-        <w:t xml:space="preserve">in</w:t>
-      </w:r>
-      <w:r>
-        <w:t xml:space="preserve"> </w:t>
-      </w:r>
-      <m:oMath>
-        <m:sSup>
-          <m:e>
-            <m:r>
-              <m:rPr>
-                <m:sty m:val="b"/>
-              </m:rPr>
-              <m:t>s</m:t>
-            </m:r>
-          </m:e>
-          <m:sup>
-            <m:r>
-              <m:t>t</m:t>
-            </m:r>
-          </m:sup>
-        </m:sSup>
-      </m:oMath>
-      <w:r>
-        <w:t xml:space="preserve">:</w:t>
-      </w:r>
-      <w:r>
-        <w:t xml:space="preserve"> </w:t>
-      </w:r>
-      <w:r>
-        <w:rPr>
-          <w:i/>
-          <w:iCs/>
-        </w:rPr>
-        <w:t xml:space="preserve">idiom</w:t>
-      </w:r>
-      <w:r>
-        <w:t xml:space="preserve"> </w:t>
-      </w:r>
-      <w:r>
-        <w:t xml:space="preserve">will start at ~0, and progressively gain weight, replacing</w:t>
-      </w:r>
-      <w:r>
-        <w:t xml:space="preserve"> </w:t>
-      </w:r>
-      <w:r>
-        <w:rPr>
-          <w:i/>
-          <w:iCs/>
-        </w:rPr>
-        <w:t xml:space="preserve">seasonal</w:t>
-      </w:r>
-      <w:r>
-        <w:t xml:space="preserve">.</w:t>
-      </w:r>
-    </w:p>
-    <w:p>
-      <w:pPr>
-        <w:pStyle w:val="BodyText"/>
-      </w:pPr>
-      <w:r>
-        <w:t xml:space="preserve">We validated that the emergence of</w:t>
-      </w:r>
-      <w:r>
-        <w:t xml:space="preserve"> </w:t>
-      </w:r>
-      <w:r>
-        <w:rPr>
-          <w:i/>
-          <w:iCs/>
-        </w:rPr>
-        <w:t xml:space="preserve">idiom</w:t>
-      </w:r>
-      <w:r>
-        <w:t xml:space="preserve"> </w:t>
-      </w:r>
-      <w:r>
-        <w:t xml:space="preserve">is indeed causal: persistently ablating</w:t>
-      </w:r>
-      <w:r>
-        <w:t xml:space="preserve"> </w:t>
-      </w:r>
-      <w:r>
-        <w:rPr>
-          <w:i/>
-          <w:iCs/>
-        </w:rPr>
-        <w:t xml:space="preserve">idiom</w:t>
-      </w:r>
-      <w:r>
-        <w:t xml:space="preserve">’s</w:t>
-      </w:r>
-      <w:r>
-        <w:t xml:space="preserve"> </w:t>
-      </w:r>
-      <m:oMath>
-        <m:r>
-          <m:rPr>
-            <m:sty m:val="b"/>
-          </m:rPr>
-          <m:t>s</m:t>
-        </m:r>
-      </m:oMath>
-      <w:r>
-        <w:t xml:space="preserve">-mass from an early step onward prevents the takeover and preserves the seasonal draft. Concretely, at every step</w:t>
-      </w:r>
-      <w:r>
-        <w:t xml:space="preserve"> </w:t>
-      </w:r>
-      <m:oMath>
-        <m:r>
-          <m:t>t</m:t>
-        </m:r>
+        <w:t xml:space="preserve">[stub:] The parallelism analysis in the main text compares set</w:t>
+      </w:r>
+      <w:r>
+        <w:t xml:space="preserve"> </w:t>
+      </w:r>
+      <w:r>
+        <w:rPr>
+          <w:i/>
+          <w:iCs/>
+        </w:rPr>
+        <w:t xml:space="preserve">means</w:t>
+      </w:r>
+      <w:r>
+        <w:t xml:space="preserve">,</w:t>
+      </w:r>
+      <w:r>
+        <w:t xml:space="preserve"> </w:t>
+      </w:r>
+      <m:oMath>
         <m:r>
           <m:rPr>
             <m:sty m:val="p"/>
           </m:rPr>
-          <m:t>≥</m:t>
+          <m:t>⟨</m:t>
+        </m:r>
+        <m:r>
+          <m:t>R</m:t>
         </m:r>
         <m:sSub>
           <m:e>
-            <m:r>
-              <m:t>t</m:t>
-            </m:r>
-          </m:e>
-          <m:sub>
             <m:r>
               <m:rPr>
                 <m:sty m:val="p"/>
               </m:rPr>
-              <m:t>a</m:t>
-            </m:r>
+              <m:t>⟩</m:t>
+            </m:r>
+          </m:e>
+          <m:sub>
+            <m:r>
+              <m:t>T</m:t>
+            </m:r>
+          </m:sub>
+        </m:sSub>
+      </m:oMath>
+      <w:r>
+        <w:t xml:space="preserve"> </w:t>
+      </w:r>
+      <w:r>
+        <w:t xml:space="preserve">vs</w:t>
+      </w:r>
+      <w:r>
+        <w:t xml:space="preserve"> </w:t>
+      </w:r>
+      <m:oMath>
+        <m:r>
+          <m:rPr>
+            <m:sty m:val="p"/>
+          </m:rPr>
+          <m:t>⟨</m:t>
+        </m:r>
+        <m:r>
+          <m:t>R</m:t>
+        </m:r>
+        <m:sSub>
+          <m:e>
             <m:r>
               <m:rPr>
                 <m:sty m:val="p"/>
               </m:rPr>
-              <m:t>b</m:t>
-            </m:r>
+              <m:t>⟩</m:t>
+            </m:r>
+          </m:e>
+          <m:sub>
+            <m:r>
+              <m:t>N</m:t>
+            </m:r>
+          </m:sub>
+        </m:sSub>
+      </m:oMath>
+      <w:r>
+        <w:t xml:space="preserve">. A stricter criterion asks whether</w:t>
+      </w:r>
+      <w:r>
+        <w:t xml:space="preserve"> </w:t>
+      </w:r>
+      <w:r>
+        <w:rPr>
+          <w:i/>
+          <w:iCs/>
+        </w:rPr>
+        <w:t xml:space="preserve">every</w:t>
+      </w:r>
+      <w:r>
+        <w:t xml:space="preserve"> </w:t>
+      </w:r>
+      <w:r>
+        <w:t xml:space="preserve">target beats</w:t>
+      </w:r>
+      <w:r>
+        <w:t xml:space="preserve"> </w:t>
+      </w:r>
+      <w:r>
+        <w:rPr>
+          <w:i/>
+          <w:iCs/>
+        </w:rPr>
+        <w:t xml:space="preserve">every</w:t>
+      </w:r>
+      <w:r>
+        <w:t xml:space="preserve"> </w:t>
+      </w:r>
+      <w:r>
+        <w:t xml:space="preserve">non-target: we aggregate the same cells with the weakest target response</w:t>
+      </w:r>
+      <w:r>
+        <w:t xml:space="preserve"> </w:t>
+      </w:r>
+      <m:oMath>
+        <m:sSubSup>
+          <m:e>
+            <m:r>
+              <m:t>R</m:t>
+            </m:r>
+          </m:e>
+          <m:sub>
+            <m:r>
+              <m:t>T</m:t>
+            </m:r>
+          </m:sub>
+          <m:sup>
             <m:r>
               <m:rPr>
                 <m:sty m:val="p"/>
               </m:rPr>
-              <m:t>l</m:t>
-            </m:r>
-          </m:sub>
-        </m:sSub>
-      </m:oMath>
-      <w:r>
-        <w:t xml:space="preserve"> </w:t>
-      </w:r>
-      <w:r>
-        <w:t xml:space="preserve">we zero the idiom tokens’ entries of</w:t>
+              <m:t>min</m:t>
+            </m:r>
+          </m:sup>
+        </m:sSubSup>
+      </m:oMath>
+      <w:r>
+        <w:t xml:space="preserve"> </w:t>
+      </w:r>
+      <w:r>
+        <w:t xml:space="preserve">against the strongest non-target response</w:t>
       </w:r>
       <w:r>
         <w:t xml:space="preserve"> </w:t>
@@ -4915,43 +4700,26 @@
         <m:sSubSup>
           <m:e>
             <m:r>
-              <m:rPr>
-                <m:sty m:val="b"/>
-              </m:rPr>
-              <m:t>s</m:t>
+              <m:t>R</m:t>
             </m:r>
           </m:e>
           <m:sub>
             <m:r>
-              <m:t>i</m:t>
+              <m:t>N</m:t>
             </m:r>
           </m:sub>
           <m:sup>
             <m:r>
-              <m:t>t</m:t>
+              <m:rPr>
+                <m:sty m:val="p"/>
+              </m:rPr>
+              <m:t>max</m:t>
             </m:r>
           </m:sup>
         </m:sSubSup>
       </m:oMath>
       <w:r>
-        <w:t xml:space="preserve"> </w:t>
-      </w:r>
-      <w:r>
-        <w:t xml:space="preserve">at the contested positions</w:t>
-      </w:r>
-      <w:r>
-        <w:t xml:space="preserve"> </w:t>
-      </w:r>
-      <m:oMath>
-        <m:r>
-          <m:t>i</m:t>
-        </m:r>
-      </m:oMath>
-      <w:r>
-        <w:t xml:space="preserve"> </w:t>
-      </w:r>
-      <w:r>
-        <w:t xml:space="preserve">(before sampling); the canvas</w:t>
+        <w:t xml:space="preserve">, and</w:t>
       </w:r>
       <w:r>
         <w:t xml:space="preserve"> </w:t>
@@ -4960,53 +4728,73 @@
         <m:sSup>
           <m:e>
             <m:r>
-              <m:t>X</m:t>
+              <m:t>E</m:t>
             </m:r>
           </m:e>
           <m:sup>
             <m:r>
-              <m:t>t</m:t>
+              <m:rPr>
+                <m:sty m:val="p"/>
+              </m:rPr>
+              <m:t>min</m:t>
             </m:r>
           </m:sup>
         </m:sSup>
-      </m:oMath>
-      <w:r>
-        <w:t xml:space="preserve"> </w:t>
-      </w:r>
-      <w:r>
-        <w:t xml:space="preserve">is never edited and every other position and token is left untouched. What is</w:t>
-      </w:r>
-      <w:r>
-        <w:t xml:space="preserve"> </w:t>
-      </w:r>
-      <w:r>
-        <w:rPr>
-          <w:i/>
-          <w:iCs/>
-        </w:rPr>
-        <w:t xml:space="preserve">preserved</w:t>
-      </w:r>
-      <w:r>
-        <w:t xml:space="preserve"> </w:t>
-      </w:r>
-      <w:r>
-        <w:t xml:space="preserve">is thus the model’s own seasonal completion — nothing is injected in its favor. Note however that later ablation onsets no longer rescue</w:t>
-      </w:r>
-      <w:r>
-        <w:t xml:space="preserve"> </w:t>
-      </w:r>
-      <w:r>
-        <w:rPr>
-          <w:i/>
-          <w:iCs/>
-        </w:rPr>
-        <w:t xml:space="preserve">seasonal</w:t>
-      </w:r>
-      <w:r>
-        <w:t xml:space="preserve"> </w:t>
-      </w:r>
-      <w:r>
-        <w:t xml:space="preserve">— the canvas instead collapses into a third, degenerate basin.</w:t>
+        <m:r>
+          <m:rPr>
+            <m:sty m:val="p"/>
+          </m:rPr>
+          <m:t>=</m:t>
+        </m:r>
+        <m:sSubSup>
+          <m:e>
+            <m:r>
+              <m:t>R</m:t>
+            </m:r>
+          </m:e>
+          <m:sub>
+            <m:r>
+              <m:t>T</m:t>
+            </m:r>
+          </m:sub>
+          <m:sup>
+            <m:r>
+              <m:rPr>
+                <m:sty m:val="p"/>
+              </m:rPr>
+              <m:t>min</m:t>
+            </m:r>
+          </m:sup>
+        </m:sSubSup>
+        <m:r>
+          <m:rPr>
+            <m:sty m:val="p"/>
+          </m:rPr>
+          <m:t>−</m:t>
+        </m:r>
+        <m:sSubSup>
+          <m:e>
+            <m:r>
+              <m:t>R</m:t>
+            </m:r>
+          </m:e>
+          <m:sub>
+            <m:r>
+              <m:t>N</m:t>
+            </m:r>
+          </m:sub>
+          <m:sup>
+            <m:r>
+              <m:rPr>
+                <m:sty m:val="p"/>
+              </m:rPr>
+              <m:t>max</m:t>
+            </m:r>
+          </m:sup>
+        </m:sSubSup>
+      </m:oMath>
+      <w:r>
+        <w:t xml:space="preserve">.</w:t>
       </w:r>
     </w:p>
     <w:p>
@@ -5016,20 +4804,1118 @@
       <w:r>
         <w:drawing>
           <wp:inline>
-            <wp:extent cx="5334000" cy="2956891"/>
+            <wp:extent cx="5334000" cy="1700212"/>
             <wp:effectExtent b="0" l="0" r="0" t="0"/>
-            <wp:docPr descr="Seasonal vs idiom: ablation" title="" id="65" name="Picture"/>
+            <wp:docPr descr="Letters strict triptych" title="" id="65" name="Picture"/>
             <a:graphic>
               <a:graphicData uri="http://schemas.openxmlformats.org/drawingml/2006/picture">
                 <pic:pic>
                   <pic:nvPicPr>
-                    <pic:cNvPr descr="figs/figA5_seasonal_ember_kill.png" id="66" name="Picture"/>
+                    <pic:cNvPr descr="figs/figA12_letters_strict.png" id="66" name="Picture"/>
                     <pic:cNvPicPr>
                       <a:picLocks noChangeArrowheads="1" noChangeAspect="1"/>
                     </pic:cNvPicPr>
                   </pic:nvPicPr>
                   <pic:blipFill>
                     <a:blip r:embed="rId64"/>
+                    <a:stretch>
+                      <a:fillRect/>
+                    </a:stretch>
+                  </pic:blipFill>
+                  <pic:spPr bwMode="auto">
+                    <a:xfrm>
+                      <a:off x="0" y="0"/>
+                      <a:ext cx="5334000" cy="1700212"/>
+                    </a:xfrm>
+                    <a:prstGeom prst="rect">
+                      <a:avLst/>
+                    </a:prstGeom>
+                    <a:noFill/>
+                    <a:ln w="9525">
+                      <a:noFill/>
+                      <a:headEnd/>
+                      <a:tailEnd/>
+                    </a:ln>
+                  </pic:spPr>
+                </pic:pic>
+              </a:graphicData>
+            </a:graphic>
+          </wp:inline>
+        </w:drawing>
+      </w:r>
+    </w:p>
+    <w:p>
+      <w:pPr>
+        <w:pStyle w:val="ImageCaption"/>
+      </w:pPr>
+      <w:r>
+        <w:t xml:space="preserve">Letters strict triptych</w:t>
+      </w:r>
+    </w:p>
+    <w:p>
+      <w:pPr>
+        <w:pStyle w:val="BodyText"/>
+      </w:pPr>
+      <w:r>
+        <w:rPr>
+          <w:i/>
+          <w:iCs/>
+        </w:rPr>
+        <w:t xml:space="preserve">The separation is mean-level only: already at</w:t>
+      </w:r>
+      <w:r>
+        <w:rPr>
+          <w:i/>
+          <w:iCs/>
+        </w:rPr>
+        <w:t xml:space="preserve"> </w:t>
+      </w:r>
+      <m:oMath>
+        <m:r>
+          <m:t>n</m:t>
+        </m:r>
+        <m:r>
+          <m:rPr>
+            <m:sty m:val="p"/>
+          </m:rPr>
+          <m:t>=</m:t>
+        </m:r>
+        <m:r>
+          <m:t>1</m:t>
+        </m:r>
+      </m:oMath>
+      <w:r>
+        <w:rPr>
+          <w:i/>
+          <w:iCs/>
+        </w:rPr>
+        <w:t xml:space="preserve"> </w:t>
+      </w:r>
+      <w:r>
+        <w:rPr>
+          <w:i/>
+          <w:iCs/>
+        </w:rPr>
+        <w:t xml:space="preserve">some non-target letter responds more strongly than the weakest target (</w:t>
+      </w:r>
+      <m:oMath>
+        <m:sSup>
+          <m:e>
+            <m:r>
+              <m:t>E</m:t>
+            </m:r>
+          </m:e>
+          <m:sup>
+            <m:r>
+              <m:rPr>
+                <m:sty m:val="p"/>
+              </m:rPr>
+              <m:t>min</m:t>
+            </m:r>
+          </m:sup>
+        </m:sSup>
+        <m:r>
+          <m:rPr>
+            <m:sty m:val="p"/>
+          </m:rPr>
+          <m:t>&lt;</m:t>
+        </m:r>
+        <m:r>
+          <m:t>0</m:t>
+        </m:r>
+      </m:oMath>
+      <w:r>
+        <w:rPr>
+          <w:i/>
+          <w:iCs/>
+        </w:rPr>
+        <w:t xml:space="preserve"> </w:t>
+      </w:r>
+      <w:r>
+        <w:rPr>
+          <w:i/>
+          <w:iCs/>
+        </w:rPr>
+        <w:t xml:space="preserve">at every</w:t>
+      </w:r>
+      <w:r>
+        <w:rPr>
+          <w:i/>
+          <w:iCs/>
+        </w:rPr>
+        <w:t xml:space="preserve"> </w:t>
+      </w:r>
+      <m:oMath>
+        <m:r>
+          <m:t>n</m:t>
+        </m:r>
+      </m:oMath>
+      <w:r>
+        <w:rPr>
+          <w:i/>
+          <w:iCs/>
+        </w:rPr>
+        <w:t xml:space="preserve">).</w:t>
+      </w:r>
+    </w:p>
+    <w:bookmarkStart w:id="76" w:name="multiplication"/>
+    <w:p>
+      <w:pPr>
+        <w:pStyle w:val="Heading4"/>
+      </w:pPr>
+      <w:r>
+        <w:t xml:space="preserve">Multiplication</w:t>
+      </w:r>
+    </w:p>
+    <w:p>
+      <w:pPr>
+        <w:pStyle w:val="FirstParagraph"/>
+      </w:pPr>
+      <w:r>
+        <w:t xml:space="preserve">[stub:] The same protocol also runs with a multiplicative image map, $x’ = $ the letter at position</w:t>
+      </w:r>
+      <w:r>
+        <w:t xml:space="preserve"> </w:t>
+      </w:r>
+      <m:oMath>
+        <m:r>
+          <m:t>k</m:t>
+        </m:r>
+        <m:r>
+          <m:rPr>
+            <m:sty m:val="p"/>
+          </m:rPr>
+          <m:t>⋅</m:t>
+        </m:r>
+        <m:r>
+          <m:rPr>
+            <m:sty m:val="p"/>
+          </m:rPr>
+          <m:t>p</m:t>
+        </m:r>
+        <m:r>
+          <m:rPr>
+            <m:sty m:val="p"/>
+          </m:rPr>
+          <m:t>o</m:t>
+        </m:r>
+        <m:r>
+          <m:rPr>
+            <m:sty m:val="p"/>
+          </m:rPr>
+          <m:t>s</m:t>
+        </m:r>
+        <m:d>
+          <m:dPr>
+            <m:begChr m:val="("/>
+            <m:sepChr m:val=""/>
+            <m:endChr m:val=")"/>
+            <m:grow/>
+          </m:dPr>
+          <m:e>
+            <m:r>
+              <m:t>x</m:t>
+            </m:r>
+          </m:e>
+        </m:d>
+      </m:oMath>
+      <w:r>
+        <w:t xml:space="preserve">,</w:t>
+      </w:r>
+      <w:r>
+        <w:t xml:space="preserve"> </w:t>
+      </w:r>
+      <m:oMath>
+        <m:r>
+          <m:t>k</m:t>
+        </m:r>
+        <m:r>
+          <m:rPr>
+            <m:sty m:val="p"/>
+          </m:rPr>
+          <m:t>∈</m:t>
+        </m:r>
+        <m:r>
+          <m:rPr>
+            <m:sty m:val="p"/>
+          </m:rPr>
+          <m:t>{</m:t>
+        </m:r>
+        <m:r>
+          <m:t>2</m:t>
+        </m:r>
+        <m:r>
+          <m:rPr>
+            <m:sty m:val="p"/>
+          </m:rPr>
+          <m:t>,</m:t>
+        </m:r>
+        <m:r>
+          <m:t>3</m:t>
+        </m:r>
+        <m:r>
+          <m:rPr>
+            <m:sty m:val="p"/>
+          </m:rPr>
+          <m:t>,</m:t>
+        </m:r>
+        <m:r>
+          <m:t>4</m:t>
+        </m:r>
+        <m:r>
+          <m:rPr>
+            <m:sty m:val="p"/>
+          </m:rPr>
+          <m:t>}</m:t>
+        </m:r>
+      </m:oMath>
+      <w:r>
+        <w:t xml:space="preserve"> </w:t>
+      </w:r>
+      <w:r>
+        <w:t xml:space="preserve">(upper→upper).</w:t>
+      </w:r>
+    </w:p>
+    <w:p>
+      <w:pPr>
+        <w:pStyle w:val="CaptionedFigure"/>
+      </w:pPr>
+      <w:r>
+        <w:drawing>
+          <wp:inline>
+            <wp:extent cx="5334000" cy="4000500"/>
+            <wp:effectExtent b="0" l="0" r="0" t="0"/>
+            <wp:docPr descr="Multiplicative transfer map" title="" id="68" name="Picture"/>
+            <a:graphic>
+              <a:graphicData uri="http://schemas.openxmlformats.org/drawingml/2006/picture">
+                <pic:pic>
+                  <pic:nvPicPr>
+                    <pic:cNvPr descr="figs/figA13_mult_transfer.png" id="69" name="Picture"/>
+                    <pic:cNvPicPr>
+                      <a:picLocks noChangeArrowheads="1" noChangeAspect="1"/>
+                    </pic:cNvPicPr>
+                  </pic:nvPicPr>
+                  <pic:blipFill>
+                    <a:blip r:embed="rId67"/>
+                    <a:stretch>
+                      <a:fillRect/>
+                    </a:stretch>
+                  </pic:blipFill>
+                  <pic:spPr bwMode="auto">
+                    <a:xfrm>
+                      <a:off x="0" y="0"/>
+                      <a:ext cx="5334000" cy="4000500"/>
+                    </a:xfrm>
+                    <a:prstGeom prst="rect">
+                      <a:avLst/>
+                    </a:prstGeom>
+                    <a:noFill/>
+                    <a:ln w="9525">
+                      <a:noFill/>
+                      <a:headEnd/>
+                      <a:tailEnd/>
+                    </a:ln>
+                  </pic:spPr>
+                </pic:pic>
+              </a:graphicData>
+            </a:graphic>
+          </wp:inline>
+        </w:drawing>
+      </w:r>
+    </w:p>
+    <w:p>
+      <w:pPr>
+        <w:pStyle w:val="ImageCaption"/>
+      </w:pPr>
+      <w:r>
+        <w:t xml:space="preserve">Multiplicative transfer map</w:t>
+      </w:r>
+    </w:p>
+    <w:p>
+      <w:pPr>
+        <w:pStyle w:val="BodyText"/>
+      </w:pPr>
+      <w:r>
+        <w:rPr>
+          <w:i/>
+          <w:iCs/>
+        </w:rPr>
+        <w:t xml:space="preserve">Perturbed sources trigger a response at their multiplicative images, but far less specifically than in the additive map (diagonal excess</w:t>
+      </w:r>
+      <w:r>
+        <w:rPr>
+          <w:i/>
+          <w:iCs/>
+        </w:rPr>
+        <w:t xml:space="preserve"> </w:t>
+      </w:r>
+      <m:oMath>
+        <m:r>
+          <m:rPr>
+            <m:sty m:val="p"/>
+          </m:rPr>
+          <m:t>+</m:t>
+        </m:r>
+        <m:r>
+          <m:t>0.19</m:t>
+        </m:r>
+      </m:oMath>
+      <w:r>
+        <w:rPr>
+          <w:i/>
+          <w:iCs/>
+        </w:rPr>
+        <w:t xml:space="preserve"> </w:t>
+      </w:r>
+      <w:r>
+        <w:rPr>
+          <w:i/>
+          <w:iCs/>
+        </w:rPr>
+        <w:t xml:space="preserve">vs</w:t>
+      </w:r>
+      <w:r>
+        <w:rPr>
+          <w:i/>
+          <w:iCs/>
+        </w:rPr>
+        <w:t xml:space="preserve"> </w:t>
+      </w:r>
+      <m:oMath>
+        <m:r>
+          <m:rPr>
+            <m:sty m:val="p"/>
+          </m:rPr>
+          <m:t>+</m:t>
+        </m:r>
+        <m:r>
+          <m:t>0.97</m:t>
+        </m:r>
+      </m:oMath>
+      <w:r>
+        <w:rPr>
+          <w:i/>
+          <w:iCs/>
+        </w:rPr>
+        <w:t xml:space="preserve">).</w:t>
+      </w:r>
+    </w:p>
+    <w:p>
+      <w:pPr>
+        <w:pStyle w:val="CaptionedFigure"/>
+      </w:pPr>
+      <w:r>
+        <w:drawing>
+          <wp:inline>
+            <wp:extent cx="5334000" cy="1700212"/>
+            <wp:effectExtent b="0" l="0" r="0" t="0"/>
+            <wp:docPr descr="Multiplicative parallelism triptych" title="" id="71" name="Picture"/>
+            <a:graphic>
+              <a:graphicData uri="http://schemas.openxmlformats.org/drawingml/2006/picture">
+                <pic:pic>
+                  <pic:nvPicPr>
+                    <pic:cNvPr descr="figs/figA14_mult_triptych.png" id="72" name="Picture"/>
+                    <pic:cNvPicPr>
+                      <a:picLocks noChangeArrowheads="1" noChangeAspect="1"/>
+                    </pic:cNvPicPr>
+                  </pic:nvPicPr>
+                  <pic:blipFill>
+                    <a:blip r:embed="rId70"/>
+                    <a:stretch>
+                      <a:fillRect/>
+                    </a:stretch>
+                  </pic:blipFill>
+                  <pic:spPr bwMode="auto">
+                    <a:xfrm>
+                      <a:off x="0" y="0"/>
+                      <a:ext cx="5334000" cy="1700212"/>
+                    </a:xfrm>
+                    <a:prstGeom prst="rect">
+                      <a:avLst/>
+                    </a:prstGeom>
+                    <a:noFill/>
+                    <a:ln w="9525">
+                      <a:noFill/>
+                      <a:headEnd/>
+                      <a:tailEnd/>
+                    </a:ln>
+                  </pic:spPr>
+                </pic:pic>
+              </a:graphicData>
+            </a:graphic>
+          </wp:inline>
+        </w:drawing>
+      </w:r>
+    </w:p>
+    <w:p>
+      <w:pPr>
+        <w:pStyle w:val="ImageCaption"/>
+      </w:pPr>
+      <w:r>
+        <w:t xml:space="preserve">Multiplicative parallelism triptych</w:t>
+      </w:r>
+    </w:p>
+    <w:p>
+      <w:pPr>
+        <w:pStyle w:val="BodyText"/>
+      </w:pPr>
+      <w:r>
+        <w:rPr>
+          <w:i/>
+          <w:iCs/>
+        </w:rPr>
+        <w:t xml:space="preserve">Mean parallelism for</w:t>
+      </w:r>
+      <w:r>
+        <w:rPr>
+          <w:i/>
+          <w:iCs/>
+        </w:rPr>
+        <w:t xml:space="preserve"> </w:t>
+      </w:r>
+      <m:oMath>
+        <m:r>
+          <m:rPr>
+            <m:sty m:val="p"/>
+          </m:rPr>
+          <m:t>×</m:t>
+        </m:r>
+        <m:r>
+          <m:t>k</m:t>
+        </m:r>
+      </m:oMath>
+      <w:r>
+        <w:rPr>
+          <w:i/>
+          <w:iCs/>
+        </w:rPr>
+        <w:t xml:space="preserve">: targets separate from non-targets, peaking at</w:t>
+      </w:r>
+      <w:r>
+        <w:rPr>
+          <w:i/>
+          <w:iCs/>
+        </w:rPr>
+        <w:t xml:space="preserve"> </w:t>
+      </w:r>
+      <m:oMath>
+        <m:r>
+          <m:t>n</m:t>
+        </m:r>
+        <m:r>
+          <m:rPr>
+            <m:sty m:val="p"/>
+          </m:rPr>
+          <m:t>≈</m:t>
+        </m:r>
+        <m:r>
+          <m:t>3</m:t>
+        </m:r>
+      </m:oMath>
+      <w:r>
+        <w:rPr>
+          <w:i/>
+          <w:iCs/>
+        </w:rPr>
+        <w:t xml:space="preserve">–</w:t>
+      </w:r>
+      <m:oMath>
+        <m:r>
+          <m:t>4</m:t>
+        </m:r>
+      </m:oMath>
+      <w:r>
+        <w:rPr>
+          <w:i/>
+          <w:iCs/>
+        </w:rPr>
+        <w:t xml:space="preserve">.</w:t>
+      </w:r>
+    </w:p>
+    <w:p>
+      <w:pPr>
+        <w:pStyle w:val="CaptionedFigure"/>
+      </w:pPr>
+      <w:r>
+        <w:drawing>
+          <wp:inline>
+            <wp:extent cx="5334000" cy="1700212"/>
+            <wp:effectExtent b="0" l="0" r="0" t="0"/>
+            <wp:docPr descr="Multiplicative strict triptych" title="" id="74" name="Picture"/>
+            <a:graphic>
+              <a:graphicData uri="http://schemas.openxmlformats.org/drawingml/2006/picture">
+                <pic:pic>
+                  <pic:nvPicPr>
+                    <pic:cNvPr descr="figs/figA15_mult_strict.png" id="75" name="Picture"/>
+                    <pic:cNvPicPr>
+                      <a:picLocks noChangeArrowheads="1" noChangeAspect="1"/>
+                    </pic:cNvPicPr>
+                  </pic:nvPicPr>
+                  <pic:blipFill>
+                    <a:blip r:embed="rId73"/>
+                    <a:stretch>
+                      <a:fillRect/>
+                    </a:stretch>
+                  </pic:blipFill>
+                  <pic:spPr bwMode="auto">
+                    <a:xfrm>
+                      <a:off x="0" y="0"/>
+                      <a:ext cx="5334000" cy="1700212"/>
+                    </a:xfrm>
+                    <a:prstGeom prst="rect">
+                      <a:avLst/>
+                    </a:prstGeom>
+                    <a:noFill/>
+                    <a:ln w="9525">
+                      <a:noFill/>
+                      <a:headEnd/>
+                      <a:tailEnd/>
+                    </a:ln>
+                  </pic:spPr>
+                </pic:pic>
+              </a:graphicData>
+            </a:graphic>
+          </wp:inline>
+        </w:drawing>
+      </w:r>
+    </w:p>
+    <w:p>
+      <w:pPr>
+        <w:pStyle w:val="ImageCaption"/>
+      </w:pPr>
+      <w:r>
+        <w:t xml:space="preserve">Multiplicative strict triptych</w:t>
+      </w:r>
+    </w:p>
+    <w:p>
+      <w:pPr>
+        <w:pStyle w:val="BodyText"/>
+      </w:pPr>
+      <w:r>
+        <w:rPr>
+          <w:i/>
+          <w:iCs/>
+        </w:rPr>
+        <w:t xml:space="preserve">As in the additive family, the worst-case criterion stays negative at every</w:t>
+      </w:r>
+      <w:r>
+        <w:rPr>
+          <w:i/>
+          <w:iCs/>
+        </w:rPr>
+        <w:t xml:space="preserve"> </w:t>
+      </w:r>
+      <m:oMath>
+        <m:r>
+          <m:t>n</m:t>
+        </m:r>
+      </m:oMath>
+      <w:r>
+        <w:rPr>
+          <w:i/>
+          <w:iCs/>
+        </w:rPr>
+        <w:t xml:space="preserve">.</w:t>
+      </w:r>
+    </w:p>
+    <w:bookmarkEnd w:id="76"/>
+    <w:bookmarkEnd w:id="77"/>
+    <w:bookmarkStart w:id="81" w:name="Xea3042850cf8050407ffdd53c2454b5f83a5608"/>
+    <w:p>
+      <w:pPr>
+        <w:pStyle w:val="Heading3"/>
+      </w:pPr>
+      <w:r>
+        <w:t xml:space="preserve">Autonomous computational usage of</w:t>
+      </w:r>
+      <w:r>
+        <w:t xml:space="preserve"> </w:t>
+      </w:r>
+      <m:oMath>
+        <m:sSup>
+          <m:e>
+            <m:r>
+              <m:rPr>
+                <m:sty m:val="b"/>
+              </m:rPr>
+              <m:t>s</m:t>
+            </m:r>
+          </m:e>
+          <m:sup>
+            <m:r>
+              <m:t>t</m:t>
+            </m:r>
+          </m:sup>
+        </m:sSup>
+      </m:oMath>
+    </w:p>
+    <w:p>
+      <w:pPr>
+        <w:pStyle w:val="FirstParagraph"/>
+      </w:pPr>
+      <w:r>
+        <w:t xml:space="preserve">In the</w:t>
+      </w:r>
+      <w:r>
+        <w:t xml:space="preserve"> </w:t>
+      </w:r>
+      <w:r>
+        <w:rPr>
+          <w:i/>
+          <w:iCs/>
+        </w:rPr>
+        <w:t xml:space="preserve">letter arithmetic</w:t>
+      </w:r>
+      <w:r>
+        <w:t xml:space="preserve"> </w:t>
+      </w:r>
+      <w:r>
+        <w:t xml:space="preserve">task introduced in the main text, DiffusionGemma did respond to modifications of the distributional state in the way we expected. While suggestive, it is unclear if the model also would make use of</w:t>
+      </w:r>
+      <w:r>
+        <w:t xml:space="preserve"> </w:t>
+      </w:r>
+      <m:oMath>
+        <m:sSup>
+          <m:e>
+            <m:r>
+              <m:rPr>
+                <m:sty m:val="b"/>
+              </m:rPr>
+              <m:t>s</m:t>
+            </m:r>
+          </m:e>
+          <m:sup>
+            <m:r>
+              <m:t>t</m:t>
+            </m:r>
+          </m:sup>
+        </m:sSup>
+      </m:oMath>
+      <w:r>
+        <w:t xml:space="preserve"> </w:t>
+      </w:r>
+      <w:r>
+        <w:rPr>
+          <w:i/>
+          <w:iCs/>
+        </w:rPr>
+        <w:t xml:space="preserve">autonomously</w:t>
+      </w:r>
+      <w:r>
+        <w:t xml:space="preserve">, i.e. without interventions.</w:t>
+      </w:r>
+    </w:p>
+    <w:p>
+      <w:pPr>
+        <w:pStyle w:val="BodyText"/>
+      </w:pPr>
+      <w:r>
+        <w:t xml:space="preserve">To investigate this, we searched for a non-trivial (i.e., not just a binary choice) task where DG will use a hypothesis subleading in its distribution. An instance we found is a</w:t>
+      </w:r>
+      <w:r>
+        <w:t xml:space="preserve"> </w:t>
+      </w:r>
+      <w:r>
+        <w:rPr>
+          <w:i/>
+          <w:iCs/>
+        </w:rPr>
+        <w:t xml:space="preserve">word-level palindrome</w:t>
+      </w:r>
+      <w:r>
+        <w:t xml:space="preserve"> </w:t>
+      </w:r>
+      <w:r>
+        <w:t xml:space="preserve">task. When asked</w:t>
+      </w:r>
+      <w:r>
+        <w:t xml:space="preserve"> </w:t>
+      </w:r>
+      <w:r>
+        <w:rPr>
+          <w:rStyle w:val="VerbatimChar"/>
+        </w:rPr>
+        <w:t xml:space="preserve">Please write a word-level palindrome</w:t>
+      </w:r>
+      <w:r>
+        <w:t xml:space="preserve">, DG maintains two competing completions of the same canvas: a literal</w:t>
+      </w:r>
+      <w:r>
+        <w:t xml:space="preserve"> </w:t>
+      </w:r>
+      <w:r>
+        <w:rPr>
+          <w:i/>
+          <w:iCs/>
+        </w:rPr>
+        <w:t xml:space="preserve">seasonal</w:t>
+      </w:r>
+      <w:r>
+        <w:t xml:space="preserve"> </w:t>
+      </w:r>
+      <w:r>
+        <w:t xml:space="preserve">phrase (</w:t>
+      </w:r>
+      <w:r>
+        <w:rPr>
+          <w:rStyle w:val="VerbatimChar"/>
+        </w:rPr>
+        <w:t xml:space="preserve">All leaves fall when leaves fall all.</w:t>
+      </w:r>
+      <w:r>
+        <w:t xml:space="preserve">) and the famous</w:t>
+      </w:r>
+      <w:r>
+        <w:t xml:space="preserve"> </w:t>
+      </w:r>
+      <w:r>
+        <w:rPr>
+          <w:i/>
+          <w:iCs/>
+        </w:rPr>
+        <w:t xml:space="preserve">idiom</w:t>
+      </w:r>
+      <w:r>
+        <w:t xml:space="preserve"> </w:t>
+      </w:r>
+      <w:r>
+        <w:t xml:space="preserve">(</w:t>
+      </w:r>
+      <w:r>
+        <w:rPr>
+          <w:rStyle w:val="VerbatimChar"/>
+        </w:rPr>
+        <w:t xml:space="preserve">All for one and one for all.</w:t>
+      </w:r>
+      <w:r>
+        <w:t xml:space="preserve">).</w:t>
+      </w:r>
+    </w:p>
+    <w:p>
+      <w:pPr>
+        <w:pStyle w:val="BodyText"/>
+      </w:pPr>
+      <w:r>
+        <w:t xml:space="preserve">The canvas will read the</w:t>
+      </w:r>
+      <w:r>
+        <w:t xml:space="preserve"> </w:t>
+      </w:r>
+      <w:r>
+        <w:rPr>
+          <w:i/>
+          <w:iCs/>
+        </w:rPr>
+        <w:t xml:space="preserve">seasonal</w:t>
+      </w:r>
+      <w:r>
+        <w:t xml:space="preserve"> </w:t>
+      </w:r>
+      <w:r>
+        <w:t xml:space="preserve">answer for the first few diffusion steps, after which it flips and stays at</w:t>
+      </w:r>
+      <w:r>
+        <w:t xml:space="preserve"> </w:t>
+      </w:r>
+      <w:r>
+        <w:rPr>
+          <w:i/>
+          <w:iCs/>
+        </w:rPr>
+        <w:t xml:space="preserve">idiom</w:t>
+      </w:r>
+      <w:r>
+        <w:t xml:space="preserve">. Interestingly, this is accompanied by</w:t>
+      </w:r>
+      <w:r>
+        <w:t xml:space="preserve"> </w:t>
+      </w:r>
+      <w:r>
+        <w:rPr>
+          <w:i/>
+          <w:iCs/>
+        </w:rPr>
+        <w:t xml:space="preserve">dynamics</w:t>
+      </w:r>
+      <w:r>
+        <w:t xml:space="preserve"> </w:t>
+      </w:r>
+      <w:r>
+        <w:t xml:space="preserve">in</w:t>
+      </w:r>
+      <w:r>
+        <w:t xml:space="preserve"> </w:t>
+      </w:r>
+      <m:oMath>
+        <m:sSup>
+          <m:e>
+            <m:r>
+              <m:rPr>
+                <m:sty m:val="b"/>
+              </m:rPr>
+              <m:t>s</m:t>
+            </m:r>
+          </m:e>
+          <m:sup>
+            <m:r>
+              <m:t>t</m:t>
+            </m:r>
+          </m:sup>
+        </m:sSup>
+      </m:oMath>
+      <w:r>
+        <w:t xml:space="preserve">:</w:t>
+      </w:r>
+      <w:r>
+        <w:t xml:space="preserve"> </w:t>
+      </w:r>
+      <w:r>
+        <w:rPr>
+          <w:i/>
+          <w:iCs/>
+        </w:rPr>
+        <w:t xml:space="preserve">idiom</w:t>
+      </w:r>
+      <w:r>
+        <w:t xml:space="preserve"> </w:t>
+      </w:r>
+      <w:r>
+        <w:t xml:space="preserve">will start at ~0, and progressively gain weight, replacing</w:t>
+      </w:r>
+      <w:r>
+        <w:t xml:space="preserve"> </w:t>
+      </w:r>
+      <w:r>
+        <w:rPr>
+          <w:i/>
+          <w:iCs/>
+        </w:rPr>
+        <w:t xml:space="preserve">seasonal</w:t>
+      </w:r>
+      <w:r>
+        <w:t xml:space="preserve">.</w:t>
+      </w:r>
+    </w:p>
+    <w:p>
+      <w:pPr>
+        <w:pStyle w:val="BodyText"/>
+      </w:pPr>
+      <w:r>
+        <w:t xml:space="preserve">We validated that the emergence of</w:t>
+      </w:r>
+      <w:r>
+        <w:t xml:space="preserve"> </w:t>
+      </w:r>
+      <w:r>
+        <w:rPr>
+          <w:i/>
+          <w:iCs/>
+        </w:rPr>
+        <w:t xml:space="preserve">idiom</w:t>
+      </w:r>
+      <w:r>
+        <w:t xml:space="preserve"> </w:t>
+      </w:r>
+      <w:r>
+        <w:t xml:space="preserve">is indeed causal: persistently ablating</w:t>
+      </w:r>
+      <w:r>
+        <w:t xml:space="preserve"> </w:t>
+      </w:r>
+      <w:r>
+        <w:rPr>
+          <w:i/>
+          <w:iCs/>
+        </w:rPr>
+        <w:t xml:space="preserve">idiom</w:t>
+      </w:r>
+      <w:r>
+        <w:t xml:space="preserve">’s</w:t>
+      </w:r>
+      <w:r>
+        <w:t xml:space="preserve"> </w:t>
+      </w:r>
+      <m:oMath>
+        <m:r>
+          <m:rPr>
+            <m:sty m:val="b"/>
+          </m:rPr>
+          <m:t>s</m:t>
+        </m:r>
+      </m:oMath>
+      <w:r>
+        <w:t xml:space="preserve">-mass from an early step onward prevents the takeover and preserves the seasonal draft. Concretely, at every step</w:t>
+      </w:r>
+      <w:r>
+        <w:t xml:space="preserve"> </w:t>
+      </w:r>
+      <m:oMath>
+        <m:r>
+          <m:t>t</m:t>
+        </m:r>
+        <m:r>
+          <m:rPr>
+            <m:sty m:val="p"/>
+          </m:rPr>
+          <m:t>≥</m:t>
+        </m:r>
+        <m:sSub>
+          <m:e>
+            <m:r>
+              <m:t>t</m:t>
+            </m:r>
+          </m:e>
+          <m:sub>
+            <m:r>
+              <m:rPr>
+                <m:sty m:val="p"/>
+              </m:rPr>
+              <m:t>a</m:t>
+            </m:r>
+            <m:r>
+              <m:rPr>
+                <m:sty m:val="p"/>
+              </m:rPr>
+              <m:t>b</m:t>
+            </m:r>
+            <m:r>
+              <m:rPr>
+                <m:sty m:val="p"/>
+              </m:rPr>
+              <m:t>l</m:t>
+            </m:r>
+          </m:sub>
+        </m:sSub>
+      </m:oMath>
+      <w:r>
+        <w:t xml:space="preserve"> </w:t>
+      </w:r>
+      <w:r>
+        <w:t xml:space="preserve">we zero the idiom tokens’ entries of</w:t>
+      </w:r>
+      <w:r>
+        <w:t xml:space="preserve"> </w:t>
+      </w:r>
+      <m:oMath>
+        <m:sSubSup>
+          <m:e>
+            <m:r>
+              <m:rPr>
+                <m:sty m:val="b"/>
+              </m:rPr>
+              <m:t>s</m:t>
+            </m:r>
+          </m:e>
+          <m:sub>
+            <m:r>
+              <m:t>i</m:t>
+            </m:r>
+          </m:sub>
+          <m:sup>
+            <m:r>
+              <m:t>t</m:t>
+            </m:r>
+          </m:sup>
+        </m:sSubSup>
+      </m:oMath>
+      <w:r>
+        <w:t xml:space="preserve"> </w:t>
+      </w:r>
+      <w:r>
+        <w:t xml:space="preserve">at the contested positions</w:t>
+      </w:r>
+      <w:r>
+        <w:t xml:space="preserve"> </w:t>
+      </w:r>
+      <m:oMath>
+        <m:r>
+          <m:t>i</m:t>
+        </m:r>
+      </m:oMath>
+      <w:r>
+        <w:t xml:space="preserve"> </w:t>
+      </w:r>
+      <w:r>
+        <w:t xml:space="preserve">(before sampling); the canvas</w:t>
+      </w:r>
+      <w:r>
+        <w:t xml:space="preserve"> </w:t>
+      </w:r>
+      <m:oMath>
+        <m:sSup>
+          <m:e>
+            <m:r>
+              <m:t>X</m:t>
+            </m:r>
+          </m:e>
+          <m:sup>
+            <m:r>
+              <m:t>t</m:t>
+            </m:r>
+          </m:sup>
+        </m:sSup>
+      </m:oMath>
+      <w:r>
+        <w:t xml:space="preserve"> </w:t>
+      </w:r>
+      <w:r>
+        <w:t xml:space="preserve">is never edited and every other position and token is left untouched. What is</w:t>
+      </w:r>
+      <w:r>
+        <w:t xml:space="preserve"> </w:t>
+      </w:r>
+      <w:r>
+        <w:rPr>
+          <w:i/>
+          <w:iCs/>
+        </w:rPr>
+        <w:t xml:space="preserve">preserved</w:t>
+      </w:r>
+      <w:r>
+        <w:t xml:space="preserve"> </w:t>
+      </w:r>
+      <w:r>
+        <w:t xml:space="preserve">is thus the model’s own seasonal completion — nothing is injected in its favor. Note however that later ablation onsets no longer rescue</w:t>
+      </w:r>
+      <w:r>
+        <w:t xml:space="preserve"> </w:t>
+      </w:r>
+      <w:r>
+        <w:rPr>
+          <w:i/>
+          <w:iCs/>
+        </w:rPr>
+        <w:t xml:space="preserve">seasonal</w:t>
+      </w:r>
+      <w:r>
+        <w:t xml:space="preserve"> </w:t>
+      </w:r>
+      <w:r>
+        <w:t xml:space="preserve">— the canvas instead collapses into a third, degenerate basin.</w:t>
+      </w:r>
+    </w:p>
+    <w:p>
+      <w:pPr>
+        <w:pStyle w:val="CaptionedFigure"/>
+      </w:pPr>
+      <w:r>
+        <w:drawing>
+          <wp:inline>
+            <wp:extent cx="5334000" cy="2956891"/>
+            <wp:effectExtent b="0" l="0" r="0" t="0"/>
+            <wp:docPr descr="Seasonal vs idiom: ablation" title="" id="79" name="Picture"/>
+            <a:graphic>
+              <a:graphicData uri="http://schemas.openxmlformats.org/drawingml/2006/picture">
+                <pic:pic>
+                  <pic:nvPicPr>
+                    <pic:cNvPr descr="figs/figA5_seasonal_ember_kill.png" id="80" name="Picture"/>
+                    <pic:cNvPicPr>
+                      <a:picLocks noChangeArrowheads="1" noChangeAspect="1"/>
+                    </pic:cNvPicPr>
+                  </pic:nvPicPr>
+                  <pic:blipFill>
+                    <a:blip r:embed="rId78"/>
                     <a:stretch>
                       <a:fillRect/>
                     </a:stretch>
@@ -5196,8 +6082,8 @@
         <w:t xml:space="preserve">channel. This has important consequences for monitorability which may not have been captured in Engels et al.’s analysis: a tool reading only the final diffusion output will miss transient output. A model may for instance choose to hide a specific fact in its chain-of-thought to a monitor, while having used it intermittently, though we did not find any instances of such behavior here.</w:t>
       </w:r>
     </w:p>
-    <w:bookmarkEnd w:id="67"/>
-    <w:bookmarkStart w:id="79" w:name="post-hoc-rationalization"/>
+    <w:bookmarkEnd w:id="81"/>
+    <w:bookmarkStart w:id="93" w:name="post-hoc-rationalization"/>
     <w:p>
       <w:pPr>
         <w:pStyle w:val="Heading3"/>
@@ -5213,7 +6099,7 @@
       <w:r>
         <w:t xml:space="preserve">An important question in monitorability (</w:t>
       </w:r>
-      <w:hyperlink r:id="rId68">
+      <w:hyperlink r:id="rId82">
         <w:r>
           <w:rPr>
             <w:rStyle w:val="Hyperlink"/>
@@ -5242,18 +6128,18 @@
           <wp:inline>
             <wp:extent cx="5334000" cy="1619249"/>
             <wp:effectExtent b="0" l="0" r="0" t="0"/>
-            <wp:docPr descr="Post-hoc correlations" title="" id="70" name="Picture"/>
+            <wp:docPr descr="Post-hoc correlations" title="" id="84" name="Picture"/>
             <a:graphic>
               <a:graphicData uri="http://schemas.openxmlformats.org/drawingml/2006/picture">
                 <pic:pic>
                   <pic:nvPicPr>
-                    <pic:cNvPr descr="figs/figA8_posthoc_correlations.png" id="71" name="Picture"/>
+                    <pic:cNvPr descr="figs/figA8_posthoc_correlations.png" id="85" name="Picture"/>
                     <pic:cNvPicPr>
                       <a:picLocks noChangeArrowheads="1" noChangeAspect="1"/>
                     </pic:cNvPicPr>
                   </pic:nvPicPr>
                   <pic:blipFill>
-                    <a:blip r:embed="rId69"/>
+                    <a:blip r:embed="rId83"/>
                     <a:stretch>
                       <a:fillRect/>
                     </a:stretch>
@@ -5542,18 +6428,18 @@
           <wp:inline>
             <wp:extent cx="5334000" cy="4036060"/>
             <wp:effectExtent b="0" l="0" r="0" t="0"/>
-            <wp:docPr descr="Post-hoc case study" title="" id="73" name="Picture"/>
+            <wp:docPr descr="Post-hoc case study" title="" id="87" name="Picture"/>
             <a:graphic>
               <a:graphicData uri="http://schemas.openxmlformats.org/drawingml/2006/picture">
                 <pic:pic>
                   <pic:nvPicPr>
-                    <pic:cNvPr descr="figs/figA8b_posthoc_case.png" id="74" name="Picture"/>
+                    <pic:cNvPr descr="figs/figA8b_posthoc_case.png" id="88" name="Picture"/>
                     <pic:cNvPicPr>
                       <a:picLocks noChangeArrowheads="1" noChangeAspect="1"/>
                     </pic:cNvPicPr>
                   </pic:nvPicPr>
                   <pic:blipFill>
-                    <a:blip r:embed="rId72"/>
+                    <a:blip r:embed="rId86"/>
                     <a:stretch>
                       <a:fillRect/>
                     </a:stretch>
@@ -5616,7 +6502,7 @@
         <w:t xml:space="preserve">Top row: normal rollout, model answer highlighted, with its commitment time. Bottom row: the susceptibility, measured like in the previous figure.</w:t>
       </w:r>
     </w:p>
-    <w:bookmarkStart w:id="78" w:name="Xabbf9ebb3c7fb0570cb1488d42cd03734ef9222"/>
+    <w:bookmarkStart w:id="92" w:name="Xabbf9ebb3c7fb0570cb1488d42cd03734ef9222"/>
     <w:p>
       <w:pPr>
         <w:pStyle w:val="Heading4"/>
@@ -5642,18 +6528,18 @@
           <wp:inline>
             <wp:extent cx="5334000" cy="2125265"/>
             <wp:effectExtent b="0" l="0" r="0" t="0"/>
-            <wp:docPr descr="Answer resolution" title="" id="76" name="Picture"/>
+            <wp:docPr descr="Answer resolution" title="" id="90" name="Picture"/>
             <a:graphic>
               <a:graphicData uri="http://schemas.openxmlformats.org/drawingml/2006/picture">
                 <pic:pic>
                   <pic:nvPicPr>
-                    <pic:cNvPr descr="figs/figA9_resolution.png" id="77" name="Picture"/>
+                    <pic:cNvPr descr="figs/figA9_resolution.png" id="91" name="Picture"/>
                     <pic:cNvPicPr>
                       <a:picLocks noChangeArrowheads="1" noChangeAspect="1"/>
                     </pic:cNvPicPr>
                   </pic:nvPicPr>
                   <pic:blipFill>
-                    <a:blip r:embed="rId75"/>
+                    <a:blip r:embed="rId89"/>
                     <a:stretch>
                       <a:fillRect/>
                     </a:stretch>
@@ -5779,9 +6665,9 @@
         <w:t xml:space="preserve"> </w:t>
       </w:r>
     </w:p>
-    <w:bookmarkEnd w:id="78"/>
-    <w:bookmarkEnd w:id="79"/>
-    <w:bookmarkStart w:id="83" w:name="Xd7c7dfb66314a32b0174c0001aa6561f67f2b90"/>
+    <w:bookmarkEnd w:id="92"/>
+    <w:bookmarkEnd w:id="93"/>
+    <w:bookmarkStart w:id="97" w:name="Xd7c7dfb66314a32b0174c0001aa6561f67f2b90"/>
     <w:p>
       <w:pPr>
         <w:pStyle w:val="Heading3"/>
@@ -5805,18 +6691,18 @@
           <wp:inline>
             <wp:extent cx="5334000" cy="1889125"/>
             <wp:effectExtent b="0" l="0" r="0" t="0"/>
-            <wp:docPr descr="Commitment causality" title="" id="81" name="Picture"/>
+            <wp:docPr descr="Commitment causality" title="" id="95" name="Picture"/>
             <a:graphic>
               <a:graphicData uri="http://schemas.openxmlformats.org/drawingml/2006/picture">
                 <pic:pic>
                   <pic:nvPicPr>
-                    <pic:cNvPr descr="figs/figA11_commit_causality.png" id="82" name="Picture"/>
+                    <pic:cNvPr descr="figs/figA11_commit_causality.png" id="96" name="Picture"/>
                     <pic:cNvPicPr>
                       <a:picLocks noChangeArrowheads="1" noChangeAspect="1"/>
                     </pic:cNvPicPr>
                   </pic:nvPicPr>
                   <pic:blipFill>
-                    <a:blip r:embed="rId80"/>
+                    <a:blip r:embed="rId94"/>
                     <a:stretch>
                       <a:fillRect/>
                     </a:stretch>
@@ -6028,9 +6914,9 @@
         <w:t xml:space="preserve">, which requires the model to reverse its reasoning order.</w:t>
       </w:r>
     </w:p>
-    <w:bookmarkEnd w:id="83"/>
-    <w:bookmarkEnd w:id="84"/>
-    <w:bookmarkEnd w:id="85"/>
+    <w:bookmarkEnd w:id="97"/>
+    <w:bookmarkEnd w:id="98"/>
+    <w:bookmarkEnd w:id="99"/>
     <w:sectPr>
       <w:footnotePr>
         <w:numRestart w:val="eachSect"/>

</xml_diff>

<commit_message>
remove every parallelism claim per user: main-text Parallelism section (fig2b, capacity n~4, superposition-transport para), appendix n-sweep figs (figA12/A14/A15), conclusion '(parallel)'; appendix Letter arithmetic keeps only the n=1 multiplicative transfer map
Co-Authored-By: Claude Fable 5 <noreply@anthropic.com>
</commit_message>
<xml_diff>
--- a/post.docx
+++ b/post.docx
@@ -2,7 +2,7 @@
 <file path=word/document.xml><?xml version="1.0" encoding="utf-8"?>
 <w:document xmlns:w="http://schemas.openxmlformats.org/wordprocessingml/2006/main" xmlns:m="http://schemas.openxmlformats.org/officeDocument/2006/math" xmlns:r="http://schemas.openxmlformats.org/officeDocument/2006/relationships" xmlns:o="urn:schemas-microsoft-com:office:office" xmlns:v="urn:schemas-microsoft-com:vml" xmlns:w10="urn:schemas-microsoft-com:office:word" xmlns:a="http://schemas.openxmlformats.org/drawingml/2006/main" xmlns:pic="http://schemas.openxmlformats.org/drawingml/2006/picture" xmlns:wp="http://schemas.openxmlformats.org/drawingml/2006/wordprocessingDrawing">
   <w:body>
-    <w:bookmarkStart w:id="99" w:name="Xf5e660dc2e9c1a368125465a5756c31f66c44e2"/>
+    <w:bookmarkStart w:id="85" w:name="Xf5e660dc2e9c1a368125465a5756c31f66c44e2"/>
     <w:p>
       <w:pPr>
         <w:pStyle w:val="Heading1"/>
@@ -1069,7 +1069,7 @@
       </w:r>
     </w:p>
     <w:bookmarkEnd w:id="28"/>
-    <w:bookmarkStart w:id="39" w:name="X6bead5e3ab0c7cbd57888e89c1191aa20e1e3ba"/>
+    <w:bookmarkStart w:id="35" w:name="X6bead5e3ab0c7cbd57888e89c1191aa20e1e3ba"/>
     <w:p>
       <w:pPr>
         <w:pStyle w:val="Heading2"/>
@@ -2237,343 +2237,8 @@
         <w:t xml:space="preserve">one step later.</w:t>
       </w:r>
     </w:p>
-    <w:bookmarkStart w:id="38" w:name="parallelism"/>
-    <w:p>
-      <w:pPr>
-        <w:pStyle w:val="Heading3"/>
-      </w:pPr>
-      <w:r>
-        <w:t xml:space="preserve">Parallelism</w:t>
-      </w:r>
-    </w:p>
-    <w:p>
-      <w:pPr>
-        <w:pStyle w:val="FirstParagraph"/>
-      </w:pPr>
-      <w:r>
-        <w:t xml:space="preserve">This simple response behavior begs the question whether it is possible to perturb</w:t>
-      </w:r>
-      <w:r>
-        <w:t xml:space="preserve"> </w:t>
-      </w:r>
-      <m:oMath>
-        <m:r>
-          <m:t>n</m:t>
-        </m:r>
-        <m:r>
-          <m:rPr>
-            <m:sty m:val="p"/>
-          </m:rPr>
-          <m:t>&gt;</m:t>
-        </m:r>
-        <m:r>
-          <m:t>1</m:t>
-        </m:r>
-      </m:oMath>
-      <w:r>
-        <w:t xml:space="preserve"> </w:t>
-      </w:r>
-      <w:r>
-        <w:t xml:space="preserve">source letters</w:t>
-      </w:r>
-      <w:r>
-        <w:t xml:space="preserve"> </w:t>
-      </w:r>
-      <w:r>
-        <w:rPr>
-          <w:i/>
-          <w:iCs/>
-        </w:rPr>
-        <w:t xml:space="preserve">simultaneously</w:t>
-      </w:r>
-      <w:r>
-        <w:t xml:space="preserve"> </w:t>
-      </w:r>
-      <w:r>
-        <w:t xml:space="preserve">(again, keeping them subleading) and see whether the corresponding target images respond. To this end, we measure responses</w:t>
-      </w:r>
-      <w:r>
-        <w:t xml:space="preserve"> </w:t>
-      </w:r>
-      <m:oMath>
-        <m:r>
-          <m:rPr>
-            <m:sty m:val="p"/>
-          </m:rPr>
-          <m:t>⟨</m:t>
-        </m:r>
-        <m:r>
-          <m:t>R</m:t>
-        </m:r>
-        <m:sSub>
-          <m:e>
-            <m:r>
-              <m:rPr>
-                <m:sty m:val="p"/>
-              </m:rPr>
-              <m:t>⟩</m:t>
-            </m:r>
-          </m:e>
-          <m:sub>
-            <m:r>
-              <m:t>T</m:t>
-            </m:r>
-          </m:sub>
-        </m:sSub>
-      </m:oMath>
-      <w:r>
-        <w:t xml:space="preserve"> </w:t>
-      </w:r>
-      <w:r>
-        <w:t xml:space="preserve">and</w:t>
-      </w:r>
-      <w:r>
-        <w:t xml:space="preserve"> </w:t>
-      </w:r>
-      <m:oMath>
-        <m:r>
-          <m:rPr>
-            <m:sty m:val="p"/>
-          </m:rPr>
-          <m:t>⟨</m:t>
-        </m:r>
-        <m:r>
-          <m:t>R</m:t>
-        </m:r>
-        <m:sSub>
-          <m:e>
-            <m:r>
-              <m:rPr>
-                <m:sty m:val="p"/>
-              </m:rPr>
-              <m:t>⟩</m:t>
-            </m:r>
-          </m:e>
-          <m:sub>
-            <m:r>
-              <m:t>N</m:t>
-            </m:r>
-          </m:sub>
-        </m:sSub>
-      </m:oMath>
-      <w:r>
-        <w:t xml:space="preserve"> </w:t>
-      </w:r>
-      <w:r>
-        <w:t xml:space="preserve">averaged over the target and non-target sets, respectively, and introduce the</w:t>
-      </w:r>
-      <w:r>
-        <w:t xml:space="preserve"> </w:t>
-      </w:r>
-      <w:r>
-        <w:rPr>
-          <w:i/>
-          <w:iCs/>
-        </w:rPr>
-        <w:t xml:space="preserve">effect</w:t>
-      </w:r>
-      <w:r>
-        <w:t xml:space="preserve"> </w:t>
-      </w:r>
-      <m:oMath>
-        <m:r>
-          <m:t>E</m:t>
-        </m:r>
-        <m:r>
-          <m:rPr>
-            <m:sty m:val="p"/>
-          </m:rPr>
-          <m:t>=</m:t>
-        </m:r>
-        <m:r>
-          <m:rPr>
-            <m:sty m:val="p"/>
-          </m:rPr>
-          <m:t>⟨</m:t>
-        </m:r>
-        <m:r>
-          <m:t>R</m:t>
-        </m:r>
-        <m:sSub>
-          <m:e>
-            <m:r>
-              <m:rPr>
-                <m:sty m:val="p"/>
-              </m:rPr>
-              <m:t>⟩</m:t>
-            </m:r>
-          </m:e>
-          <m:sub>
-            <m:r>
-              <m:t>T</m:t>
-            </m:r>
-          </m:sub>
-        </m:sSub>
-        <m:r>
-          <m:rPr>
-            <m:sty m:val="p"/>
-          </m:rPr>
-          <m:t>−</m:t>
-        </m:r>
-        <m:r>
-          <m:rPr>
-            <m:sty m:val="p"/>
-          </m:rPr>
-          <m:t>⟨</m:t>
-        </m:r>
-        <m:r>
-          <m:t>R</m:t>
-        </m:r>
-        <m:sSub>
-          <m:e>
-            <m:r>
-              <m:rPr>
-                <m:sty m:val="p"/>
-              </m:rPr>
-              <m:t>⟩</m:t>
-            </m:r>
-          </m:e>
-          <m:sub>
-            <m:r>
-              <m:t>N</m:t>
-            </m:r>
-          </m:sub>
-        </m:sSub>
-      </m:oMath>
-      <w:r>
-        <w:t xml:space="preserve">. Because we now inject mass at multiple positions and observe proportionally scaled response, we calculate a</w:t>
-      </w:r>
-      <w:r>
-        <w:t xml:space="preserve"> </w:t>
-      </w:r>
-      <w:r>
-        <w:rPr>
-          <w:i/>
-          <w:iCs/>
-        </w:rPr>
-        <w:t xml:space="preserve">normalized effect</w:t>
-      </w:r>
-      <w:r>
-        <w:t xml:space="preserve"> </w:t>
-      </w:r>
-      <m:oMath>
-        <m:r>
-          <m:t>N</m:t>
-        </m:r>
-        <m:r>
-          <m:t>E</m:t>
-        </m:r>
-      </m:oMath>
-      <w:r>
-        <w:t xml:space="preserve">.</w:t>
-      </w:r>
-    </w:p>
-    <w:p>
-      <w:pPr>
-        <w:pStyle w:val="CaptionedFigure"/>
-      </w:pPr>
-      <w:r>
-        <w:drawing>
-          <wp:inline>
-            <wp:extent cx="5334000" cy="1700212"/>
-            <wp:effectExtent b="0" l="0" r="0" t="0"/>
-            <wp:docPr descr="Parallelism triptych" title="" id="36" name="Picture"/>
-            <a:graphic>
-              <a:graphicData uri="http://schemas.openxmlformats.org/drawingml/2006/picture">
-                <pic:pic>
-                  <pic:nvPicPr>
-                    <pic:cNvPr descr="figs/fig2b_triptych.png" id="37" name="Picture"/>
-                    <pic:cNvPicPr>
-                      <a:picLocks noChangeArrowheads="1" noChangeAspect="1"/>
-                    </pic:cNvPicPr>
-                  </pic:nvPicPr>
-                  <pic:blipFill>
-                    <a:blip r:embed="rId35"/>
-                    <a:stretch>
-                      <a:fillRect/>
-                    </a:stretch>
-                  </pic:blipFill>
-                  <pic:spPr bwMode="auto">
-                    <a:xfrm>
-                      <a:off x="0" y="0"/>
-                      <a:ext cx="5334000" cy="1700212"/>
-                    </a:xfrm>
-                    <a:prstGeom prst="rect">
-                      <a:avLst/>
-                    </a:prstGeom>
-                    <a:noFill/>
-                    <a:ln w="9525">
-                      <a:noFill/>
-                      <a:headEnd/>
-                      <a:tailEnd/>
-                    </a:ln>
-                  </pic:spPr>
-                </pic:pic>
-              </a:graphicData>
-            </a:graphic>
-          </wp:inline>
-        </w:drawing>
-      </w:r>
-    </w:p>
-    <w:p>
-      <w:pPr>
-        <w:pStyle w:val="ImageCaption"/>
-      </w:pPr>
-      <w:r>
-        <w:t xml:space="preserve">Parallelism triptych</w:t>
-      </w:r>
-    </w:p>
-    <w:p>
-      <w:pPr>
-        <w:pStyle w:val="BodyText"/>
-      </w:pPr>
-      <w:r>
-        <w:rPr>
-          <w:i/>
-          <w:iCs/>
-        </w:rPr>
-        <w:t xml:space="preserve">DiffusionGemma does simultaneous letter arithmetic to about a capacity of</w:t>
-      </w:r>
-      <w:r>
-        <w:rPr>
-          <w:i/>
-          <w:iCs/>
-        </w:rPr>
-        <w:t xml:space="preserve"> </w:t>
-      </w:r>
-      <m:oMath>
-        <m:r>
-          <m:t>n</m:t>
-        </m:r>
-        <m:r>
-          <m:rPr>
-            <m:sty m:val="p"/>
-          </m:rPr>
-          <m:t>=</m:t>
-        </m:r>
-        <m:r>
-          <m:t>4</m:t>
-        </m:r>
-      </m:oMath>
-      <w:r>
-        <w:rPr>
-          <w:i/>
-          <w:iCs/>
-        </w:rPr>
-        <w:t xml:space="preserve">.</w:t>
-      </w:r>
-    </w:p>
-    <w:p>
-      <w:pPr>
-        <w:pStyle w:val="BodyText"/>
-      </w:pPr>
-      <w:r>
-        <w:t xml:space="preserve">This behavior is plausible considering the computation in question: a shift is easily implemented by a linear rotation in representation space. Therefore, superpositions of letters will be transported to superpositions of responses. Overall, this leaves an interpretable picture.</w:t>
-      </w:r>
-    </w:p>
-    <w:bookmarkEnd w:id="38"/>
-    <w:bookmarkEnd w:id="39"/>
-    <w:bookmarkStart w:id="40" w:name="conclusion"/>
+    <w:bookmarkEnd w:id="35"/>
+    <w:bookmarkStart w:id="36" w:name="conclusion"/>
     <w:p>
       <w:pPr>
         <w:pStyle w:val="Heading2"/>
@@ -2691,7 +2356,7 @@
         </m:sSup>
       </m:oMath>
       <w:r>
-        <w:t xml:space="preserve">, in terms of carrying out (parallel) computation on it.</w:t>
+        <w:t xml:space="preserve">, in terms of carrying out computation on it.</w:t>
       </w:r>
     </w:p>
     <w:p>
@@ -2775,8 +2440,8 @@
         <w:t xml:space="preserve">latent reasoning is somewhat hard to learn. However, there already exist models like CODI that pass a vector-valued state that is not clearly a superposition of tokens, though they so far don’t show superior performance. We believe that finding methods to better interpret such models is an important area of reasearch.</w:t>
       </w:r>
     </w:p>
-    <w:bookmarkEnd w:id="40"/>
-    <w:bookmarkStart w:id="98" w:name="appendix"/>
+    <w:bookmarkEnd w:id="36"/>
+    <w:bookmarkStart w:id="84" w:name="appendix"/>
     <w:p>
       <w:pPr>
         <w:pStyle w:val="Heading2"/>
@@ -2810,7 +2475,7 @@
         <w:t xml:space="preserve">and in this post have focused on DiffusionGemma’s behavior. We here study whether the model’s representation supports the behavioral finding of high monitorability.</w:t>
       </w:r>
     </w:p>
-    <w:bookmarkStart w:id="44" w:name="representation-similarity"/>
+    <w:bookmarkStart w:id="40" w:name="representation-similarity"/>
     <w:p>
       <w:pPr>
         <w:pStyle w:val="Heading3"/>
@@ -2836,18 +2501,18 @@
           <wp:inline>
             <wp:extent cx="5334000" cy="2125265"/>
             <wp:effectExtent b="0" l="0" r="0" t="0"/>
-            <wp:docPr descr="RSA cosine and CKA" title="" id="42" name="Picture"/>
+            <wp:docPr descr="RSA cosine and CKA" title="" id="38" name="Picture"/>
             <a:graphic>
               <a:graphicData uri="http://schemas.openxmlformats.org/drawingml/2006/picture">
                 <pic:pic>
                   <pic:nvPicPr>
-                    <pic:cNvPr descr="figs/figA1_rsa_cosine_cka.png" id="43" name="Picture"/>
+                    <pic:cNvPr descr="figs/figA1_rsa_cosine_cka.png" id="39" name="Picture"/>
                     <pic:cNvPicPr>
                       <a:picLocks noChangeArrowheads="1" noChangeAspect="1"/>
                     </pic:cNvPicPr>
                   </pic:nvPicPr>
                   <pic:blipFill>
-                    <a:blip r:embed="rId41"/>
+                    <a:blip r:embed="rId37"/>
                     <a:stretch>
                       <a:fillRect/>
                     </a:stretch>
@@ -2902,8 +2567,8 @@
         <w:t xml:space="preserve">A priori, this rather large drop suggests a significant change in how the representation is organized, which we then went on to test more specifically.</w:t>
       </w:r>
     </w:p>
-    <w:bookmarkEnd w:id="44"/>
-    <w:bookmarkStart w:id="50" w:name="probe-retention"/>
+    <w:bookmarkEnd w:id="40"/>
+    <w:bookmarkStart w:id="46" w:name="probe-retention"/>
     <w:p>
       <w:pPr>
         <w:pStyle w:val="Heading3"/>
@@ -2919,7 +2584,7 @@
       <w:r>
         <w:t xml:space="preserve">Probing allows to study how well a model separates concepts. We use 56 binary concept datasets from the SAE-Probes benchmark (</w:t>
       </w:r>
-      <w:hyperlink r:id="rId45">
+      <w:hyperlink r:id="rId41">
         <w:r>
           <w:rPr>
             <w:rStyle w:val="Hyperlink"/>
@@ -2940,18 +2605,18 @@
           <wp:inline>
             <wp:extent cx="5334000" cy="3810846"/>
             <wp:effectExtent b="0" l="0" r="0" t="0"/>
-            <wp:docPr descr="Probe retention" title="" id="47" name="Picture"/>
+            <wp:docPr descr="Probe retention" title="" id="43" name="Picture"/>
             <a:graphic>
               <a:graphicData uri="http://schemas.openxmlformats.org/drawingml/2006/picture">
                 <pic:pic>
                   <pic:nvPicPr>
-                    <pic:cNvPr descr="figs/figA2_probe_retention.png" id="48" name="Picture"/>
+                    <pic:cNvPr descr="figs/figA2_probe_retention.png" id="44" name="Picture"/>
                     <pic:cNvPicPr>
                       <a:picLocks noChangeArrowheads="1" noChangeAspect="1"/>
                     </pic:cNvPicPr>
                   </pic:nvPicPr>
                   <pic:blipFill>
-                    <a:blip r:embed="rId46"/>
+                    <a:blip r:embed="rId42"/>
                     <a:stretch>
                       <a:fillRect/>
                     </a:stretch>
@@ -3042,7 +2707,7 @@
         <w:t xml:space="preserve">= the probe reads the residual at the last token.</w:t>
       </w:r>
     </w:p>
-    <w:bookmarkStart w:id="49" w:name="Xe54800880311e20d4783ff8070e763dcf274742"/>
+    <w:bookmarkStart w:id="45" w:name="Xe54800880311e20d4783ff8070e763dcf274742"/>
     <w:p>
       <w:pPr>
         <w:pStyle w:val="Heading4"/>
@@ -3075,9 +2740,9 @@
         <w:t xml:space="preserve">attention mode yields a somewhat higher AUC. This is suggestive of DG’s bidirectional attention yielding a better structured representation, but is confounded by potentially longer training.</w:t>
       </w:r>
     </w:p>
-    <w:bookmarkEnd w:id="49"/>
-    <w:bookmarkEnd w:id="50"/>
-    <w:bookmarkStart w:id="55" w:name="steering-retention"/>
+    <w:bookmarkEnd w:id="45"/>
+    <w:bookmarkEnd w:id="46"/>
+    <w:bookmarkStart w:id="51" w:name="steering-retention"/>
     <w:p>
       <w:pPr>
         <w:pStyle w:val="Heading3"/>
@@ -3093,7 +2758,7 @@
       <w:r>
         <w:t xml:space="preserve">To see whether these similarities in representation are causally load-bearing, we consider the steering experiments from the RepE paper (</w:t>
       </w:r>
-      <w:hyperlink r:id="rId51">
+      <w:hyperlink r:id="rId47">
         <w:r>
           <w:rPr>
             <w:rStyle w:val="Hyperlink"/>
@@ -3537,18 +3202,18 @@
           <wp:inline>
             <wp:extent cx="5334000" cy="6394873"/>
             <wp:effectExtent b="0" l="0" r="0" t="0"/>
-            <wp:docPr descr="Steering retention" title="" id="53" name="Picture"/>
+            <wp:docPr descr="Steering retention" title="" id="49" name="Picture"/>
             <a:graphic>
               <a:graphicData uri="http://schemas.openxmlformats.org/drawingml/2006/picture">
                 <pic:pic>
                   <pic:nvPicPr>
-                    <pic:cNvPr descr="figs/figA3_steer_retention.png" id="54" name="Picture"/>
+                    <pic:cNvPr descr="figs/figA3_steer_retention.png" id="50" name="Picture"/>
                     <pic:cNvPicPr>
                       <a:picLocks noChangeArrowheads="1" noChangeAspect="1"/>
                     </pic:cNvPicPr>
                   </pic:nvPicPr>
                   <pic:blipFill>
-                    <a:blip r:embed="rId52"/>
+                    <a:blip r:embed="rId48"/>
                     <a:stretch>
                       <a:fillRect/>
                     </a:stretch>
@@ -3639,8 +3304,8 @@
         <w:t xml:space="preserve">= the direction is added over the last 80% of prompt positions.</w:t>
       </w:r>
     </w:p>
-    <w:bookmarkEnd w:id="55"/>
-    <w:bookmarkStart w:id="63" w:name="j-lens-retention"/>
+    <w:bookmarkEnd w:id="51"/>
+    <w:bookmarkStart w:id="59" w:name="j-lens-retention"/>
     <w:p>
       <w:pPr>
         <w:pStyle w:val="Heading3"/>
@@ -3659,7 +3324,7 @@
       <w:r>
         <w:t xml:space="preserve"> </w:t>
       </w:r>
-      <w:hyperlink r:id="rId56">
+      <w:hyperlink r:id="rId52">
         <w:r>
           <w:rPr>
             <w:rStyle w:val="Hyperlink"/>
@@ -3965,18 +3630,18 @@
           <wp:inline>
             <wp:extent cx="5334000" cy="4296833"/>
             <wp:effectExtent b="0" l="0" r="0" t="0"/>
-            <wp:docPr descr="J-Lens retention" title="" id="58" name="Picture"/>
+            <wp:docPr descr="J-Lens retention" title="" id="54" name="Picture"/>
             <a:graphic>
               <a:graphicData uri="http://schemas.openxmlformats.org/drawingml/2006/picture">
                 <pic:pic>
                   <pic:nvPicPr>
-                    <pic:cNvPr descr="figs/figA4_jlens_retention.png" id="59" name="Picture"/>
+                    <pic:cNvPr descr="figs/figA4_jlens_retention.png" id="55" name="Picture"/>
                     <pic:cNvPicPr>
                       <a:picLocks noChangeArrowheads="1" noChangeAspect="1"/>
                     </pic:cNvPicPr>
                   </pic:nvPicPr>
                   <pic:blipFill>
-                    <a:blip r:embed="rId57"/>
+                    <a:blip r:embed="rId53"/>
                     <a:stretch>
                       <a:fillRect/>
                     </a:stretch>
@@ -4045,7 +3710,7 @@
         </w:rPr>
         <w:t xml:space="preserve"> </w:t>
       </w:r>
-      <w:hyperlink r:id="rId56">
+      <w:hyperlink r:id="rId52">
         <w:r>
           <w:rPr>
             <w:rStyle w:val="Hyperlink"/>
@@ -4357,18 +4022,18 @@
           <wp:inline>
             <wp:extent cx="5334000" cy="1197186"/>
             <wp:effectExtent b="0" l="0" r="0" t="0"/>
-            <wp:docPr descr="J-Lens future operation" title="" id="61" name="Picture"/>
+            <wp:docPr descr="J-Lens future operation" title="" id="57" name="Picture"/>
             <a:graphic>
               <a:graphicData uri="http://schemas.openxmlformats.org/drawingml/2006/picture">
                 <pic:pic>
                   <pic:nvPicPr>
-                    <pic:cNvPr descr="figs/figA6_jlens_future.png" id="62" name="Picture"/>
+                    <pic:cNvPr descr="figs/figA6_jlens_future.png" id="58" name="Picture"/>
                     <pic:cNvPicPr>
                       <a:picLocks noChangeArrowheads="1" noChangeAspect="1"/>
                     </pic:cNvPicPr>
                   </pic:nvPicPr>
                   <pic:blipFill>
-                    <a:blip r:embed="rId60"/>
+                    <a:blip r:embed="rId56"/>
                     <a:stretch>
                       <a:fillRect/>
                     </a:stretch>
@@ -4533,8 +4198,8 @@
         <w:t xml:space="preserve">remains highly ranked in the addition variant.</w:t>
       </w:r>
     </w:p>
-    <w:bookmarkEnd w:id="63"/>
-    <w:bookmarkStart w:id="77" w:name="letter-arithmetic"/>
+    <w:bookmarkEnd w:id="59"/>
+    <w:bookmarkStart w:id="63" w:name="letter-arithmetic"/>
     <w:p>
       <w:pPr>
         <w:pStyle w:val="Heading3"/>
@@ -4548,431 +4213,7 @@
         <w:pStyle w:val="FirstParagraph"/>
       </w:pPr>
       <w:r>
-        <w:t xml:space="preserve">[stub:] The parallelism analysis in the main text compares set</w:t>
-      </w:r>
-      <w:r>
-        <w:t xml:space="preserve"> </w:t>
-      </w:r>
-      <w:r>
-        <w:rPr>
-          <w:i/>
-          <w:iCs/>
-        </w:rPr>
-        <w:t xml:space="preserve">means</w:t>
-      </w:r>
-      <w:r>
-        <w:t xml:space="preserve">,</w:t>
-      </w:r>
-      <w:r>
-        <w:t xml:space="preserve"> </w:t>
-      </w:r>
-      <m:oMath>
-        <m:r>
-          <m:rPr>
-            <m:sty m:val="p"/>
-          </m:rPr>
-          <m:t>⟨</m:t>
-        </m:r>
-        <m:r>
-          <m:t>R</m:t>
-        </m:r>
-        <m:sSub>
-          <m:e>
-            <m:r>
-              <m:rPr>
-                <m:sty m:val="p"/>
-              </m:rPr>
-              <m:t>⟩</m:t>
-            </m:r>
-          </m:e>
-          <m:sub>
-            <m:r>
-              <m:t>T</m:t>
-            </m:r>
-          </m:sub>
-        </m:sSub>
-      </m:oMath>
-      <w:r>
-        <w:t xml:space="preserve"> </w:t>
-      </w:r>
-      <w:r>
-        <w:t xml:space="preserve">vs</w:t>
-      </w:r>
-      <w:r>
-        <w:t xml:space="preserve"> </w:t>
-      </w:r>
-      <m:oMath>
-        <m:r>
-          <m:rPr>
-            <m:sty m:val="p"/>
-          </m:rPr>
-          <m:t>⟨</m:t>
-        </m:r>
-        <m:r>
-          <m:t>R</m:t>
-        </m:r>
-        <m:sSub>
-          <m:e>
-            <m:r>
-              <m:rPr>
-                <m:sty m:val="p"/>
-              </m:rPr>
-              <m:t>⟩</m:t>
-            </m:r>
-          </m:e>
-          <m:sub>
-            <m:r>
-              <m:t>N</m:t>
-            </m:r>
-          </m:sub>
-        </m:sSub>
-      </m:oMath>
-      <w:r>
-        <w:t xml:space="preserve">. A stricter criterion asks whether</w:t>
-      </w:r>
-      <w:r>
-        <w:t xml:space="preserve"> </w:t>
-      </w:r>
-      <w:r>
-        <w:rPr>
-          <w:i/>
-          <w:iCs/>
-        </w:rPr>
-        <w:t xml:space="preserve">every</w:t>
-      </w:r>
-      <w:r>
-        <w:t xml:space="preserve"> </w:t>
-      </w:r>
-      <w:r>
-        <w:t xml:space="preserve">target beats</w:t>
-      </w:r>
-      <w:r>
-        <w:t xml:space="preserve"> </w:t>
-      </w:r>
-      <w:r>
-        <w:rPr>
-          <w:i/>
-          <w:iCs/>
-        </w:rPr>
-        <w:t xml:space="preserve">every</w:t>
-      </w:r>
-      <w:r>
-        <w:t xml:space="preserve"> </w:t>
-      </w:r>
-      <w:r>
-        <w:t xml:space="preserve">non-target: we aggregate the same cells with the weakest target response</w:t>
-      </w:r>
-      <w:r>
-        <w:t xml:space="preserve"> </w:t>
-      </w:r>
-      <m:oMath>
-        <m:sSubSup>
-          <m:e>
-            <m:r>
-              <m:t>R</m:t>
-            </m:r>
-          </m:e>
-          <m:sub>
-            <m:r>
-              <m:t>T</m:t>
-            </m:r>
-          </m:sub>
-          <m:sup>
-            <m:r>
-              <m:rPr>
-                <m:sty m:val="p"/>
-              </m:rPr>
-              <m:t>min</m:t>
-            </m:r>
-          </m:sup>
-        </m:sSubSup>
-      </m:oMath>
-      <w:r>
-        <w:t xml:space="preserve"> </w:t>
-      </w:r>
-      <w:r>
-        <w:t xml:space="preserve">against the strongest non-target response</w:t>
-      </w:r>
-      <w:r>
-        <w:t xml:space="preserve"> </w:t>
-      </w:r>
-      <m:oMath>
-        <m:sSubSup>
-          <m:e>
-            <m:r>
-              <m:t>R</m:t>
-            </m:r>
-          </m:e>
-          <m:sub>
-            <m:r>
-              <m:t>N</m:t>
-            </m:r>
-          </m:sub>
-          <m:sup>
-            <m:r>
-              <m:rPr>
-                <m:sty m:val="p"/>
-              </m:rPr>
-              <m:t>max</m:t>
-            </m:r>
-          </m:sup>
-        </m:sSubSup>
-      </m:oMath>
-      <w:r>
-        <w:t xml:space="preserve">, and</w:t>
-      </w:r>
-      <w:r>
-        <w:t xml:space="preserve"> </w:t>
-      </w:r>
-      <m:oMath>
-        <m:sSup>
-          <m:e>
-            <m:r>
-              <m:t>E</m:t>
-            </m:r>
-          </m:e>
-          <m:sup>
-            <m:r>
-              <m:rPr>
-                <m:sty m:val="p"/>
-              </m:rPr>
-              <m:t>min</m:t>
-            </m:r>
-          </m:sup>
-        </m:sSup>
-        <m:r>
-          <m:rPr>
-            <m:sty m:val="p"/>
-          </m:rPr>
-          <m:t>=</m:t>
-        </m:r>
-        <m:sSubSup>
-          <m:e>
-            <m:r>
-              <m:t>R</m:t>
-            </m:r>
-          </m:e>
-          <m:sub>
-            <m:r>
-              <m:t>T</m:t>
-            </m:r>
-          </m:sub>
-          <m:sup>
-            <m:r>
-              <m:rPr>
-                <m:sty m:val="p"/>
-              </m:rPr>
-              <m:t>min</m:t>
-            </m:r>
-          </m:sup>
-        </m:sSubSup>
-        <m:r>
-          <m:rPr>
-            <m:sty m:val="p"/>
-          </m:rPr>
-          <m:t>−</m:t>
-        </m:r>
-        <m:sSubSup>
-          <m:e>
-            <m:r>
-              <m:t>R</m:t>
-            </m:r>
-          </m:e>
-          <m:sub>
-            <m:r>
-              <m:t>N</m:t>
-            </m:r>
-          </m:sub>
-          <m:sup>
-            <m:r>
-              <m:rPr>
-                <m:sty m:val="p"/>
-              </m:rPr>
-              <m:t>max</m:t>
-            </m:r>
-          </m:sup>
-        </m:sSubSup>
-      </m:oMath>
-      <w:r>
-        <w:t xml:space="preserve">.</w:t>
-      </w:r>
-    </w:p>
-    <w:p>
-      <w:pPr>
-        <w:pStyle w:val="CaptionedFigure"/>
-      </w:pPr>
-      <w:r>
-        <w:drawing>
-          <wp:inline>
-            <wp:extent cx="5334000" cy="1700212"/>
-            <wp:effectExtent b="0" l="0" r="0" t="0"/>
-            <wp:docPr descr="Letters strict triptych" title="" id="65" name="Picture"/>
-            <a:graphic>
-              <a:graphicData uri="http://schemas.openxmlformats.org/drawingml/2006/picture">
-                <pic:pic>
-                  <pic:nvPicPr>
-                    <pic:cNvPr descr="figs/figA12_letters_strict.png" id="66" name="Picture"/>
-                    <pic:cNvPicPr>
-                      <a:picLocks noChangeArrowheads="1" noChangeAspect="1"/>
-                    </pic:cNvPicPr>
-                  </pic:nvPicPr>
-                  <pic:blipFill>
-                    <a:blip r:embed="rId64"/>
-                    <a:stretch>
-                      <a:fillRect/>
-                    </a:stretch>
-                  </pic:blipFill>
-                  <pic:spPr bwMode="auto">
-                    <a:xfrm>
-                      <a:off x="0" y="0"/>
-                      <a:ext cx="5334000" cy="1700212"/>
-                    </a:xfrm>
-                    <a:prstGeom prst="rect">
-                      <a:avLst/>
-                    </a:prstGeom>
-                    <a:noFill/>
-                    <a:ln w="9525">
-                      <a:noFill/>
-                      <a:headEnd/>
-                      <a:tailEnd/>
-                    </a:ln>
-                  </pic:spPr>
-                </pic:pic>
-              </a:graphicData>
-            </a:graphic>
-          </wp:inline>
-        </w:drawing>
-      </w:r>
-    </w:p>
-    <w:p>
-      <w:pPr>
-        <w:pStyle w:val="ImageCaption"/>
-      </w:pPr>
-      <w:r>
-        <w:t xml:space="preserve">Letters strict triptych</w:t>
-      </w:r>
-    </w:p>
-    <w:p>
-      <w:pPr>
-        <w:pStyle w:val="BodyText"/>
-      </w:pPr>
-      <w:r>
-        <w:rPr>
-          <w:i/>
-          <w:iCs/>
-        </w:rPr>
-        <w:t xml:space="preserve">The separation is mean-level only: already at</w:t>
-      </w:r>
-      <w:r>
-        <w:rPr>
-          <w:i/>
-          <w:iCs/>
-        </w:rPr>
-        <w:t xml:space="preserve"> </w:t>
-      </w:r>
-      <m:oMath>
-        <m:r>
-          <m:t>n</m:t>
-        </m:r>
-        <m:r>
-          <m:rPr>
-            <m:sty m:val="p"/>
-          </m:rPr>
-          <m:t>=</m:t>
-        </m:r>
-        <m:r>
-          <m:t>1</m:t>
-        </m:r>
-      </m:oMath>
-      <w:r>
-        <w:rPr>
-          <w:i/>
-          <w:iCs/>
-        </w:rPr>
-        <w:t xml:space="preserve"> </w:t>
-      </w:r>
-      <w:r>
-        <w:rPr>
-          <w:i/>
-          <w:iCs/>
-        </w:rPr>
-        <w:t xml:space="preserve">some non-target letter responds more strongly than the weakest target (</w:t>
-      </w:r>
-      <m:oMath>
-        <m:sSup>
-          <m:e>
-            <m:r>
-              <m:t>E</m:t>
-            </m:r>
-          </m:e>
-          <m:sup>
-            <m:r>
-              <m:rPr>
-                <m:sty m:val="p"/>
-              </m:rPr>
-              <m:t>min</m:t>
-            </m:r>
-          </m:sup>
-        </m:sSup>
-        <m:r>
-          <m:rPr>
-            <m:sty m:val="p"/>
-          </m:rPr>
-          <m:t>&lt;</m:t>
-        </m:r>
-        <m:r>
-          <m:t>0</m:t>
-        </m:r>
-      </m:oMath>
-      <w:r>
-        <w:rPr>
-          <w:i/>
-          <w:iCs/>
-        </w:rPr>
-        <w:t xml:space="preserve"> </w:t>
-      </w:r>
-      <w:r>
-        <w:rPr>
-          <w:i/>
-          <w:iCs/>
-        </w:rPr>
-        <w:t xml:space="preserve">at every</w:t>
-      </w:r>
-      <w:r>
-        <w:rPr>
-          <w:i/>
-          <w:iCs/>
-        </w:rPr>
-        <w:t xml:space="preserve"> </w:t>
-      </w:r>
-      <m:oMath>
-        <m:r>
-          <m:t>n</m:t>
-        </m:r>
-      </m:oMath>
-      <w:r>
-        <w:rPr>
-          <w:i/>
-          <w:iCs/>
-        </w:rPr>
-        <w:t xml:space="preserve">).</w:t>
-      </w:r>
-    </w:p>
-    <w:bookmarkStart w:id="76" w:name="multiplication"/>
-    <w:p>
-      <w:pPr>
-        <w:pStyle w:val="Heading4"/>
-      </w:pPr>
-      <w:r>
-        <w:t xml:space="preserve">Multiplication</w:t>
-      </w:r>
-    </w:p>
-    <w:p>
-      <w:pPr>
-        <w:pStyle w:val="FirstParagraph"/>
-      </w:pPr>
-      <w:r>
-        <w:t xml:space="preserve">[stub:] The same protocol also runs with a multiplicative image map, $x’ = $ the letter at position</w:t>
+        <w:t xml:space="preserve">[stub:] The single-injection transfer-map protocol of the main text also runs with a multiplicative image map, $x’ = $ the letter at position</w:t>
       </w:r>
       <w:r>
         <w:t xml:space="preserve"> </w:t>
@@ -5085,18 +4326,18 @@
           <wp:inline>
             <wp:extent cx="5334000" cy="4000500"/>
             <wp:effectExtent b="0" l="0" r="0" t="0"/>
-            <wp:docPr descr="Multiplicative transfer map" title="" id="68" name="Picture"/>
+            <wp:docPr descr="Multiplicative transfer map" title="" id="61" name="Picture"/>
             <a:graphic>
               <a:graphicData uri="http://schemas.openxmlformats.org/drawingml/2006/picture">
                 <pic:pic>
                   <pic:nvPicPr>
-                    <pic:cNvPr descr="figs/figA13_mult_transfer.png" id="69" name="Picture"/>
+                    <pic:cNvPr descr="figs/figA13_mult_transfer.png" id="62" name="Picture"/>
                     <pic:cNvPicPr>
                       <a:picLocks noChangeArrowheads="1" noChangeAspect="1"/>
                     </pic:cNvPicPr>
                   </pic:nvPicPr>
                   <pic:blipFill>
-                    <a:blip r:embed="rId67"/>
+                    <a:blip r:embed="rId60"/>
                     <a:stretch>
                       <a:fillRect/>
                     </a:stretch>
@@ -5200,6 +4441,482 @@
         <w:t xml:space="preserve">).</w:t>
       </w:r>
     </w:p>
+    <w:bookmarkEnd w:id="63"/>
+    <w:bookmarkStart w:id="67" w:name="Xea3042850cf8050407ffdd53c2454b5f83a5608"/>
+    <w:p>
+      <w:pPr>
+        <w:pStyle w:val="Heading3"/>
+      </w:pPr>
+      <w:r>
+        <w:t xml:space="preserve">Autonomous computational usage of</w:t>
+      </w:r>
+      <w:r>
+        <w:t xml:space="preserve"> </w:t>
+      </w:r>
+      <m:oMath>
+        <m:sSup>
+          <m:e>
+            <m:r>
+              <m:rPr>
+                <m:sty m:val="b"/>
+              </m:rPr>
+              <m:t>s</m:t>
+            </m:r>
+          </m:e>
+          <m:sup>
+            <m:r>
+              <m:t>t</m:t>
+            </m:r>
+          </m:sup>
+        </m:sSup>
+      </m:oMath>
+    </w:p>
+    <w:p>
+      <w:pPr>
+        <w:pStyle w:val="FirstParagraph"/>
+      </w:pPr>
+      <w:r>
+        <w:t xml:space="preserve">In the</w:t>
+      </w:r>
+      <w:r>
+        <w:t xml:space="preserve"> </w:t>
+      </w:r>
+      <w:r>
+        <w:rPr>
+          <w:i/>
+          <w:iCs/>
+        </w:rPr>
+        <w:t xml:space="preserve">letter arithmetic</w:t>
+      </w:r>
+      <w:r>
+        <w:t xml:space="preserve"> </w:t>
+      </w:r>
+      <w:r>
+        <w:t xml:space="preserve">task introduced in the main text, DiffusionGemma did respond to modifications of the distributional state in the way we expected. While suggestive, it is unclear if the model also would make use of</w:t>
+      </w:r>
+      <w:r>
+        <w:t xml:space="preserve"> </w:t>
+      </w:r>
+      <m:oMath>
+        <m:sSup>
+          <m:e>
+            <m:r>
+              <m:rPr>
+                <m:sty m:val="b"/>
+              </m:rPr>
+              <m:t>s</m:t>
+            </m:r>
+          </m:e>
+          <m:sup>
+            <m:r>
+              <m:t>t</m:t>
+            </m:r>
+          </m:sup>
+        </m:sSup>
+      </m:oMath>
+      <w:r>
+        <w:t xml:space="preserve"> </w:t>
+      </w:r>
+      <w:r>
+        <w:rPr>
+          <w:i/>
+          <w:iCs/>
+        </w:rPr>
+        <w:t xml:space="preserve">autonomously</w:t>
+      </w:r>
+      <w:r>
+        <w:t xml:space="preserve">, i.e. without interventions.</w:t>
+      </w:r>
+    </w:p>
+    <w:p>
+      <w:pPr>
+        <w:pStyle w:val="BodyText"/>
+      </w:pPr>
+      <w:r>
+        <w:t xml:space="preserve">To investigate this, we searched for a non-trivial (i.e., not just a binary choice) task where DG will use a hypothesis subleading in its distribution. An instance we found is a</w:t>
+      </w:r>
+      <w:r>
+        <w:t xml:space="preserve"> </w:t>
+      </w:r>
+      <w:r>
+        <w:rPr>
+          <w:i/>
+          <w:iCs/>
+        </w:rPr>
+        <w:t xml:space="preserve">word-level palindrome</w:t>
+      </w:r>
+      <w:r>
+        <w:t xml:space="preserve"> </w:t>
+      </w:r>
+      <w:r>
+        <w:t xml:space="preserve">task. When asked</w:t>
+      </w:r>
+      <w:r>
+        <w:t xml:space="preserve"> </w:t>
+      </w:r>
+      <w:r>
+        <w:rPr>
+          <w:rStyle w:val="VerbatimChar"/>
+        </w:rPr>
+        <w:t xml:space="preserve">Please write a word-level palindrome</w:t>
+      </w:r>
+      <w:r>
+        <w:t xml:space="preserve">, DG maintains two competing completions of the same canvas: a literal</w:t>
+      </w:r>
+      <w:r>
+        <w:t xml:space="preserve"> </w:t>
+      </w:r>
+      <w:r>
+        <w:rPr>
+          <w:i/>
+          <w:iCs/>
+        </w:rPr>
+        <w:t xml:space="preserve">seasonal</w:t>
+      </w:r>
+      <w:r>
+        <w:t xml:space="preserve"> </w:t>
+      </w:r>
+      <w:r>
+        <w:t xml:space="preserve">phrase (</w:t>
+      </w:r>
+      <w:r>
+        <w:rPr>
+          <w:rStyle w:val="VerbatimChar"/>
+        </w:rPr>
+        <w:t xml:space="preserve">All leaves fall when leaves fall all.</w:t>
+      </w:r>
+      <w:r>
+        <w:t xml:space="preserve">) and the famous</w:t>
+      </w:r>
+      <w:r>
+        <w:t xml:space="preserve"> </w:t>
+      </w:r>
+      <w:r>
+        <w:rPr>
+          <w:i/>
+          <w:iCs/>
+        </w:rPr>
+        <w:t xml:space="preserve">idiom</w:t>
+      </w:r>
+      <w:r>
+        <w:t xml:space="preserve"> </w:t>
+      </w:r>
+      <w:r>
+        <w:t xml:space="preserve">(</w:t>
+      </w:r>
+      <w:r>
+        <w:rPr>
+          <w:rStyle w:val="VerbatimChar"/>
+        </w:rPr>
+        <w:t xml:space="preserve">All for one and one for all.</w:t>
+      </w:r>
+      <w:r>
+        <w:t xml:space="preserve">).</w:t>
+      </w:r>
+    </w:p>
+    <w:p>
+      <w:pPr>
+        <w:pStyle w:val="BodyText"/>
+      </w:pPr>
+      <w:r>
+        <w:t xml:space="preserve">The canvas will read the</w:t>
+      </w:r>
+      <w:r>
+        <w:t xml:space="preserve"> </w:t>
+      </w:r>
+      <w:r>
+        <w:rPr>
+          <w:i/>
+          <w:iCs/>
+        </w:rPr>
+        <w:t xml:space="preserve">seasonal</w:t>
+      </w:r>
+      <w:r>
+        <w:t xml:space="preserve"> </w:t>
+      </w:r>
+      <w:r>
+        <w:t xml:space="preserve">answer for the first few diffusion steps, after which it flips and stays at</w:t>
+      </w:r>
+      <w:r>
+        <w:t xml:space="preserve"> </w:t>
+      </w:r>
+      <w:r>
+        <w:rPr>
+          <w:i/>
+          <w:iCs/>
+        </w:rPr>
+        <w:t xml:space="preserve">idiom</w:t>
+      </w:r>
+      <w:r>
+        <w:t xml:space="preserve">. Interestingly, this is accompanied by</w:t>
+      </w:r>
+      <w:r>
+        <w:t xml:space="preserve"> </w:t>
+      </w:r>
+      <w:r>
+        <w:rPr>
+          <w:i/>
+          <w:iCs/>
+        </w:rPr>
+        <w:t xml:space="preserve">dynamics</w:t>
+      </w:r>
+      <w:r>
+        <w:t xml:space="preserve"> </w:t>
+      </w:r>
+      <w:r>
+        <w:t xml:space="preserve">in</w:t>
+      </w:r>
+      <w:r>
+        <w:t xml:space="preserve"> </w:t>
+      </w:r>
+      <m:oMath>
+        <m:sSup>
+          <m:e>
+            <m:r>
+              <m:rPr>
+                <m:sty m:val="b"/>
+              </m:rPr>
+              <m:t>s</m:t>
+            </m:r>
+          </m:e>
+          <m:sup>
+            <m:r>
+              <m:t>t</m:t>
+            </m:r>
+          </m:sup>
+        </m:sSup>
+      </m:oMath>
+      <w:r>
+        <w:t xml:space="preserve">:</w:t>
+      </w:r>
+      <w:r>
+        <w:t xml:space="preserve"> </w:t>
+      </w:r>
+      <w:r>
+        <w:rPr>
+          <w:i/>
+          <w:iCs/>
+        </w:rPr>
+        <w:t xml:space="preserve">idiom</w:t>
+      </w:r>
+      <w:r>
+        <w:t xml:space="preserve"> </w:t>
+      </w:r>
+      <w:r>
+        <w:t xml:space="preserve">will start at ~0, and progressively gain weight, replacing</w:t>
+      </w:r>
+      <w:r>
+        <w:t xml:space="preserve"> </w:t>
+      </w:r>
+      <w:r>
+        <w:rPr>
+          <w:i/>
+          <w:iCs/>
+        </w:rPr>
+        <w:t xml:space="preserve">seasonal</w:t>
+      </w:r>
+      <w:r>
+        <w:t xml:space="preserve">.</w:t>
+      </w:r>
+    </w:p>
+    <w:p>
+      <w:pPr>
+        <w:pStyle w:val="BodyText"/>
+      </w:pPr>
+      <w:r>
+        <w:t xml:space="preserve">We validated that the emergence of</w:t>
+      </w:r>
+      <w:r>
+        <w:t xml:space="preserve"> </w:t>
+      </w:r>
+      <w:r>
+        <w:rPr>
+          <w:i/>
+          <w:iCs/>
+        </w:rPr>
+        <w:t xml:space="preserve">idiom</w:t>
+      </w:r>
+      <w:r>
+        <w:t xml:space="preserve"> </w:t>
+      </w:r>
+      <w:r>
+        <w:t xml:space="preserve">is indeed causal: persistently ablating</w:t>
+      </w:r>
+      <w:r>
+        <w:t xml:space="preserve"> </w:t>
+      </w:r>
+      <w:r>
+        <w:rPr>
+          <w:i/>
+          <w:iCs/>
+        </w:rPr>
+        <w:t xml:space="preserve">idiom</w:t>
+      </w:r>
+      <w:r>
+        <w:t xml:space="preserve">’s</w:t>
+      </w:r>
+      <w:r>
+        <w:t xml:space="preserve"> </w:t>
+      </w:r>
+      <m:oMath>
+        <m:r>
+          <m:rPr>
+            <m:sty m:val="b"/>
+          </m:rPr>
+          <m:t>s</m:t>
+        </m:r>
+      </m:oMath>
+      <w:r>
+        <w:t xml:space="preserve">-mass from an early step onward prevents the takeover and preserves the seasonal draft. Concretely, at every step</w:t>
+      </w:r>
+      <w:r>
+        <w:t xml:space="preserve"> </w:t>
+      </w:r>
+      <m:oMath>
+        <m:r>
+          <m:t>t</m:t>
+        </m:r>
+        <m:r>
+          <m:rPr>
+            <m:sty m:val="p"/>
+          </m:rPr>
+          <m:t>≥</m:t>
+        </m:r>
+        <m:sSub>
+          <m:e>
+            <m:r>
+              <m:t>t</m:t>
+            </m:r>
+          </m:e>
+          <m:sub>
+            <m:r>
+              <m:rPr>
+                <m:sty m:val="p"/>
+              </m:rPr>
+              <m:t>a</m:t>
+            </m:r>
+            <m:r>
+              <m:rPr>
+                <m:sty m:val="p"/>
+              </m:rPr>
+              <m:t>b</m:t>
+            </m:r>
+            <m:r>
+              <m:rPr>
+                <m:sty m:val="p"/>
+              </m:rPr>
+              <m:t>l</m:t>
+            </m:r>
+          </m:sub>
+        </m:sSub>
+      </m:oMath>
+      <w:r>
+        <w:t xml:space="preserve"> </w:t>
+      </w:r>
+      <w:r>
+        <w:t xml:space="preserve">we zero the idiom tokens’ entries of</w:t>
+      </w:r>
+      <w:r>
+        <w:t xml:space="preserve"> </w:t>
+      </w:r>
+      <m:oMath>
+        <m:sSubSup>
+          <m:e>
+            <m:r>
+              <m:rPr>
+                <m:sty m:val="b"/>
+              </m:rPr>
+              <m:t>s</m:t>
+            </m:r>
+          </m:e>
+          <m:sub>
+            <m:r>
+              <m:t>i</m:t>
+            </m:r>
+          </m:sub>
+          <m:sup>
+            <m:r>
+              <m:t>t</m:t>
+            </m:r>
+          </m:sup>
+        </m:sSubSup>
+      </m:oMath>
+      <w:r>
+        <w:t xml:space="preserve"> </w:t>
+      </w:r>
+      <w:r>
+        <w:t xml:space="preserve">at the contested positions</w:t>
+      </w:r>
+      <w:r>
+        <w:t xml:space="preserve"> </w:t>
+      </w:r>
+      <m:oMath>
+        <m:r>
+          <m:t>i</m:t>
+        </m:r>
+      </m:oMath>
+      <w:r>
+        <w:t xml:space="preserve"> </w:t>
+      </w:r>
+      <w:r>
+        <w:t xml:space="preserve">(before sampling); the canvas</w:t>
+      </w:r>
+      <w:r>
+        <w:t xml:space="preserve"> </w:t>
+      </w:r>
+      <m:oMath>
+        <m:sSup>
+          <m:e>
+            <m:r>
+              <m:t>X</m:t>
+            </m:r>
+          </m:e>
+          <m:sup>
+            <m:r>
+              <m:t>t</m:t>
+            </m:r>
+          </m:sup>
+        </m:sSup>
+      </m:oMath>
+      <w:r>
+        <w:t xml:space="preserve"> </w:t>
+      </w:r>
+      <w:r>
+        <w:t xml:space="preserve">is never edited and every other position and token is left untouched. What is</w:t>
+      </w:r>
+      <w:r>
+        <w:t xml:space="preserve"> </w:t>
+      </w:r>
+      <w:r>
+        <w:rPr>
+          <w:i/>
+          <w:iCs/>
+        </w:rPr>
+        <w:t xml:space="preserve">preserved</w:t>
+      </w:r>
+      <w:r>
+        <w:t xml:space="preserve"> </w:t>
+      </w:r>
+      <w:r>
+        <w:t xml:space="preserve">is thus the model’s own seasonal completion — nothing is injected in its favor. Note however that later ablation onsets no longer rescue</w:t>
+      </w:r>
+      <w:r>
+        <w:t xml:space="preserve"> </w:t>
+      </w:r>
+      <w:r>
+        <w:rPr>
+          <w:i/>
+          <w:iCs/>
+        </w:rPr>
+        <w:t xml:space="preserve">seasonal</w:t>
+      </w:r>
+      <w:r>
+        <w:t xml:space="preserve"> </w:t>
+      </w:r>
+      <w:r>
+        <w:t xml:space="preserve">— the canvas instead collapses into a third, degenerate basin.</w:t>
+      </w:r>
+    </w:p>
     <w:p>
       <w:pPr>
         <w:pStyle w:val="CaptionedFigure"/>
@@ -5207,715 +4924,20 @@
       <w:r>
         <w:drawing>
           <wp:inline>
-            <wp:extent cx="5334000" cy="1700212"/>
+            <wp:extent cx="5334000" cy="2956891"/>
             <wp:effectExtent b="0" l="0" r="0" t="0"/>
-            <wp:docPr descr="Multiplicative parallelism triptych" title="" id="71" name="Picture"/>
+            <wp:docPr descr="Seasonal vs idiom: ablation" title="" id="65" name="Picture"/>
             <a:graphic>
               <a:graphicData uri="http://schemas.openxmlformats.org/drawingml/2006/picture">
                 <pic:pic>
                   <pic:nvPicPr>
-                    <pic:cNvPr descr="figs/figA14_mult_triptych.png" id="72" name="Picture"/>
+                    <pic:cNvPr descr="figs/figA5_seasonal_ember_kill.png" id="66" name="Picture"/>
                     <pic:cNvPicPr>
                       <a:picLocks noChangeArrowheads="1" noChangeAspect="1"/>
                     </pic:cNvPicPr>
                   </pic:nvPicPr>
                   <pic:blipFill>
-                    <a:blip r:embed="rId70"/>
-                    <a:stretch>
-                      <a:fillRect/>
-                    </a:stretch>
-                  </pic:blipFill>
-                  <pic:spPr bwMode="auto">
-                    <a:xfrm>
-                      <a:off x="0" y="0"/>
-                      <a:ext cx="5334000" cy="1700212"/>
-                    </a:xfrm>
-                    <a:prstGeom prst="rect">
-                      <a:avLst/>
-                    </a:prstGeom>
-                    <a:noFill/>
-                    <a:ln w="9525">
-                      <a:noFill/>
-                      <a:headEnd/>
-                      <a:tailEnd/>
-                    </a:ln>
-                  </pic:spPr>
-                </pic:pic>
-              </a:graphicData>
-            </a:graphic>
-          </wp:inline>
-        </w:drawing>
-      </w:r>
-    </w:p>
-    <w:p>
-      <w:pPr>
-        <w:pStyle w:val="ImageCaption"/>
-      </w:pPr>
-      <w:r>
-        <w:t xml:space="preserve">Multiplicative parallelism triptych</w:t>
-      </w:r>
-    </w:p>
-    <w:p>
-      <w:pPr>
-        <w:pStyle w:val="BodyText"/>
-      </w:pPr>
-      <w:r>
-        <w:rPr>
-          <w:i/>
-          <w:iCs/>
-        </w:rPr>
-        <w:t xml:space="preserve">Mean parallelism for</w:t>
-      </w:r>
-      <w:r>
-        <w:rPr>
-          <w:i/>
-          <w:iCs/>
-        </w:rPr>
-        <w:t xml:space="preserve"> </w:t>
-      </w:r>
-      <m:oMath>
-        <m:r>
-          <m:rPr>
-            <m:sty m:val="p"/>
-          </m:rPr>
-          <m:t>×</m:t>
-        </m:r>
-        <m:r>
-          <m:t>k</m:t>
-        </m:r>
-      </m:oMath>
-      <w:r>
-        <w:rPr>
-          <w:i/>
-          <w:iCs/>
-        </w:rPr>
-        <w:t xml:space="preserve">: targets separate from non-targets, peaking at</w:t>
-      </w:r>
-      <w:r>
-        <w:rPr>
-          <w:i/>
-          <w:iCs/>
-        </w:rPr>
-        <w:t xml:space="preserve"> </w:t>
-      </w:r>
-      <m:oMath>
-        <m:r>
-          <m:t>n</m:t>
-        </m:r>
-        <m:r>
-          <m:rPr>
-            <m:sty m:val="p"/>
-          </m:rPr>
-          <m:t>≈</m:t>
-        </m:r>
-        <m:r>
-          <m:t>3</m:t>
-        </m:r>
-      </m:oMath>
-      <w:r>
-        <w:rPr>
-          <w:i/>
-          <w:iCs/>
-        </w:rPr>
-        <w:t xml:space="preserve">–</w:t>
-      </w:r>
-      <m:oMath>
-        <m:r>
-          <m:t>4</m:t>
-        </m:r>
-      </m:oMath>
-      <w:r>
-        <w:rPr>
-          <w:i/>
-          <w:iCs/>
-        </w:rPr>
-        <w:t xml:space="preserve">.</w:t>
-      </w:r>
-    </w:p>
-    <w:p>
-      <w:pPr>
-        <w:pStyle w:val="CaptionedFigure"/>
-      </w:pPr>
-      <w:r>
-        <w:drawing>
-          <wp:inline>
-            <wp:extent cx="5334000" cy="1700212"/>
-            <wp:effectExtent b="0" l="0" r="0" t="0"/>
-            <wp:docPr descr="Multiplicative strict triptych" title="" id="74" name="Picture"/>
-            <a:graphic>
-              <a:graphicData uri="http://schemas.openxmlformats.org/drawingml/2006/picture">
-                <pic:pic>
-                  <pic:nvPicPr>
-                    <pic:cNvPr descr="figs/figA15_mult_strict.png" id="75" name="Picture"/>
-                    <pic:cNvPicPr>
-                      <a:picLocks noChangeArrowheads="1" noChangeAspect="1"/>
-                    </pic:cNvPicPr>
-                  </pic:nvPicPr>
-                  <pic:blipFill>
-                    <a:blip r:embed="rId73"/>
-                    <a:stretch>
-                      <a:fillRect/>
-                    </a:stretch>
-                  </pic:blipFill>
-                  <pic:spPr bwMode="auto">
-                    <a:xfrm>
-                      <a:off x="0" y="0"/>
-                      <a:ext cx="5334000" cy="1700212"/>
-                    </a:xfrm>
-                    <a:prstGeom prst="rect">
-                      <a:avLst/>
-                    </a:prstGeom>
-                    <a:noFill/>
-                    <a:ln w="9525">
-                      <a:noFill/>
-                      <a:headEnd/>
-                      <a:tailEnd/>
-                    </a:ln>
-                  </pic:spPr>
-                </pic:pic>
-              </a:graphicData>
-            </a:graphic>
-          </wp:inline>
-        </w:drawing>
-      </w:r>
-    </w:p>
-    <w:p>
-      <w:pPr>
-        <w:pStyle w:val="ImageCaption"/>
-      </w:pPr>
-      <w:r>
-        <w:t xml:space="preserve">Multiplicative strict triptych</w:t>
-      </w:r>
-    </w:p>
-    <w:p>
-      <w:pPr>
-        <w:pStyle w:val="BodyText"/>
-      </w:pPr>
-      <w:r>
-        <w:rPr>
-          <w:i/>
-          <w:iCs/>
-        </w:rPr>
-        <w:t xml:space="preserve">As in the additive family, the worst-case criterion stays negative at every</w:t>
-      </w:r>
-      <w:r>
-        <w:rPr>
-          <w:i/>
-          <w:iCs/>
-        </w:rPr>
-        <w:t xml:space="preserve"> </w:t>
-      </w:r>
-      <m:oMath>
-        <m:r>
-          <m:t>n</m:t>
-        </m:r>
-      </m:oMath>
-      <w:r>
-        <w:rPr>
-          <w:i/>
-          <w:iCs/>
-        </w:rPr>
-        <w:t xml:space="preserve">.</w:t>
-      </w:r>
-    </w:p>
-    <w:bookmarkEnd w:id="76"/>
-    <w:bookmarkEnd w:id="77"/>
-    <w:bookmarkStart w:id="81" w:name="Xea3042850cf8050407ffdd53c2454b5f83a5608"/>
-    <w:p>
-      <w:pPr>
-        <w:pStyle w:val="Heading3"/>
-      </w:pPr>
-      <w:r>
-        <w:t xml:space="preserve">Autonomous computational usage of</w:t>
-      </w:r>
-      <w:r>
-        <w:t xml:space="preserve"> </w:t>
-      </w:r>
-      <m:oMath>
-        <m:sSup>
-          <m:e>
-            <m:r>
-              <m:rPr>
-                <m:sty m:val="b"/>
-              </m:rPr>
-              <m:t>s</m:t>
-            </m:r>
-          </m:e>
-          <m:sup>
-            <m:r>
-              <m:t>t</m:t>
-            </m:r>
-          </m:sup>
-        </m:sSup>
-      </m:oMath>
-    </w:p>
-    <w:p>
-      <w:pPr>
-        <w:pStyle w:val="FirstParagraph"/>
-      </w:pPr>
-      <w:r>
-        <w:t xml:space="preserve">In the</w:t>
-      </w:r>
-      <w:r>
-        <w:t xml:space="preserve"> </w:t>
-      </w:r>
-      <w:r>
-        <w:rPr>
-          <w:i/>
-          <w:iCs/>
-        </w:rPr>
-        <w:t xml:space="preserve">letter arithmetic</w:t>
-      </w:r>
-      <w:r>
-        <w:t xml:space="preserve"> </w:t>
-      </w:r>
-      <w:r>
-        <w:t xml:space="preserve">task introduced in the main text, DiffusionGemma did respond to modifications of the distributional state in the way we expected. While suggestive, it is unclear if the model also would make use of</w:t>
-      </w:r>
-      <w:r>
-        <w:t xml:space="preserve"> </w:t>
-      </w:r>
-      <m:oMath>
-        <m:sSup>
-          <m:e>
-            <m:r>
-              <m:rPr>
-                <m:sty m:val="b"/>
-              </m:rPr>
-              <m:t>s</m:t>
-            </m:r>
-          </m:e>
-          <m:sup>
-            <m:r>
-              <m:t>t</m:t>
-            </m:r>
-          </m:sup>
-        </m:sSup>
-      </m:oMath>
-      <w:r>
-        <w:t xml:space="preserve"> </w:t>
-      </w:r>
-      <w:r>
-        <w:rPr>
-          <w:i/>
-          <w:iCs/>
-        </w:rPr>
-        <w:t xml:space="preserve">autonomously</w:t>
-      </w:r>
-      <w:r>
-        <w:t xml:space="preserve">, i.e. without interventions.</w:t>
-      </w:r>
-    </w:p>
-    <w:p>
-      <w:pPr>
-        <w:pStyle w:val="BodyText"/>
-      </w:pPr>
-      <w:r>
-        <w:t xml:space="preserve">To investigate this, we searched for a non-trivial (i.e., not just a binary choice) task where DG will use a hypothesis subleading in its distribution. An instance we found is a</w:t>
-      </w:r>
-      <w:r>
-        <w:t xml:space="preserve"> </w:t>
-      </w:r>
-      <w:r>
-        <w:rPr>
-          <w:i/>
-          <w:iCs/>
-        </w:rPr>
-        <w:t xml:space="preserve">word-level palindrome</w:t>
-      </w:r>
-      <w:r>
-        <w:t xml:space="preserve"> </w:t>
-      </w:r>
-      <w:r>
-        <w:t xml:space="preserve">task. When asked</w:t>
-      </w:r>
-      <w:r>
-        <w:t xml:space="preserve"> </w:t>
-      </w:r>
-      <w:r>
-        <w:rPr>
-          <w:rStyle w:val="VerbatimChar"/>
-        </w:rPr>
-        <w:t xml:space="preserve">Please write a word-level palindrome</w:t>
-      </w:r>
-      <w:r>
-        <w:t xml:space="preserve">, DG maintains two competing completions of the same canvas: a literal</w:t>
-      </w:r>
-      <w:r>
-        <w:t xml:space="preserve"> </w:t>
-      </w:r>
-      <w:r>
-        <w:rPr>
-          <w:i/>
-          <w:iCs/>
-        </w:rPr>
-        <w:t xml:space="preserve">seasonal</w:t>
-      </w:r>
-      <w:r>
-        <w:t xml:space="preserve"> </w:t>
-      </w:r>
-      <w:r>
-        <w:t xml:space="preserve">phrase (</w:t>
-      </w:r>
-      <w:r>
-        <w:rPr>
-          <w:rStyle w:val="VerbatimChar"/>
-        </w:rPr>
-        <w:t xml:space="preserve">All leaves fall when leaves fall all.</w:t>
-      </w:r>
-      <w:r>
-        <w:t xml:space="preserve">) and the famous</w:t>
-      </w:r>
-      <w:r>
-        <w:t xml:space="preserve"> </w:t>
-      </w:r>
-      <w:r>
-        <w:rPr>
-          <w:i/>
-          <w:iCs/>
-        </w:rPr>
-        <w:t xml:space="preserve">idiom</w:t>
-      </w:r>
-      <w:r>
-        <w:t xml:space="preserve"> </w:t>
-      </w:r>
-      <w:r>
-        <w:t xml:space="preserve">(</w:t>
-      </w:r>
-      <w:r>
-        <w:rPr>
-          <w:rStyle w:val="VerbatimChar"/>
-        </w:rPr>
-        <w:t xml:space="preserve">All for one and one for all.</w:t>
-      </w:r>
-      <w:r>
-        <w:t xml:space="preserve">).</w:t>
-      </w:r>
-    </w:p>
-    <w:p>
-      <w:pPr>
-        <w:pStyle w:val="BodyText"/>
-      </w:pPr>
-      <w:r>
-        <w:t xml:space="preserve">The canvas will read the</w:t>
-      </w:r>
-      <w:r>
-        <w:t xml:space="preserve"> </w:t>
-      </w:r>
-      <w:r>
-        <w:rPr>
-          <w:i/>
-          <w:iCs/>
-        </w:rPr>
-        <w:t xml:space="preserve">seasonal</w:t>
-      </w:r>
-      <w:r>
-        <w:t xml:space="preserve"> </w:t>
-      </w:r>
-      <w:r>
-        <w:t xml:space="preserve">answer for the first few diffusion steps, after which it flips and stays at</w:t>
-      </w:r>
-      <w:r>
-        <w:t xml:space="preserve"> </w:t>
-      </w:r>
-      <w:r>
-        <w:rPr>
-          <w:i/>
-          <w:iCs/>
-        </w:rPr>
-        <w:t xml:space="preserve">idiom</w:t>
-      </w:r>
-      <w:r>
-        <w:t xml:space="preserve">. Interestingly, this is accompanied by</w:t>
-      </w:r>
-      <w:r>
-        <w:t xml:space="preserve"> </w:t>
-      </w:r>
-      <w:r>
-        <w:rPr>
-          <w:i/>
-          <w:iCs/>
-        </w:rPr>
-        <w:t xml:space="preserve">dynamics</w:t>
-      </w:r>
-      <w:r>
-        <w:t xml:space="preserve"> </w:t>
-      </w:r>
-      <w:r>
-        <w:t xml:space="preserve">in</w:t>
-      </w:r>
-      <w:r>
-        <w:t xml:space="preserve"> </w:t>
-      </w:r>
-      <m:oMath>
-        <m:sSup>
-          <m:e>
-            <m:r>
-              <m:rPr>
-                <m:sty m:val="b"/>
-              </m:rPr>
-              <m:t>s</m:t>
-            </m:r>
-          </m:e>
-          <m:sup>
-            <m:r>
-              <m:t>t</m:t>
-            </m:r>
-          </m:sup>
-        </m:sSup>
-      </m:oMath>
-      <w:r>
-        <w:t xml:space="preserve">:</w:t>
-      </w:r>
-      <w:r>
-        <w:t xml:space="preserve"> </w:t>
-      </w:r>
-      <w:r>
-        <w:rPr>
-          <w:i/>
-          <w:iCs/>
-        </w:rPr>
-        <w:t xml:space="preserve">idiom</w:t>
-      </w:r>
-      <w:r>
-        <w:t xml:space="preserve"> </w:t>
-      </w:r>
-      <w:r>
-        <w:t xml:space="preserve">will start at ~0, and progressively gain weight, replacing</w:t>
-      </w:r>
-      <w:r>
-        <w:t xml:space="preserve"> </w:t>
-      </w:r>
-      <w:r>
-        <w:rPr>
-          <w:i/>
-          <w:iCs/>
-        </w:rPr>
-        <w:t xml:space="preserve">seasonal</w:t>
-      </w:r>
-      <w:r>
-        <w:t xml:space="preserve">.</w:t>
-      </w:r>
-    </w:p>
-    <w:p>
-      <w:pPr>
-        <w:pStyle w:val="BodyText"/>
-      </w:pPr>
-      <w:r>
-        <w:t xml:space="preserve">We validated that the emergence of</w:t>
-      </w:r>
-      <w:r>
-        <w:t xml:space="preserve"> </w:t>
-      </w:r>
-      <w:r>
-        <w:rPr>
-          <w:i/>
-          <w:iCs/>
-        </w:rPr>
-        <w:t xml:space="preserve">idiom</w:t>
-      </w:r>
-      <w:r>
-        <w:t xml:space="preserve"> </w:t>
-      </w:r>
-      <w:r>
-        <w:t xml:space="preserve">is indeed causal: persistently ablating</w:t>
-      </w:r>
-      <w:r>
-        <w:t xml:space="preserve"> </w:t>
-      </w:r>
-      <w:r>
-        <w:rPr>
-          <w:i/>
-          <w:iCs/>
-        </w:rPr>
-        <w:t xml:space="preserve">idiom</w:t>
-      </w:r>
-      <w:r>
-        <w:t xml:space="preserve">’s</w:t>
-      </w:r>
-      <w:r>
-        <w:t xml:space="preserve"> </w:t>
-      </w:r>
-      <m:oMath>
-        <m:r>
-          <m:rPr>
-            <m:sty m:val="b"/>
-          </m:rPr>
-          <m:t>s</m:t>
-        </m:r>
-      </m:oMath>
-      <w:r>
-        <w:t xml:space="preserve">-mass from an early step onward prevents the takeover and preserves the seasonal draft. Concretely, at every step</w:t>
-      </w:r>
-      <w:r>
-        <w:t xml:space="preserve"> </w:t>
-      </w:r>
-      <m:oMath>
-        <m:r>
-          <m:t>t</m:t>
-        </m:r>
-        <m:r>
-          <m:rPr>
-            <m:sty m:val="p"/>
-          </m:rPr>
-          <m:t>≥</m:t>
-        </m:r>
-        <m:sSub>
-          <m:e>
-            <m:r>
-              <m:t>t</m:t>
-            </m:r>
-          </m:e>
-          <m:sub>
-            <m:r>
-              <m:rPr>
-                <m:sty m:val="p"/>
-              </m:rPr>
-              <m:t>a</m:t>
-            </m:r>
-            <m:r>
-              <m:rPr>
-                <m:sty m:val="p"/>
-              </m:rPr>
-              <m:t>b</m:t>
-            </m:r>
-            <m:r>
-              <m:rPr>
-                <m:sty m:val="p"/>
-              </m:rPr>
-              <m:t>l</m:t>
-            </m:r>
-          </m:sub>
-        </m:sSub>
-      </m:oMath>
-      <w:r>
-        <w:t xml:space="preserve"> </w:t>
-      </w:r>
-      <w:r>
-        <w:t xml:space="preserve">we zero the idiom tokens’ entries of</w:t>
-      </w:r>
-      <w:r>
-        <w:t xml:space="preserve"> </w:t>
-      </w:r>
-      <m:oMath>
-        <m:sSubSup>
-          <m:e>
-            <m:r>
-              <m:rPr>
-                <m:sty m:val="b"/>
-              </m:rPr>
-              <m:t>s</m:t>
-            </m:r>
-          </m:e>
-          <m:sub>
-            <m:r>
-              <m:t>i</m:t>
-            </m:r>
-          </m:sub>
-          <m:sup>
-            <m:r>
-              <m:t>t</m:t>
-            </m:r>
-          </m:sup>
-        </m:sSubSup>
-      </m:oMath>
-      <w:r>
-        <w:t xml:space="preserve"> </w:t>
-      </w:r>
-      <w:r>
-        <w:t xml:space="preserve">at the contested positions</w:t>
-      </w:r>
-      <w:r>
-        <w:t xml:space="preserve"> </w:t>
-      </w:r>
-      <m:oMath>
-        <m:r>
-          <m:t>i</m:t>
-        </m:r>
-      </m:oMath>
-      <w:r>
-        <w:t xml:space="preserve"> </w:t>
-      </w:r>
-      <w:r>
-        <w:t xml:space="preserve">(before sampling); the canvas</w:t>
-      </w:r>
-      <w:r>
-        <w:t xml:space="preserve"> </w:t>
-      </w:r>
-      <m:oMath>
-        <m:sSup>
-          <m:e>
-            <m:r>
-              <m:t>X</m:t>
-            </m:r>
-          </m:e>
-          <m:sup>
-            <m:r>
-              <m:t>t</m:t>
-            </m:r>
-          </m:sup>
-        </m:sSup>
-      </m:oMath>
-      <w:r>
-        <w:t xml:space="preserve"> </w:t>
-      </w:r>
-      <w:r>
-        <w:t xml:space="preserve">is never edited and every other position and token is left untouched. What is</w:t>
-      </w:r>
-      <w:r>
-        <w:t xml:space="preserve"> </w:t>
-      </w:r>
-      <w:r>
-        <w:rPr>
-          <w:i/>
-          <w:iCs/>
-        </w:rPr>
-        <w:t xml:space="preserve">preserved</w:t>
-      </w:r>
-      <w:r>
-        <w:t xml:space="preserve"> </w:t>
-      </w:r>
-      <w:r>
-        <w:t xml:space="preserve">is thus the model’s own seasonal completion — nothing is injected in its favor. Note however that later ablation onsets no longer rescue</w:t>
-      </w:r>
-      <w:r>
-        <w:t xml:space="preserve"> </w:t>
-      </w:r>
-      <w:r>
-        <w:rPr>
-          <w:i/>
-          <w:iCs/>
-        </w:rPr>
-        <w:t xml:space="preserve">seasonal</w:t>
-      </w:r>
-      <w:r>
-        <w:t xml:space="preserve"> </w:t>
-      </w:r>
-      <w:r>
-        <w:t xml:space="preserve">— the canvas instead collapses into a third, degenerate basin.</w:t>
-      </w:r>
-    </w:p>
-    <w:p>
-      <w:pPr>
-        <w:pStyle w:val="CaptionedFigure"/>
-      </w:pPr>
-      <w:r>
-        <w:drawing>
-          <wp:inline>
-            <wp:extent cx="5334000" cy="2956891"/>
-            <wp:effectExtent b="0" l="0" r="0" t="0"/>
-            <wp:docPr descr="Seasonal vs idiom: ablation" title="" id="79" name="Picture"/>
-            <a:graphic>
-              <a:graphicData uri="http://schemas.openxmlformats.org/drawingml/2006/picture">
-                <pic:pic>
-                  <pic:nvPicPr>
-                    <pic:cNvPr descr="figs/figA5_seasonal_ember_kill.png" id="80" name="Picture"/>
-                    <pic:cNvPicPr>
-                      <a:picLocks noChangeArrowheads="1" noChangeAspect="1"/>
-                    </pic:cNvPicPr>
-                  </pic:nvPicPr>
-                  <pic:blipFill>
-                    <a:blip r:embed="rId78"/>
+                    <a:blip r:embed="rId64"/>
                     <a:stretch>
                       <a:fillRect/>
                     </a:stretch>
@@ -6082,8 +5104,8 @@
         <w:t xml:space="preserve">channel. This has important consequences for monitorability which may not have been captured in Engels et al.’s analysis: a tool reading only the final diffusion output will miss transient output. A model may for instance choose to hide a specific fact in its chain-of-thought to a monitor, while having used it intermittently, though we did not find any instances of such behavior here.</w:t>
       </w:r>
     </w:p>
-    <w:bookmarkEnd w:id="81"/>
-    <w:bookmarkStart w:id="93" w:name="post-hoc-rationalization"/>
+    <w:bookmarkEnd w:id="67"/>
+    <w:bookmarkStart w:id="79" w:name="post-hoc-rationalization"/>
     <w:p>
       <w:pPr>
         <w:pStyle w:val="Heading3"/>
@@ -6099,7 +5121,7 @@
       <w:r>
         <w:t xml:space="preserve">An important question in monitorability (</w:t>
       </w:r>
-      <w:hyperlink r:id="rId82">
+      <w:hyperlink r:id="rId68">
         <w:r>
           <w:rPr>
             <w:rStyle w:val="Hyperlink"/>
@@ -6128,18 +5150,18 @@
           <wp:inline>
             <wp:extent cx="5334000" cy="1619249"/>
             <wp:effectExtent b="0" l="0" r="0" t="0"/>
-            <wp:docPr descr="Post-hoc correlations" title="" id="84" name="Picture"/>
+            <wp:docPr descr="Post-hoc correlations" title="" id="70" name="Picture"/>
             <a:graphic>
               <a:graphicData uri="http://schemas.openxmlformats.org/drawingml/2006/picture">
                 <pic:pic>
                   <pic:nvPicPr>
-                    <pic:cNvPr descr="figs/figA8_posthoc_correlations.png" id="85" name="Picture"/>
+                    <pic:cNvPr descr="figs/figA8_posthoc_correlations.png" id="71" name="Picture"/>
                     <pic:cNvPicPr>
                       <a:picLocks noChangeArrowheads="1" noChangeAspect="1"/>
                     </pic:cNvPicPr>
                   </pic:nvPicPr>
                   <pic:blipFill>
-                    <a:blip r:embed="rId83"/>
+                    <a:blip r:embed="rId69"/>
                     <a:stretch>
                       <a:fillRect/>
                     </a:stretch>
@@ -6428,18 +5450,18 @@
           <wp:inline>
             <wp:extent cx="5334000" cy="4036060"/>
             <wp:effectExtent b="0" l="0" r="0" t="0"/>
-            <wp:docPr descr="Post-hoc case study" title="" id="87" name="Picture"/>
+            <wp:docPr descr="Post-hoc case study" title="" id="73" name="Picture"/>
             <a:graphic>
               <a:graphicData uri="http://schemas.openxmlformats.org/drawingml/2006/picture">
                 <pic:pic>
                   <pic:nvPicPr>
-                    <pic:cNvPr descr="figs/figA8b_posthoc_case.png" id="88" name="Picture"/>
+                    <pic:cNvPr descr="figs/figA8b_posthoc_case.png" id="74" name="Picture"/>
                     <pic:cNvPicPr>
                       <a:picLocks noChangeArrowheads="1" noChangeAspect="1"/>
                     </pic:cNvPicPr>
                   </pic:nvPicPr>
                   <pic:blipFill>
-                    <a:blip r:embed="rId86"/>
+                    <a:blip r:embed="rId72"/>
                     <a:stretch>
                       <a:fillRect/>
                     </a:stretch>
@@ -6502,7 +5524,7 @@
         <w:t xml:space="preserve">Top row: normal rollout, model answer highlighted, with its commitment time. Bottom row: the susceptibility, measured like in the previous figure.</w:t>
       </w:r>
     </w:p>
-    <w:bookmarkStart w:id="92" w:name="Xabbf9ebb3c7fb0570cb1488d42cd03734ef9222"/>
+    <w:bookmarkStart w:id="78" w:name="Xabbf9ebb3c7fb0570cb1488d42cd03734ef9222"/>
     <w:p>
       <w:pPr>
         <w:pStyle w:val="Heading4"/>
@@ -6528,18 +5550,18 @@
           <wp:inline>
             <wp:extent cx="5334000" cy="2125265"/>
             <wp:effectExtent b="0" l="0" r="0" t="0"/>
-            <wp:docPr descr="Answer resolution" title="" id="90" name="Picture"/>
+            <wp:docPr descr="Answer resolution" title="" id="76" name="Picture"/>
             <a:graphic>
               <a:graphicData uri="http://schemas.openxmlformats.org/drawingml/2006/picture">
                 <pic:pic>
                   <pic:nvPicPr>
-                    <pic:cNvPr descr="figs/figA9_resolution.png" id="91" name="Picture"/>
+                    <pic:cNvPr descr="figs/figA9_resolution.png" id="77" name="Picture"/>
                     <pic:cNvPicPr>
                       <a:picLocks noChangeArrowheads="1" noChangeAspect="1"/>
                     </pic:cNvPicPr>
                   </pic:nvPicPr>
                   <pic:blipFill>
-                    <a:blip r:embed="rId89"/>
+                    <a:blip r:embed="rId75"/>
                     <a:stretch>
                       <a:fillRect/>
                     </a:stretch>
@@ -6665,9 +5687,9 @@
         <w:t xml:space="preserve"> </w:t>
       </w:r>
     </w:p>
-    <w:bookmarkEnd w:id="92"/>
-    <w:bookmarkEnd w:id="93"/>
-    <w:bookmarkStart w:id="97" w:name="Xd7c7dfb66314a32b0174c0001aa6561f67f2b90"/>
+    <w:bookmarkEnd w:id="78"/>
+    <w:bookmarkEnd w:id="79"/>
+    <w:bookmarkStart w:id="83" w:name="Xd7c7dfb66314a32b0174c0001aa6561f67f2b90"/>
     <w:p>
       <w:pPr>
         <w:pStyle w:val="Heading3"/>
@@ -6691,18 +5713,18 @@
           <wp:inline>
             <wp:extent cx="5334000" cy="1889125"/>
             <wp:effectExtent b="0" l="0" r="0" t="0"/>
-            <wp:docPr descr="Commitment causality" title="" id="95" name="Picture"/>
+            <wp:docPr descr="Commitment causality" title="" id="81" name="Picture"/>
             <a:graphic>
               <a:graphicData uri="http://schemas.openxmlformats.org/drawingml/2006/picture">
                 <pic:pic>
                   <pic:nvPicPr>
-                    <pic:cNvPr descr="figs/figA11_commit_causality.png" id="96" name="Picture"/>
+                    <pic:cNvPr descr="figs/figA11_commit_causality.png" id="82" name="Picture"/>
                     <pic:cNvPicPr>
                       <a:picLocks noChangeArrowheads="1" noChangeAspect="1"/>
                     </pic:cNvPicPr>
                   </pic:nvPicPr>
                   <pic:blipFill>
-                    <a:blip r:embed="rId94"/>
+                    <a:blip r:embed="rId80"/>
                     <a:stretch>
                       <a:fillRect/>
                     </a:stretch>
@@ -6914,9 +5936,9 @@
         <w:t xml:space="preserve">, which requires the model to reverse its reasoning order.</w:t>
       </w:r>
     </w:p>
-    <w:bookmarkEnd w:id="97"/>
-    <w:bookmarkEnd w:id="98"/>
-    <w:bookmarkEnd w:id="99"/>
+    <w:bookmarkEnd w:id="83"/>
+    <w:bookmarkEnd w:id="84"/>
+    <w:bookmarkEnd w:id="85"/>
     <w:sectPr>
       <w:footnotePr>
         <w:numRestart w:val="eachSect"/>

</xml_diff>

<commit_message>
merge Google-Docs editing pass (base = 45b8dce export, comments 08-03/04): ~20 wording edits ported; new figA16 J-lens step-accuracy block + acausal-tokens subsection prose from the docx; parallelism + seasonal-section edits not ported (superseded); GDocs source archived in src_data; fresh docx re-export
Co-Authored-By: Claude Fable 5 <noreply@anthropic.com>
</commit_message>
<xml_diff>
--- a/post.docx
+++ b/post.docx
@@ -2,7 +2,7 @@
 <file path=word/document.xml><?xml version="1.0" encoding="utf-8"?>
 <w:document xmlns:w="http://schemas.openxmlformats.org/wordprocessingml/2006/main" xmlns:m="http://schemas.openxmlformats.org/officeDocument/2006/math" xmlns:r="http://schemas.openxmlformats.org/officeDocument/2006/relationships" xmlns:o="urn:schemas-microsoft-com:office:office" xmlns:v="urn:schemas-microsoft-com:vml" xmlns:w10="urn:schemas-microsoft-com:office:word" xmlns:a="http://schemas.openxmlformats.org/drawingml/2006/main" xmlns:pic="http://schemas.openxmlformats.org/drawingml/2006/picture" xmlns:wp="http://schemas.openxmlformats.org/drawingml/2006/wordprocessingDrawing">
   <w:body>
-    <w:bookmarkStart w:id="85" w:name="Xf5e660dc2e9c1a368125465a5756c31f66c44e2"/>
+    <w:bookmarkStart w:id="89" w:name="Xf5e660dc2e9c1a368125465a5756c31f66c44e2"/>
     <w:p>
       <w:pPr>
         <w:pStyle w:val="Heading1"/>
@@ -46,7 +46,15 @@
         <w:t xml:space="preserve"> </w:t>
       </w:r>
       <w:r>
-        <w:t xml:space="preserve">Overall, this underlines the paper’s conclusion that DiffusionGemma remains highly monitorable, while nevertheless showing that there are cases where models can learn to use vector-valued information.</w:t>
+        <w:t xml:space="preserve">Overall, this supports the paper’s conclusion that DiffusionGemma remains highly monitorable, while nevertheless showing that there are cases where models can learn to use vector-valued information.</w:t>
+      </w:r>
+    </w:p>
+    <w:p>
+      <w:pPr>
+        <w:pStyle w:val="BodyText"/>
+      </w:pPr>
+      <w:r>
+        <w:t xml:space="preserve">Github: …</w:t>
       </w:r>
     </w:p>
     <w:bookmarkEnd w:id="20"/>
@@ -492,16 +500,88 @@
         <w:t xml:space="preserve"> </w:t>
       </w:r>
       <w:r>
-        <w:t xml:space="preserve">is the number of diffusion steps. Importantly,</w:t>
-      </w:r>
-      <w:r>
-        <w:t xml:space="preserve"> </w:t>
-      </w:r>
-      <m:oMath>
+        <w:t xml:space="preserve">is the number of diffusion steps. Here,</w:t>
+      </w:r>
+      <w:r>
+        <w:t xml:space="preserve"> </w:t>
+      </w:r>
+      <m:oMath>
+        <m:sSub>
+          <m:e>
+            <m:d>
+              <m:dPr>
+                <m:begChr m:val="("/>
+                <m:sepChr m:val=""/>
+                <m:endChr m:val=")"/>
+                <m:grow/>
+              </m:dPr>
+              <m:e>
+                <m:sSubSup>
+                  <m:e>
+                    <m:r>
+                      <m:rPr>
+                        <m:sty m:val="b"/>
+                      </m:rPr>
+                      <m:t>s</m:t>
+                    </m:r>
+                  </m:e>
+                  <m:sub>
+                    <m:r>
+                      <m:t>i</m:t>
+                    </m:r>
+                  </m:sub>
+                  <m:sup>
+                    <m:r>
+                      <m:t>t</m:t>
+                    </m:r>
+                  </m:sup>
+                </m:sSubSup>
+              </m:e>
+            </m:d>
+          </m:e>
+          <m:sub>
+            <m:r>
+              <m:t>i</m:t>
+            </m:r>
+            <m:r>
+              <m:rPr>
+                <m:sty m:val="p"/>
+              </m:rPr>
+              <m:t>=</m:t>
+            </m:r>
+            <m:r>
+              <m:t>1</m:t>
+            </m:r>
+            <m:r>
+              <m:rPr>
+                <m:sty m:val="p"/>
+              </m:rPr>
+              <m:t>.</m:t>
+            </m:r>
+            <m:r>
+              <m:rPr>
+                <m:sty m:val="p"/>
+              </m:rPr>
+              <m:t>.</m:t>
+            </m:r>
+            <m:r>
+              <m:t>C</m:t>
+            </m:r>
+          </m:sub>
+        </m:sSub>
+        <m:r>
+          <m:rPr>
+            <m:sty m:val="p"/>
+          </m:rPr>
+          <m:t>=</m:t>
+        </m:r>
         <m:sSup>
           <m:e>
             <m:r>
-              <m:t>X</m:t>
+              <m:rPr>
+                <m:sty m:val="b"/>
+              </m:rPr>
+              <m:t>S</m:t>
             </m:r>
           </m:e>
           <m:sup>
@@ -510,12 +590,80 @@
             </m:r>
           </m:sup>
         </m:sSup>
-      </m:oMath>
-      <w:r>
-        <w:t xml:space="preserve"> </w:t>
-      </w:r>
-      <w:r>
-        <w:t xml:space="preserve">attends bidirectionally to itself, and causally to</w:t>
+        <m:r>
+          <m:rPr>
+            <m:sty m:val="p"/>
+          </m:rPr>
+          <m:t>∈</m:t>
+        </m:r>
+        <m:sSup>
+          <m:e>
+            <m:r>
+              <m:rPr>
+                <m:sty m:val="p"/>
+                <m:scr m:val="double-struck"/>
+              </m:rPr>
+              <m:t>R</m:t>
+            </m:r>
+          </m:e>
+          <m:sup>
+            <m:r>
+              <m:t>C</m:t>
+            </m:r>
+            <m:r>
+              <m:rPr>
+                <m:sty m:val="p"/>
+              </m:rPr>
+              <m:t>×</m:t>
+            </m:r>
+            <m:d>
+              <m:dPr>
+                <m:begChr m:val="|"/>
+                <m:sepChr m:val=""/>
+                <m:endChr m:val="|"/>
+                <m:grow/>
+              </m:dPr>
+              <m:e>
+                <m:r>
+                  <m:rPr>
+                    <m:sty m:val="p"/>
+                    <m:scr m:val="script"/>
+                  </m:rPr>
+                  <m:t>V</m:t>
+                </m:r>
+              </m:e>
+            </m:d>
+          </m:sup>
+        </m:sSup>
+      </m:oMath>
+      <w:r>
+        <w:t xml:space="preserve"> </w:t>
+      </w:r>
+      <w:r>
+        <w:t xml:space="preserve">represents the distribution passed between diffusion steps. Importantly,</w:t>
+      </w:r>
+      <w:r>
+        <w:t xml:space="preserve"> </w:t>
+      </w:r>
+      <m:oMath>
+        <m:sSup>
+          <m:e>
+            <m:r>
+              <m:t>X</m:t>
+            </m:r>
+          </m:e>
+          <m:sup>
+            <m:r>
+              <m:t>t</m:t>
+            </m:r>
+          </m:sup>
+        </m:sSup>
+      </m:oMath>
+      <w:r>
+        <w:t xml:space="preserve"> </w:t>
+      </w:r>
+      <w:r>
+        <w:t xml:space="preserve">attends bidirectionally to itself, and to</w:t>
       </w:r>
       <w:r>
         <w:t xml:space="preserve"> </w:t>
@@ -897,7 +1045,7 @@
         <w:t xml:space="preserve"> </w:t>
       </w:r>
       <w:r>
-        <w:t xml:space="preserve">to just its top-k entries, performance of DG significantly dropped. Thus somehow the information in</w:t>
+        <w:t xml:space="preserve">to just its top-k entries, performance significantly dropped. Thus somehow the information in</w:t>
       </w:r>
       <w:r>
         <w:t xml:space="preserve"> </w:t>
@@ -923,7 +1071,7 @@
         <w:t xml:space="preserve"> </w:t>
       </w:r>
       <w:r>
-        <w:t xml:space="preserve">seemed to have been essential to DiffusionGemma, conflicting the results of high monitorability.</w:t>
+        <w:t xml:space="preserve">seemed to have been essential, conflicting the results of high monitorability.</w:t>
       </w:r>
     </w:p>
     <w:p>
@@ -1004,6 +1152,8 @@
       </w:pPr>
       <w:r>
         <w:rPr>
+          <w:b/>
+          <w:bCs/>
           <w:i/>
           <w:iCs/>
         </w:rPr>
@@ -1011,6 +1161,8 @@
       </w:r>
       <w:r>
         <w:rPr>
+          <w:b/>
+          <w:bCs/>
           <w:i/>
           <w:iCs/>
         </w:rPr>
@@ -1035,13 +1187,17 @@
       </m:oMath>
       <w:r>
         <w:rPr>
-          <w:i/>
-          <w:iCs/>
-        </w:rPr>
-        <w:t xml:space="preserve"> </w:t>
-      </w:r>
-      <w:r>
-        <w:rPr>
+          <w:b/>
+          <w:bCs/>
+          <w:i/>
+          <w:iCs/>
+        </w:rPr>
+        <w:t xml:space="preserve"> </w:t>
+      </w:r>
+      <w:r>
+        <w:rPr>
+          <w:b/>
+          <w:bCs/>
           <w:i/>
           <w:iCs/>
         </w:rPr>
@@ -1049,6 +1205,8 @@
       </w:r>
       <w:r>
         <w:rPr>
+          <w:b/>
+          <w:bCs/>
           <w:i/>
           <w:iCs/>
         </w:rPr>
@@ -1058,6 +1216,8 @@
         <w:r>
           <w:rPr>
             <w:rStyle w:val="Hyperlink"/>
+            <w:b/>
+            <w:bCs/>
             <w:i/>
             <w:iCs/>
           </w:rPr>
@@ -1065,7 +1225,27 @@
         </w:r>
       </w:hyperlink>
       <w:r>
+        <w:rPr>
+          <w:b/>
+          <w:bCs/>
+          <w:i/>
+          <w:iCs/>
+        </w:rPr>
         <w:t xml:space="preserve">.</w:t>
+      </w:r>
+      <w:r>
+        <w:rPr>
+          <w:i/>
+          <w:iCs/>
+        </w:rPr>
+        <w:t xml:space="preserve"> </w:t>
+      </w:r>
+      <w:r>
+        <w:rPr>
+          <w:i/>
+          <w:iCs/>
+        </w:rPr>
+        <w:t xml:space="preserve">Specifically, we use more diffusion steps, a wider temperature range, and a lower entropy bound.</w:t>
       </w:r>
     </w:p>
     <w:bookmarkEnd w:id="28"/>
@@ -1178,7 +1358,7 @@
         <w:rPr>
           <w:rStyle w:val="VerbatimChar"/>
         </w:rPr>
-        <w:t xml:space="preserve">Today the weather is _</w:t>
+        <w:t xml:space="preserve">Tomorrow the weather will be _</w:t>
       </w:r>
       <w:r>
         <w:t xml:space="preserve">, with</w:t>
@@ -1193,9 +1373,15 @@
         <w:t xml:space="preserve">rainy</w:t>
       </w:r>
       <w:r>
+        <w:t xml:space="preserve"> </w:t>
+      </w:r>
+      <w:r>
         <w:t xml:space="preserve">and</w:t>
       </w:r>
       <w:r>
+        <w:t xml:space="preserve"> </w:t>
+      </w:r>
+      <w:r>
         <w:rPr>
           <w:rStyle w:val="VerbatimChar"/>
         </w:rPr>
@@ -1225,7 +1411,7 @@
         <w:pStyle w:val="BodyText"/>
       </w:pPr>
       <w:r>
-        <w:t xml:space="preserve">We therefore looked for a task that requires DG to make an unspecified choice, and to do a compution on that choice. Specifically, we consider</w:t>
+        <w:t xml:space="preserve">We therefore looked for a task that requires DG to make an unspecified choice, and to do a computation on that choice. Specifically, we consider</w:t>
       </w:r>
       <w:r>
         <w:t xml:space="preserve"> </w:t>
@@ -2039,10 +2225,12 @@
       </w:pPr>
       <w:r>
         <w:rPr>
-          <w:i/>
-          <w:iCs/>
-        </w:rPr>
-        <w:t xml:space="preserve">Perturbing subleading tokens triggers a response at corresponding target tokens.</w:t>
+          <w:b/>
+          <w:bCs/>
+          <w:i/>
+          <w:iCs/>
+        </w:rPr>
+        <w:t xml:space="preserve">Perturbing subleading tokens predominantly triggers a response at corresponding target tokens.</w:t>
       </w:r>
     </w:p>
     <w:p>
@@ -2114,10 +2302,26 @@
       </w:pPr>
       <w:r>
         <w:rPr>
-          <w:i/>
-          <w:iCs/>
-        </w:rPr>
-        <w:t xml:space="preserve">Example of one intervention: a subleading injection on</w:t>
+          <w:b/>
+          <w:bCs/>
+          <w:i/>
+          <w:iCs/>
+        </w:rPr>
+        <w:t xml:space="preserve">Example of one intervention.</w:t>
+      </w:r>
+      <w:r>
+        <w:rPr>
+          <w:i/>
+          <w:iCs/>
+        </w:rPr>
+        <w:t xml:space="preserve"> </w:t>
+      </w:r>
+      <w:r>
+        <w:rPr>
+          <w:i/>
+          <w:iCs/>
+        </w:rPr>
+        <w:t xml:space="preserve">A subleading injection on</w:t>
       </w:r>
       <w:r>
         <w:rPr>
@@ -2139,6 +2343,13 @@
           <w:i/>
           <w:iCs/>
         </w:rPr>
+        <w:t xml:space="preserve"> </w:t>
+      </w:r>
+      <w:r>
+        <w:rPr>
+          <w:i/>
+          <w:iCs/>
+        </w:rPr>
         <w:t xml:space="preserve">(the leader</w:t>
       </w:r>
       <w:r>
@@ -2168,7 +2379,7 @@
           <w:i/>
           <w:iCs/>
         </w:rPr>
-        <w:t xml:space="preserve">keeps rank 1) swings the answer slot from</w:t>
+        <w:t xml:space="preserve">keeps rank 1) switches the answer slot from</w:t>
       </w:r>
       <w:r>
         <w:rPr>
@@ -2198,6 +2409,13 @@
           <w:iCs/>
         </w:rPr>
         <w:t xml:space="preserve">to</w:t>
+      </w:r>
+      <w:r>
+        <w:rPr>
+          <w:i/>
+          <w:iCs/>
+        </w:rPr>
+        <w:t xml:space="preserve"> </w:t>
       </w:r>
       <w:r>
         <w:rPr>
@@ -2317,7 +2535,7 @@
         <w:t xml:space="preserve"> </w:t>
       </w:r>
       <w:r>
-        <w:t xml:space="preserve">being used in typical reasoning-focussed task. However, for some tasks, we found that the model can make</w:t>
+        <w:t xml:space="preserve">being used in typical reasoning-focused task. However, for some tasks, we found that the model can make</w:t>
       </w:r>
       <w:r>
         <w:t xml:space="preserve"> </w:t>
@@ -2437,11 +2655,11 @@
         <w:t xml:space="preserve"> </w:t>
       </w:r>
       <w:r>
-        <w:t xml:space="preserve">latent reasoning is somewhat hard to learn. However, there already exist models like CODI that pass a vector-valued state that is not clearly a superposition of tokens, though they so far don’t show superior performance. We believe that finding methods to better interpret such models is an important area of reasearch.</w:t>
+        <w:t xml:space="preserve">latent reasoning is somewhat hard to learn. However, there already exist models like CODI that pass a vector-valued state that is not clearly a superposition of tokens, though they so far don’t show superior performance. We believe that finding methods to better interpret such models is an important area of research.</w:t>
       </w:r>
     </w:p>
     <w:bookmarkEnd w:id="36"/>
-    <w:bookmarkStart w:id="84" w:name="appendix"/>
+    <w:bookmarkStart w:id="88" w:name="appendix"/>
     <w:p>
       <w:pPr>
         <w:pStyle w:val="Heading2"/>
@@ -2475,7 +2693,7 @@
         <w:t xml:space="preserve">and in this post have focused on DiffusionGemma’s behavior. We here study whether the model’s representation supports the behavioral finding of high monitorability.</w:t>
       </w:r>
     </w:p>
-    <w:bookmarkStart w:id="40" w:name="representation-similarity"/>
+    <w:bookmarkStart w:id="41" w:name="representation-similarity"/>
     <w:p>
       <w:pPr>
         <w:pStyle w:val="Heading3"/>
@@ -2489,7 +2707,15 @@
         <w:pStyle w:val="FirstParagraph"/>
       </w:pPr>
       <w:r>
-        <w:t xml:space="preserve">We first ask about how the representation changes between Gemma and DiffusionGemma. A simple way is to just measure overlap between pairs of inputs, where each element of the pair is fed through Gemma or DiffusionGemma, respectively. We here compare a simple cosine similarity, and centered kernel analysis (CKA).</w:t>
+        <w:t xml:space="preserve">We first ask about how the representation changes between Gemma and DiffusionGemma, and then will ask about functional implications.</w:t>
+      </w:r>
+    </w:p>
+    <w:p>
+      <w:pPr>
+        <w:pStyle w:val="BodyText"/>
+      </w:pPr>
+      <w:r>
+        <w:t xml:space="preserve">A simple way is to just measure overlap between pairs of inputs, where each element of the pair is fed through Gemma or DiffusionGemma, respectively. We here compare a simple cosine similarity, and centered kernel analysis (CKA, a measure that is invariant to global rotations of the representation).</w:t>
       </w:r>
     </w:p>
     <w:p>
@@ -2553,11 +2779,44 @@
       </w:pPr>
       <w:r>
         <w:rPr>
+          <w:b/>
+          <w:bCs/>
           <w:i/>
           <w:iCs/>
         </w:rPr>
         <w:t xml:space="preserve">Representational similarity falls with layers, and is significantly driven by bare model difference and bidirectional attention.</w:t>
       </w:r>
+      <w:r>
+        <w:rPr>
+          <w:i/>
+          <w:iCs/>
+        </w:rPr>
+        <w:t xml:space="preserve"> </w:t>
+      </w:r>
+      <w:r>
+        <w:rPr>
+          <w:i/>
+          <w:iCs/>
+        </w:rPr>
+        <w:t xml:space="preserve">Inputs are concepts from (</w:t>
+      </w:r>
+      <w:hyperlink r:id="rId40">
+        <w:r>
+          <w:rPr>
+            <w:rStyle w:val="Hyperlink"/>
+            <w:i/>
+            <w:iCs/>
+          </w:rPr>
+          <w:t xml:space="preserve">Kantamneni et al., 2025</w:t>
+        </w:r>
+      </w:hyperlink>
+      <w:r>
+        <w:rPr>
+          <w:i/>
+          <w:iCs/>
+        </w:rPr>
+        <w:t xml:space="preserve">).</w:t>
+      </w:r>
     </w:p>
     <w:p>
       <w:pPr>
@@ -2567,7 +2826,7 @@
         <w:t xml:space="preserve">A priori, this rather large drop suggests a significant change in how the representation is organized, which we then went on to test more specifically.</w:t>
       </w:r>
     </w:p>
-    <w:bookmarkEnd w:id="40"/>
+    <w:bookmarkEnd w:id="41"/>
     <w:bookmarkStart w:id="46" w:name="probe-retention"/>
     <w:p>
       <w:pPr>
@@ -2582,9 +2841,9 @@
         <w:pStyle w:val="FirstParagraph"/>
       </w:pPr>
       <w:r>
-        <w:t xml:space="preserve">Probing allows to study how well a model separates concepts. We use 56 binary concept datasets from the SAE-Probes benchmark (</w:t>
-      </w:r>
-      <w:hyperlink r:id="rId41">
+        <w:t xml:space="preserve">Probing allows us to study how well a model separates concepts. We use 56 binary concept datasets from the SAE-Probes benchmark (</w:t>
+      </w:r>
+      <w:hyperlink r:id="rId40">
         <w:r>
           <w:rPr>
             <w:rStyle w:val="Hyperlink"/>
@@ -2593,7 +2852,7 @@
         </w:r>
       </w:hyperlink>
       <w:r>
-        <w:t xml:space="preserve">) and train logistic-regression probes on gemma-4’s residual stream (up to 1024 training examples per concept; 43/56 at the full budget, minimum 512), optimizing the layer via heldout AUC. We then test this probe on DG.</w:t>
+        <w:t xml:space="preserve">) and train logistic-regression probes on gemma-4’s residual stream (up to 1024 training examples per concept; 43/56 at the full budget, minimum 512; 256 held-out), optimizing the layer via heldout AUC. We then test this probe on DG.</w:t>
       </w:r>
     </w:p>
     <w:p>
@@ -2676,7 +2935,7 @@
           <w:i/>
           <w:iCs/>
         </w:rPr>
-        <w:t xml:space="preserve">Top: mean held-out AUC over the 56 concepts, probe source (trained on) × target (applied to). DG is split by attention mode (last-position read everywhere). Bottom: a held-out positive and negative test text for one concept (clickbait): the same gemma-trained probe scores gemma-4 and DG activations near-identically. Ticks: &lt;read model&gt; · &lt;attention mode&gt; · &lt;read position&gt; — G = gemma-4, DG = DiffusionGemma,</w:t>
+        <w:t xml:space="preserve">Top: mean held-out AUC over the 56 concepts, probe source (trained on) × target (applied to). DG is split by attention mode (last-position read everywhere). Bottom: a held-out positive and negative test text for one concept (clickbait): On this instance, the same gemma-trained probe scores gemma-4 and DG activations near-identically. Ticks: &lt;read model&gt; · &lt;attention mode&gt; · &lt;read position&gt;. G = gemma-4, DG = DiffusionGemma,</w:t>
       </w:r>
       <w:r>
         <w:rPr>
@@ -3176,7 +3435,7 @@
         </m:acc>
       </m:oMath>
       <w:r>
-        <w:t xml:space="preserve">. A blinded judge sees the two generations in random order and must identify the</w:t>
+        <w:t xml:space="preserve">. A blinded judge sees the two generations in random order and needs to make a forced choice to select the</w:t>
       </w:r>
       <w:r>
         <w:t xml:space="preserve"> </w:t>
@@ -3305,7 +3564,7 @@
       </w:r>
     </w:p>
     <w:bookmarkEnd w:id="51"/>
-    <w:bookmarkStart w:id="59" w:name="j-lens-retention"/>
+    <w:bookmarkStart w:id="63" w:name="j-lens-retention"/>
     <w:p>
       <w:pPr>
         <w:pStyle w:val="Heading3"/>
@@ -3362,7 +3621,7 @@
         <w:t xml:space="preserve"> </w:t>
       </w:r>
       <w:r>
-        <w:t xml:space="preserve">is disposed to make the model say: it linearly transports</w:t>
+        <w:t xml:space="preserve">would make the model say: It linearly transports</w:t>
       </w:r>
       <w:r>
         <w:t xml:space="preserve"> </w:t>
@@ -3725,7 +3984,7 @@
           <w:i/>
           <w:iCs/>
         </w:rPr>
-        <w:t xml:space="preserve">). Bottom: An example poetry eval task, where the models surface the rhyme already one line in advance. Ticks show the fitted Jacobian estimator:</w:t>
+        <w:t xml:space="preserve">). Bottom: An example poetry eval task, where the models surface the rhyme already one line in advance. Ticks show the computed Jacobian:</w:t>
       </w:r>
       <w:r>
         <w:rPr>
@@ -3913,7 +4172,7 @@
           <w:i/>
           <w:iCs/>
         </w:rPr>
-        <w:t xml:space="preserve">; the causal fits average over causal targets</w:t>
+        <w:t xml:space="preserve">. The causal fits average over causal targets</w:t>
       </w:r>
       <w:r>
         <w:rPr>
@@ -3960,7 +4219,7 @@
           <w:i/>
           <w:iCs/>
         </w:rPr>
-        <w:t xml:space="preserve">, and the expectation is taken over samples</w:t>
+        <w:t xml:space="preserve">. The expectation is taken over samples</w:t>
       </w:r>
       <w:r>
         <w:rPr>
@@ -3994,23 +4253,7 @@
         <w:pStyle w:val="BodyText"/>
       </w:pPr>
       <w:r>
-        <w:t xml:space="preserve">[stub:] Beyond retention, the bidirectional stream also carries information about</w:t>
-      </w:r>
-      <w:r>
-        <w:t xml:space="preserve"> </w:t>
-      </w:r>
-      <w:r>
-        <w:rPr>
-          <w:i/>
-          <w:iCs/>
-        </w:rPr>
-        <w:t xml:space="preserve">future</w:t>
-      </w:r>
-      <w:r>
-        <w:t xml:space="preserve"> </w:t>
-      </w:r>
-      <w:r>
-        <w:t xml:space="preserve">positions: on an arithmetic prompt, the lens read at an earlier canvas position already decodes the operation that only appears two tokens later.</w:t>
+        <w:t xml:space="preserve">We then briefly investigated whether the diffusion step where J-lens is applied affects accuracy:</w:t>
       </w:r>
     </w:p>
     <w:p>
@@ -4020,20 +4263,227 @@
       <w:r>
         <w:drawing>
           <wp:inline>
-            <wp:extent cx="5334000" cy="1197186"/>
+            <wp:extent cx="5334000" cy="3852702"/>
             <wp:effectExtent b="0" l="0" r="0" t="0"/>
-            <wp:docPr descr="J-Lens future operation" title="" id="57" name="Picture"/>
+            <wp:docPr descr="J-Lens step accuracy" title="" id="57" name="Picture"/>
             <a:graphic>
               <a:graphicData uri="http://schemas.openxmlformats.org/drawingml/2006/picture">
                 <pic:pic>
                   <pic:nvPicPr>
-                    <pic:cNvPr descr="figs/figA6_jlens_future.png" id="58" name="Picture"/>
+                    <pic:cNvPr descr="figs/figA16_jlens_step_accuracy.png" id="58" name="Picture"/>
                     <pic:cNvPicPr>
                       <a:picLocks noChangeArrowheads="1" noChangeAspect="1"/>
                     </pic:cNvPicPr>
                   </pic:nvPicPr>
                   <pic:blipFill>
                     <a:blip r:embed="rId56"/>
+                    <a:stretch>
+                      <a:fillRect/>
+                    </a:stretch>
+                  </pic:blipFill>
+                  <pic:spPr bwMode="auto">
+                    <a:xfrm>
+                      <a:off x="0" y="0"/>
+                      <a:ext cx="5334000" cy="3852702"/>
+                    </a:xfrm>
+                    <a:prstGeom prst="rect">
+                      <a:avLst/>
+                    </a:prstGeom>
+                    <a:noFill/>
+                    <a:ln w="9525">
+                      <a:noFill/>
+                      <a:headEnd/>
+                      <a:tailEnd/>
+                    </a:ln>
+                  </pic:spPr>
+                </pic:pic>
+              </a:graphicData>
+            </a:graphic>
+          </wp:inline>
+        </w:drawing>
+      </w:r>
+    </w:p>
+    <w:p>
+      <w:pPr>
+        <w:pStyle w:val="ImageCaption"/>
+      </w:pPr>
+      <w:r>
+        <w:t xml:space="preserve">J-Lens step accuracy</w:t>
+      </w:r>
+    </w:p>
+    <w:p>
+      <w:pPr>
+        <w:pStyle w:val="BodyText"/>
+      </w:pPr>
+      <w:r>
+        <w:rPr>
+          <w:b/>
+          <w:bCs/>
+          <w:i/>
+          <w:iCs/>
+        </w:rPr>
+        <w:t xml:space="preserve">Accuracy of J-lens outputs as a function of source and target diffusion step.</w:t>
+      </w:r>
+      <w:r>
+        <w:rPr>
+          <w:i/>
+          <w:iCs/>
+        </w:rPr>
+        <w:t xml:space="preserve"> </w:t>
+      </w:r>
+      <w:r>
+        <w:rPr>
+          <w:i/>
+          <w:iCs/>
+        </w:rPr>
+        <w:t xml:space="preserve">We consider J-lens on the canvas region resulting from diffusion on a prompt, fitted at diffusion step</w:t>
+      </w:r>
+      <w:r>
+        <w:rPr>
+          <w:i/>
+          <w:iCs/>
+        </w:rPr>
+        <w:t xml:space="preserve"> </w:t>
+      </w:r>
+      <m:oMath>
+        <m:r>
+          <m:t>t</m:t>
+        </m:r>
+      </m:oMath>
+      <w:r>
+        <w:rPr>
+          <w:i/>
+          <w:iCs/>
+        </w:rPr>
+        <w:t xml:space="preserve"> </w:t>
+      </w:r>
+      <w:r>
+        <w:rPr>
+          <w:i/>
+          <w:iCs/>
+        </w:rPr>
+        <w:t xml:space="preserve">and tested at step</w:t>
+      </w:r>
+      <w:r>
+        <w:rPr>
+          <w:i/>
+          <w:iCs/>
+        </w:rPr>
+        <w:t xml:space="preserve"> </w:t>
+      </w:r>
+      <m:oMath>
+        <m:r>
+          <m:t>t</m:t>
+        </m:r>
+        <m:r>
+          <m:rPr>
+            <m:sty m:val="p"/>
+          </m:rPr>
+          <m:t>′</m:t>
+        </m:r>
+      </m:oMath>
+      <w:r>
+        <w:rPr>
+          <w:i/>
+          <w:iCs/>
+        </w:rPr>
+        <w:t xml:space="preserve">. This is in contrast to the token-forcing in the previous investigation.</w:t>
+      </w:r>
+    </w:p>
+    <w:p>
+      <w:pPr>
+        <w:pStyle w:val="BodyText"/>
+      </w:pPr>
+      <w:r>
+        <w:t xml:space="preserve">The model is prompted with</w:t>
+      </w:r>
+      <w:r>
+        <w:t xml:space="preserve"> </w:t>
+      </w:r>
+      <w:r>
+        <w:rPr>
+          <w:rStyle w:val="VerbatimChar"/>
+        </w:rPr>
+        <w:t xml:space="preserve">Continue the scene below in exactly two sentences of 12 to 20 words each. Use only concrete actions, dialogue, and sensory details. Do not explain, summarize, diagnose, classify, identify, or name any underlying emotion, situation, theme, person, genre, or concept. Scene: &lt;beginning of a story&gt; Continuation:</w:t>
+      </w:r>
+    </w:p>
+    <w:p>
+      <w:pPr>
+        <w:pStyle w:val="BodyText"/>
+      </w:pPr>
+      <w:r>
+        <w:t xml:space="preserve">We then fit J-lens at every diffusion step</w:t>
+      </w:r>
+      <w:r>
+        <w:t xml:space="preserve"> </w:t>
+      </w:r>
+      <m:oMath>
+        <m:r>
+          <m:t>t</m:t>
+        </m:r>
+      </m:oMath>
+      <w:r>
+        <w:t xml:space="preserve">, and on a set of heldout prompts measure at each application step</w:t>
+      </w:r>
+      <w:r>
+        <w:t xml:space="preserve"> </w:t>
+      </w:r>
+      <m:oMath>
+        <m:r>
+          <m:t>t</m:t>
+        </m:r>
+        <m:r>
+          <m:rPr>
+            <m:sty m:val="p"/>
+          </m:rPr>
+          <m:t>′</m:t>
+        </m:r>
+      </m:oMath>
+      <w:r>
+        <w:t xml:space="preserve"> </w:t>
+      </w:r>
+      <w:r>
+        <w:t xml:space="preserve">[TODO use better score] how many of the top-20 tokens surfaced by J-lens are plausible in context, but not lexically related to the canvas at any diffusion step.</w:t>
+      </w:r>
+    </w:p>
+    <w:bookmarkStart w:id="62" w:name="X9b7ff029db2884a5e97d7b865768ea997429a17"/>
+    <w:p>
+      <w:pPr>
+        <w:pStyle w:val="Heading4"/>
+      </w:pPr>
+      <w:r>
+        <w:t xml:space="preserve">DiffusionGemma represents tokens acausally</w:t>
+      </w:r>
+    </w:p>
+    <w:p>
+      <w:pPr>
+        <w:pStyle w:val="FirstParagraph"/>
+      </w:pPr>
+      <w:r>
+        <w:t xml:space="preserve">Since DiffusionGemma uses bidirectional attention, it is interesting to ask whether J-space percepts will also be distributed in a non-causal way. In particular, do they occur before the token that triggers them? Indeed, we found such instances on some problems:</w:t>
+      </w:r>
+    </w:p>
+    <w:p>
+      <w:pPr>
+        <w:pStyle w:val="CaptionedFigure"/>
+      </w:pPr>
+      <w:r>
+        <w:drawing>
+          <wp:inline>
+            <wp:extent cx="5334000" cy="1197186"/>
+            <wp:effectExtent b="0" l="0" r="0" t="0"/>
+            <wp:docPr descr="J-Lens future operation" title="" id="60" name="Picture"/>
+            <a:graphic>
+              <a:graphicData uri="http://schemas.openxmlformats.org/drawingml/2006/picture">
+                <pic:pic>
+                  <pic:nvPicPr>
+                    <pic:cNvPr descr="figs/figA6_jlens_future.png" id="61" name="Picture"/>
+                    <pic:cNvPicPr>
+                      <a:picLocks noChangeArrowheads="1" noChangeAspect="1"/>
+                    </pic:cNvPicPr>
+                  </pic:nvPicPr>
+                  <pic:blipFill>
+                    <a:blip r:embed="rId59"/>
                     <a:stretch>
                       <a:fillRect/>
                     </a:stretch>
@@ -4198,8 +4648,9 @@
         <w:t xml:space="preserve">remains highly ranked in the addition variant.</w:t>
       </w:r>
     </w:p>
-    <w:bookmarkEnd w:id="59"/>
-    <w:bookmarkStart w:id="63" w:name="letter-arithmetic"/>
+    <w:bookmarkEnd w:id="62"/>
+    <w:bookmarkEnd w:id="63"/>
+    <w:bookmarkStart w:id="67" w:name="letter-arithmetic"/>
     <w:p>
       <w:pPr>
         <w:pStyle w:val="Heading3"/>
@@ -4326,18 +4777,18 @@
           <wp:inline>
             <wp:extent cx="5334000" cy="4000500"/>
             <wp:effectExtent b="0" l="0" r="0" t="0"/>
-            <wp:docPr descr="Multiplicative transfer map" title="" id="61" name="Picture"/>
+            <wp:docPr descr="Multiplicative transfer map" title="" id="65" name="Picture"/>
             <a:graphic>
               <a:graphicData uri="http://schemas.openxmlformats.org/drawingml/2006/picture">
                 <pic:pic>
                   <pic:nvPicPr>
-                    <pic:cNvPr descr="figs/figA13_mult_transfer.png" id="62" name="Picture"/>
+                    <pic:cNvPr descr="figs/figA13_mult_transfer.png" id="66" name="Picture"/>
                     <pic:cNvPicPr>
                       <a:picLocks noChangeArrowheads="1" noChangeAspect="1"/>
                     </pic:cNvPicPr>
                   </pic:nvPicPr>
                   <pic:blipFill>
-                    <a:blip r:embed="rId60"/>
+                    <a:blip r:embed="rId64"/>
                     <a:stretch>
                       <a:fillRect/>
                     </a:stretch>
@@ -4441,8 +4892,8 @@
         <w:t xml:space="preserve">).</w:t>
       </w:r>
     </w:p>
-    <w:bookmarkEnd w:id="63"/>
-    <w:bookmarkStart w:id="67" w:name="Xea3042850cf8050407ffdd53c2454b5f83a5608"/>
+    <w:bookmarkEnd w:id="67"/>
+    <w:bookmarkStart w:id="71" w:name="Xea3042850cf8050407ffdd53c2454b5f83a5608"/>
     <w:p>
       <w:pPr>
         <w:pStyle w:val="Heading3"/>
@@ -4926,18 +5377,18 @@
           <wp:inline>
             <wp:extent cx="5334000" cy="2956891"/>
             <wp:effectExtent b="0" l="0" r="0" t="0"/>
-            <wp:docPr descr="Seasonal vs idiom: ablation" title="" id="65" name="Picture"/>
+            <wp:docPr descr="Seasonal vs idiom: ablation" title="" id="69" name="Picture"/>
             <a:graphic>
               <a:graphicData uri="http://schemas.openxmlformats.org/drawingml/2006/picture">
                 <pic:pic>
                   <pic:nvPicPr>
-                    <pic:cNvPr descr="figs/figA5_seasonal_ember_kill.png" id="66" name="Picture"/>
+                    <pic:cNvPr descr="figs/figA5_seasonal_ember_kill.png" id="70" name="Picture"/>
                     <pic:cNvPicPr>
                       <a:picLocks noChangeArrowheads="1" noChangeAspect="1"/>
                     </pic:cNvPicPr>
                   </pic:nvPicPr>
                   <pic:blipFill>
-                    <a:blip r:embed="rId64"/>
+                    <a:blip r:embed="rId68"/>
                     <a:stretch>
                       <a:fillRect/>
                     </a:stretch>
@@ -5104,8 +5555,8 @@
         <w:t xml:space="preserve">channel. This has important consequences for monitorability which may not have been captured in Engels et al.’s analysis: a tool reading only the final diffusion output will miss transient output. A model may for instance choose to hide a specific fact in its chain-of-thought to a monitor, while having used it intermittently, though we did not find any instances of such behavior here.</w:t>
       </w:r>
     </w:p>
-    <w:bookmarkEnd w:id="67"/>
-    <w:bookmarkStart w:id="79" w:name="post-hoc-rationalization"/>
+    <w:bookmarkEnd w:id="71"/>
+    <w:bookmarkStart w:id="83" w:name="post-hoc-rationalization"/>
     <w:p>
       <w:pPr>
         <w:pStyle w:val="Heading3"/>
@@ -5121,7 +5572,7 @@
       <w:r>
         <w:t xml:space="preserve">An important question in monitorability (</w:t>
       </w:r>
-      <w:hyperlink r:id="rId68">
+      <w:hyperlink r:id="rId72">
         <w:r>
           <w:rPr>
             <w:rStyle w:val="Hyperlink"/>
@@ -5150,18 +5601,18 @@
           <wp:inline>
             <wp:extent cx="5334000" cy="1619249"/>
             <wp:effectExtent b="0" l="0" r="0" t="0"/>
-            <wp:docPr descr="Post-hoc correlations" title="" id="70" name="Picture"/>
+            <wp:docPr descr="Post-hoc correlations" title="" id="74" name="Picture"/>
             <a:graphic>
               <a:graphicData uri="http://schemas.openxmlformats.org/drawingml/2006/picture">
                 <pic:pic>
                   <pic:nvPicPr>
-                    <pic:cNvPr descr="figs/figA8_posthoc_correlations.png" id="71" name="Picture"/>
+                    <pic:cNvPr descr="figs/figA8_posthoc_correlations.png" id="75" name="Picture"/>
                     <pic:cNvPicPr>
                       <a:picLocks noChangeArrowheads="1" noChangeAspect="1"/>
                     </pic:cNvPicPr>
                   </pic:nvPicPr>
                   <pic:blipFill>
-                    <a:blip r:embed="rId69"/>
+                    <a:blip r:embed="rId73"/>
                     <a:stretch>
                       <a:fillRect/>
                     </a:stretch>
@@ -5450,18 +5901,18 @@
           <wp:inline>
             <wp:extent cx="5334000" cy="4036060"/>
             <wp:effectExtent b="0" l="0" r="0" t="0"/>
-            <wp:docPr descr="Post-hoc case study" title="" id="73" name="Picture"/>
+            <wp:docPr descr="Post-hoc case study" title="" id="77" name="Picture"/>
             <a:graphic>
               <a:graphicData uri="http://schemas.openxmlformats.org/drawingml/2006/picture">
                 <pic:pic>
                   <pic:nvPicPr>
-                    <pic:cNvPr descr="figs/figA8b_posthoc_case.png" id="74" name="Picture"/>
+                    <pic:cNvPr descr="figs/figA8b_posthoc_case.png" id="78" name="Picture"/>
                     <pic:cNvPicPr>
                       <a:picLocks noChangeArrowheads="1" noChangeAspect="1"/>
                     </pic:cNvPicPr>
                   </pic:nvPicPr>
                   <pic:blipFill>
-                    <a:blip r:embed="rId72"/>
+                    <a:blip r:embed="rId76"/>
                     <a:stretch>
                       <a:fillRect/>
                     </a:stretch>
@@ -5524,7 +5975,7 @@
         <w:t xml:space="preserve">Top row: normal rollout, model answer highlighted, with its commitment time. Bottom row: the susceptibility, measured like in the previous figure.</w:t>
       </w:r>
     </w:p>
-    <w:bookmarkStart w:id="78" w:name="Xabbf9ebb3c7fb0570cb1488d42cd03734ef9222"/>
+    <w:bookmarkStart w:id="82" w:name="Xabbf9ebb3c7fb0570cb1488d42cd03734ef9222"/>
     <w:p>
       <w:pPr>
         <w:pStyle w:val="Heading4"/>
@@ -5550,18 +6001,18 @@
           <wp:inline>
             <wp:extent cx="5334000" cy="2125265"/>
             <wp:effectExtent b="0" l="0" r="0" t="0"/>
-            <wp:docPr descr="Answer resolution" title="" id="76" name="Picture"/>
+            <wp:docPr descr="Answer resolution" title="" id="80" name="Picture"/>
             <a:graphic>
               <a:graphicData uri="http://schemas.openxmlformats.org/drawingml/2006/picture">
                 <pic:pic>
                   <pic:nvPicPr>
-                    <pic:cNvPr descr="figs/figA9_resolution.png" id="77" name="Picture"/>
+                    <pic:cNvPr descr="figs/figA9_resolution.png" id="81" name="Picture"/>
                     <pic:cNvPicPr>
                       <a:picLocks noChangeArrowheads="1" noChangeAspect="1"/>
                     </pic:cNvPicPr>
                   </pic:nvPicPr>
                   <pic:blipFill>
-                    <a:blip r:embed="rId75"/>
+                    <a:blip r:embed="rId79"/>
                     <a:stretch>
                       <a:fillRect/>
                     </a:stretch>
@@ -5687,9 +6138,9 @@
         <w:t xml:space="preserve"> </w:t>
       </w:r>
     </w:p>
-    <w:bookmarkEnd w:id="78"/>
-    <w:bookmarkEnd w:id="79"/>
-    <w:bookmarkStart w:id="83" w:name="Xd7c7dfb66314a32b0174c0001aa6561f67f2b90"/>
+    <w:bookmarkEnd w:id="82"/>
+    <w:bookmarkEnd w:id="83"/>
+    <w:bookmarkStart w:id="87" w:name="Xd7c7dfb66314a32b0174c0001aa6561f67f2b90"/>
     <w:p>
       <w:pPr>
         <w:pStyle w:val="Heading3"/>
@@ -5713,18 +6164,18 @@
           <wp:inline>
             <wp:extent cx="5334000" cy="1889125"/>
             <wp:effectExtent b="0" l="0" r="0" t="0"/>
-            <wp:docPr descr="Commitment causality" title="" id="81" name="Picture"/>
+            <wp:docPr descr="Commitment causality" title="" id="85" name="Picture"/>
             <a:graphic>
               <a:graphicData uri="http://schemas.openxmlformats.org/drawingml/2006/picture">
                 <pic:pic>
                   <pic:nvPicPr>
-                    <pic:cNvPr descr="figs/figA11_commit_causality.png" id="82" name="Picture"/>
+                    <pic:cNvPr descr="figs/figA11_commit_causality.png" id="86" name="Picture"/>
                     <pic:cNvPicPr>
                       <a:picLocks noChangeArrowheads="1" noChangeAspect="1"/>
                     </pic:cNvPicPr>
                   </pic:nvPicPr>
                   <pic:blipFill>
-                    <a:blip r:embed="rId80"/>
+                    <a:blip r:embed="rId84"/>
                     <a:stretch>
                       <a:fillRect/>
                     </a:stretch>
@@ -5936,9 +6387,9 @@
         <w:t xml:space="preserve">, which requires the model to reverse its reasoning order.</w:t>
       </w:r>
     </w:p>
-    <w:bookmarkEnd w:id="83"/>
-    <w:bookmarkEnd w:id="84"/>
-    <w:bookmarkEnd w:id="85"/>
+    <w:bookmarkEnd w:id="87"/>
+    <w:bookmarkEnd w:id="88"/>
+    <w:bookmarkEnd w:id="89"/>
     <w:sectPr>
       <w:footnotePr>
         <w:numRestart w:val="eachSect"/>

</xml_diff>

<commit_message>
fig1 caption: complete the gentle-sampler sentence — commitment-pacing mechanism for the temperature range and entropy bound (with the slow3 vs standard values)
Co-Authored-By: Claude Fable 5 <noreply@anthropic.com>
</commit_message>
<xml_diff>
--- a/post.docx
+++ b/post.docx
@@ -1245,7 +1245,139 @@
           <w:i/>
           <w:iCs/>
         </w:rPr>
-        <w:t xml:space="preserve">Specifically, we use more diffusion steps, a wider temperature range, and a lower entropy bound.</w:t>
+        <w:t xml:space="preserve">Specifically, we use more diffusion steps, a wider temperature range (</w:t>
+      </w:r>
+      <m:oMath>
+        <m:r>
+          <m:t>1.0</m:t>
+        </m:r>
+        <m:r>
+          <m:rPr>
+            <m:sty m:val="p"/>
+          </m:rPr>
+          <m:t>→</m:t>
+        </m:r>
+        <m:r>
+          <m:t>0.5</m:t>
+        </m:r>
+      </m:oMath>
+      <w:r>
+        <w:rPr>
+          <w:i/>
+          <w:iCs/>
+        </w:rPr>
+        <w:t xml:space="preserve"> </w:t>
+      </w:r>
+      <w:r>
+        <w:rPr>
+          <w:i/>
+          <w:iCs/>
+        </w:rPr>
+        <w:t xml:space="preserve">vs</w:t>
+      </w:r>
+      <w:r>
+        <w:rPr>
+          <w:i/>
+          <w:iCs/>
+        </w:rPr>
+        <w:t xml:space="preserve"> </w:t>
+      </w:r>
+      <m:oMath>
+        <m:r>
+          <m:t>0.8</m:t>
+        </m:r>
+        <m:r>
+          <m:rPr>
+            <m:sty m:val="p"/>
+          </m:rPr>
+          <m:t>→</m:t>
+        </m:r>
+        <m:r>
+          <m:t>0.4</m:t>
+        </m:r>
+      </m:oMath>
+      <w:r>
+        <w:rPr>
+          <w:i/>
+          <w:iCs/>
+        </w:rPr>
+        <w:t xml:space="preserve">), and a lower entropy bound (</w:t>
+      </w:r>
+      <m:oMath>
+        <m:r>
+          <m:t>0.02</m:t>
+        </m:r>
+      </m:oMath>
+      <w:r>
+        <w:rPr>
+          <w:i/>
+          <w:iCs/>
+        </w:rPr>
+        <w:t xml:space="preserve"> </w:t>
+      </w:r>
+      <w:r>
+        <w:rPr>
+          <w:i/>
+          <w:iCs/>
+        </w:rPr>
+        <w:t xml:space="preserve">vs</w:t>
+      </w:r>
+      <w:r>
+        <w:rPr>
+          <w:i/>
+          <w:iCs/>
+        </w:rPr>
+        <w:t xml:space="preserve"> </w:t>
+      </w:r>
+      <m:oMath>
+        <m:r>
+          <m:t>0.1</m:t>
+        </m:r>
+      </m:oMath>
+      <w:r>
+        <w:rPr>
+          <w:i/>
+          <w:iCs/>
+        </w:rPr>
+        <w:t xml:space="preserve">). Both knobs act on commitment pacing: truncating</w:t>
+      </w:r>
+      <w:r>
+        <w:rPr>
+          <w:i/>
+          <w:iCs/>
+        </w:rPr>
+        <w:t xml:space="preserve"> </w:t>
+      </w:r>
+      <m:oMath>
+        <m:sSup>
+          <m:e>
+            <m:r>
+              <m:rPr>
+                <m:sty m:val="b"/>
+              </m:rPr>
+              <m:t>s</m:t>
+            </m:r>
+          </m:e>
+          <m:sup>
+            <m:r>
+              <m:t>t</m:t>
+            </m:r>
+          </m:sup>
+        </m:sSup>
+      </m:oMath>
+      <w:r>
+        <w:rPr>
+          <w:i/>
+          <w:iCs/>
+        </w:rPr>
+        <w:t xml:space="preserve"> </w:t>
+      </w:r>
+      <w:r>
+        <w:rPr>
+          <w:i/>
+          <w:iCs/>
+        </w:rPr>
+        <w:t xml:space="preserve">to its top-k renormalizes it into an over-confident distribution, so the standard sampler freezes canvas positions before their content has formed and then anneals too cold to escape the resulting repetition. The lower entropy bound admits fewer positions per step, while the hotter, wider temperature schedule keeps the uncommitted positions exploring until they genuinely settle.</w:t>
       </w:r>
     </w:p>
     <w:bookmarkEnd w:id="28"/>

</xml_diff>

<commit_message>
move sampler-knob explanation to the background: entropy bound + step count T defined in the intro; fig1 caption reverted to the user's short sentence
Co-Authored-By: Claude Fable 5 <noreply@anthropic.com>
</commit_message>
<xml_diff>
--- a/post.docx
+++ b/post.docx
@@ -776,7 +776,65 @@
         </m:r>
       </m:oMath>
       <w:r>
-        <w:t xml:space="preserve">, facilitating exploration and correction.</w:t>
+        <w:t xml:space="preserve">, facilitating exploration and correction. This threshold is an</w:t>
+      </w:r>
+      <w:r>
+        <w:t xml:space="preserve"> </w:t>
+      </w:r>
+      <w:r>
+        <w:rPr>
+          <w:i/>
+          <w:iCs/>
+        </w:rPr>
+        <w:t xml:space="preserve">entropy bound</w:t>
+      </w:r>
+      <w:r>
+        <w:t xml:space="preserve"> </w:t>
+      </w:r>
+      <w:r>
+        <w:t xml:space="preserve">on</w:t>
+      </w:r>
+      <w:r>
+        <w:t xml:space="preserve"> </w:t>
+      </w:r>
+      <m:oMath>
+        <m:sSubSup>
+          <m:e>
+            <m:r>
+              <m:rPr>
+                <m:sty m:val="b"/>
+              </m:rPr>
+              <m:t>s</m:t>
+            </m:r>
+          </m:e>
+          <m:sub>
+            <m:r>
+              <m:t>i</m:t>
+            </m:r>
+          </m:sub>
+          <m:sup>
+            <m:r>
+              <m:t>t</m:t>
+            </m:r>
+          </m:sup>
+        </m:sSubSup>
+      </m:oMath>
+      <w:r>
+        <w:t xml:space="preserve"> </w:t>
+      </w:r>
+      <w:r>
+        <w:t xml:space="preserve">— a position only commits once its distribution is sharp enough — and the replacement tokens are drawn at a temperature that anneals over the run. Together with the total number of diffusion steps</w:t>
+      </w:r>
+      <w:r>
+        <w:t xml:space="preserve"> </w:t>
+      </w:r>
+      <m:oMath>
+        <m:r>
+          <m:t>T</m:t>
+        </m:r>
+      </m:oMath>
+      <w:r>
+        <w:t xml:space="preserve">, which caps how many refinement passes the canvas receives, these are the sampler settings we adjust below.</w:t>
       </w:r>
     </w:p>
     <w:p>
@@ -1245,139 +1303,7 @@
           <w:i/>
           <w:iCs/>
         </w:rPr>
-        <w:t xml:space="preserve">Specifically, we use more diffusion steps, a wider temperature range (</w:t>
-      </w:r>
-      <m:oMath>
-        <m:r>
-          <m:t>1.0</m:t>
-        </m:r>
-        <m:r>
-          <m:rPr>
-            <m:sty m:val="p"/>
-          </m:rPr>
-          <m:t>→</m:t>
-        </m:r>
-        <m:r>
-          <m:t>0.5</m:t>
-        </m:r>
-      </m:oMath>
-      <w:r>
-        <w:rPr>
-          <w:i/>
-          <w:iCs/>
-        </w:rPr>
-        <w:t xml:space="preserve"> </w:t>
-      </w:r>
-      <w:r>
-        <w:rPr>
-          <w:i/>
-          <w:iCs/>
-        </w:rPr>
-        <w:t xml:space="preserve">vs</w:t>
-      </w:r>
-      <w:r>
-        <w:rPr>
-          <w:i/>
-          <w:iCs/>
-        </w:rPr>
-        <w:t xml:space="preserve"> </w:t>
-      </w:r>
-      <m:oMath>
-        <m:r>
-          <m:t>0.8</m:t>
-        </m:r>
-        <m:r>
-          <m:rPr>
-            <m:sty m:val="p"/>
-          </m:rPr>
-          <m:t>→</m:t>
-        </m:r>
-        <m:r>
-          <m:t>0.4</m:t>
-        </m:r>
-      </m:oMath>
-      <w:r>
-        <w:rPr>
-          <w:i/>
-          <w:iCs/>
-        </w:rPr>
-        <w:t xml:space="preserve">), and a lower entropy bound (</w:t>
-      </w:r>
-      <m:oMath>
-        <m:r>
-          <m:t>0.02</m:t>
-        </m:r>
-      </m:oMath>
-      <w:r>
-        <w:rPr>
-          <w:i/>
-          <w:iCs/>
-        </w:rPr>
-        <w:t xml:space="preserve"> </w:t>
-      </w:r>
-      <w:r>
-        <w:rPr>
-          <w:i/>
-          <w:iCs/>
-        </w:rPr>
-        <w:t xml:space="preserve">vs</w:t>
-      </w:r>
-      <w:r>
-        <w:rPr>
-          <w:i/>
-          <w:iCs/>
-        </w:rPr>
-        <w:t xml:space="preserve"> </w:t>
-      </w:r>
-      <m:oMath>
-        <m:r>
-          <m:t>0.1</m:t>
-        </m:r>
-      </m:oMath>
-      <w:r>
-        <w:rPr>
-          <w:i/>
-          <w:iCs/>
-        </w:rPr>
-        <w:t xml:space="preserve">). Both knobs act on commitment pacing: truncating</w:t>
-      </w:r>
-      <w:r>
-        <w:rPr>
-          <w:i/>
-          <w:iCs/>
-        </w:rPr>
-        <w:t xml:space="preserve"> </w:t>
-      </w:r>
-      <m:oMath>
-        <m:sSup>
-          <m:e>
-            <m:r>
-              <m:rPr>
-                <m:sty m:val="b"/>
-              </m:rPr>
-              <m:t>s</m:t>
-            </m:r>
-          </m:e>
-          <m:sup>
-            <m:r>
-              <m:t>t</m:t>
-            </m:r>
-          </m:sup>
-        </m:sSup>
-      </m:oMath>
-      <w:r>
-        <w:rPr>
-          <w:i/>
-          <w:iCs/>
-        </w:rPr>
-        <w:t xml:space="preserve"> </w:t>
-      </w:r>
-      <w:r>
-        <w:rPr>
-          <w:i/>
-          <w:iCs/>
-        </w:rPr>
-        <w:t xml:space="preserve">to its top-k renormalizes it into an over-confident distribution, so the standard sampler freezes canvas positions before their content has formed and then anneals too cold to escape the resulting repetition. The lower entropy bound admits fewer positions per step, while the hotter, wider temperature schedule keeps the uncommitted positions exploring until they genuinely settle.</w:t>
+        <w:t xml:space="preserve">Specifically, we use more diffusion steps, a wider temperature range, and a lower entropy bound.</w:t>
       </w:r>
     </w:p>
     <w:bookmarkEnd w:id="28"/>

</xml_diff>

<commit_message>
background: correct the renoising description per the tech report (uncommitted positions renoised UNIFORMLY at random; the annealed temperature applies to the proposal sampling from s^t, not the renoise draw)
Co-Authored-By: Claude Fable 5 <noreply@anthropic.com>
</commit_message>
<xml_diff>
--- a/post.docx
+++ b/post.docx
@@ -820,10 +820,33 @@
         </m:sSubSup>
       </m:oMath>
       <w:r>
-        <w:t xml:space="preserve"> </w:t>
-      </w:r>
-      <w:r>
-        <w:t xml:space="preserve">— a position only commits once its distribution is sharp enough — and the replacement tokens are drawn at a temperature that anneals over the run. Together with the total number of diffusion steps</w:t>
+        <w:t xml:space="preserve">: positions are accepted in order of increasing entropy until the budget is spent, and every remaining position is renoised uniformly at random. The proposal tokens themselves are sampled from</w:t>
+      </w:r>
+      <w:r>
+        <w:t xml:space="preserve"> </w:t>
+      </w:r>
+      <m:oMath>
+        <m:sSup>
+          <m:e>
+            <m:r>
+              <m:rPr>
+                <m:sty m:val="b"/>
+              </m:rPr>
+              <m:t>s</m:t>
+            </m:r>
+          </m:e>
+          <m:sup>
+            <m:r>
+              <m:t>t</m:t>
+            </m:r>
+          </m:sup>
+        </m:sSup>
+      </m:oMath>
+      <w:r>
+        <w:t xml:space="preserve"> </w:t>
+      </w:r>
+      <w:r>
+        <w:t xml:space="preserve">at a temperature that anneals over the run. Together with the total number of diffusion steps</w:t>
       </w:r>
       <w:r>
         <w:t xml:space="preserve"> </w:t>

</xml_diff>

<commit_message>
fig2a ticks back to plain x+k; example-intervention card gains log-gridded decade axes beneath all four bar tracks (10^-5..1, matching lgw scale)
Co-Authored-By: Claude Fable 5 <noreply@anthropic.com>
</commit_message>
<xml_diff>
--- a/post.docx
+++ b/post.docx
@@ -2329,7 +2329,7 @@
       <w:r>
         <w:drawing>
           <wp:inline>
-            <wp:extent cx="5334000" cy="2341033"/>
+            <wp:extent cx="5334000" cy="2429933"/>
             <wp:effectExtent b="0" l="0" r="0" t="0"/>
             <wp:docPr descr="Example intervention" title="" id="33" name="Picture"/>
             <a:graphic>
@@ -2350,7 +2350,7 @@
                   <pic:spPr bwMode="auto">
                     <a:xfrm>
                       <a:off x="0" y="0"/>
-                      <a:ext cx="5334000" cy="2341033"/>
+                      <a:ext cx="5334000" cy="2429933"/>
                     </a:xfrm>
                     <a:prstGeom prst="rect">
                       <a:avLst/>

</xml_diff>

<commit_message>
fig2a: single-k map (k=3 / UU3 only) — rows now resolve to unique targets D..Z as yticklabels; diag excess +1.46 (was +0.97 pooled); figA13 caption comparison updated to the displayed map
Co-Authored-By: Claude Fable 5 <noreply@anthropic.com>
</commit_message>
<xml_diff>
--- a/post.docx
+++ b/post.docx
@@ -2,16 +2,17 @@
 <file path=word/document.xml><?xml version="1.0" encoding="utf-8"?>
 <w:document xmlns:w="http://schemas.openxmlformats.org/wordprocessingml/2006/main" xmlns:m="http://schemas.openxmlformats.org/officeDocument/2006/math" xmlns:r="http://schemas.openxmlformats.org/officeDocument/2006/relationships" xmlns:o="urn:schemas-microsoft-com:office:office" xmlns:v="urn:schemas-microsoft-com:vml" xmlns:w10="urn:schemas-microsoft-com:office:word" xmlns:a="http://schemas.openxmlformats.org/drawingml/2006/main" xmlns:pic="http://schemas.openxmlformats.org/drawingml/2006/picture" xmlns:wp="http://schemas.openxmlformats.org/drawingml/2006/wordprocessingDrawing">
   <w:body>
-    <w:bookmarkStart w:id="89" w:name="Xf5e660dc2e9c1a368125465a5756c31f66c44e2"/>
-    <w:p>
-      <w:pPr>
-        <w:pStyle w:val="Heading1"/>
+    <w:bookmarkStart w:id="20" w:name="Xf5e660dc2e9c1a368125465a5756c31f66c44e2"/>
+    <w:p>
+      <w:pPr>
+        <w:pStyle w:val="Heading4"/>
       </w:pPr>
       <w:r>
         <w:t xml:space="preserve">Does DiffusionGemma have latent reasoning?</w:t>
       </w:r>
     </w:p>
-    <w:bookmarkStart w:id="20" w:name="tldr"/>
+    <w:bookmarkEnd w:id="20"/>
+    <w:bookmarkStart w:id="21" w:name="tldr"/>
     <w:p>
       <w:pPr>
         <w:pStyle w:val="Heading2"/>
@@ -57,8 +58,8 @@
         <w:t xml:space="preserve">Github: …</w:t>
       </w:r>
     </w:p>
-    <w:bookmarkEnd w:id="20"/>
-    <w:bookmarkStart w:id="23" w:name="introduction"/>
+    <w:bookmarkEnd w:id="21"/>
+    <w:bookmarkStart w:id="24" w:name="introduction"/>
     <w:p>
       <w:pPr>
         <w:pStyle w:val="Heading2"/>
@@ -870,7 +871,7 @@
       <w:r>
         <w:t xml:space="preserve"> </w:t>
       </w:r>
-      <w:hyperlink r:id="rId21">
+      <w:hyperlink r:id="rId22">
         <w:r>
           <w:rPr>
             <w:rStyle w:val="Hyperlink"/>
@@ -901,7 +902,7 @@
       <w:r>
         <w:t xml:space="preserve">Generation happens as reverse diffusion, not as token-by-token autoregression. This is reminiscent of a looped transformer (</w:t>
       </w:r>
-      <w:hyperlink r:id="rId22">
+      <w:hyperlink r:id="rId23">
         <w:r>
           <w:rPr>
             <w:rStyle w:val="Hyperlink"/>
@@ -1068,8 +1069,8 @@
         <w:t xml:space="preserve">axis. A priori, this allows the model to transport drastically more information between diffusion steps in an illegible way, hindering monitorability.</w:t>
       </w:r>
     </w:p>
-    <w:bookmarkEnd w:id="23"/>
-    <w:bookmarkStart w:id="28" w:name="Xf638a3cf391e24e99a13c28ea09cc4d444ff628"/>
+    <w:bookmarkEnd w:id="24"/>
+    <w:bookmarkStart w:id="29" w:name="Xf638a3cf391e24e99a13c28ea09cc4d444ff628"/>
     <w:p>
       <w:pPr>
         <w:pStyle w:val="Heading2"/>
@@ -1088,7 +1089,7 @@
       <w:r>
         <w:t xml:space="preserve"> </w:t>
       </w:r>
-      <w:hyperlink r:id="rId24">
+      <w:hyperlink r:id="rId25">
         <w:r>
           <w:rPr>
             <w:rStyle w:val="Hyperlink"/>
@@ -1181,18 +1182,18 @@
           <wp:inline>
             <wp:extent cx="5334000" cy="4000500"/>
             <wp:effectExtent b="0" l="0" r="0" t="0"/>
-            <wp:docPr descr="GPQA truncation failure modes" title="" id="26" name="Picture"/>
+            <wp:docPr descr="GPQA truncation failure modes" title="" id="27" name="Picture"/>
             <a:graphic>
               <a:graphicData uri="http://schemas.openxmlformats.org/drawingml/2006/picture">
                 <pic:pic>
                   <pic:nvPicPr>
-                    <pic:cNvPr descr="figs/fig1_gpqa_trunc_failures.png" id="27" name="Picture"/>
+                    <pic:cNvPr descr="figs/fig1_gpqa_trunc_failures.png" id="28" name="Picture"/>
                     <pic:cNvPicPr>
                       <a:picLocks noChangeArrowheads="1" noChangeAspect="1"/>
                     </pic:cNvPicPr>
                   </pic:nvPicPr>
                   <pic:blipFill>
-                    <a:blip r:embed="rId25"/>
+                    <a:blip r:embed="rId26"/>
                     <a:stretch>
                       <a:fillRect/>
                     </a:stretch>
@@ -1293,7 +1294,7 @@
         </w:rPr>
         <w:t xml:space="preserve"> </w:t>
       </w:r>
-      <w:hyperlink r:id="rId24">
+      <w:hyperlink r:id="rId25">
         <w:r>
           <w:rPr>
             <w:rStyle w:val="Hyperlink"/>
@@ -1329,8 +1330,8 @@
         <w:t xml:space="preserve">Specifically, we use more diffusion steps, a wider temperature range, and a lower entropy bound.</w:t>
       </w:r>
     </w:p>
-    <w:bookmarkEnd w:id="28"/>
-    <w:bookmarkStart w:id="35" w:name="X6bead5e3ab0c7cbd57888e89c1191aa20e1e3ba"/>
+    <w:bookmarkEnd w:id="29"/>
+    <w:bookmarkStart w:id="36" w:name="X6bead5e3ab0c7cbd57888e89c1191aa20e1e3ba"/>
     <w:p>
       <w:pPr>
         <w:pStyle w:val="Heading2"/>
@@ -1401,7 +1402,7 @@
       <w:r>
         <w:t xml:space="preserve"> </w:t>
       </w:r>
-      <w:hyperlink r:id="rId24">
+      <w:hyperlink r:id="rId25">
         <w:r>
           <w:rPr>
             <w:rStyle w:val="Hyperlink"/>
@@ -2254,18 +2255,18 @@
           <wp:inline>
             <wp:extent cx="5334000" cy="4000500"/>
             <wp:effectExtent b="0" l="0" r="0" t="0"/>
-            <wp:docPr descr="Letter-arithmetic transfer maps" title="" id="30" name="Picture"/>
+            <wp:docPr descr="Letter-arithmetic transfer maps" title="" id="31" name="Picture"/>
             <a:graphic>
               <a:graphicData uri="http://schemas.openxmlformats.org/drawingml/2006/picture">
                 <pic:pic>
                   <pic:nvPicPr>
-                    <pic:cNvPr descr="figs/fig2a_transfer_map.png" id="31" name="Picture"/>
+                    <pic:cNvPr descr="figs/fig2a_transfer_map.png" id="32" name="Picture"/>
                     <pic:cNvPicPr>
                       <a:picLocks noChangeArrowheads="1" noChangeAspect="1"/>
                     </pic:cNvPicPr>
                   </pic:nvPicPr>
                   <pic:blipFill>
-                    <a:blip r:embed="rId29"/>
+                    <a:blip r:embed="rId30"/>
                     <a:stretch>
                       <a:fillRect/>
                     </a:stretch>
@@ -2331,18 +2332,18 @@
           <wp:inline>
             <wp:extent cx="5334000" cy="2429933"/>
             <wp:effectExtent b="0" l="0" r="0" t="0"/>
-            <wp:docPr descr="Example intervention" title="" id="33" name="Picture"/>
+            <wp:docPr descr="Example intervention" title="" id="34" name="Picture"/>
             <a:graphic>
               <a:graphicData uri="http://schemas.openxmlformats.org/drawingml/2006/picture">
                 <pic:pic>
                   <pic:nvPicPr>
-                    <pic:cNvPr descr="figs/fig2a_example_intervention.png" id="34" name="Picture"/>
+                    <pic:cNvPr descr="figs/fig2a_example_intervention.png" id="35" name="Picture"/>
                     <pic:cNvPicPr>
                       <a:picLocks noChangeArrowheads="1" noChangeAspect="1"/>
                     </pic:cNvPicPr>
                   </pic:nvPicPr>
                   <pic:blipFill>
-                    <a:blip r:embed="rId32"/>
+                    <a:blip r:embed="rId33"/>
                     <a:stretch>
                       <a:fillRect/>
                     </a:stretch>
@@ -2536,8 +2537,8 @@
         <w:t xml:space="preserve">one step later.</w:t>
       </w:r>
     </w:p>
-    <w:bookmarkEnd w:id="35"/>
-    <w:bookmarkStart w:id="36" w:name="conclusion"/>
+    <w:bookmarkEnd w:id="36"/>
+    <w:bookmarkStart w:id="37" w:name="conclusion"/>
     <w:p>
       <w:pPr>
         <w:pStyle w:val="Heading2"/>
@@ -2668,7 +2669,7 @@
       <w:r>
         <w:t xml:space="preserve"> </w:t>
       </w:r>
-      <w:hyperlink r:id="rId24">
+      <w:hyperlink r:id="rId25">
         <w:r>
           <w:rPr>
             <w:rStyle w:val="Hyperlink"/>
@@ -2739,8 +2740,8 @@
         <w:t xml:space="preserve">latent reasoning is somewhat hard to learn. However, there already exist models like CODI that pass a vector-valued state that is not clearly a superposition of tokens, though they so far don’t show superior performance. We believe that finding methods to better interpret such models is an important area of research.</w:t>
       </w:r>
     </w:p>
-    <w:bookmarkEnd w:id="36"/>
-    <w:bookmarkStart w:id="88" w:name="appendix"/>
+    <w:bookmarkEnd w:id="37"/>
+    <w:bookmarkStart w:id="89" w:name="appendix"/>
     <w:p>
       <w:pPr>
         <w:pStyle w:val="Heading2"/>
@@ -2759,7 +2760,7 @@
       <w:r>
         <w:t xml:space="preserve"> </w:t>
       </w:r>
-      <w:hyperlink r:id="rId24">
+      <w:hyperlink r:id="rId25">
         <w:r>
           <w:rPr>
             <w:rStyle w:val="Hyperlink"/>
@@ -2774,7 +2775,7 @@
         <w:t xml:space="preserve">and in this post have focused on DiffusionGemma’s behavior. We here study whether the model’s representation supports the behavioral finding of high monitorability.</w:t>
       </w:r>
     </w:p>
-    <w:bookmarkStart w:id="41" w:name="representation-similarity"/>
+    <w:bookmarkStart w:id="42" w:name="representation-similarity"/>
     <w:p>
       <w:pPr>
         <w:pStyle w:val="Heading3"/>
@@ -2808,18 +2809,18 @@
           <wp:inline>
             <wp:extent cx="5334000" cy="2125265"/>
             <wp:effectExtent b="0" l="0" r="0" t="0"/>
-            <wp:docPr descr="RSA cosine and CKA" title="" id="38" name="Picture"/>
+            <wp:docPr descr="RSA cosine and CKA" title="" id="39" name="Picture"/>
             <a:graphic>
               <a:graphicData uri="http://schemas.openxmlformats.org/drawingml/2006/picture">
                 <pic:pic>
                   <pic:nvPicPr>
-                    <pic:cNvPr descr="figs/figA1_rsa_cosine_cka.png" id="39" name="Picture"/>
+                    <pic:cNvPr descr="figs/figA1_rsa_cosine_cka.png" id="40" name="Picture"/>
                     <pic:cNvPicPr>
                       <a:picLocks noChangeArrowheads="1" noChangeAspect="1"/>
                     </pic:cNvPicPr>
                   </pic:nvPicPr>
                   <pic:blipFill>
-                    <a:blip r:embed="rId37"/>
+                    <a:blip r:embed="rId38"/>
                     <a:stretch>
                       <a:fillRect/>
                     </a:stretch>
@@ -2881,7 +2882,7 @@
         </w:rPr>
         <w:t xml:space="preserve">Inputs are concepts from (</w:t>
       </w:r>
-      <w:hyperlink r:id="rId40">
+      <w:hyperlink r:id="rId41">
         <w:r>
           <w:rPr>
             <w:rStyle w:val="Hyperlink"/>
@@ -2907,8 +2908,8 @@
         <w:t xml:space="preserve">A priori, this rather large drop suggests a significant change in how the representation is organized, which we then went on to test more specifically.</w:t>
       </w:r>
     </w:p>
-    <w:bookmarkEnd w:id="41"/>
-    <w:bookmarkStart w:id="46" w:name="probe-retention"/>
+    <w:bookmarkEnd w:id="42"/>
+    <w:bookmarkStart w:id="47" w:name="probe-retention"/>
     <w:p>
       <w:pPr>
         <w:pStyle w:val="Heading3"/>
@@ -2924,7 +2925,7 @@
       <w:r>
         <w:t xml:space="preserve">Probing allows us to study how well a model separates concepts. We use 56 binary concept datasets from the SAE-Probes benchmark (</w:t>
       </w:r>
-      <w:hyperlink r:id="rId40">
+      <w:hyperlink r:id="rId41">
         <w:r>
           <w:rPr>
             <w:rStyle w:val="Hyperlink"/>
@@ -2945,18 +2946,18 @@
           <wp:inline>
             <wp:extent cx="5334000" cy="3810846"/>
             <wp:effectExtent b="0" l="0" r="0" t="0"/>
-            <wp:docPr descr="Probe retention" title="" id="43" name="Picture"/>
+            <wp:docPr descr="Probe retention" title="" id="44" name="Picture"/>
             <a:graphic>
               <a:graphicData uri="http://schemas.openxmlformats.org/drawingml/2006/picture">
                 <pic:pic>
                   <pic:nvPicPr>
-                    <pic:cNvPr descr="figs/figA2_probe_retention.png" id="44" name="Picture"/>
+                    <pic:cNvPr descr="figs/figA2_probe_retention.png" id="45" name="Picture"/>
                     <pic:cNvPicPr>
                       <a:picLocks noChangeArrowheads="1" noChangeAspect="1"/>
                     </pic:cNvPicPr>
                   </pic:nvPicPr>
                   <pic:blipFill>
-                    <a:blip r:embed="rId42"/>
+                    <a:blip r:embed="rId43"/>
                     <a:stretch>
                       <a:fillRect/>
                     </a:stretch>
@@ -3047,7 +3048,7 @@
         <w:t xml:space="preserve">= the probe reads the residual at the last token.</w:t>
       </w:r>
     </w:p>
-    <w:bookmarkStart w:id="45" w:name="Xe54800880311e20d4783ff8070e763dcf274742"/>
+    <w:bookmarkStart w:id="46" w:name="Xe54800880311e20d4783ff8070e763dcf274742"/>
     <w:p>
       <w:pPr>
         <w:pStyle w:val="Heading4"/>
@@ -3080,9 +3081,9 @@
         <w:t xml:space="preserve">attention mode yields a somewhat higher AUC. This is suggestive of DG’s bidirectional attention yielding a better structured representation, but is confounded by potentially longer training.</w:t>
       </w:r>
     </w:p>
-    <w:bookmarkEnd w:id="45"/>
     <w:bookmarkEnd w:id="46"/>
-    <w:bookmarkStart w:id="51" w:name="steering-retention"/>
+    <w:bookmarkEnd w:id="47"/>
+    <w:bookmarkStart w:id="52" w:name="steering-retention"/>
     <w:p>
       <w:pPr>
         <w:pStyle w:val="Heading3"/>
@@ -3098,7 +3099,7 @@
       <w:r>
         <w:t xml:space="preserve">To see whether these similarities in representation are causally load-bearing, we consider the steering experiments from the RepE paper (</w:t>
       </w:r>
-      <w:hyperlink r:id="rId47">
+      <w:hyperlink r:id="rId48">
         <w:r>
           <w:rPr>
             <w:rStyle w:val="Hyperlink"/>
@@ -3542,18 +3543,18 @@
           <wp:inline>
             <wp:extent cx="5334000" cy="6394873"/>
             <wp:effectExtent b="0" l="0" r="0" t="0"/>
-            <wp:docPr descr="Steering retention" title="" id="49" name="Picture"/>
+            <wp:docPr descr="Steering retention" title="" id="50" name="Picture"/>
             <a:graphic>
               <a:graphicData uri="http://schemas.openxmlformats.org/drawingml/2006/picture">
                 <pic:pic>
                   <pic:nvPicPr>
-                    <pic:cNvPr descr="figs/figA3_steer_retention.png" id="50" name="Picture"/>
+                    <pic:cNvPr descr="figs/figA3_steer_retention.png" id="51" name="Picture"/>
                     <pic:cNvPicPr>
                       <a:picLocks noChangeArrowheads="1" noChangeAspect="1"/>
                     </pic:cNvPicPr>
                   </pic:nvPicPr>
                   <pic:blipFill>
-                    <a:blip r:embed="rId48"/>
+                    <a:blip r:embed="rId49"/>
                     <a:stretch>
                       <a:fillRect/>
                     </a:stretch>
@@ -3644,8 +3645,8 @@
         <w:t xml:space="preserve">= the direction is added over the last 80% of prompt positions.</w:t>
       </w:r>
     </w:p>
-    <w:bookmarkEnd w:id="51"/>
-    <w:bookmarkStart w:id="63" w:name="j-lens-retention"/>
+    <w:bookmarkEnd w:id="52"/>
+    <w:bookmarkStart w:id="64" w:name="j-lens-retention"/>
     <w:p>
       <w:pPr>
         <w:pStyle w:val="Heading3"/>
@@ -3664,7 +3665,7 @@
       <w:r>
         <w:t xml:space="preserve"> </w:t>
       </w:r>
-      <w:hyperlink r:id="rId52">
+      <w:hyperlink r:id="rId53">
         <w:r>
           <w:rPr>
             <w:rStyle w:val="Hyperlink"/>
@@ -3970,18 +3971,18 @@
           <wp:inline>
             <wp:extent cx="5334000" cy="4296833"/>
             <wp:effectExtent b="0" l="0" r="0" t="0"/>
-            <wp:docPr descr="J-Lens retention" title="" id="54" name="Picture"/>
+            <wp:docPr descr="J-Lens retention" title="" id="55" name="Picture"/>
             <a:graphic>
               <a:graphicData uri="http://schemas.openxmlformats.org/drawingml/2006/picture">
                 <pic:pic>
                   <pic:nvPicPr>
-                    <pic:cNvPr descr="figs/figA4_jlens_retention.png" id="55" name="Picture"/>
+                    <pic:cNvPr descr="figs/figA4_jlens_retention.png" id="56" name="Picture"/>
                     <pic:cNvPicPr>
                       <a:picLocks noChangeArrowheads="1" noChangeAspect="1"/>
                     </pic:cNvPicPr>
                   </pic:nvPicPr>
                   <pic:blipFill>
-                    <a:blip r:embed="rId53"/>
+                    <a:blip r:embed="rId54"/>
                     <a:stretch>
                       <a:fillRect/>
                     </a:stretch>
@@ -4050,7 +4051,7 @@
         </w:rPr>
         <w:t xml:space="preserve"> </w:t>
       </w:r>
-      <w:hyperlink r:id="rId52">
+      <w:hyperlink r:id="rId53">
         <w:r>
           <w:rPr>
             <w:rStyle w:val="Hyperlink"/>
@@ -4346,18 +4347,18 @@
           <wp:inline>
             <wp:extent cx="5334000" cy="3852702"/>
             <wp:effectExtent b="0" l="0" r="0" t="0"/>
-            <wp:docPr descr="J-Lens step accuracy" title="" id="57" name="Picture"/>
+            <wp:docPr descr="J-Lens step accuracy" title="" id="58" name="Picture"/>
             <a:graphic>
               <a:graphicData uri="http://schemas.openxmlformats.org/drawingml/2006/picture">
                 <pic:pic>
                   <pic:nvPicPr>
-                    <pic:cNvPr descr="figs/figA16_jlens_step_accuracy.png" id="58" name="Picture"/>
+                    <pic:cNvPr descr="figs/figA16_jlens_step_accuracy.png" id="59" name="Picture"/>
                     <pic:cNvPicPr>
                       <a:picLocks noChangeArrowheads="1" noChangeAspect="1"/>
                     </pic:cNvPicPr>
                   </pic:nvPicPr>
                   <pic:blipFill>
-                    <a:blip r:embed="rId56"/>
+                    <a:blip r:embed="rId57"/>
                     <a:stretch>
                       <a:fillRect/>
                     </a:stretch>
@@ -4527,7 +4528,7 @@
         <w:t xml:space="preserve">[TODO use better score] how many of the top-20 tokens surfaced by J-lens are plausible in context, but not lexically related to the canvas at any diffusion step.</w:t>
       </w:r>
     </w:p>
-    <w:bookmarkStart w:id="62" w:name="X9b7ff029db2884a5e97d7b865768ea997429a17"/>
+    <w:bookmarkStart w:id="63" w:name="X9b7ff029db2884a5e97d7b865768ea997429a17"/>
     <w:p>
       <w:pPr>
         <w:pStyle w:val="Heading4"/>
@@ -4553,18 +4554,18 @@
           <wp:inline>
             <wp:extent cx="5334000" cy="1197186"/>
             <wp:effectExtent b="0" l="0" r="0" t="0"/>
-            <wp:docPr descr="J-Lens future operation" title="" id="60" name="Picture"/>
+            <wp:docPr descr="J-Lens future operation" title="" id="61" name="Picture"/>
             <a:graphic>
               <a:graphicData uri="http://schemas.openxmlformats.org/drawingml/2006/picture">
                 <pic:pic>
                   <pic:nvPicPr>
-                    <pic:cNvPr descr="figs/figA6_jlens_future.png" id="61" name="Picture"/>
+                    <pic:cNvPr descr="figs/figA6_jlens_future.png" id="62" name="Picture"/>
                     <pic:cNvPicPr>
                       <a:picLocks noChangeArrowheads="1" noChangeAspect="1"/>
                     </pic:cNvPicPr>
                   </pic:nvPicPr>
                   <pic:blipFill>
-                    <a:blip r:embed="rId59"/>
+                    <a:blip r:embed="rId60"/>
                     <a:stretch>
                       <a:fillRect/>
                     </a:stretch>
@@ -4729,9 +4730,9 @@
         <w:t xml:space="preserve">remains highly ranked in the addition variant.</w:t>
       </w:r>
     </w:p>
-    <w:bookmarkEnd w:id="62"/>
     <w:bookmarkEnd w:id="63"/>
-    <w:bookmarkStart w:id="67" w:name="letter-arithmetic"/>
+    <w:bookmarkEnd w:id="64"/>
+    <w:bookmarkStart w:id="68" w:name="letter-arithmetic"/>
     <w:p>
       <w:pPr>
         <w:pStyle w:val="Heading3"/>
@@ -4858,18 +4859,18 @@
           <wp:inline>
             <wp:extent cx="5334000" cy="4000500"/>
             <wp:effectExtent b="0" l="0" r="0" t="0"/>
-            <wp:docPr descr="Multiplicative transfer map" title="" id="65" name="Picture"/>
+            <wp:docPr descr="Multiplicative transfer map" title="" id="66" name="Picture"/>
             <a:graphic>
               <a:graphicData uri="http://schemas.openxmlformats.org/drawingml/2006/picture">
                 <pic:pic>
                   <pic:nvPicPr>
-                    <pic:cNvPr descr="figs/figA13_mult_transfer.png" id="66" name="Picture"/>
+                    <pic:cNvPr descr="figs/figA13_mult_transfer.png" id="67" name="Picture"/>
                     <pic:cNvPicPr>
                       <a:picLocks noChangeArrowheads="1" noChangeAspect="1"/>
                     </pic:cNvPicPr>
                   </pic:nvPicPr>
                   <pic:blipFill>
-                    <a:blip r:embed="rId64"/>
+                    <a:blip r:embed="rId65"/>
                     <a:stretch>
                       <a:fillRect/>
                     </a:stretch>
@@ -4962,19 +4963,61 @@
           <m:t>+</m:t>
         </m:r>
         <m:r>
-          <m:t>0.97</m:t>
-        </m:r>
-      </m:oMath>
-      <w:r>
-        <w:rPr>
-          <w:i/>
-          <w:iCs/>
-        </w:rPr>
-        <w:t xml:space="preserve">).</w:t>
-      </w:r>
-    </w:p>
-    <w:bookmarkEnd w:id="67"/>
-    <w:bookmarkStart w:id="71" w:name="Xea3042850cf8050407ffdd53c2454b5f83a5608"/>
+          <m:t>1.46</m:t>
+        </m:r>
+      </m:oMath>
+      <w:r>
+        <w:rPr>
+          <w:i/>
+          <w:iCs/>
+        </w:rPr>
+        <w:t xml:space="preserve"> </w:t>
+      </w:r>
+      <w:r>
+        <w:rPr>
+          <w:i/>
+          <w:iCs/>
+        </w:rPr>
+        <w:t xml:space="preserve">for the</w:t>
+      </w:r>
+      <w:r>
+        <w:rPr>
+          <w:i/>
+          <w:iCs/>
+        </w:rPr>
+        <w:t xml:space="preserve"> </w:t>
+      </w:r>
+      <m:oMath>
+        <m:r>
+          <m:t>k</m:t>
+        </m:r>
+        <m:r>
+          <m:rPr>
+            <m:sty m:val="p"/>
+          </m:rPr>
+          <m:t>=</m:t>
+        </m:r>
+        <m:r>
+          <m:t>3</m:t>
+        </m:r>
+      </m:oMath>
+      <w:r>
+        <w:rPr>
+          <w:i/>
+          <w:iCs/>
+        </w:rPr>
+        <w:t xml:space="preserve"> </w:t>
+      </w:r>
+      <w:r>
+        <w:rPr>
+          <w:i/>
+          <w:iCs/>
+        </w:rPr>
+        <w:t xml:space="preserve">map shown in the main text).</w:t>
+      </w:r>
+    </w:p>
+    <w:bookmarkEnd w:id="68"/>
+    <w:bookmarkStart w:id="72" w:name="Xea3042850cf8050407ffdd53c2454b5f83a5608"/>
     <w:p>
       <w:pPr>
         <w:pStyle w:val="Heading3"/>
@@ -5458,18 +5501,18 @@
           <wp:inline>
             <wp:extent cx="5334000" cy="2956891"/>
             <wp:effectExtent b="0" l="0" r="0" t="0"/>
-            <wp:docPr descr="Seasonal vs idiom: ablation" title="" id="69" name="Picture"/>
+            <wp:docPr descr="Seasonal vs idiom: ablation" title="" id="70" name="Picture"/>
             <a:graphic>
               <a:graphicData uri="http://schemas.openxmlformats.org/drawingml/2006/picture">
                 <pic:pic>
                   <pic:nvPicPr>
-                    <pic:cNvPr descr="figs/figA5_seasonal_ember_kill.png" id="70" name="Picture"/>
+                    <pic:cNvPr descr="figs/figA5_seasonal_ember_kill.png" id="71" name="Picture"/>
                     <pic:cNvPicPr>
                       <a:picLocks noChangeArrowheads="1" noChangeAspect="1"/>
                     </pic:cNvPicPr>
                   </pic:nvPicPr>
                   <pic:blipFill>
-                    <a:blip r:embed="rId68"/>
+                    <a:blip r:embed="rId69"/>
                     <a:stretch>
                       <a:fillRect/>
                     </a:stretch>
@@ -5636,8 +5679,8 @@
         <w:t xml:space="preserve">channel. This has important consequences for monitorability which may not have been captured in Engels et al.’s analysis: a tool reading only the final diffusion output will miss transient output. A model may for instance choose to hide a specific fact in its chain-of-thought to a monitor, while having used it intermittently, though we did not find any instances of such behavior here.</w:t>
       </w:r>
     </w:p>
-    <w:bookmarkEnd w:id="71"/>
-    <w:bookmarkStart w:id="83" w:name="post-hoc-rationalization"/>
+    <w:bookmarkEnd w:id="72"/>
+    <w:bookmarkStart w:id="84" w:name="post-hoc-rationalization"/>
     <w:p>
       <w:pPr>
         <w:pStyle w:val="Heading3"/>
@@ -5653,7 +5696,7 @@
       <w:r>
         <w:t xml:space="preserve">An important question in monitorability (</w:t>
       </w:r>
-      <w:hyperlink r:id="rId72">
+      <w:hyperlink r:id="rId73">
         <w:r>
           <w:rPr>
             <w:rStyle w:val="Hyperlink"/>
@@ -5682,18 +5725,18 @@
           <wp:inline>
             <wp:extent cx="5334000" cy="1619249"/>
             <wp:effectExtent b="0" l="0" r="0" t="0"/>
-            <wp:docPr descr="Post-hoc correlations" title="" id="74" name="Picture"/>
+            <wp:docPr descr="Post-hoc correlations" title="" id="75" name="Picture"/>
             <a:graphic>
               <a:graphicData uri="http://schemas.openxmlformats.org/drawingml/2006/picture">
                 <pic:pic>
                   <pic:nvPicPr>
-                    <pic:cNvPr descr="figs/figA8_posthoc_correlations.png" id="75" name="Picture"/>
+                    <pic:cNvPr descr="figs/figA8_posthoc_correlations.png" id="76" name="Picture"/>
                     <pic:cNvPicPr>
                       <a:picLocks noChangeArrowheads="1" noChangeAspect="1"/>
                     </pic:cNvPicPr>
                   </pic:nvPicPr>
                   <pic:blipFill>
-                    <a:blip r:embed="rId73"/>
+                    <a:blip r:embed="rId74"/>
                     <a:stretch>
                       <a:fillRect/>
                     </a:stretch>
@@ -5982,18 +6025,18 @@
           <wp:inline>
             <wp:extent cx="5334000" cy="4036060"/>
             <wp:effectExtent b="0" l="0" r="0" t="0"/>
-            <wp:docPr descr="Post-hoc case study" title="" id="77" name="Picture"/>
+            <wp:docPr descr="Post-hoc case study" title="" id="78" name="Picture"/>
             <a:graphic>
               <a:graphicData uri="http://schemas.openxmlformats.org/drawingml/2006/picture">
                 <pic:pic>
                   <pic:nvPicPr>
-                    <pic:cNvPr descr="figs/figA8b_posthoc_case.png" id="78" name="Picture"/>
+                    <pic:cNvPr descr="figs/figA8b_posthoc_case.png" id="79" name="Picture"/>
                     <pic:cNvPicPr>
                       <a:picLocks noChangeArrowheads="1" noChangeAspect="1"/>
                     </pic:cNvPicPr>
                   </pic:nvPicPr>
                   <pic:blipFill>
-                    <a:blip r:embed="rId76"/>
+                    <a:blip r:embed="rId77"/>
                     <a:stretch>
                       <a:fillRect/>
                     </a:stretch>
@@ -6056,7 +6099,7 @@
         <w:t xml:space="preserve">Top row: normal rollout, model answer highlighted, with its commitment time. Bottom row: the susceptibility, measured like in the previous figure.</w:t>
       </w:r>
     </w:p>
-    <w:bookmarkStart w:id="82" w:name="Xabbf9ebb3c7fb0570cb1488d42cd03734ef9222"/>
+    <w:bookmarkStart w:id="83" w:name="Xabbf9ebb3c7fb0570cb1488d42cd03734ef9222"/>
     <w:p>
       <w:pPr>
         <w:pStyle w:val="Heading4"/>
@@ -6082,18 +6125,18 @@
           <wp:inline>
             <wp:extent cx="5334000" cy="2125265"/>
             <wp:effectExtent b="0" l="0" r="0" t="0"/>
-            <wp:docPr descr="Answer resolution" title="" id="80" name="Picture"/>
+            <wp:docPr descr="Answer resolution" title="" id="81" name="Picture"/>
             <a:graphic>
               <a:graphicData uri="http://schemas.openxmlformats.org/drawingml/2006/picture">
                 <pic:pic>
                   <pic:nvPicPr>
-                    <pic:cNvPr descr="figs/figA9_resolution.png" id="81" name="Picture"/>
+                    <pic:cNvPr descr="figs/figA9_resolution.png" id="82" name="Picture"/>
                     <pic:cNvPicPr>
                       <a:picLocks noChangeArrowheads="1" noChangeAspect="1"/>
                     </pic:cNvPicPr>
                   </pic:nvPicPr>
                   <pic:blipFill>
-                    <a:blip r:embed="rId79"/>
+                    <a:blip r:embed="rId80"/>
                     <a:stretch>
                       <a:fillRect/>
                     </a:stretch>
@@ -6219,9 +6262,9 @@
         <w:t xml:space="preserve"> </w:t>
       </w:r>
     </w:p>
-    <w:bookmarkEnd w:id="82"/>
     <w:bookmarkEnd w:id="83"/>
-    <w:bookmarkStart w:id="87" w:name="Xd7c7dfb66314a32b0174c0001aa6561f67f2b90"/>
+    <w:bookmarkEnd w:id="84"/>
+    <w:bookmarkStart w:id="88" w:name="Xd7c7dfb66314a32b0174c0001aa6561f67f2b90"/>
     <w:p>
       <w:pPr>
         <w:pStyle w:val="Heading3"/>
@@ -6245,18 +6288,18 @@
           <wp:inline>
             <wp:extent cx="5334000" cy="1889125"/>
             <wp:effectExtent b="0" l="0" r="0" t="0"/>
-            <wp:docPr descr="Commitment causality" title="" id="85" name="Picture"/>
+            <wp:docPr descr="Commitment causality" title="" id="86" name="Picture"/>
             <a:graphic>
               <a:graphicData uri="http://schemas.openxmlformats.org/drawingml/2006/picture">
                 <pic:pic>
                   <pic:nvPicPr>
-                    <pic:cNvPr descr="figs/figA11_commit_causality.png" id="86" name="Picture"/>
+                    <pic:cNvPr descr="figs/figA11_commit_causality.png" id="87" name="Picture"/>
                     <pic:cNvPicPr>
                       <a:picLocks noChangeArrowheads="1" noChangeAspect="1"/>
                     </pic:cNvPicPr>
                   </pic:nvPicPr>
                   <pic:blipFill>
-                    <a:blip r:embed="rId84"/>
+                    <a:blip r:embed="rId85"/>
                     <a:stretch>
                       <a:fillRect/>
                     </a:stretch>
@@ -6468,7 +6511,6 @@
         <w:t xml:space="preserve">, which requires the model to reverse its reasoning order.</w:t>
       </w:r>
     </w:p>
-    <w:bookmarkEnd w:id="87"/>
     <w:bookmarkEnd w:id="88"/>
     <w:bookmarkEnd w:id="89"/>
     <w:sectPr>

</xml_diff>

<commit_message>
example-intervention card: indicate the orange (image K) mass change — dashed tick at baseline mass + 'R = +3.6 vs baseline' label on the intervention answer bar; legend clause added
Co-Authored-By: Claude Fable 5 <noreply@anthropic.com>
</commit_message>
<xml_diff>
--- a/post.docx
+++ b/post.docx
@@ -2330,7 +2330,7 @@
       <w:r>
         <w:drawing>
           <wp:inline>
-            <wp:extent cx="5334000" cy="2429933"/>
+            <wp:extent cx="5334000" cy="2554393"/>
             <wp:effectExtent b="0" l="0" r="0" t="0"/>
             <wp:docPr descr="Example intervention" title="" id="34" name="Picture"/>
             <a:graphic>
@@ -2351,7 +2351,7 @@
                   <pic:spPr bwMode="auto">
                     <a:xfrm>
                       <a:off x="0" y="0"/>
-                      <a:ext cx="5334000" cy="2429933"/>
+                      <a:ext cx="5334000" cy="2554393"/>
                     </a:xfrm>
                     <a:prstGeom prst="rect">
                       <a:avLst/>

</xml_diff>

<commit_message>
merge second GDocs pass: restructure (new Intro, Background split, Parallel computation reinstated with new min-E fraction metric + vendored fig2c, Autonomous usage to main text, Transfer-of-interp section, Conclusion moved, appendix trimmed to posthoc+bidirectionality); figA16 + appendix mult-map removed; caption steps corrected 64->94 to 48->96; typo fixes; GDocs source archived
Co-Authored-By: Claude Fable 5 <noreply@anthropic.com>
</commit_message>
<xml_diff>
--- a/post.docx
+++ b/post.docx
@@ -2,17 +2,16 @@
 <file path=word/document.xml><?xml version="1.0" encoding="utf-8"?>
 <w:document xmlns:w="http://schemas.openxmlformats.org/wordprocessingml/2006/main" xmlns:m="http://schemas.openxmlformats.org/officeDocument/2006/math" xmlns:r="http://schemas.openxmlformats.org/officeDocument/2006/relationships" xmlns:o="urn:schemas-microsoft-com:office:office" xmlns:v="urn:schemas-microsoft-com:vml" xmlns:w10="urn:schemas-microsoft-com:office:word" xmlns:a="http://schemas.openxmlformats.org/drawingml/2006/main" xmlns:pic="http://schemas.openxmlformats.org/drawingml/2006/picture" xmlns:wp="http://schemas.openxmlformats.org/drawingml/2006/wordprocessingDrawing">
   <w:body>
-    <w:bookmarkStart w:id="20" w:name="Xf5e660dc2e9c1a368125465a5756c31f66c44e2"/>
-    <w:p>
-      <w:pPr>
-        <w:pStyle w:val="Heading4"/>
-      </w:pPr>
-      <w:r>
-        <w:t xml:space="preserve">Does DiffusionGemma have latent reasoning?</w:t>
-      </w:r>
-    </w:p>
-    <w:bookmarkEnd w:id="20"/>
-    <w:bookmarkStart w:id="21" w:name="tldr"/>
+    <w:bookmarkStart w:id="92" w:name="does-diffusiongemma-do-latent-reasoning"/>
+    <w:p>
+      <w:pPr>
+        <w:pStyle w:val="Heading1"/>
+      </w:pPr>
+      <w:r>
+        <w:t xml:space="preserve">Does DiffusionGemma do latent reasoning?</w:t>
+      </w:r>
+    </w:p>
+    <w:bookmarkStart w:id="22" w:name="tldr"/>
     <w:p>
       <w:pPr>
         <w:pStyle w:val="Heading2"/>
@@ -26,26 +25,68 @@
         <w:pStyle w:val="FirstParagraph"/>
       </w:pPr>
       <w:r>
-        <w:t xml:space="preserve">Google DeepMind’s recent model DiffusionGemma (DG) works differently from regular language models, including by passing distribution vectors in addition to tokens between generation steps. A priori, this allows it to pass information that is illegible to monitors, sometimes called</w:t>
-      </w:r>
-      <w:r>
-        <w:t xml:space="preserve"> </w:t>
-      </w:r>
-      <w:r>
-        <w:t xml:space="preserve">“latent reasoning”</w:t>
-      </w:r>
-      <w:r>
-        <w:t xml:space="preserve">. A recent paper found that DG nevertheless maintains high monitorability, but at the same time found that ablating the passed distribution degrades performance.</w:t>
-      </w:r>
-      <w:r>
-        <w:t xml:space="preserve"> </w:t>
-      </w:r>
-      <w:r>
-        <w:t xml:space="preserve">Here, we show that this performance degradation is largely a sampler artifact, supporting the case for high monitorability. Nevertheless, we find some rare cases where the distribution vector is load-bearing computationally, however in a way that is easily interpretable.</w:t>
-      </w:r>
-      <w:r>
-        <w:t xml:space="preserve"> </w:t>
-      </w:r>
+        <w:t xml:space="preserve">Google DeepMind’s recent model DiffusionGemma (DG) generates text via diffusion, meaning many diffusion steps happen before generating the final output. In particular, these diffusion steps carry</w:t>
+      </w:r>
+      <w:r>
+        <w:t xml:space="preserve"> </w:t>
+      </w:r>
+      <w:r>
+        <w:rPr>
+          <w:i/>
+          <w:iCs/>
+        </w:rPr>
+        <w:t xml:space="preserve">vectors</w:t>
+      </w:r>
+      <w:r>
+        <w:t xml:space="preserve"> </w:t>
+      </w:r>
+      <w:r>
+        <w:t xml:space="preserve">in addition to tokens. If we cannot interpret these tokens and vectors, the model has significant</w:t>
+      </w:r>
+      <w:r>
+        <w:t xml:space="preserve"> </w:t>
+      </w:r>
+      <w:hyperlink r:id="rId20">
+        <w:r>
+          <w:rPr>
+            <w:rStyle w:val="Hyperlink"/>
+          </w:rPr>
+          <w:t xml:space="preserve">opaque serial depth</w:t>
+        </w:r>
+      </w:hyperlink>
+      <w:r>
+        <w:t xml:space="preserve">, potentially harming monitorability. Recently,</w:t>
+      </w:r>
+      <w:r>
+        <w:t xml:space="preserve"> </w:t>
+      </w:r>
+      <w:hyperlink r:id="rId21">
+        <w:r>
+          <w:rPr>
+            <w:rStyle w:val="Hyperlink"/>
+          </w:rPr>
+          <w:t xml:space="preserve">Engels et al.</w:t>
+        </w:r>
+      </w:hyperlink>
+      <w:r>
+        <w:t xml:space="preserve"> </w:t>
+      </w:r>
+      <w:r>
+        <w:t xml:space="preserve">found that DG nevertheless maintains high monitorability, for instance by showing that projecting the distribution to its top-k items largely retains performance. We strengthen these results by showing that this performance degradation is largely a sampler artifact and good performance can be maintained with only the top item, supporting the case for high monitorability. Still, we also find some rare case studies where the distribution vector is load-bearing computationally, i.e. thus top-1 projection is not enough. However even in these cases, it just encodes superposition, remaining interpretable.</w:t>
+      </w:r>
+    </w:p>
+    <w:p>
+      <w:pPr>
+        <w:pStyle w:val="BodyText"/>
+      </w:pPr>
+      <w:r>
+        <w:t xml:space="preserve">Apart from model behavior, we also examined how interpretability techniques carry over to DiffusionGemma, including probes, steering, and J-lens. We find that performance is largely retained. This is a positive update on the interpretability of diffusion models that are derived from text-pretrained LLMs (an efficient training method likely to be deployed), but might not apply for more general paradigms.</w:t>
+      </w:r>
+    </w:p>
+    <w:p>
+      <w:pPr>
+        <w:pStyle w:val="BodyText"/>
+      </w:pPr>
       <w:r>
         <w:t xml:space="preserve">Overall, this supports the paper’s conclusion that DiffusionGemma remains highly monitorable, while nevertheless showing that there are cases where models can learn to use vector-valued information.</w:t>
       </w:r>
@@ -55,17 +96,122 @@
         <w:pStyle w:val="BodyText"/>
       </w:pPr>
       <w:r>
-        <w:t xml:space="preserve">Github: …</w:t>
-      </w:r>
-    </w:p>
-    <w:bookmarkEnd w:id="21"/>
-    <w:bookmarkStart w:id="24" w:name="introduction"/>
+        <w:t xml:space="preserve">Github</w:t>
+      </w:r>
+    </w:p>
+    <w:bookmarkEnd w:id="22"/>
+    <w:bookmarkStart w:id="25" w:name="introduction"/>
     <w:p>
       <w:pPr>
         <w:pStyle w:val="Heading2"/>
       </w:pPr>
       <w:r>
         <w:t xml:space="preserve">Introduction</w:t>
+      </w:r>
+    </w:p>
+    <w:p>
+      <w:pPr>
+        <w:pStyle w:val="FirstParagraph"/>
+      </w:pPr>
+      <w:r>
+        <w:t xml:space="preserve">Large language models arrive at answers to complex questions through chains-of-thought. These chains are generated token-by-token in a sequence of autoregressive steps. This gives fairly large visibility into the model’s process of arriving at the answer, and has been the main pillar for monitorability in recent years (see e.g. </w:t>
+      </w:r>
+      <w:hyperlink r:id="rId23">
+        <w:r>
+          <w:rPr>
+            <w:rStyle w:val="Hyperlink"/>
+          </w:rPr>
+          <w:t xml:space="preserve">Guan et al.</w:t>
+        </w:r>
+      </w:hyperlink>
+      <w:r>
+        <w:t xml:space="preserve">). In contrast, latent reasoning models (see</w:t>
+      </w:r>
+      <w:r>
+        <w:t xml:space="preserve"> </w:t>
+      </w:r>
+      <w:hyperlink r:id="rId24">
+        <w:r>
+          <w:rPr>
+            <w:rStyle w:val="Hyperlink"/>
+          </w:rPr>
+          <w:t xml:space="preserve">here</w:t>
+        </w:r>
+      </w:hyperlink>
+      <w:r>
+        <w:t xml:space="preserve"> </w:t>
+      </w:r>
+      <w:r>
+        <w:t xml:space="preserve">for a survey) pass</w:t>
+      </w:r>
+      <w:r>
+        <w:t xml:space="preserve"> </w:t>
+      </w:r>
+      <w:r>
+        <w:rPr>
+          <w:i/>
+          <w:iCs/>
+        </w:rPr>
+        <w:t xml:space="preserve">vectors</w:t>
+      </w:r>
+      <w:r>
+        <w:t xml:space="preserve"> </w:t>
+      </w:r>
+      <w:r>
+        <w:t xml:space="preserve">between diffusion steps, a priori destroying monitorability.</w:t>
+      </w:r>
+    </w:p>
+    <w:p>
+      <w:pPr>
+        <w:pStyle w:val="BodyText"/>
+      </w:pPr>
+      <w:r>
+        <w:t xml:space="preserve">DiffusionGemma is a particular model whose architecture allows latent reasoning, by passing a</w:t>
+      </w:r>
+      <w:r>
+        <w:t xml:space="preserve"> </w:t>
+      </w:r>
+      <w:r>
+        <w:rPr>
+          <w:b/>
+          <w:bCs/>
+        </w:rPr>
+        <w:t xml:space="preserve">vector encoding a probability distribution</w:t>
+      </w:r>
+      <w:r>
+        <w:t xml:space="preserve"> </w:t>
+      </w:r>
+      <w:r>
+        <w:t xml:space="preserve">between steps.</w:t>
+      </w:r>
+    </w:p>
+    <w:p>
+      <w:pPr>
+        <w:pStyle w:val="BodyText"/>
+      </w:pPr>
+      <w:hyperlink r:id="rId21">
+        <w:r>
+          <w:rPr>
+            <w:rStyle w:val="Hyperlink"/>
+          </w:rPr>
+          <w:t xml:space="preserve">Engels et al.</w:t>
+        </w:r>
+      </w:hyperlink>
+      <w:r>
+        <w:t xml:space="preserve"> </w:t>
+      </w:r>
+      <w:r>
+        <w:t xml:space="preserve">recently surveyed DiffusionGemma’s behavior, identifying cases where the model will use its distribution to express uncertainty about positioning of tokens. Here, we explore whether there are instances where the model uses the distribution computationally.</w:t>
+      </w:r>
+    </w:p>
+    <w:bookmarkEnd w:id="25"/>
+    <w:bookmarkStart w:id="29" w:name="background-on-diffusiongemma"/>
+    <w:p>
+      <w:pPr>
+        <w:pStyle w:val="Heading2"/>
+      </w:pPr>
+      <w:r>
+        <w:t xml:space="preserve">Background on DiffusionGemma</w:t>
       </w:r>
     </w:p>
     <w:p>
@@ -641,7 +787,7 @@
         <w:t xml:space="preserve"> </w:t>
       </w:r>
       <w:r>
-        <w:t xml:space="preserve">represents the distribution passed between diffusion steps. Importantly,</w:t>
+        <w:t xml:space="preserve">represents the distribution passed between diffusion steps. While</w:t>
       </w:r>
       <w:r>
         <w:t xml:space="preserve"> </w:t>
@@ -664,7 +810,7 @@
         <w:t xml:space="preserve"> </w:t>
       </w:r>
       <w:r>
-        <w:t xml:space="preserve">attends bidirectionally to itself, and to</w:t>
+        <w:t xml:space="preserve">attends causally to</w:t>
       </w:r>
       <w:r>
         <w:t xml:space="preserve"> </w:t>
@@ -675,7 +821,23 @@
         </m:r>
       </m:oMath>
       <w:r>
-        <w:t xml:space="preserve">.</w:t>
+        <w:t xml:space="preserve">, it attends</w:t>
+      </w:r>
+      <w:r>
+        <w:t xml:space="preserve"> </w:t>
+      </w:r>
+      <w:r>
+        <w:rPr>
+          <w:i/>
+          <w:iCs/>
+        </w:rPr>
+        <w:t xml:space="preserve">bidirectionally</w:t>
+      </w:r>
+      <w:r>
+        <w:t xml:space="preserve"> </w:t>
+      </w:r>
+      <w:r>
+        <w:t xml:space="preserve">to itself.</w:t>
       </w:r>
       <w:r>
         <w:t xml:space="preserve"> </w:t>
@@ -743,7 +905,23 @@
         </m:sSup>
       </m:oMath>
       <w:r>
-        <w:t xml:space="preserve">: unless a confidence threshold is passed,</w:t>
+        <w:t xml:space="preserve">: unless a cumulative</w:t>
+      </w:r>
+      <w:r>
+        <w:t xml:space="preserve"> </w:t>
+      </w:r>
+      <w:r>
+        <w:rPr>
+          <w:i/>
+          <w:iCs/>
+        </w:rPr>
+        <w:t xml:space="preserve">entropy bound</w:t>
+      </w:r>
+      <w:r>
+        <w:t xml:space="preserve"> </w:t>
+      </w:r>
+      <w:r>
+        <w:t xml:space="preserve">is crossed,</w:t>
       </w:r>
       <w:r>
         <w:t xml:space="preserve"> </w:t>
@@ -766,7 +944,7 @@
         <w:t xml:space="preserve"> </w:t>
       </w:r>
       <w:r>
-        <w:t xml:space="preserve">gets replaced with a random token at every step</w:t>
+        <w:t xml:space="preserve">gets replaced with a uniformly chosen random token at every step</w:t>
       </w:r>
       <w:r>
         <w:t xml:space="preserve"> </w:t>
@@ -777,29 +955,13 @@
         </m:r>
       </m:oMath>
       <w:r>
-        <w:t xml:space="preserve">, facilitating exploration and correction. This threshold is an</w:t>
-      </w:r>
-      <w:r>
-        <w:t xml:space="preserve"> </w:t>
-      </w:r>
-      <w:r>
-        <w:rPr>
-          <w:i/>
-          <w:iCs/>
-        </w:rPr>
-        <w:t xml:space="preserve">entropy bound</w:t>
-      </w:r>
-      <w:r>
-        <w:t xml:space="preserve"> </w:t>
-      </w:r>
-      <w:r>
-        <w:t xml:space="preserve">on</w:t>
-      </w:r>
-      <w:r>
-        <w:t xml:space="preserve"> </w:t>
-      </w:r>
-      <m:oMath>
-        <m:sSubSup>
+        <w:t xml:space="preserve">. The distribution</w:t>
+      </w:r>
+      <w:r>
+        <w:t xml:space="preserve"> </w:t>
+      </w:r>
+      <m:oMath>
+        <m:sSup>
           <m:e>
             <m:r>
               <m:rPr>
@@ -808,34 +970,6 @@
               <m:t>s</m:t>
             </m:r>
           </m:e>
-          <m:sub>
-            <m:r>
-              <m:t>i</m:t>
-            </m:r>
-          </m:sub>
-          <m:sup>
-            <m:r>
-              <m:t>t</m:t>
-            </m:r>
-          </m:sup>
-        </m:sSubSup>
-      </m:oMath>
-      <w:r>
-        <w:t xml:space="preserve">: positions are accepted in order of increasing entropy until the budget is spent, and every remaining position is renoised uniformly at random. The proposal tokens themselves are sampled from</w:t>
-      </w:r>
-      <w:r>
-        <w:t xml:space="preserve"> </w:t>
-      </w:r>
-      <m:oMath>
-        <m:sSup>
-          <m:e>
-            <m:r>
-              <m:rPr>
-                <m:sty m:val="b"/>
-              </m:rPr>
-              <m:t>s</m:t>
-            </m:r>
-          </m:e>
           <m:sup>
             <m:r>
               <m:t>t</m:t>
@@ -847,18 +981,7 @@
         <w:t xml:space="preserve"> </w:t>
       </w:r>
       <w:r>
-        <w:t xml:space="preserve">at a temperature that anneals over the run. Together with the total number of diffusion steps</w:t>
-      </w:r>
-      <w:r>
-        <w:t xml:space="preserve"> </w:t>
-      </w:r>
-      <m:oMath>
-        <m:r>
-          <m:t>T</m:t>
-        </m:r>
-      </m:oMath>
-      <w:r>
-        <w:t xml:space="preserve">, which caps how many refinement passes the canvas receives, these are the sampler settings we adjust below.</w:t>
+        <w:t xml:space="preserve">at every step is furthermore sharpened by a temperature rescaling the logits, which itself follows a linear cooling schedule over steps.</w:t>
       </w:r>
     </w:p>
     <w:p>
@@ -871,7 +994,7 @@
       <w:r>
         <w:t xml:space="preserve"> </w:t>
       </w:r>
-      <w:hyperlink r:id="rId22">
+      <w:hyperlink r:id="rId26">
         <w:r>
           <w:rPr>
             <w:rStyle w:val="Hyperlink"/>
@@ -880,6 +1003,23 @@
         </w:r>
       </w:hyperlink>
       <w:r>
+        <w:t xml:space="preserve"> </w:t>
+      </w:r>
+      <w:r>
+        <w:t xml:space="preserve">or the</w:t>
+      </w:r>
+      <w:r>
+        <w:t xml:space="preserve"> </w:t>
+      </w:r>
+      <w:hyperlink r:id="rId27">
+        <w:r>
+          <w:rPr>
+            <w:rStyle w:val="Hyperlink"/>
+          </w:rPr>
+          <w:t xml:space="preserve">technical report</w:t>
+        </w:r>
+      </w:hyperlink>
+      <w:r>
         <w:t xml:space="preserve">.</w:t>
       </w:r>
     </w:p>
@@ -900,9 +1040,9 @@
         </w:numPr>
       </w:pPr>
       <w:r>
-        <w:t xml:space="preserve">Generation happens as reverse diffusion, not as token-by-token autoregression. This is reminiscent of a looped transformer (</w:t>
-      </w:r>
-      <w:hyperlink r:id="rId23">
+        <w:t xml:space="preserve">Generation happens as reverse diffusion, not as token-by-token autoregression. This is reminiscent of a looped transformer (see e.g. </w:t>
+      </w:r>
+      <w:hyperlink r:id="rId28">
         <w:r>
           <w:rPr>
             <w:rStyle w:val="Hyperlink"/>
@@ -1069,8 +1209,8 @@
         <w:t xml:space="preserve">axis. A priori, this allows the model to transport drastically more information between diffusion steps in an illegible way, hindering monitorability.</w:t>
       </w:r>
     </w:p>
-    <w:bookmarkEnd w:id="24"/>
-    <w:bookmarkStart w:id="29" w:name="Xf638a3cf391e24e99a13c28ea09cc4d444ff628"/>
+    <w:bookmarkEnd w:id="29"/>
+    <w:bookmarkStart w:id="33" w:name="Xf638a3cf391e24e99a13c28ea09cc4d444ff628"/>
     <w:p>
       <w:pPr>
         <w:pStyle w:val="Heading2"/>
@@ -1089,7 +1229,7 @@
       <w:r>
         <w:t xml:space="preserve"> </w:t>
       </w:r>
-      <w:hyperlink r:id="rId25">
+      <w:hyperlink r:id="rId21">
         <w:r>
           <w:rPr>
             <w:rStyle w:val="Hyperlink"/>
@@ -1101,7 +1241,7 @@
         <w:t xml:space="preserve"> </w:t>
       </w:r>
       <w:r>
-        <w:t xml:space="preserve">found that DiffusionGemma scores similar monitorability to Gemma [maybe give more details on what they found]. However, when truncating</w:t>
+        <w:t xml:space="preserve">found that DiffusionGemma scores similar monitorability to Gemma [maybe give more details on what the paper found]. However, when truncating</w:t>
       </w:r>
       <w:r>
         <w:t xml:space="preserve"> </w:t>
@@ -1182,18 +1322,18 @@
           <wp:inline>
             <wp:extent cx="5334000" cy="4000500"/>
             <wp:effectExtent b="0" l="0" r="0" t="0"/>
-            <wp:docPr descr="GPQA truncation failure modes" title="" id="27" name="Picture"/>
+            <wp:docPr descr="GPQA truncation failure modes" title="" id="31" name="Picture"/>
             <a:graphic>
               <a:graphicData uri="http://schemas.openxmlformats.org/drawingml/2006/picture">
                 <pic:pic>
                   <pic:nvPicPr>
-                    <pic:cNvPr descr="figs/fig1_gpqa_trunc_failures.png" id="28" name="Picture"/>
+                    <pic:cNvPr descr="figs/fig1_gpqa_trunc_failures.png" id="32" name="Picture"/>
                     <pic:cNvPicPr>
                       <a:picLocks noChangeArrowheads="1" noChangeAspect="1"/>
                     </pic:cNvPicPr>
                   </pic:nvPicPr>
                   <pic:blipFill>
-                    <a:blip r:embed="rId26"/>
+                    <a:blip r:embed="rId30"/>
                     <a:stretch>
                       <a:fillRect/>
                     </a:stretch>
@@ -1294,7 +1434,7 @@
         </w:rPr>
         <w:t xml:space="preserve"> </w:t>
       </w:r>
-      <w:hyperlink r:id="rId25">
+      <w:hyperlink r:id="rId21">
         <w:r>
           <w:rPr>
             <w:rStyle w:val="Hyperlink"/>
@@ -1327,11 +1467,61 @@
           <w:i/>
           <w:iCs/>
         </w:rPr>
-        <w:t xml:space="preserve">Specifically, we use more diffusion steps, a wider temperature range, and a lower entropy bound.</w:t>
-      </w:r>
-    </w:p>
-    <w:bookmarkEnd w:id="29"/>
-    <w:bookmarkStart w:id="36" w:name="X6bead5e3ab0c7cbd57888e89c1191aa20e1e3ba"/>
+        <w:t xml:space="preserve">Specifically, we use more diffusion steps (</w:t>
+      </w:r>
+      <m:oMath>
+        <m:r>
+          <m:t>T</m:t>
+        </m:r>
+      </m:oMath>
+      <w:r>
+        <w:rPr>
+          <w:i/>
+          <w:iCs/>
+        </w:rPr>
+        <w:t xml:space="preserve"> </w:t>
+      </w:r>
+      <w:r>
+        <w:rPr>
+          <w:i/>
+          <w:iCs/>
+        </w:rPr>
+        <w:t xml:space="preserve">= 48 → 96), a wider temperature range (0.8–0.4 → 1.0–0.5), and a lower entropy bound (0.1 → 0.02), all of which contribute to stabilization. Soft denotes the untruncated distribution</w:t>
+      </w:r>
+      <w:r>
+        <w:rPr>
+          <w:i/>
+          <w:iCs/>
+        </w:rPr>
+        <w:t xml:space="preserve"> </w:t>
+      </w:r>
+      <m:oMath>
+        <m:sSup>
+          <m:e>
+            <m:r>
+              <m:rPr>
+                <m:sty m:val="b"/>
+              </m:rPr>
+              <m:t>s</m:t>
+            </m:r>
+          </m:e>
+          <m:sup>
+            <m:r>
+              <m:t>t</m:t>
+            </m:r>
+          </m:sup>
+        </m:sSup>
+      </m:oMath>
+      <w:r>
+        <w:rPr>
+          <w:i/>
+          <w:iCs/>
+        </w:rPr>
+        <w:t xml:space="preserve">.</w:t>
+      </w:r>
+    </w:p>
+    <w:bookmarkEnd w:id="33"/>
+    <w:bookmarkStart w:id="48" w:name="X6bead5e3ab0c7cbd57888e89c1191aa20e1e3ba"/>
     <w:p>
       <w:pPr>
         <w:pStyle w:val="Heading2"/>
@@ -1371,58 +1561,7 @@
         <w:t xml:space="preserve"> </w:t>
       </w:r>
       <w:r>
-        <w:t xml:space="preserve">in fact is essential. Note that in principle, there is no need for the model to use</w:t>
-      </w:r>
-      <w:r>
-        <w:t xml:space="preserve"> </w:t>
-      </w:r>
-      <m:oMath>
-        <m:sSup>
-          <m:e>
-            <m:r>
-              <m:rPr>
-                <m:sty m:val="b"/>
-              </m:rPr>
-              <m:t>S</m:t>
-            </m:r>
-          </m:e>
-          <m:sup>
-            <m:r>
-              <m:t>t</m:t>
-            </m:r>
-          </m:sup>
-        </m:sSup>
-      </m:oMath>
-      <w:r>
-        <w:t xml:space="preserve"> </w:t>
-      </w:r>
-      <w:r>
-        <w:t xml:space="preserve">whatsoever to satisfy its training objective (indeed, most of the phenomena in</w:t>
-      </w:r>
-      <w:r>
-        <w:t xml:space="preserve"> </w:t>
-      </w:r>
-      <w:hyperlink r:id="rId25">
-        <w:r>
-          <w:rPr>
-            <w:rStyle w:val="Hyperlink"/>
-          </w:rPr>
-          <w:t xml:space="preserve">Engels et al.</w:t>
-        </w:r>
-      </w:hyperlink>
-      <w:r>
-        <w:t xml:space="preserve"> </w:t>
-      </w:r>
-      <w:r>
-        <w:t xml:space="preserve">are explained by bidirectional attention+looping). However, it may facilitate trainability and exploration.</w:t>
-      </w:r>
-    </w:p>
-    <w:p>
-      <w:pPr>
-        <w:pStyle w:val="BodyText"/>
-      </w:pPr>
-      <w:r>
-        <w:t xml:space="preserve">We therefore looked for tasks where the model plausibly would hold several</w:t>
+        <w:t xml:space="preserve">in fact is essential. We looked for tasks where the model plausibly would hold several</w:t>
       </w:r>
       <w:r>
         <w:t xml:space="preserve"> </w:t>
@@ -1434,66 +1573,7 @@
         <w:t xml:space="preserve"> </w:t>
       </w:r>
       <w:r>
-        <w:t xml:space="preserve">in superposition. Note that superposition in a simple form is already present in the pretraining data (</w:t>
-      </w:r>
-      <w:r>
-        <w:rPr>
-          <w:rStyle w:val="VerbatimChar"/>
-        </w:rPr>
-        <w:t xml:space="preserve">Tomorrow the weather will be _</w:t>
-      </w:r>
-      <w:r>
-        <w:t xml:space="preserve">, with</w:t>
-      </w:r>
-      <w:r>
-        <w:t xml:space="preserve"> </w:t>
-      </w:r>
-      <w:r>
-        <w:rPr>
-          <w:rStyle w:val="VerbatimChar"/>
-        </w:rPr>
-        <w:t xml:space="preserve">rainy</w:t>
-      </w:r>
-      <w:r>
-        <w:t xml:space="preserve"> </w:t>
-      </w:r>
-      <w:r>
-        <w:t xml:space="preserve">and</w:t>
-      </w:r>
-      <w:r>
-        <w:t xml:space="preserve"> </w:t>
-      </w:r>
-      <w:r>
-        <w:rPr>
-          <w:rStyle w:val="VerbatimChar"/>
-        </w:rPr>
-        <w:t xml:space="preserve">sunny</w:t>
-      </w:r>
-      <w:r>
-        <w:t xml:space="preserve"> </w:t>
-      </w:r>
-      <w:r>
-        <w:t xml:space="preserve">both plausible), so that we were especially interested in cases where this 1) has instead been induced by the model’s generalization, 2) involves nontrivial computation (the latter is important, since some superposition may be explained by</w:t>
-      </w:r>
-      <w:r>
-        <w:t xml:space="preserve"> </w:t>
-      </w:r>
-      <w:r>
-        <w:t xml:space="preserve">“interpolating”</w:t>
-      </w:r>
-      <w:r>
-        <w:t xml:space="preserve"> </w:t>
-      </w:r>
-      <w:r>
-        <w:t xml:space="preserve">the training distribution).</w:t>
-      </w:r>
-    </w:p>
-    <w:p>
-      <w:pPr>
-        <w:pStyle w:val="BodyText"/>
-      </w:pPr>
-      <w:r>
-        <w:t xml:space="preserve">We therefore looked for a task that requires DG to make an unspecified choice, and to do a computation on that choice. Specifically, we consider</w:t>
+        <w:t xml:space="preserve">in superposition, and do computation on them in parallel. We were able to construct a case study with</w:t>
       </w:r>
       <w:r>
         <w:t xml:space="preserve"> </w:t>
@@ -1506,7 +1586,7 @@
         <w:t xml:space="preserve">letter arithmetic</w:t>
       </w:r>
       <w:r>
-        <w:t xml:space="preserve">:</w:t>
+        <w:t xml:space="preserve">, where we ask the model to shift a letter 3 down in the alphabet:</w:t>
       </w:r>
     </w:p>
     <w:p>
@@ -1732,7 +1812,23 @@
         <w:t xml:space="preserve">Letters: G, J</w:t>
       </w:r>
       <w:r>
-        <w:t xml:space="preserve">). To intervene on this computation, we capture the canvas at some intermediate denoising step</w:t>
+        <w:t xml:space="preserve">).</w:t>
+      </w:r>
+    </w:p>
+    <w:p>
+      <w:pPr>
+        <w:pStyle w:val="BodyText"/>
+      </w:pPr>
+      <w:r>
+        <w:t xml:space="preserve">We here find that DG holds a probability distribution on the starting letter. Note however that there is a natural mechanism to implement this computation: embedding letters as points on a circle and rotating by an angle of 3/26. We were not able to easily find similar parallel computation in other settings.</w:t>
+      </w:r>
+    </w:p>
+    <w:p>
+      <w:pPr>
+        <w:pStyle w:val="BodyText"/>
+      </w:pPr>
+      <w:r>
+        <w:t xml:space="preserve">To intervene on this computation, we capture the canvas at some intermediate denoising step</w:t>
       </w:r>
       <w:r>
         <w:t xml:space="preserve"> </w:t>
@@ -1820,7 +1916,7 @@
         <w:t xml:space="preserve"> </w:t>
       </w:r>
       <w:r>
-        <w:t xml:space="preserve">at the operand position. Importantly, we choose the injection such that</w:t>
+        <w:t xml:space="preserve">at the operand position. We choose the injection such that</w:t>
       </w:r>
       <w:r>
         <w:t xml:space="preserve"> </w:t>
@@ -2255,18 +2351,18 @@
           <wp:inline>
             <wp:extent cx="5334000" cy="4000500"/>
             <wp:effectExtent b="0" l="0" r="0" t="0"/>
-            <wp:docPr descr="Letter-arithmetic transfer maps" title="" id="31" name="Picture"/>
+            <wp:docPr descr="Letter-arithmetic transfer maps" title="" id="35" name="Picture"/>
             <a:graphic>
               <a:graphicData uri="http://schemas.openxmlformats.org/drawingml/2006/picture">
                 <pic:pic>
                   <pic:nvPicPr>
-                    <pic:cNvPr descr="figs/fig2a_transfer_map.png" id="32" name="Picture"/>
+                    <pic:cNvPr descr="figs/fig2a_transfer_map.png" id="36" name="Picture"/>
                     <pic:cNvPicPr>
                       <a:picLocks noChangeArrowheads="1" noChangeAspect="1"/>
                     </pic:cNvPicPr>
                   </pic:nvPicPr>
                   <pic:blipFill>
-                    <a:blip r:embed="rId30"/>
+                    <a:blip r:embed="rId34"/>
                     <a:stretch>
                       <a:fillRect/>
                     </a:stretch>
@@ -2314,6 +2410,42 @@
         </w:rPr>
         <w:t xml:space="preserve">Perturbing subleading tokens predominantly triggers a response at corresponding target tokens.</w:t>
       </w:r>
+      <w:r>
+        <w:rPr>
+          <w:i/>
+          <w:iCs/>
+        </w:rPr>
+        <w:t xml:space="preserve"> </w:t>
+      </w:r>
+      <w:r>
+        <w:rPr>
+          <w:i/>
+          <w:iCs/>
+        </w:rPr>
+        <w:t xml:space="preserve">x-axis: Injection token, y-axis: possible target tokens. Note the negative response at J, the target of the model’s natural response</w:t>
+      </w:r>
+      <w:r>
+        <w:rPr>
+          <w:i/>
+          <w:iCs/>
+        </w:rPr>
+        <w:t xml:space="preserve"> </w:t>
+      </w:r>
+      <w:r>
+        <w:rPr>
+          <w:rStyle w:val="VerbatimChar"/>
+          <w:i/>
+          <w:iCs/>
+        </w:rPr>
+        <w:t xml:space="preserve">Letters: G, J</w:t>
+      </w:r>
+      <w:r>
+        <w:rPr>
+          <w:i/>
+          <w:iCs/>
+        </w:rPr>
+        <w:t xml:space="preserve">.</w:t>
+      </w:r>
     </w:p>
     <w:p>
       <w:pPr>
@@ -2332,18 +2464,18 @@
           <wp:inline>
             <wp:extent cx="5334000" cy="2554393"/>
             <wp:effectExtent b="0" l="0" r="0" t="0"/>
-            <wp:docPr descr="Example intervention" title="" id="34" name="Picture"/>
+            <wp:docPr descr="Example intervention" title="" id="38" name="Picture"/>
             <a:graphic>
               <a:graphicData uri="http://schemas.openxmlformats.org/drawingml/2006/picture">
                 <pic:pic>
                   <pic:nvPicPr>
-                    <pic:cNvPr descr="figs/fig2a_example_intervention.png" id="35" name="Picture"/>
+                    <pic:cNvPr descr="figs/fig2a_example_intervention.png" id="39" name="Picture"/>
                     <pic:cNvPicPr>
                       <a:picLocks noChangeArrowheads="1" noChangeAspect="1"/>
                     </pic:cNvPicPr>
                   </pic:nvPicPr>
                   <pic:blipFill>
-                    <a:blip r:embed="rId33"/>
+                    <a:blip r:embed="rId37"/>
                     <a:stretch>
                       <a:fillRect/>
                     </a:stretch>
@@ -2403,7 +2535,7 @@
           <w:i/>
           <w:iCs/>
         </w:rPr>
-        <w:t xml:space="preserve">A subleading injection on</w:t>
+        <w:t xml:space="preserve">a subleading injection on</w:t>
       </w:r>
       <w:r>
         <w:rPr>
@@ -2534,17 +2666,72 @@
           <w:i/>
           <w:iCs/>
         </w:rPr>
-        <w:t xml:space="preserve">one step later.</w:t>
-      </w:r>
-    </w:p>
-    <w:bookmarkEnd w:id="36"/>
-    <w:bookmarkStart w:id="37" w:name="conclusion"/>
-    <w:p>
-      <w:pPr>
-        <w:pStyle w:val="Heading2"/>
-      </w:pPr>
-      <w:r>
-        <w:t xml:space="preserve">Conclusion</w:t>
+        <w:t xml:space="preserve">one step later. Top shows the prompt, and the model’s</w:t>
+      </w:r>
+      <w:r>
+        <w:rPr>
+          <w:i/>
+          <w:iCs/>
+        </w:rPr>
+        <w:t xml:space="preserve"> </w:t>
+      </w:r>
+      <w:r>
+        <w:rPr>
+          <w:i/>
+          <w:iCs/>
+        </w:rPr>
+        <w:t xml:space="preserve">“natural”</w:t>
+      </w:r>
+      <w:r>
+        <w:rPr>
+          <w:i/>
+          <w:iCs/>
+        </w:rPr>
+        <w:t xml:space="preserve"> </w:t>
+      </w:r>
+      <w:r>
+        <w:rPr>
+          <w:i/>
+          <w:iCs/>
+        </w:rPr>
+        <w:t xml:space="preserve">output. The lower part shows previous and next step vocabulary distributions (minor columns), for the baseline run and after intervention, respectively. Note how the</w:t>
+      </w:r>
+      <w:r>
+        <w:rPr>
+          <w:i/>
+          <w:iCs/>
+        </w:rPr>
+        <w:t xml:space="preserve"> </w:t>
+      </w:r>
+      <w:r>
+        <w:rPr>
+          <w:i/>
+          <w:iCs/>
+        </w:rPr>
+        <w:t xml:space="preserve">“natural”</w:t>
+      </w:r>
+      <w:r>
+        <w:rPr>
+          <w:i/>
+          <w:iCs/>
+        </w:rPr>
+        <w:t xml:space="preserve"> </w:t>
+      </w:r>
+      <w:r>
+        <w:rPr>
+          <w:i/>
+          <w:iCs/>
+        </w:rPr>
+        <w:t xml:space="preserve">output J loses mass due to the competing injected mass on H (purple).</w:t>
+      </w:r>
+    </w:p>
+    <w:bookmarkStart w:id="43" w:name="parallel-computation"/>
+    <w:p>
+      <w:pPr>
+        <w:pStyle w:val="Heading3"/>
+      </w:pPr>
+      <w:r>
+        <w:t xml:space="preserve">Parallel computation</w:t>
       </w:r>
     </w:p>
     <w:p>
@@ -2552,252 +2739,218 @@
         <w:pStyle w:val="FirstParagraph"/>
       </w:pPr>
       <w:r>
-        <w:t xml:space="preserve">In this post, we have studied whether DiffusionGemma has latent reasoning in terms of its vector-valued state</w:t>
-      </w:r>
-      <w:r>
-        <w:t xml:space="preserve"> </w:t>
-      </w:r>
-      <m:oMath>
-        <m:sSup>
+        <w:t xml:space="preserve">This simple response behavior begs the question whether it is possible to perturb</w:t>
+      </w:r>
+      <w:r>
+        <w:t xml:space="preserve"> </w:t>
+      </w:r>
+      <m:oMath>
+        <m:r>
+          <m:t>n</m:t>
+        </m:r>
+        <m:r>
+          <m:rPr>
+            <m:sty m:val="p"/>
+          </m:rPr>
+          <m:t>&gt;</m:t>
+        </m:r>
+        <m:r>
+          <m:t>1</m:t>
+        </m:r>
+      </m:oMath>
+      <w:r>
+        <w:t xml:space="preserve"> </w:t>
+      </w:r>
+      <w:r>
+        <w:t xml:space="preserve">source letters</w:t>
+      </w:r>
+      <w:r>
+        <w:t xml:space="preserve"> </w:t>
+      </w:r>
+      <w:r>
+        <w:rPr>
+          <w:i/>
+          <w:iCs/>
+        </w:rPr>
+        <w:t xml:space="preserve">simultaneously</w:t>
+      </w:r>
+      <w:r>
+        <w:t xml:space="preserve"> </w:t>
+      </w:r>
+      <w:r>
+        <w:t xml:space="preserve">(again, keeping them subleading) and see whether the corresponding target images respond. This would be interesting, since it would point to the model’s capacity to carry out simultaneous computation, a key advantage that latent reasoning models have on paper.</w:t>
+      </w:r>
+    </w:p>
+    <w:p>
+      <w:pPr>
+        <w:pStyle w:val="BodyText"/>
+      </w:pPr>
+      <w:r>
+        <w:t xml:space="preserve">To this end, we measured responses</w:t>
+      </w:r>
+      <w:r>
+        <w:t xml:space="preserve"> </w:t>
+      </w:r>
+      <m:oMath>
+        <m:r>
+          <m:rPr>
+            <m:sty m:val="p"/>
+          </m:rPr>
+          <m:t>⟨</m:t>
+        </m:r>
+        <m:r>
+          <m:t>R</m:t>
+        </m:r>
+        <m:sSub>
           <m:e>
             <m:r>
               <m:rPr>
-                <m:sty m:val="b"/>
+                <m:sty m:val="p"/>
               </m:rPr>
-              <m:t>s</m:t>
+              <m:t>⟩</m:t>
             </m:r>
           </m:e>
-          <m:sup>
-            <m:r>
-              <m:t>t</m:t>
-            </m:r>
-          </m:sup>
-        </m:sSup>
-      </m:oMath>
-      <w:r>
-        <w:t xml:space="preserve">. We found that top-k truncation of</w:t>
-      </w:r>
-      <w:r>
-        <w:t xml:space="preserve"> </w:t>
-      </w:r>
-      <m:oMath>
-        <m:sSup>
+          <m:sub>
+            <m:r>
+              <m:t>T</m:t>
+            </m:r>
+          </m:sub>
+        </m:sSub>
+      </m:oMath>
+      <w:r>
+        <w:t xml:space="preserve"> </w:t>
+      </w:r>
+      <w:r>
+        <w:t xml:space="preserve">and</w:t>
+      </w:r>
+      <w:r>
+        <w:t xml:space="preserve"> </w:t>
+      </w:r>
+      <m:oMath>
+        <m:r>
+          <m:rPr>
+            <m:sty m:val="p"/>
+          </m:rPr>
+          <m:t>⟨</m:t>
+        </m:r>
+        <m:r>
+          <m:t>R</m:t>
+        </m:r>
+        <m:sSub>
           <m:e>
             <m:r>
               <m:rPr>
-                <m:sty m:val="b"/>
+                <m:sty m:val="p"/>
               </m:rPr>
-              <m:t>s</m:t>
+              <m:t>⟩</m:t>
             </m:r>
           </m:e>
-          <m:sup>
-            <m:r>
-              <m:t>t</m:t>
-            </m:r>
-          </m:sup>
-        </m:sSup>
-      </m:oMath>
-      <w:r>
-        <w:t xml:space="preserve"> </w:t>
-      </w:r>
-      <w:r>
-        <w:t xml:space="preserve">largely preserves accuracy suggests that it is not</w:t>
-      </w:r>
-      <w:r>
-        <w:t xml:space="preserve"> </w:t>
-      </w:r>
-      <w:r>
-        <w:rPr>
-          <w:i/>
-          <w:iCs/>
-        </w:rPr>
-        <w:t xml:space="preserve">significantly</w:t>
-      </w:r>
-      <w:r>
-        <w:t xml:space="preserve"> </w:t>
-      </w:r>
-      <w:r>
-        <w:t xml:space="preserve">being used in typical reasoning-focused task. However, for some tasks, we found that the model can make</w:t>
-      </w:r>
-      <w:r>
-        <w:t xml:space="preserve"> </w:t>
-      </w:r>
-      <w:r>
-        <w:rPr>
-          <w:i/>
-          <w:iCs/>
-        </w:rPr>
-        <w:t xml:space="preserve">some</w:t>
-      </w:r>
-      <w:r>
-        <w:t xml:space="preserve"> </w:t>
-      </w:r>
-      <w:r>
-        <w:t xml:space="preserve">use of</w:t>
-      </w:r>
-      <w:r>
-        <w:t xml:space="preserve"> </w:t>
-      </w:r>
-      <m:oMath>
-        <m:sSup>
+          <m:sub>
+            <m:r>
+              <m:t>N</m:t>
+            </m:r>
+          </m:sub>
+        </m:sSub>
+      </m:oMath>
+      <w:r>
+        <w:t xml:space="preserve"> </w:t>
+      </w:r>
+      <w:r>
+        <w:t xml:space="preserve">averaged over the target images over the injection operand sets and images of</w:t>
+      </w:r>
+      <w:r>
+        <w:t xml:space="preserve"> </w:t>
+      </w:r>
+      <w:r>
+        <w:rPr>
+          <w:i/>
+          <w:iCs/>
+        </w:rPr>
+        <w:t xml:space="preserve">non-injected but possible operands</w:t>
+      </w:r>
+      <w:r>
+        <w:t xml:space="preserve">, respectively, and measure the</w:t>
+      </w:r>
+      <w:r>
+        <w:t xml:space="preserve"> </w:t>
+      </w:r>
+      <w:r>
+        <w:rPr>
+          <w:i/>
+          <w:iCs/>
+        </w:rPr>
+        <w:t xml:space="preserve">effect</w:t>
+      </w:r>
+      <w:r>
+        <w:t xml:space="preserve"> </w:t>
+      </w:r>
+      <m:oMath>
+        <m:r>
+          <m:t>E</m:t>
+        </m:r>
+        <m:r>
+          <m:rPr>
+            <m:sty m:val="p"/>
+          </m:rPr>
+          <m:t>=</m:t>
+        </m:r>
+        <m:r>
+          <m:rPr>
+            <m:sty m:val="p"/>
+          </m:rPr>
+          <m:t>⟨</m:t>
+        </m:r>
+        <m:r>
+          <m:t>R</m:t>
+        </m:r>
+        <m:sSub>
           <m:e>
             <m:r>
               <m:rPr>
-                <m:sty m:val="b"/>
+                <m:sty m:val="p"/>
               </m:rPr>
-              <m:t>s</m:t>
+              <m:t>⟩</m:t>
             </m:r>
           </m:e>
-          <m:sup>
-            <m:r>
-              <m:t>t</m:t>
-            </m:r>
-          </m:sup>
-        </m:sSup>
-      </m:oMath>
-      <w:r>
-        <w:t xml:space="preserve">, in terms of carrying out computation on it.</w:t>
-      </w:r>
-    </w:p>
-    <w:p>
-      <w:pPr>
-        <w:pStyle w:val="BodyText"/>
-      </w:pPr>
-      <w:r>
-        <w:t xml:space="preserve">Overall, this supports</w:t>
-      </w:r>
-      <w:r>
-        <w:t xml:space="preserve"> </w:t>
-      </w:r>
-      <w:hyperlink r:id="rId25">
-        <w:r>
-          <w:rPr>
-            <w:rStyle w:val="Hyperlink"/>
-          </w:rPr>
-          <w:t xml:space="preserve">Engels et al.</w:t>
-        </w:r>
-      </w:hyperlink>
-      <w:r>
-        <w:t xml:space="preserve">’s conclusion of a highly monitorable DiffusionGemma. In particular, we did not find any strong evidence of latent</w:t>
-      </w:r>
-      <w:r>
-        <w:t xml:space="preserve"> </w:t>
-      </w:r>
-      <w:r>
-        <w:rPr>
-          <w:i/>
-          <w:iCs/>
-        </w:rPr>
-        <w:t xml:space="preserve">reasoning</w:t>
-      </w:r>
-      <w:r>
-        <w:t xml:space="preserve">, as in using</w:t>
-      </w:r>
-      <w:r>
-        <w:t xml:space="preserve"> </w:t>
-      </w:r>
-      <m:oMath>
-        <m:sSup>
+          <m:sub>
+            <m:r>
+              <m:t>T</m:t>
+            </m:r>
+          </m:sub>
+        </m:sSub>
+        <m:r>
+          <m:rPr>
+            <m:sty m:val="p"/>
+          </m:rPr>
+          <m:t>−</m:t>
+        </m:r>
+        <m:r>
+          <m:rPr>
+            <m:sty m:val="p"/>
+          </m:rPr>
+          <m:t>⟨</m:t>
+        </m:r>
+        <m:r>
+          <m:t>R</m:t>
+        </m:r>
+        <m:sSub>
           <m:e>
             <m:r>
               <m:rPr>
-                <m:sty m:val="b"/>
+                <m:sty m:val="p"/>
               </m:rPr>
-              <m:t>s</m:t>
+              <m:t>⟩</m:t>
             </m:r>
           </m:e>
-          <m:sup>
-            <m:r>
-              <m:t>t</m:t>
-            </m:r>
-          </m:sup>
-        </m:sSup>
-      </m:oMath>
-      <w:r>
-        <w:t xml:space="preserve"> </w:t>
-      </w:r>
-      <w:r>
-        <w:t xml:space="preserve">in a way that carries out meaningful computation and is opaque.</w:t>
-      </w:r>
-    </w:p>
-    <w:p>
-      <w:pPr>
-        <w:pStyle w:val="BodyText"/>
-      </w:pPr>
-      <w:r>
-        <w:t xml:space="preserve">Going forward, these largely negative results are an update that</w:t>
-      </w:r>
-      <w:r>
-        <w:t xml:space="preserve"> </w:t>
-      </w:r>
-      <w:r>
-        <w:t xml:space="preserve">“true”</w:t>
-      </w:r>
-      <w:r>
-        <w:t xml:space="preserve"> </w:t>
-      </w:r>
-      <w:r>
-        <w:t xml:space="preserve">latent reasoning is somewhat hard to learn. However, there already exist models like CODI that pass a vector-valued state that is not clearly a superposition of tokens, though they so far don’t show superior performance. We believe that finding methods to better interpret such models is an important area of research.</w:t>
-      </w:r>
-    </w:p>
-    <w:bookmarkEnd w:id="37"/>
-    <w:bookmarkStart w:id="89" w:name="appendix"/>
-    <w:p>
-      <w:pPr>
-        <w:pStyle w:val="Heading2"/>
-      </w:pPr>
-      <w:r>
-        <w:t xml:space="preserve">Appendix</w:t>
-      </w:r>
-    </w:p>
-    <w:p>
-      <w:pPr>
-        <w:pStyle w:val="FirstParagraph"/>
-      </w:pPr>
-      <w:r>
-        <w:t xml:space="preserve">The findings by</w:t>
-      </w:r>
-      <w:r>
-        <w:t xml:space="preserve"> </w:t>
-      </w:r>
-      <w:hyperlink r:id="rId25">
-        <w:r>
-          <w:rPr>
-            <w:rStyle w:val="Hyperlink"/>
-          </w:rPr>
-          <w:t xml:space="preserve">Engels et al.</w:t>
-        </w:r>
-      </w:hyperlink>
-      <w:r>
-        <w:t xml:space="preserve"> </w:t>
-      </w:r>
-      <w:r>
-        <w:t xml:space="preserve">and in this post have focused on DiffusionGemma’s behavior. We here study whether the model’s representation supports the behavioral finding of high monitorability.</w:t>
-      </w:r>
-    </w:p>
-    <w:bookmarkStart w:id="42" w:name="representation-similarity"/>
-    <w:p>
-      <w:pPr>
-        <w:pStyle w:val="Heading3"/>
-      </w:pPr>
-      <w:r>
-        <w:t xml:space="preserve">Representation similarity</w:t>
-      </w:r>
-    </w:p>
-    <w:p>
-      <w:pPr>
-        <w:pStyle w:val="FirstParagraph"/>
-      </w:pPr>
-      <w:r>
-        <w:t xml:space="preserve">We first ask about how the representation changes between Gemma and DiffusionGemma, and then will ask about functional implications.</w:t>
-      </w:r>
-    </w:p>
-    <w:p>
-      <w:pPr>
-        <w:pStyle w:val="BodyText"/>
-      </w:pPr>
-      <w:r>
-        <w:t xml:space="preserve">A simple way is to just measure overlap between pairs of inputs, where each element of the pair is fed through Gemma or DiffusionGemma, respectively. We here compare a simple cosine similarity, and centered kernel analysis (CKA, a measure that is invariant to global rotations of the representation).</w:t>
+          <m:sub>
+            <m:r>
+              <m:t>N</m:t>
+            </m:r>
+          </m:sub>
+        </m:sSub>
+      </m:oMath>
+      <w:r>
+        <w:t xml:space="preserve">. We then report the fraction of simultaneous injections that has positive response on all targets, as well as a null hypothesis if tokens would respond randomly.</w:t>
       </w:r>
     </w:p>
     <w:p>
@@ -2807,20 +2960,589 @@
       <w:r>
         <w:drawing>
           <wp:inline>
-            <wp:extent cx="5334000" cy="2125265"/>
+            <wp:extent cx="5334000" cy="4513384"/>
             <wp:effectExtent b="0" l="0" r="0" t="0"/>
-            <wp:docPr descr="RSA cosine and CKA" title="" id="39" name="Picture"/>
+            <wp:docPr descr="Parallel injection fraction" title="" id="41" name="Picture"/>
             <a:graphic>
               <a:graphicData uri="http://schemas.openxmlformats.org/drawingml/2006/picture">
                 <pic:pic>
                   <pic:nvPicPr>
-                    <pic:cNvPr descr="figs/figA1_rsa_cosine_cka.png" id="40" name="Picture"/>
+                    <pic:cNvPr descr="figs/fig2c_parallel_frac.png" id="42" name="Picture"/>
                     <pic:cNvPicPr>
                       <a:picLocks noChangeArrowheads="1" noChangeAspect="1"/>
                     </pic:cNvPicPr>
                   </pic:nvPicPr>
                   <pic:blipFill>
-                    <a:blip r:embed="rId38"/>
+                    <a:blip r:embed="rId40"/>
+                    <a:stretch>
+                      <a:fillRect/>
+                    </a:stretch>
+                  </pic:blipFill>
+                  <pic:spPr bwMode="auto">
+                    <a:xfrm>
+                      <a:off x="0" y="0"/>
+                      <a:ext cx="5334000" cy="4513384"/>
+                    </a:xfrm>
+                    <a:prstGeom prst="rect">
+                      <a:avLst/>
+                    </a:prstGeom>
+                    <a:noFill/>
+                    <a:ln w="9525">
+                      <a:noFill/>
+                      <a:headEnd/>
+                      <a:tailEnd/>
+                    </a:ln>
+                  </pic:spPr>
+                </pic:pic>
+              </a:graphicData>
+            </a:graphic>
+          </wp:inline>
+        </w:drawing>
+      </w:r>
+    </w:p>
+    <w:p>
+      <w:pPr>
+        <w:pStyle w:val="ImageCaption"/>
+      </w:pPr>
+      <w:r>
+        <w:t xml:space="preserve">Parallel injection fraction</w:t>
+      </w:r>
+    </w:p>
+    <w:p>
+      <w:pPr>
+        <w:pStyle w:val="BodyText"/>
+      </w:pPr>
+      <w:r>
+        <w:rPr>
+          <w:b/>
+          <w:bCs/>
+          <w:i/>
+          <w:iCs/>
+        </w:rPr>
+        <w:t xml:space="preserve">DiffusionGemma responds to multiple injections in parallel, more than expected by chance.</w:t>
+      </w:r>
+      <w:r>
+        <w:rPr>
+          <w:i/>
+          <w:iCs/>
+        </w:rPr>
+        <w:t xml:space="preserve"> </w:t>
+      </w:r>
+      <w:r>
+        <w:rPr>
+          <w:i/>
+          <w:iCs/>
+        </w:rPr>
+        <w:t xml:space="preserve">Error bars are 95% CIs over possible injection operand sets.</w:t>
+      </w:r>
+    </w:p>
+    <w:p>
+      <w:pPr>
+        <w:pStyle w:val="BodyText"/>
+      </w:pPr>
+      <w:r>
+        <w:t xml:space="preserve">We observe that the average target response exceeds the non-target response for all injected members more often than chance, averaged over possible injection sets. This behavior is plausible considering the computation in question: a shift is easily implemented by a linear operation in representation space. Therefore by linearity, superpositions of letters will be transported to superpositions of responses. Overall, this leaves an interpretable picture.</w:t>
+      </w:r>
+    </w:p>
+    <w:p>
+      <w:pPr>
+        <w:pStyle w:val="BodyText"/>
+      </w:pPr>
+      <w:r>
+        <w:t xml:space="preserve">In contrast, we found that for multiplication (e.g. letter × 3) or taking the absolute value, there was no significant effect.</w:t>
+      </w:r>
+    </w:p>
+    <w:bookmarkEnd w:id="43"/>
+    <w:bookmarkStart w:id="47" w:name="Xea3042850cf8050407ffdd53c2454b5f83a5608"/>
+    <w:p>
+      <w:pPr>
+        <w:pStyle w:val="Heading3"/>
+      </w:pPr>
+      <w:r>
+        <w:t xml:space="preserve">Autonomous computational usage of</w:t>
+      </w:r>
+      <w:r>
+        <w:t xml:space="preserve"> </w:t>
+      </w:r>
+      <m:oMath>
+        <m:sSup>
+          <m:e>
+            <m:r>
+              <m:rPr>
+                <m:sty m:val="b"/>
+              </m:rPr>
+              <m:t>s</m:t>
+            </m:r>
+          </m:e>
+          <m:sup>
+            <m:r>
+              <m:t>t</m:t>
+            </m:r>
+          </m:sup>
+        </m:sSup>
+      </m:oMath>
+    </w:p>
+    <w:p>
+      <w:pPr>
+        <w:pStyle w:val="FirstParagraph"/>
+      </w:pPr>
+      <w:r>
+        <w:t xml:space="preserve">In the previous</w:t>
+      </w:r>
+      <w:r>
+        <w:t xml:space="preserve"> </w:t>
+      </w:r>
+      <w:r>
+        <w:rPr>
+          <w:i/>
+          <w:iCs/>
+        </w:rPr>
+        <w:t xml:space="preserve">letter arithmetic</w:t>
+      </w:r>
+      <w:r>
+        <w:t xml:space="preserve"> </w:t>
+      </w:r>
+      <w:r>
+        <w:t xml:space="preserve">task, DiffusionGemma did respond to modifications of the distributional state in the way we expected. While suggestive, it is unclear if the model also would make use of</w:t>
+      </w:r>
+      <w:r>
+        <w:t xml:space="preserve"> </w:t>
+      </w:r>
+      <m:oMath>
+        <m:sSup>
+          <m:e>
+            <m:r>
+              <m:rPr>
+                <m:sty m:val="b"/>
+              </m:rPr>
+              <m:t>s</m:t>
+            </m:r>
+          </m:e>
+          <m:sup>
+            <m:r>
+              <m:t>t</m:t>
+            </m:r>
+          </m:sup>
+        </m:sSup>
+      </m:oMath>
+      <w:r>
+        <w:t xml:space="preserve"> </w:t>
+      </w:r>
+      <w:r>
+        <w:rPr>
+          <w:i/>
+          <w:iCs/>
+        </w:rPr>
+        <w:t xml:space="preserve">autonomously</w:t>
+      </w:r>
+      <w:r>
+        <w:t xml:space="preserve">, i.e. without interventions.</w:t>
+      </w:r>
+    </w:p>
+    <w:p>
+      <w:pPr>
+        <w:pStyle w:val="BodyText"/>
+      </w:pPr>
+      <w:r>
+        <w:t xml:space="preserve">To investigate this, we searched for a non-trivial (i.e., not just a binary choice) task where DG will use a hypothesis subleading in its distribution. An instance we found is a</w:t>
+      </w:r>
+      <w:r>
+        <w:t xml:space="preserve"> </w:t>
+      </w:r>
+      <w:r>
+        <w:rPr>
+          <w:i/>
+          <w:iCs/>
+        </w:rPr>
+        <w:t xml:space="preserve">word-level palindrome</w:t>
+      </w:r>
+      <w:r>
+        <w:t xml:space="preserve"> </w:t>
+      </w:r>
+      <w:r>
+        <w:t xml:space="preserve">task. We ask the model</w:t>
+      </w:r>
+      <w:r>
+        <w:t xml:space="preserve"> </w:t>
+      </w:r>
+      <w:r>
+        <w:rPr>
+          <w:rStyle w:val="VerbatimChar"/>
+        </w:rPr>
+        <w:t xml:space="preserve">Please write a word-level palindrome</w:t>
+      </w:r>
+      <w:r>
+        <w:t xml:space="preserve">. DG maintains two competing completions of the same canvas: a literal</w:t>
+      </w:r>
+      <w:r>
+        <w:t xml:space="preserve"> </w:t>
+      </w:r>
+      <w:r>
+        <w:rPr>
+          <w:i/>
+          <w:iCs/>
+        </w:rPr>
+        <w:t xml:space="preserve">seasonal</w:t>
+      </w:r>
+      <w:r>
+        <w:t xml:space="preserve"> </w:t>
+      </w:r>
+      <w:r>
+        <w:t xml:space="preserve">phrase (</w:t>
+      </w:r>
+      <w:r>
+        <w:rPr>
+          <w:rStyle w:val="VerbatimChar"/>
+        </w:rPr>
+        <w:t xml:space="preserve">fall leaves as soon as leaves fall</w:t>
+      </w:r>
+      <w:r>
+        <w:t xml:space="preserve">) and a well-known</w:t>
+      </w:r>
+      <w:r>
+        <w:t xml:space="preserve"> </w:t>
+      </w:r>
+      <w:r>
+        <w:rPr>
+          <w:i/>
+          <w:iCs/>
+        </w:rPr>
+        <w:t xml:space="preserve">idiom</w:t>
+      </w:r>
+      <w:r>
+        <w:t xml:space="preserve"> </w:t>
+      </w:r>
+      <w:r>
+        <w:t xml:space="preserve">(</w:t>
+      </w:r>
+      <w:r>
+        <w:rPr>
+          <w:rStyle w:val="VerbatimChar"/>
+        </w:rPr>
+        <w:t xml:space="preserve">all for one and one for all</w:t>
+      </w:r>
+      <w:r>
+        <w:t xml:space="preserve">). We measure how the probability mass of these two typical outcomes, summed over positions, varies over the course of diffusion.</w:t>
+      </w:r>
+    </w:p>
+    <w:p>
+      <w:pPr>
+        <w:pStyle w:val="CaptionedFigure"/>
+      </w:pPr>
+      <w:r>
+        <w:drawing>
+          <wp:inline>
+            <wp:extent cx="5334000" cy="2956891"/>
+            <wp:effectExtent b="0" l="0" r="0" t="0"/>
+            <wp:docPr descr="Seasonal vs idiom: ablation" title="" id="45" name="Picture"/>
+            <a:graphic>
+              <a:graphicData uri="http://schemas.openxmlformats.org/drawingml/2006/picture">
+                <pic:pic>
+                  <pic:nvPicPr>
+                    <pic:cNvPr descr="figs/figA5_seasonal_ember_kill.png" id="46" name="Picture"/>
+                    <pic:cNvPicPr>
+                      <a:picLocks noChangeArrowheads="1" noChangeAspect="1"/>
+                    </pic:cNvPicPr>
+                  </pic:nvPicPr>
+                  <pic:blipFill>
+                    <a:blip r:embed="rId44"/>
+                    <a:stretch>
+                      <a:fillRect/>
+                    </a:stretch>
+                  </pic:blipFill>
+                  <pic:spPr bwMode="auto">
+                    <a:xfrm>
+                      <a:off x="0" y="0"/>
+                      <a:ext cx="5334000" cy="2956891"/>
+                    </a:xfrm>
+                    <a:prstGeom prst="rect">
+                      <a:avLst/>
+                    </a:prstGeom>
+                    <a:noFill/>
+                    <a:ln w="9525">
+                      <a:noFill/>
+                      <a:headEnd/>
+                      <a:tailEnd/>
+                    </a:ln>
+                  </pic:spPr>
+                </pic:pic>
+              </a:graphicData>
+            </a:graphic>
+          </wp:inline>
+        </w:drawing>
+      </w:r>
+    </w:p>
+    <w:p>
+      <w:pPr>
+        <w:pStyle w:val="ImageCaption"/>
+      </w:pPr>
+      <w:r>
+        <w:t xml:space="preserve">Seasonal vs idiom: ablation</w:t>
+      </w:r>
+    </w:p>
+    <w:p>
+      <w:pPr>
+        <w:pStyle w:val="BodyText"/>
+      </w:pPr>
+      <w:r>
+        <w:rPr>
+          <w:b/>
+          <w:bCs/>
+          <w:i/>
+          <w:iCs/>
+        </w:rPr>
+        <w:t xml:space="preserve">Ablating a nascent contender can prevent takeover (during an intermediate step window).</w:t>
+      </w:r>
+      <w:r>
+        <w:rPr>
+          <w:i/>
+          <w:iCs/>
+        </w:rPr>
+        <w:t xml:space="preserve"> </w:t>
+      </w:r>
+      <w:r>
+        <w:rPr>
+          <w:i/>
+          <w:iCs/>
+        </w:rPr>
+        <w:t xml:space="preserve">Probability mass of the two completions at the contested slots, summed over comprising tokens (black: idiom, purple: seasonal). Top row: Base run without interventions. Bottom row: ablation of the idiom’s probability mass (red) beyond step</w:t>
+      </w:r>
+      <w:r>
+        <w:rPr>
+          <w:i/>
+          <w:iCs/>
+        </w:rPr>
+        <w:t xml:space="preserve"> </w:t>
+      </w:r>
+      <m:oMath>
+        <m:r>
+          <m:t>t</m:t>
+        </m:r>
+        <m:r>
+          <m:rPr>
+            <m:sty m:val="p"/>
+          </m:rPr>
+          <m:t>=</m:t>
+        </m:r>
+        <m:r>
+          <m:t>2</m:t>
+        </m:r>
+      </m:oMath>
+      <w:r>
+        <w:rPr>
+          <w:i/>
+          <w:iCs/>
+        </w:rPr>
+        <w:t xml:space="preserve">.</w:t>
+      </w:r>
+    </w:p>
+    <w:p>
+      <w:pPr>
+        <w:pStyle w:val="BodyText"/>
+      </w:pPr>
+      <w:r>
+        <w:t xml:space="preserve">The canvas will read the</w:t>
+      </w:r>
+      <w:r>
+        <w:t xml:space="preserve"> </w:t>
+      </w:r>
+      <w:r>
+        <w:rPr>
+          <w:i/>
+          <w:iCs/>
+        </w:rPr>
+        <w:t xml:space="preserve">seasonal</w:t>
+      </w:r>
+      <w:r>
+        <w:t xml:space="preserve"> </w:t>
+      </w:r>
+      <w:r>
+        <w:t xml:space="preserve">answer for the first few diffusion steps, after which it flips and stays at</w:t>
+      </w:r>
+      <w:r>
+        <w:t xml:space="preserve"> </w:t>
+      </w:r>
+      <w:r>
+        <w:rPr>
+          <w:i/>
+          <w:iCs/>
+        </w:rPr>
+        <w:t xml:space="preserve">idiom</w:t>
+      </w:r>
+      <w:r>
+        <w:t xml:space="preserve">. Interestingly, this is accompanied by</w:t>
+      </w:r>
+      <w:r>
+        <w:t xml:space="preserve"> </w:t>
+      </w:r>
+      <w:r>
+        <w:rPr>
+          <w:i/>
+          <w:iCs/>
+        </w:rPr>
+        <w:t xml:space="preserve">dynamics</w:t>
+      </w:r>
+      <w:r>
+        <w:t xml:space="preserve"> </w:t>
+      </w:r>
+      <w:r>
+        <w:t xml:space="preserve">in</w:t>
+      </w:r>
+      <w:r>
+        <w:t xml:space="preserve"> </w:t>
+      </w:r>
+      <m:oMath>
+        <m:sSup>
+          <m:e>
+            <m:r>
+              <m:rPr>
+                <m:sty m:val="b"/>
+              </m:rPr>
+              <m:t>s</m:t>
+            </m:r>
+          </m:e>
+          <m:sup>
+            <m:r>
+              <m:t>t</m:t>
+            </m:r>
+          </m:sup>
+        </m:sSup>
+      </m:oMath>
+      <w:r>
+        <w:t xml:space="preserve">:</w:t>
+      </w:r>
+      <w:r>
+        <w:t xml:space="preserve"> </w:t>
+      </w:r>
+      <w:r>
+        <w:rPr>
+          <w:i/>
+          <w:iCs/>
+        </w:rPr>
+        <w:t xml:space="preserve">idiom</w:t>
+      </w:r>
+      <w:r>
+        <w:t xml:space="preserve"> </w:t>
+      </w:r>
+      <w:r>
+        <w:t xml:space="preserve">will start at ~0, and progressively gain weight, replacing</w:t>
+      </w:r>
+      <w:r>
+        <w:t xml:space="preserve"> </w:t>
+      </w:r>
+      <w:r>
+        <w:rPr>
+          <w:i/>
+          <w:iCs/>
+        </w:rPr>
+        <w:t xml:space="preserve">seasonal</w:t>
+      </w:r>
+      <w:r>
+        <w:t xml:space="preserve">.</w:t>
+      </w:r>
+    </w:p>
+    <w:p>
+      <w:pPr>
+        <w:pStyle w:val="BodyText"/>
+      </w:pPr>
+      <w:r>
+        <w:t xml:space="preserve">We validated that the emergence of</w:t>
+      </w:r>
+      <w:r>
+        <w:t xml:space="preserve"> </w:t>
+      </w:r>
+      <w:r>
+        <w:rPr>
+          <w:i/>
+          <w:iCs/>
+        </w:rPr>
+        <w:t xml:space="preserve">idiom</w:t>
+      </w:r>
+      <w:r>
+        <w:t xml:space="preserve"> </w:t>
+      </w:r>
+      <w:r>
+        <w:t xml:space="preserve">is indeed causal: when ablating</w:t>
+      </w:r>
+      <w:r>
+        <w:t xml:space="preserve"> </w:t>
+      </w:r>
+      <w:r>
+        <w:rPr>
+          <w:i/>
+          <w:iCs/>
+        </w:rPr>
+        <w:t xml:space="preserve">idiom</w:t>
+      </w:r>
+      <w:r>
+        <w:t xml:space="preserve">’s tokens, the transition can be prevented. Note however that early and late ablation do not have this effect.</w:t>
+      </w:r>
+    </w:p>
+    <w:bookmarkEnd w:id="47"/>
+    <w:bookmarkEnd w:id="48"/>
+    <w:bookmarkStart w:id="73" w:name="transfer-of-interpretability-techniques"/>
+    <w:p>
+      <w:pPr>
+        <w:pStyle w:val="Heading2"/>
+      </w:pPr>
+      <w:r>
+        <w:t xml:space="preserve">Transfer of interpretability techniques</w:t>
+      </w:r>
+    </w:p>
+    <w:p>
+      <w:pPr>
+        <w:pStyle w:val="FirstParagraph"/>
+      </w:pPr>
+      <w:r>
+        <w:t xml:space="preserve">So far, we have focused on DiffusionGemma’s behavior. We here study whether the model’s representation supports the behavioral finding of high monitorability.</w:t>
+      </w:r>
+    </w:p>
+    <w:bookmarkStart w:id="53" w:name="representation-similarity"/>
+    <w:p>
+      <w:pPr>
+        <w:pStyle w:val="Heading3"/>
+      </w:pPr>
+      <w:r>
+        <w:t xml:space="preserve">Representation similarity</w:t>
+      </w:r>
+    </w:p>
+    <w:p>
+      <w:pPr>
+        <w:pStyle w:val="FirstParagraph"/>
+      </w:pPr>
+      <w:r>
+        <w:t xml:space="preserve">We first ask about how the representation changes between Gemma and DiffusionGemma, and then will ask about functional implications.</w:t>
+      </w:r>
+    </w:p>
+    <w:p>
+      <w:pPr>
+        <w:pStyle w:val="BodyText"/>
+      </w:pPr>
+      <w:r>
+        <w:t xml:space="preserve">A simple way is to just measure overlap between pairs of inputs, where each element of the pair is fed through Gemma or DiffusionGemma, respectively. We here compare a simple cosine similarity, and centered kernel analysis (CKA, a measure that is invariant to global rotations of the representation).</w:t>
+      </w:r>
+    </w:p>
+    <w:p>
+      <w:pPr>
+        <w:pStyle w:val="CaptionedFigure"/>
+      </w:pPr>
+      <w:r>
+        <w:drawing>
+          <wp:inline>
+            <wp:extent cx="5334000" cy="2125265"/>
+            <wp:effectExtent b="0" l="0" r="0" t="0"/>
+            <wp:docPr descr="RSA cosine and CKA" title="" id="50" name="Picture"/>
+            <a:graphic>
+              <a:graphicData uri="http://schemas.openxmlformats.org/drawingml/2006/picture">
+                <pic:pic>
+                  <pic:nvPicPr>
+                    <pic:cNvPr descr="figs/figA1_rsa_cosine_cka.png" id="51" name="Picture"/>
+                    <pic:cNvPicPr>
+                      <a:picLocks noChangeArrowheads="1" noChangeAspect="1"/>
+                    </pic:cNvPicPr>
+                  </pic:nvPicPr>
+                  <pic:blipFill>
+                    <a:blip r:embed="rId49"/>
                     <a:stretch>
                       <a:fillRect/>
                     </a:stretch>
@@ -2882,7 +3604,7 @@
         </w:rPr>
         <w:t xml:space="preserve">Inputs are concepts from (</w:t>
       </w:r>
-      <w:hyperlink r:id="rId41">
+      <w:hyperlink r:id="rId52">
         <w:r>
           <w:rPr>
             <w:rStyle w:val="Hyperlink"/>
@@ -2908,8 +3630,8 @@
         <w:t xml:space="preserve">A priori, this rather large drop suggests a significant change in how the representation is organized, which we then went on to test more specifically.</w:t>
       </w:r>
     </w:p>
-    <w:bookmarkEnd w:id="42"/>
-    <w:bookmarkStart w:id="47" w:name="probe-retention"/>
+    <w:bookmarkEnd w:id="53"/>
+    <w:bookmarkStart w:id="58" w:name="probe-retention"/>
     <w:p>
       <w:pPr>
         <w:pStyle w:val="Heading3"/>
@@ -2925,7 +3647,7 @@
       <w:r>
         <w:t xml:space="preserve">Probing allows us to study how well a model separates concepts. We use 56 binary concept datasets from the SAE-Probes benchmark (</w:t>
       </w:r>
-      <w:hyperlink r:id="rId41">
+      <w:hyperlink r:id="rId52">
         <w:r>
           <w:rPr>
             <w:rStyle w:val="Hyperlink"/>
@@ -2934,7 +3656,7 @@
         </w:r>
       </w:hyperlink>
       <w:r>
-        <w:t xml:space="preserve">) and train logistic-regression probes on gemma-4’s residual stream (up to 1024 training examples per concept; 43/56 at the full budget, minimum 512; 256 held-out), optimizing the layer via heldout AUC. We then test this probe on DG.</w:t>
+        <w:t xml:space="preserve">) and train logistic-regression probes on gemma-4’s residual stream (≤ 1024 training examples for most concepts, 256 held-out), optimizing the layer via heldout AUC. We then test this probe on DG.</w:t>
       </w:r>
     </w:p>
     <w:p>
@@ -2946,18 +3668,18 @@
           <wp:inline>
             <wp:extent cx="5334000" cy="3810846"/>
             <wp:effectExtent b="0" l="0" r="0" t="0"/>
-            <wp:docPr descr="Probe retention" title="" id="44" name="Picture"/>
+            <wp:docPr descr="Probe retention" title="" id="55" name="Picture"/>
             <a:graphic>
               <a:graphicData uri="http://schemas.openxmlformats.org/drawingml/2006/picture">
                 <pic:pic>
                   <pic:nvPicPr>
-                    <pic:cNvPr descr="figs/figA2_probe_retention.png" id="45" name="Picture"/>
+                    <pic:cNvPr descr="figs/figA2_probe_retention.png" id="56" name="Picture"/>
                     <pic:cNvPicPr>
                       <a:picLocks noChangeArrowheads="1" noChangeAspect="1"/>
                     </pic:cNvPicPr>
                   </pic:nvPicPr>
                   <pic:blipFill>
-                    <a:blip r:embed="rId43"/>
+                    <a:blip r:embed="rId54"/>
                     <a:stretch>
                       <a:fillRect/>
                     </a:stretch>
@@ -3048,7 +3770,7 @@
         <w:t xml:space="preserve">= the probe reads the residual at the last token.</w:t>
       </w:r>
     </w:p>
-    <w:bookmarkStart w:id="46" w:name="Xe54800880311e20d4783ff8070e763dcf274742"/>
+    <w:bookmarkStart w:id="57" w:name="Xe54800880311e20d4783ff8070e763dcf274742"/>
     <w:p>
       <w:pPr>
         <w:pStyle w:val="Heading4"/>
@@ -3081,9 +3803,9 @@
         <w:t xml:space="preserve">attention mode yields a somewhat higher AUC. This is suggestive of DG’s bidirectional attention yielding a better structured representation, but is confounded by potentially longer training.</w:t>
       </w:r>
     </w:p>
-    <w:bookmarkEnd w:id="46"/>
-    <w:bookmarkEnd w:id="47"/>
-    <w:bookmarkStart w:id="52" w:name="steering-retention"/>
+    <w:bookmarkEnd w:id="57"/>
+    <w:bookmarkEnd w:id="58"/>
+    <w:bookmarkStart w:id="63" w:name="steering-retention"/>
     <w:p>
       <w:pPr>
         <w:pStyle w:val="Heading3"/>
@@ -3099,7 +3821,7 @@
       <w:r>
         <w:t xml:space="preserve">To see whether these similarities in representation are causally load-bearing, we consider the steering experiments from the RepE paper (</w:t>
       </w:r>
-      <w:hyperlink r:id="rId48">
+      <w:hyperlink r:id="rId59">
         <w:r>
           <w:rPr>
             <w:rStyle w:val="Hyperlink"/>
@@ -3543,18 +4265,18 @@
           <wp:inline>
             <wp:extent cx="5334000" cy="6394873"/>
             <wp:effectExtent b="0" l="0" r="0" t="0"/>
-            <wp:docPr descr="Steering retention" title="" id="50" name="Picture"/>
+            <wp:docPr descr="Steering retention" title="" id="61" name="Picture"/>
             <a:graphic>
               <a:graphicData uri="http://schemas.openxmlformats.org/drawingml/2006/picture">
                 <pic:pic>
                   <pic:nvPicPr>
-                    <pic:cNvPr descr="figs/figA3_steer_retention.png" id="51" name="Picture"/>
+                    <pic:cNvPr descr="figs/figA3_steer_retention.png" id="62" name="Picture"/>
                     <pic:cNvPicPr>
                       <a:picLocks noChangeArrowheads="1" noChangeAspect="1"/>
                     </pic:cNvPicPr>
                   </pic:nvPicPr>
                   <pic:blipFill>
-                    <a:blip r:embed="rId49"/>
+                    <a:blip r:embed="rId60"/>
                     <a:stretch>
                       <a:fillRect/>
                     </a:stretch>
@@ -3645,8 +4367,8 @@
         <w:t xml:space="preserve">= the direction is added over the last 80% of prompt positions.</w:t>
       </w:r>
     </w:p>
-    <w:bookmarkEnd w:id="52"/>
-    <w:bookmarkStart w:id="64" w:name="j-lens-retention"/>
+    <w:bookmarkEnd w:id="63"/>
+    <w:bookmarkStart w:id="72" w:name="j-lens-retention"/>
     <w:p>
       <w:pPr>
         <w:pStyle w:val="Heading3"/>
@@ -3665,7 +4387,7 @@
       <w:r>
         <w:t xml:space="preserve"> </w:t>
       </w:r>
-      <w:hyperlink r:id="rId53">
+      <w:hyperlink r:id="rId64">
         <w:r>
           <w:rPr>
             <w:rStyle w:val="Hyperlink"/>
@@ -3677,7 +4399,7 @@
         <w:t xml:space="preserve"> </w:t>
       </w:r>
       <w:r>
-        <w:t xml:space="preserve">reads out what a residual-stream activation</w:t>
+        <w:t xml:space="preserve">describes how a residual-stream activation</w:t>
       </w:r>
       <w:r>
         <w:t xml:space="preserve"> </w:t>
@@ -3703,7 +4425,7 @@
         <w:t xml:space="preserve"> </w:t>
       </w:r>
       <w:r>
-        <w:t xml:space="preserve">would make the model say: It linearly transports</w:t>
+        <w:t xml:space="preserve">affects future output, on average. It linearly transports</w:t>
       </w:r>
       <w:r>
         <w:t xml:space="preserve"> </w:t>
@@ -3971,18 +4693,18 @@
           <wp:inline>
             <wp:extent cx="5334000" cy="4296833"/>
             <wp:effectExtent b="0" l="0" r="0" t="0"/>
-            <wp:docPr descr="J-Lens retention" title="" id="55" name="Picture"/>
+            <wp:docPr descr="J-Lens retention" title="" id="66" name="Picture"/>
             <a:graphic>
               <a:graphicData uri="http://schemas.openxmlformats.org/drawingml/2006/picture">
                 <pic:pic>
                   <pic:nvPicPr>
-                    <pic:cNvPr descr="figs/figA4_jlens_retention.png" id="56" name="Picture"/>
+                    <pic:cNvPr descr="figs/figA4_jlens_retention.png" id="67" name="Picture"/>
                     <pic:cNvPicPr>
                       <a:picLocks noChangeArrowheads="1" noChangeAspect="1"/>
                     </pic:cNvPicPr>
                   </pic:nvPicPr>
                   <pic:blipFill>
-                    <a:blip r:embed="rId54"/>
+                    <a:blip r:embed="rId65"/>
                     <a:stretch>
                       <a:fillRect/>
                     </a:stretch>
@@ -4051,7 +4773,7 @@
         </w:rPr>
         <w:t xml:space="preserve"> </w:t>
       </w:r>
-      <w:hyperlink r:id="rId53">
+      <w:hyperlink r:id="rId64">
         <w:r>
           <w:rPr>
             <w:rStyle w:val="Hyperlink"/>
@@ -4330,12 +5052,21 @@
         <w:t xml:space="preserve">of WikiText.</w:t>
       </w:r>
     </w:p>
-    <w:p>
-      <w:pPr>
-        <w:pStyle w:val="BodyText"/>
-      </w:pPr>
-      <w:r>
-        <w:t xml:space="preserve">We then briefly investigated whether the diffusion step where J-lens is applied affects accuracy:</w:t>
+    <w:bookmarkStart w:id="71" w:name="X9b7ff029db2884a5e97d7b865768ea997429a17"/>
+    <w:p>
+      <w:pPr>
+        <w:pStyle w:val="Heading4"/>
+      </w:pPr>
+      <w:r>
+        <w:t xml:space="preserve">DiffusionGemma represents tokens acausally</w:t>
+      </w:r>
+    </w:p>
+    <w:p>
+      <w:pPr>
+        <w:pStyle w:val="FirstParagraph"/>
+      </w:pPr>
+      <w:r>
+        <w:t xml:space="preserve">Since DiffusionGemma uses bidirectional attention, it is interesting to ask whether J-space percept will also be distributed in a non-causal way. In particular, do they occur before the token that triggers them? Indeed, we found such instances on some problems:</w:t>
       </w:r>
     </w:p>
     <w:p>
@@ -4345,227 +5076,20 @@
       <w:r>
         <w:drawing>
           <wp:inline>
-            <wp:extent cx="5334000" cy="3852702"/>
+            <wp:extent cx="5334000" cy="1197186"/>
             <wp:effectExtent b="0" l="0" r="0" t="0"/>
-            <wp:docPr descr="J-Lens step accuracy" title="" id="58" name="Picture"/>
+            <wp:docPr descr="J-Lens future operation" title="" id="69" name="Picture"/>
             <a:graphic>
               <a:graphicData uri="http://schemas.openxmlformats.org/drawingml/2006/picture">
                 <pic:pic>
                   <pic:nvPicPr>
-                    <pic:cNvPr descr="figs/figA16_jlens_step_accuracy.png" id="59" name="Picture"/>
+                    <pic:cNvPr descr="figs/figA6_jlens_future.png" id="70" name="Picture"/>
                     <pic:cNvPicPr>
                       <a:picLocks noChangeArrowheads="1" noChangeAspect="1"/>
                     </pic:cNvPicPr>
                   </pic:nvPicPr>
                   <pic:blipFill>
-                    <a:blip r:embed="rId57"/>
-                    <a:stretch>
-                      <a:fillRect/>
-                    </a:stretch>
-                  </pic:blipFill>
-                  <pic:spPr bwMode="auto">
-                    <a:xfrm>
-                      <a:off x="0" y="0"/>
-                      <a:ext cx="5334000" cy="3852702"/>
-                    </a:xfrm>
-                    <a:prstGeom prst="rect">
-                      <a:avLst/>
-                    </a:prstGeom>
-                    <a:noFill/>
-                    <a:ln w="9525">
-                      <a:noFill/>
-                      <a:headEnd/>
-                      <a:tailEnd/>
-                    </a:ln>
-                  </pic:spPr>
-                </pic:pic>
-              </a:graphicData>
-            </a:graphic>
-          </wp:inline>
-        </w:drawing>
-      </w:r>
-    </w:p>
-    <w:p>
-      <w:pPr>
-        <w:pStyle w:val="ImageCaption"/>
-      </w:pPr>
-      <w:r>
-        <w:t xml:space="preserve">J-Lens step accuracy</w:t>
-      </w:r>
-    </w:p>
-    <w:p>
-      <w:pPr>
-        <w:pStyle w:val="BodyText"/>
-      </w:pPr>
-      <w:r>
-        <w:rPr>
-          <w:b/>
-          <w:bCs/>
-          <w:i/>
-          <w:iCs/>
-        </w:rPr>
-        <w:t xml:space="preserve">Accuracy of J-lens outputs as a function of source and target diffusion step.</w:t>
-      </w:r>
-      <w:r>
-        <w:rPr>
-          <w:i/>
-          <w:iCs/>
-        </w:rPr>
-        <w:t xml:space="preserve"> </w:t>
-      </w:r>
-      <w:r>
-        <w:rPr>
-          <w:i/>
-          <w:iCs/>
-        </w:rPr>
-        <w:t xml:space="preserve">We consider J-lens on the canvas region resulting from diffusion on a prompt, fitted at diffusion step</w:t>
-      </w:r>
-      <w:r>
-        <w:rPr>
-          <w:i/>
-          <w:iCs/>
-        </w:rPr>
-        <w:t xml:space="preserve"> </w:t>
-      </w:r>
-      <m:oMath>
-        <m:r>
-          <m:t>t</m:t>
-        </m:r>
-      </m:oMath>
-      <w:r>
-        <w:rPr>
-          <w:i/>
-          <w:iCs/>
-        </w:rPr>
-        <w:t xml:space="preserve"> </w:t>
-      </w:r>
-      <w:r>
-        <w:rPr>
-          <w:i/>
-          <w:iCs/>
-        </w:rPr>
-        <w:t xml:space="preserve">and tested at step</w:t>
-      </w:r>
-      <w:r>
-        <w:rPr>
-          <w:i/>
-          <w:iCs/>
-        </w:rPr>
-        <w:t xml:space="preserve"> </w:t>
-      </w:r>
-      <m:oMath>
-        <m:r>
-          <m:t>t</m:t>
-        </m:r>
-        <m:r>
-          <m:rPr>
-            <m:sty m:val="p"/>
-          </m:rPr>
-          <m:t>′</m:t>
-        </m:r>
-      </m:oMath>
-      <w:r>
-        <w:rPr>
-          <w:i/>
-          <w:iCs/>
-        </w:rPr>
-        <w:t xml:space="preserve">. This is in contrast to the token-forcing in the previous investigation.</w:t>
-      </w:r>
-    </w:p>
-    <w:p>
-      <w:pPr>
-        <w:pStyle w:val="BodyText"/>
-      </w:pPr>
-      <w:r>
-        <w:t xml:space="preserve">The model is prompted with</w:t>
-      </w:r>
-      <w:r>
-        <w:t xml:space="preserve"> </w:t>
-      </w:r>
-      <w:r>
-        <w:rPr>
-          <w:rStyle w:val="VerbatimChar"/>
-        </w:rPr>
-        <w:t xml:space="preserve">Continue the scene below in exactly two sentences of 12 to 20 words each. Use only concrete actions, dialogue, and sensory details. Do not explain, summarize, diagnose, classify, identify, or name any underlying emotion, situation, theme, person, genre, or concept. Scene: &lt;beginning of a story&gt; Continuation:</w:t>
-      </w:r>
-    </w:p>
-    <w:p>
-      <w:pPr>
-        <w:pStyle w:val="BodyText"/>
-      </w:pPr>
-      <w:r>
-        <w:t xml:space="preserve">We then fit J-lens at every diffusion step</w:t>
-      </w:r>
-      <w:r>
-        <w:t xml:space="preserve"> </w:t>
-      </w:r>
-      <m:oMath>
-        <m:r>
-          <m:t>t</m:t>
-        </m:r>
-      </m:oMath>
-      <w:r>
-        <w:t xml:space="preserve">, and on a set of heldout prompts measure at each application step</w:t>
-      </w:r>
-      <w:r>
-        <w:t xml:space="preserve"> </w:t>
-      </w:r>
-      <m:oMath>
-        <m:r>
-          <m:t>t</m:t>
-        </m:r>
-        <m:r>
-          <m:rPr>
-            <m:sty m:val="p"/>
-          </m:rPr>
-          <m:t>′</m:t>
-        </m:r>
-      </m:oMath>
-      <w:r>
-        <w:t xml:space="preserve"> </w:t>
-      </w:r>
-      <w:r>
-        <w:t xml:space="preserve">[TODO use better score] how many of the top-20 tokens surfaced by J-lens are plausible in context, but not lexically related to the canvas at any diffusion step.</w:t>
-      </w:r>
-    </w:p>
-    <w:bookmarkStart w:id="63" w:name="X9b7ff029db2884a5e97d7b865768ea997429a17"/>
-    <w:p>
-      <w:pPr>
-        <w:pStyle w:val="Heading4"/>
-      </w:pPr>
-      <w:r>
-        <w:t xml:space="preserve">DiffusionGemma represents tokens acausally</w:t>
-      </w:r>
-    </w:p>
-    <w:p>
-      <w:pPr>
-        <w:pStyle w:val="FirstParagraph"/>
-      </w:pPr>
-      <w:r>
-        <w:t xml:space="preserve">Since DiffusionGemma uses bidirectional attention, it is interesting to ask whether J-space percepts will also be distributed in a non-causal way. In particular, do they occur before the token that triggers them? Indeed, we found such instances on some problems:</w:t>
-      </w:r>
-    </w:p>
-    <w:p>
-      <w:pPr>
-        <w:pStyle w:val="CaptionedFigure"/>
-      </w:pPr>
-      <w:r>
-        <w:drawing>
-          <wp:inline>
-            <wp:extent cx="5334000" cy="1197186"/>
-            <wp:effectExtent b="0" l="0" r="0" t="0"/>
-            <wp:docPr descr="J-Lens future operation" title="" id="61" name="Picture"/>
-            <a:graphic>
-              <a:graphicData uri="http://schemas.openxmlformats.org/drawingml/2006/picture">
-                <pic:pic>
-                  <pic:nvPicPr>
-                    <pic:cNvPr descr="figs/figA6_jlens_future.png" id="62" name="Picture"/>
-                    <pic:cNvPicPr>
-                      <a:picLocks noChangeArrowheads="1" noChangeAspect="1"/>
-                    </pic:cNvPicPr>
-                  </pic:nvPicPr>
-                  <pic:blipFill>
-                    <a:blip r:embed="rId60"/>
+                    <a:blip r:embed="rId68"/>
                     <a:stretch>
                       <a:fillRect/>
                     </a:stretch>
@@ -4611,134 +5135,33 @@
           <w:i/>
           <w:iCs/>
         </w:rPr>
-        <w:t xml:space="preserve">The upcoming operation is readable at an earlier canvas position.</w:t>
-      </w:r>
-      <w:r>
-        <w:rPr>
-          <w:i/>
-          <w:iCs/>
-        </w:rPr>
-        <w:t xml:space="preserve"> </w:t>
-      </w:r>
-      <w:r>
-        <w:rPr>
-          <w:i/>
-          <w:iCs/>
-        </w:rPr>
-        <w:t xml:space="preserve">The DG-bidirectional-fit J-Lens is read at the token</w:t>
-      </w:r>
-      <w:r>
-        <w:rPr>
-          <w:i/>
-          <w:iCs/>
-        </w:rPr>
-        <w:t xml:space="preserve"> </w:t>
-      </w:r>
-      <w:r>
-        <w:rPr>
-          <w:rStyle w:val="VerbatimChar"/>
-          <w:i/>
-          <w:iCs/>
-        </w:rPr>
-        <w:t xml:space="preserve">by</w:t>
-      </w:r>
-      <w:r>
-        <w:rPr>
-          <w:i/>
-          <w:iCs/>
-        </w:rPr>
-        <w:t xml:space="preserve"> </w:t>
-      </w:r>
-      <w:r>
-        <w:rPr>
-          <w:i/>
-          <w:iCs/>
-        </w:rPr>
-        <w:t xml:space="preserve">(blue), two positions before the operation slot, on an otherwise identical prompt pair. The variant’s operation (orange) surfaces in the top-5 across workspace layers (</w:t>
-      </w:r>
-      <w:r>
-        <w:rPr>
-          <w:i/>
-          <w:iCs/>
-        </w:rPr>
-        <w:t xml:space="preserve"> </w:t>
-      </w:r>
-      <w:r>
-        <w:rPr>
-          <w:rStyle w:val="VerbatimChar"/>
-          <w:i/>
-          <w:iCs/>
-        </w:rPr>
-        <w:t xml:space="preserve">minus</w:t>
-      </w:r>
-      <w:r>
-        <w:rPr>
-          <w:i/>
-          <w:iCs/>
-        </w:rPr>
-        <w:t xml:space="preserve">: rank 1 at L18–21;</w:t>
-      </w:r>
-      <w:r>
-        <w:rPr>
-          <w:i/>
-          <w:iCs/>
-        </w:rPr>
-        <w:t xml:space="preserve"> </w:t>
-      </w:r>
-      <w:r>
-        <w:rPr>
-          <w:rStyle w:val="VerbatimChar"/>
-          <w:i/>
-          <w:iCs/>
-        </w:rPr>
-        <w:t xml:space="preserve">plus</w:t>
-      </w:r>
-      <w:r>
-        <w:rPr>
-          <w:i/>
-          <w:iCs/>
-        </w:rPr>
-        <w:t xml:space="preserve">: rank 5/3 at L21/L23 after the single-token swap). The switch is partial —</w:t>
-      </w:r>
-      <w:r>
-        <w:rPr>
-          <w:i/>
-          <w:iCs/>
-        </w:rPr>
-        <w:t xml:space="preserve"> </w:t>
-      </w:r>
-      <w:r>
-        <w:rPr>
-          <w:rStyle w:val="VerbatimChar"/>
-          <w:i/>
-          <w:iCs/>
-        </w:rPr>
-        <w:t xml:space="preserve">minus</w:t>
-      </w:r>
-      <w:r>
-        <w:rPr>
-          <w:i/>
-          <w:iCs/>
-        </w:rPr>
-        <w:t xml:space="preserve"> </w:t>
-      </w:r>
-      <w:r>
-        <w:rPr>
-          <w:i/>
-          <w:iCs/>
-        </w:rPr>
-        <w:t xml:space="preserve">remains highly ranked in the addition variant.</w:t>
-      </w:r>
-    </w:p>
-    <w:bookmarkEnd w:id="63"/>
-    <w:bookmarkEnd w:id="64"/>
-    <w:bookmarkStart w:id="68" w:name="letter-arithmetic"/>
-    <w:p>
-      <w:pPr>
-        <w:pStyle w:val="Heading3"/>
-      </w:pPr>
-      <w:r>
-        <w:t xml:space="preserve">Letter arithmetic</w:t>
+        <w:t xml:space="preserve">A position preceding the operand will hold it in J-space.</w:t>
+      </w:r>
+      <w:r>
+        <w:rPr>
+          <w:i/>
+          <w:iCs/>
+        </w:rPr>
+        <w:t xml:space="preserve"> </w:t>
+      </w:r>
+      <w:r>
+        <w:rPr>
+          <w:i/>
+          <w:iCs/>
+        </w:rPr>
+        <w:t xml:space="preserve">Shown are the top-5 J-space tokens.</w:t>
+      </w:r>
+    </w:p>
+    <w:bookmarkEnd w:id="71"/>
+    <w:bookmarkEnd w:id="72"/>
+    <w:bookmarkEnd w:id="73"/>
+    <w:bookmarkStart w:id="74" w:name="conclusion"/>
+    <w:p>
+      <w:pPr>
+        <w:pStyle w:val="Heading2"/>
+      </w:pPr>
+      <w:r>
+        <w:t xml:space="preserve">Conclusion</w:t>
       </w:r>
     </w:p>
     <w:p>
@@ -4746,284 +5169,7 @@
         <w:pStyle w:val="FirstParagraph"/>
       </w:pPr>
       <w:r>
-        <w:t xml:space="preserve">[stub:] The single-injection transfer-map protocol of the main text also runs with a multiplicative image map, $x’ = $ the letter at position</w:t>
-      </w:r>
-      <w:r>
-        <w:t xml:space="preserve"> </w:t>
-      </w:r>
-      <m:oMath>
-        <m:r>
-          <m:t>k</m:t>
-        </m:r>
-        <m:r>
-          <m:rPr>
-            <m:sty m:val="p"/>
-          </m:rPr>
-          <m:t>⋅</m:t>
-        </m:r>
-        <m:r>
-          <m:rPr>
-            <m:sty m:val="p"/>
-          </m:rPr>
-          <m:t>p</m:t>
-        </m:r>
-        <m:r>
-          <m:rPr>
-            <m:sty m:val="p"/>
-          </m:rPr>
-          <m:t>o</m:t>
-        </m:r>
-        <m:r>
-          <m:rPr>
-            <m:sty m:val="p"/>
-          </m:rPr>
-          <m:t>s</m:t>
-        </m:r>
-        <m:d>
-          <m:dPr>
-            <m:begChr m:val="("/>
-            <m:sepChr m:val=""/>
-            <m:endChr m:val=")"/>
-            <m:grow/>
-          </m:dPr>
-          <m:e>
-            <m:r>
-              <m:t>x</m:t>
-            </m:r>
-          </m:e>
-        </m:d>
-      </m:oMath>
-      <w:r>
-        <w:t xml:space="preserve">,</w:t>
-      </w:r>
-      <w:r>
-        <w:t xml:space="preserve"> </w:t>
-      </w:r>
-      <m:oMath>
-        <m:r>
-          <m:t>k</m:t>
-        </m:r>
-        <m:r>
-          <m:rPr>
-            <m:sty m:val="p"/>
-          </m:rPr>
-          <m:t>∈</m:t>
-        </m:r>
-        <m:r>
-          <m:rPr>
-            <m:sty m:val="p"/>
-          </m:rPr>
-          <m:t>{</m:t>
-        </m:r>
-        <m:r>
-          <m:t>2</m:t>
-        </m:r>
-        <m:r>
-          <m:rPr>
-            <m:sty m:val="p"/>
-          </m:rPr>
-          <m:t>,</m:t>
-        </m:r>
-        <m:r>
-          <m:t>3</m:t>
-        </m:r>
-        <m:r>
-          <m:rPr>
-            <m:sty m:val="p"/>
-          </m:rPr>
-          <m:t>,</m:t>
-        </m:r>
-        <m:r>
-          <m:t>4</m:t>
-        </m:r>
-        <m:r>
-          <m:rPr>
-            <m:sty m:val="p"/>
-          </m:rPr>
-          <m:t>}</m:t>
-        </m:r>
-      </m:oMath>
-      <w:r>
-        <w:t xml:space="preserve"> </w:t>
-      </w:r>
-      <w:r>
-        <w:t xml:space="preserve">(upper→upper).</w:t>
-      </w:r>
-    </w:p>
-    <w:p>
-      <w:pPr>
-        <w:pStyle w:val="CaptionedFigure"/>
-      </w:pPr>
-      <w:r>
-        <w:drawing>
-          <wp:inline>
-            <wp:extent cx="5334000" cy="4000500"/>
-            <wp:effectExtent b="0" l="0" r="0" t="0"/>
-            <wp:docPr descr="Multiplicative transfer map" title="" id="66" name="Picture"/>
-            <a:graphic>
-              <a:graphicData uri="http://schemas.openxmlformats.org/drawingml/2006/picture">
-                <pic:pic>
-                  <pic:nvPicPr>
-                    <pic:cNvPr descr="figs/figA13_mult_transfer.png" id="67" name="Picture"/>
-                    <pic:cNvPicPr>
-                      <a:picLocks noChangeArrowheads="1" noChangeAspect="1"/>
-                    </pic:cNvPicPr>
-                  </pic:nvPicPr>
-                  <pic:blipFill>
-                    <a:blip r:embed="rId65"/>
-                    <a:stretch>
-                      <a:fillRect/>
-                    </a:stretch>
-                  </pic:blipFill>
-                  <pic:spPr bwMode="auto">
-                    <a:xfrm>
-                      <a:off x="0" y="0"/>
-                      <a:ext cx="5334000" cy="4000500"/>
-                    </a:xfrm>
-                    <a:prstGeom prst="rect">
-                      <a:avLst/>
-                    </a:prstGeom>
-                    <a:noFill/>
-                    <a:ln w="9525">
-                      <a:noFill/>
-                      <a:headEnd/>
-                      <a:tailEnd/>
-                    </a:ln>
-                  </pic:spPr>
-                </pic:pic>
-              </a:graphicData>
-            </a:graphic>
-          </wp:inline>
-        </w:drawing>
-      </w:r>
-    </w:p>
-    <w:p>
-      <w:pPr>
-        <w:pStyle w:val="ImageCaption"/>
-      </w:pPr>
-      <w:r>
-        <w:t xml:space="preserve">Multiplicative transfer map</w:t>
-      </w:r>
-    </w:p>
-    <w:p>
-      <w:pPr>
-        <w:pStyle w:val="BodyText"/>
-      </w:pPr>
-      <w:r>
-        <w:rPr>
-          <w:i/>
-          <w:iCs/>
-        </w:rPr>
-        <w:t xml:space="preserve">Perturbed sources trigger a response at their multiplicative images, but far less specifically than in the additive map (diagonal excess</w:t>
-      </w:r>
-      <w:r>
-        <w:rPr>
-          <w:i/>
-          <w:iCs/>
-        </w:rPr>
-        <w:t xml:space="preserve"> </w:t>
-      </w:r>
-      <m:oMath>
-        <m:r>
-          <m:rPr>
-            <m:sty m:val="p"/>
-          </m:rPr>
-          <m:t>+</m:t>
-        </m:r>
-        <m:r>
-          <m:t>0.19</m:t>
-        </m:r>
-      </m:oMath>
-      <w:r>
-        <w:rPr>
-          <w:i/>
-          <w:iCs/>
-        </w:rPr>
-        <w:t xml:space="preserve"> </w:t>
-      </w:r>
-      <w:r>
-        <w:rPr>
-          <w:i/>
-          <w:iCs/>
-        </w:rPr>
-        <w:t xml:space="preserve">vs</w:t>
-      </w:r>
-      <w:r>
-        <w:rPr>
-          <w:i/>
-          <w:iCs/>
-        </w:rPr>
-        <w:t xml:space="preserve"> </w:t>
-      </w:r>
-      <m:oMath>
-        <m:r>
-          <m:rPr>
-            <m:sty m:val="p"/>
-          </m:rPr>
-          <m:t>+</m:t>
-        </m:r>
-        <m:r>
-          <m:t>1.46</m:t>
-        </m:r>
-      </m:oMath>
-      <w:r>
-        <w:rPr>
-          <w:i/>
-          <w:iCs/>
-        </w:rPr>
-        <w:t xml:space="preserve"> </w:t>
-      </w:r>
-      <w:r>
-        <w:rPr>
-          <w:i/>
-          <w:iCs/>
-        </w:rPr>
-        <w:t xml:space="preserve">for the</w:t>
-      </w:r>
-      <w:r>
-        <w:rPr>
-          <w:i/>
-          <w:iCs/>
-        </w:rPr>
-        <w:t xml:space="preserve"> </w:t>
-      </w:r>
-      <m:oMath>
-        <m:r>
-          <m:t>k</m:t>
-        </m:r>
-        <m:r>
-          <m:rPr>
-            <m:sty m:val="p"/>
-          </m:rPr>
-          <m:t>=</m:t>
-        </m:r>
-        <m:r>
-          <m:t>3</m:t>
-        </m:r>
-      </m:oMath>
-      <w:r>
-        <w:rPr>
-          <w:i/>
-          <w:iCs/>
-        </w:rPr>
-        <w:t xml:space="preserve"> </w:t>
-      </w:r>
-      <w:r>
-        <w:rPr>
-          <w:i/>
-          <w:iCs/>
-        </w:rPr>
-        <w:t xml:space="preserve">map shown in the main text).</w:t>
-      </w:r>
-    </w:p>
-    <w:bookmarkEnd w:id="68"/>
-    <w:bookmarkStart w:id="72" w:name="Xea3042850cf8050407ffdd53c2454b5f83a5608"/>
-    <w:p>
-      <w:pPr>
-        <w:pStyle w:val="Heading3"/>
-      </w:pPr>
-      <w:r>
-        <w:t xml:space="preserve">Autonomous computational usage of</w:t>
+        <w:t xml:space="preserve">In this post, we have studied whether DiffusionGemma does latent reasoning via its vector-valued state</w:t>
       </w:r>
       <w:r>
         <w:t xml:space="preserve"> </w:t>
@@ -5045,29 +5191,8 @@
           </m:sup>
         </m:sSup>
       </m:oMath>
-    </w:p>
-    <w:p>
-      <w:pPr>
-        <w:pStyle w:val="FirstParagraph"/>
-      </w:pPr>
-      <w:r>
-        <w:t xml:space="preserve">In the</w:t>
-      </w:r>
-      <w:r>
-        <w:t xml:space="preserve"> </w:t>
-      </w:r>
-      <w:r>
-        <w:rPr>
-          <w:i/>
-          <w:iCs/>
-        </w:rPr>
-        <w:t xml:space="preserve">letter arithmetic</w:t>
-      </w:r>
-      <w:r>
-        <w:t xml:space="preserve"> </w:t>
-      </w:r>
-      <w:r>
-        <w:t xml:space="preserve">task introduced in the main text, DiffusionGemma did respond to modifications of the distributional state in the way we expected. While suggestive, it is unclear if the model also would make use of</w:t>
+      <w:r>
+        <w:t xml:space="preserve">. We found that top-k truncation of</w:t>
       </w:r>
       <w:r>
         <w:t xml:space="preserve"> </w:t>
@@ -5093,153 +5218,39 @@
         <w:t xml:space="preserve"> </w:t>
       </w:r>
       <w:r>
-        <w:rPr>
-          <w:i/>
-          <w:iCs/>
-        </w:rPr>
-        <w:t xml:space="preserve">autonomously</w:t>
-      </w:r>
-      <w:r>
-        <w:t xml:space="preserve">, i.e. without interventions.</w:t>
-      </w:r>
-    </w:p>
-    <w:p>
-      <w:pPr>
-        <w:pStyle w:val="BodyText"/>
-      </w:pPr>
-      <w:r>
-        <w:t xml:space="preserve">To investigate this, we searched for a non-trivial (i.e., not just a binary choice) task where DG will use a hypothesis subleading in its distribution. An instance we found is a</w:t>
-      </w:r>
-      <w:r>
-        <w:t xml:space="preserve"> </w:t>
-      </w:r>
-      <w:r>
-        <w:rPr>
-          <w:i/>
-          <w:iCs/>
-        </w:rPr>
-        <w:t xml:space="preserve">word-level palindrome</w:t>
-      </w:r>
-      <w:r>
-        <w:t xml:space="preserve"> </w:t>
-      </w:r>
-      <w:r>
-        <w:t xml:space="preserve">task. When asked</w:t>
-      </w:r>
-      <w:r>
-        <w:t xml:space="preserve"> </w:t>
-      </w:r>
-      <w:r>
-        <w:rPr>
-          <w:rStyle w:val="VerbatimChar"/>
-        </w:rPr>
-        <w:t xml:space="preserve">Please write a word-level palindrome</w:t>
-      </w:r>
-      <w:r>
-        <w:t xml:space="preserve">, DG maintains two competing completions of the same canvas: a literal</w:t>
-      </w:r>
-      <w:r>
-        <w:t xml:space="preserve"> </w:t>
-      </w:r>
-      <w:r>
-        <w:rPr>
-          <w:i/>
-          <w:iCs/>
-        </w:rPr>
-        <w:t xml:space="preserve">seasonal</w:t>
-      </w:r>
-      <w:r>
-        <w:t xml:space="preserve"> </w:t>
-      </w:r>
-      <w:r>
-        <w:t xml:space="preserve">phrase (</w:t>
-      </w:r>
-      <w:r>
-        <w:rPr>
-          <w:rStyle w:val="VerbatimChar"/>
-        </w:rPr>
-        <w:t xml:space="preserve">All leaves fall when leaves fall all.</w:t>
-      </w:r>
-      <w:r>
-        <w:t xml:space="preserve">) and the famous</w:t>
-      </w:r>
-      <w:r>
-        <w:t xml:space="preserve"> </w:t>
-      </w:r>
-      <w:r>
-        <w:rPr>
-          <w:i/>
-          <w:iCs/>
-        </w:rPr>
-        <w:t xml:space="preserve">idiom</w:t>
-      </w:r>
-      <w:r>
-        <w:t xml:space="preserve"> </w:t>
-      </w:r>
-      <w:r>
-        <w:t xml:space="preserve">(</w:t>
-      </w:r>
-      <w:r>
-        <w:rPr>
-          <w:rStyle w:val="VerbatimChar"/>
-        </w:rPr>
-        <w:t xml:space="preserve">All for one and one for all.</w:t>
-      </w:r>
-      <w:r>
-        <w:t xml:space="preserve">).</w:t>
-      </w:r>
-    </w:p>
-    <w:p>
-      <w:pPr>
-        <w:pStyle w:val="BodyText"/>
-      </w:pPr>
-      <w:r>
-        <w:t xml:space="preserve">The canvas will read the</w:t>
-      </w:r>
-      <w:r>
-        <w:t xml:space="preserve"> </w:t>
-      </w:r>
-      <w:r>
-        <w:rPr>
-          <w:i/>
-          <w:iCs/>
-        </w:rPr>
-        <w:t xml:space="preserve">seasonal</w:t>
-      </w:r>
-      <w:r>
-        <w:t xml:space="preserve"> </w:t>
-      </w:r>
-      <w:r>
-        <w:t xml:space="preserve">answer for the first few diffusion steps, after which it flips and stays at</w:t>
-      </w:r>
-      <w:r>
-        <w:t xml:space="preserve"> </w:t>
-      </w:r>
-      <w:r>
-        <w:rPr>
-          <w:i/>
-          <w:iCs/>
-        </w:rPr>
-        <w:t xml:space="preserve">idiom</w:t>
-      </w:r>
-      <w:r>
-        <w:t xml:space="preserve">. Interestingly, this is accompanied by</w:t>
-      </w:r>
-      <w:r>
-        <w:t xml:space="preserve"> </w:t>
-      </w:r>
-      <w:r>
-        <w:rPr>
-          <w:i/>
-          <w:iCs/>
-        </w:rPr>
-        <w:t xml:space="preserve">dynamics</w:t>
-      </w:r>
-      <w:r>
-        <w:t xml:space="preserve"> </w:t>
-      </w:r>
-      <w:r>
-        <w:t xml:space="preserve">in</w:t>
+        <w:t xml:space="preserve">largely preserves accuracy suggests that it is not</w:t>
+      </w:r>
+      <w:r>
+        <w:t xml:space="preserve"> </w:t>
+      </w:r>
+      <w:r>
+        <w:rPr>
+          <w:i/>
+          <w:iCs/>
+        </w:rPr>
+        <w:t xml:space="preserve">significantly</w:t>
+      </w:r>
+      <w:r>
+        <w:t xml:space="preserve"> </w:t>
+      </w:r>
+      <w:r>
+        <w:t xml:space="preserve">being used in typical reasoning-focused task. However, for some tasks, we found that the model can make</w:t>
+      </w:r>
+      <w:r>
+        <w:t xml:space="preserve"> </w:t>
+      </w:r>
+      <w:r>
+        <w:rPr>
+          <w:i/>
+          <w:iCs/>
+        </w:rPr>
+        <w:t xml:space="preserve">some</w:t>
+      </w:r>
+      <w:r>
+        <w:t xml:space="preserve"> </w:t>
+      </w:r>
+      <w:r>
+        <w:t xml:space="preserve">use of</w:t>
       </w:r>
       <w:r>
         <w:t xml:space="preserve"> </w:t>
@@ -5262,36 +5273,7 @@
         </m:sSup>
       </m:oMath>
       <w:r>
-        <w:t xml:space="preserve">:</w:t>
-      </w:r>
-      <w:r>
-        <w:t xml:space="preserve"> </w:t>
-      </w:r>
-      <w:r>
-        <w:rPr>
-          <w:i/>
-          <w:iCs/>
-        </w:rPr>
-        <w:t xml:space="preserve">idiom</w:t>
-      </w:r>
-      <w:r>
-        <w:t xml:space="preserve"> </w:t>
-      </w:r>
-      <w:r>
-        <w:t xml:space="preserve">will start at ~0, and progressively gain weight, replacing</w:t>
-      </w:r>
-      <w:r>
-        <w:t xml:space="preserve"> </w:t>
-      </w:r>
-      <w:r>
-        <w:rPr>
-          <w:i/>
-          <w:iCs/>
-        </w:rPr>
-        <w:t xml:space="preserve">seasonal</w:t>
-      </w:r>
-      <w:r>
-        <w:t xml:space="preserve">.</w:t>
+        <w:t xml:space="preserve">, in terms of carrying out (parallel) computation on it.</w:t>
       </w:r>
     </w:p>
     <w:p>
@@ -5299,103 +5281,40 @@
         <w:pStyle w:val="BodyText"/>
       </w:pPr>
       <w:r>
-        <w:t xml:space="preserve">We validated that the emergence of</w:t>
-      </w:r>
-      <w:r>
-        <w:t xml:space="preserve"> </w:t>
-      </w:r>
-      <w:r>
-        <w:rPr>
-          <w:i/>
-          <w:iCs/>
-        </w:rPr>
-        <w:t xml:space="preserve">idiom</w:t>
-      </w:r>
-      <w:r>
-        <w:t xml:space="preserve"> </w:t>
-      </w:r>
-      <w:r>
-        <w:t xml:space="preserve">is indeed causal: persistently ablating</w:t>
-      </w:r>
-      <w:r>
-        <w:t xml:space="preserve"> </w:t>
-      </w:r>
-      <w:r>
-        <w:rPr>
-          <w:i/>
-          <w:iCs/>
-        </w:rPr>
-        <w:t xml:space="preserve">idiom</w:t>
-      </w:r>
-      <w:r>
-        <w:t xml:space="preserve">’s</w:t>
-      </w:r>
-      <w:r>
-        <w:t xml:space="preserve"> </w:t>
-      </w:r>
-      <m:oMath>
-        <m:r>
-          <m:rPr>
-            <m:sty m:val="b"/>
-          </m:rPr>
-          <m:t>s</m:t>
-        </m:r>
-      </m:oMath>
-      <w:r>
-        <w:t xml:space="preserve">-mass from an early step onward prevents the takeover and preserves the seasonal draft. Concretely, at every step</w:t>
-      </w:r>
-      <w:r>
-        <w:t xml:space="preserve"> </w:t>
-      </w:r>
-      <m:oMath>
-        <m:r>
-          <m:t>t</m:t>
-        </m:r>
-        <m:r>
-          <m:rPr>
-            <m:sty m:val="p"/>
-          </m:rPr>
-          <m:t>≥</m:t>
-        </m:r>
-        <m:sSub>
-          <m:e>
-            <m:r>
-              <m:t>t</m:t>
-            </m:r>
-          </m:e>
-          <m:sub>
-            <m:r>
-              <m:rPr>
-                <m:sty m:val="p"/>
-              </m:rPr>
-              <m:t>a</m:t>
-            </m:r>
-            <m:r>
-              <m:rPr>
-                <m:sty m:val="p"/>
-              </m:rPr>
-              <m:t>b</m:t>
-            </m:r>
-            <m:r>
-              <m:rPr>
-                <m:sty m:val="p"/>
-              </m:rPr>
-              <m:t>l</m:t>
-            </m:r>
-          </m:sub>
-        </m:sSub>
-      </m:oMath>
-      <w:r>
-        <w:t xml:space="preserve"> </w:t>
-      </w:r>
-      <w:r>
-        <w:t xml:space="preserve">we zero the idiom tokens’ entries of</w:t>
-      </w:r>
-      <w:r>
-        <w:t xml:space="preserve"> </w:t>
-      </w:r>
-      <m:oMath>
-        <m:sSubSup>
+        <w:t xml:space="preserve">Overall, this supports</w:t>
+      </w:r>
+      <w:r>
+        <w:t xml:space="preserve"> </w:t>
+      </w:r>
+      <w:hyperlink r:id="rId21">
+        <w:r>
+          <w:rPr>
+            <w:rStyle w:val="Hyperlink"/>
+          </w:rPr>
+          <w:t xml:space="preserve">Engels et al.</w:t>
+        </w:r>
+      </w:hyperlink>
+      <w:r>
+        <w:t xml:space="preserve">’s conclusion of a highly monitorable DiffusionGemma. In particular, we did not find any strong evidence of latent</w:t>
+      </w:r>
+      <w:r>
+        <w:t xml:space="preserve"> </w:t>
+      </w:r>
+      <w:r>
+        <w:rPr>
+          <w:i/>
+          <w:iCs/>
+        </w:rPr>
+        <w:t xml:space="preserve">reasoning</w:t>
+      </w:r>
+      <w:r>
+        <w:t xml:space="preserve">, as in using</w:t>
+      </w:r>
+      <w:r>
+        <w:t xml:space="preserve"> </w:t>
+      </w:r>
+      <m:oMath>
+        <m:sSup>
           <m:e>
             <m:r>
               <m:rPr>
@@ -5404,48 +5323,6 @@
               <m:t>s</m:t>
             </m:r>
           </m:e>
-          <m:sub>
-            <m:r>
-              <m:t>i</m:t>
-            </m:r>
-          </m:sub>
-          <m:sup>
-            <m:r>
-              <m:t>t</m:t>
-            </m:r>
-          </m:sup>
-        </m:sSubSup>
-      </m:oMath>
-      <w:r>
-        <w:t xml:space="preserve"> </w:t>
-      </w:r>
-      <w:r>
-        <w:t xml:space="preserve">at the contested positions</w:t>
-      </w:r>
-      <w:r>
-        <w:t xml:space="preserve"> </w:t>
-      </w:r>
-      <m:oMath>
-        <m:r>
-          <m:t>i</m:t>
-        </m:r>
-      </m:oMath>
-      <w:r>
-        <w:t xml:space="preserve"> </w:t>
-      </w:r>
-      <w:r>
-        <w:t xml:space="preserve">(before sampling); the canvas</w:t>
-      </w:r>
-      <w:r>
-        <w:t xml:space="preserve"> </w:t>
-      </w:r>
-      <m:oMath>
-        <m:sSup>
-          <m:e>
-            <m:r>
-              <m:t>X</m:t>
-            </m:r>
-          </m:e>
           <m:sup>
             <m:r>
               <m:t>t</m:t>
@@ -5457,94 +5334,7 @@
         <w:t xml:space="preserve"> </w:t>
       </w:r>
       <w:r>
-        <w:t xml:space="preserve">is never edited and every other position and token is left untouched. What is</w:t>
-      </w:r>
-      <w:r>
-        <w:t xml:space="preserve"> </w:t>
-      </w:r>
-      <w:r>
-        <w:rPr>
-          <w:i/>
-          <w:iCs/>
-        </w:rPr>
-        <w:t xml:space="preserve">preserved</w:t>
-      </w:r>
-      <w:r>
-        <w:t xml:space="preserve"> </w:t>
-      </w:r>
-      <w:r>
-        <w:t xml:space="preserve">is thus the model’s own seasonal completion — nothing is injected in its favor. Note however that later ablation onsets no longer rescue</w:t>
-      </w:r>
-      <w:r>
-        <w:t xml:space="preserve"> </w:t>
-      </w:r>
-      <w:r>
-        <w:rPr>
-          <w:i/>
-          <w:iCs/>
-        </w:rPr>
-        <w:t xml:space="preserve">seasonal</w:t>
-      </w:r>
-      <w:r>
-        <w:t xml:space="preserve"> </w:t>
-      </w:r>
-      <w:r>
-        <w:t xml:space="preserve">— the canvas instead collapses into a third, degenerate basin.</w:t>
-      </w:r>
-    </w:p>
-    <w:p>
-      <w:pPr>
-        <w:pStyle w:val="CaptionedFigure"/>
-      </w:pPr>
-      <w:r>
-        <w:drawing>
-          <wp:inline>
-            <wp:extent cx="5334000" cy="2956891"/>
-            <wp:effectExtent b="0" l="0" r="0" t="0"/>
-            <wp:docPr descr="Seasonal vs idiom: ablation" title="" id="70" name="Picture"/>
-            <a:graphic>
-              <a:graphicData uri="http://schemas.openxmlformats.org/drawingml/2006/picture">
-                <pic:pic>
-                  <pic:nvPicPr>
-                    <pic:cNvPr descr="figs/figA5_seasonal_ember_kill.png" id="71" name="Picture"/>
-                    <pic:cNvPicPr>
-                      <a:picLocks noChangeArrowheads="1" noChangeAspect="1"/>
-                    </pic:cNvPicPr>
-                  </pic:nvPicPr>
-                  <pic:blipFill>
-                    <a:blip r:embed="rId69"/>
-                    <a:stretch>
-                      <a:fillRect/>
-                    </a:stretch>
-                  </pic:blipFill>
-                  <pic:spPr bwMode="auto">
-                    <a:xfrm>
-                      <a:off x="0" y="0"/>
-                      <a:ext cx="5334000" cy="2956891"/>
-                    </a:xfrm>
-                    <a:prstGeom prst="rect">
-                      <a:avLst/>
-                    </a:prstGeom>
-                    <a:noFill/>
-                    <a:ln w="9525">
-                      <a:noFill/>
-                      <a:headEnd/>
-                      <a:tailEnd/>
-                    </a:ln>
-                  </pic:spPr>
-                </pic:pic>
-              </a:graphicData>
-            </a:graphic>
-          </wp:inline>
-        </w:drawing>
-      </w:r>
-    </w:p>
-    <w:p>
-      <w:pPr>
-        <w:pStyle w:val="ImageCaption"/>
-      </w:pPr>
-      <w:r>
-        <w:t xml:space="preserve">Seasonal vs idiom: ablation</w:t>
+        <w:t xml:space="preserve">in a way that carries out nontrivial computation and is opaque.</w:t>
       </w:r>
     </w:p>
     <w:p>
@@ -5552,135 +5342,40 @@
         <w:pStyle w:val="BodyText"/>
       </w:pPr>
       <w:r>
-        <w:rPr>
-          <w:b/>
-          <w:bCs/>
-          <w:i/>
-          <w:iCs/>
-        </w:rPr>
-        <w:t xml:space="preserve">Persistently ablating the nascent idiom preserves the native seasonal completion.</w:t>
-      </w:r>
-      <w:r>
-        <w:rPr>
-          <w:i/>
-          <w:iCs/>
-        </w:rPr>
-        <w:t xml:space="preserve"> </w:t>
-      </w:r>
-      <w:r>
-        <w:rPr>
-          <w:i/>
-          <w:iCs/>
-        </w:rPr>
-        <w:t xml:space="preserve">Probability mass of the two completions at the contested slots, summed over comprising tokens (black: idiom, purple: seasonal; seed s5). Top: the base run — the idiom takes over. Bottom: ablating the idiom’s</w:t>
-      </w:r>
-      <w:r>
-        <w:rPr>
-          <w:i/>
-          <w:iCs/>
-        </w:rPr>
-        <w:t xml:space="preserve"> </w:t>
-      </w:r>
-      <m:oMath>
-        <m:r>
-          <m:rPr>
-            <m:sty m:val="b"/>
-          </m:rPr>
-          <m:t>s</m:t>
-        </m:r>
-      </m:oMath>
-      <w:r>
-        <w:rPr>
-          <w:i/>
-          <w:iCs/>
-        </w:rPr>
-        <w:t xml:space="preserve">-mass at every step from</w:t>
-      </w:r>
-      <w:r>
-        <w:rPr>
-          <w:i/>
-          <w:iCs/>
-        </w:rPr>
-        <w:t xml:space="preserve"> </w:t>
-      </w:r>
-      <m:oMath>
-        <m:r>
-          <m:t>t</m:t>
-        </m:r>
-        <m:r>
-          <m:rPr>
-            <m:sty m:val="p"/>
-          </m:rPr>
-          <m:t>=</m:t>
-        </m:r>
-        <m:r>
-          <m:t>2</m:t>
-        </m:r>
-      </m:oMath>
-      <w:r>
-        <w:rPr>
-          <w:i/>
-          <w:iCs/>
-        </w:rPr>
-        <w:t xml:space="preserve"> </w:t>
-      </w:r>
-      <w:r>
-        <w:rPr>
-          <w:i/>
-          <w:iCs/>
-        </w:rPr>
-        <w:t xml:space="preserve">onward (dotted onset, shaded) keeps the seasonal draft, which completes cleanly.</w:t>
-      </w:r>
-    </w:p>
-    <w:p>
-      <w:pPr>
-        <w:pStyle w:val="BodyText"/>
-      </w:pPr>
-      <w:r>
-        <w:t xml:space="preserve">Note that this example also represents a more general instantion of</w:t>
-      </w:r>
-      <w:r>
-        <w:t xml:space="preserve"> </w:t>
-      </w:r>
-      <w:r>
-        <w:rPr>
-          <w:b/>
-          <w:bCs/>
-        </w:rPr>
-        <w:t xml:space="preserve">self-correction</w:t>
-      </w:r>
-      <w:r>
-        <w:t xml:space="preserve">, anticipating the correction through the</w:t>
-      </w:r>
-      <w:r>
-        <w:t xml:space="preserve"> </w:t>
-      </w:r>
-      <m:oMath>
-        <m:sSup>
-          <m:e>
-            <m:r>
-              <m:rPr>
-                <m:sty m:val="b"/>
-              </m:rPr>
-              <m:t>s</m:t>
-            </m:r>
-          </m:e>
-          <m:sup>
-            <m:r>
-              <m:t>t</m:t>
-            </m:r>
-          </m:sup>
-        </m:sSup>
-      </m:oMath>
-      <w:r>
-        <w:t xml:space="preserve"> </w:t>
-      </w:r>
-      <w:r>
-        <w:t xml:space="preserve">channel. This has important consequences for monitorability which may not have been captured in Engels et al.’s analysis: a tool reading only the final diffusion output will miss transient output. A model may for instance choose to hide a specific fact in its chain-of-thought to a monitor, while having used it intermittently, though we did not find any instances of such behavior here.</w:t>
-      </w:r>
-    </w:p>
-    <w:bookmarkEnd w:id="72"/>
-    <w:bookmarkStart w:id="84" w:name="post-hoc-rationalization"/>
+        <w:t xml:space="preserve">Going forward, these largely negative results are an update that</w:t>
+      </w:r>
+      <w:r>
+        <w:t xml:space="preserve"> </w:t>
+      </w:r>
+      <w:r>
+        <w:t xml:space="preserve">“true”</w:t>
+      </w:r>
+      <w:r>
+        <w:t xml:space="preserve"> </w:t>
+      </w:r>
+      <w:r>
+        <w:t xml:space="preserve">latent reasoning is somewhat hard to learn. However, there already exist models like CODI that pass a vector-valued state that is not clearly a superposition of tokens, though they so far don’t show superior performance. We believe that finding methods to better interpret such models is an important area of research.</w:t>
+      </w:r>
+    </w:p>
+    <w:bookmarkEnd w:id="74"/>
+    <w:bookmarkStart w:id="91" w:name="appendix"/>
+    <w:p>
+      <w:pPr>
+        <w:pStyle w:val="Heading2"/>
+      </w:pPr>
+      <w:r>
+        <w:t xml:space="preserve">Appendix</w:t>
+      </w:r>
+    </w:p>
+    <w:p>
+      <w:pPr>
+        <w:pStyle w:val="FirstParagraph"/>
+      </w:pPr>
+      <w:r>
+        <w:t xml:space="preserve">Here we discuss some additional interesting phenomena in DiffusionGemma relating to its monitorability that do not depend on using its distributional state, but rather arise from bidirectional attention and looped generation per se.</w:t>
+      </w:r>
+    </w:p>
+    <w:bookmarkStart w:id="86" w:name="post-hoc-rationalization"/>
     <w:p>
       <w:pPr>
         <w:pStyle w:val="Heading3"/>
@@ -5696,7 +5391,7 @@
       <w:r>
         <w:t xml:space="preserve">An important question in monitorability (</w:t>
       </w:r>
-      <w:hyperlink r:id="rId73">
+      <w:hyperlink r:id="rId75">
         <w:r>
           <w:rPr>
             <w:rStyle w:val="Hyperlink"/>
@@ -5713,7 +5408,7 @@
         <w:pStyle w:val="BodyText"/>
       </w:pPr>
       <w:r>
-        <w:t xml:space="preserve">For autoregressive models, the answer appears after the CoT. This incentivizes actually using CoT positions to computate the answer. In contrast, DiffusionGemma may arrive at an answer throughout multiple steps of computation, and then fill in a CoT post-hoc to match the format of the training distribution. An increased presence of such post-hoc rationalization relative to Gemma would be a blackpill for DiffusionGemma’s monitorabiltiy.</w:t>
+        <w:t xml:space="preserve">For autoregressive models, the answer appears after the CoT. This incentivizes actually using CoT positions to compute the answer. In contrast, DiffusionGemma may arrive at an answer throughout multiple steps of computation, and then fill in a CoT post-hoc to match the format of the training distribution. An increased presence of such post-hoc rationalization relative to Gemma would be a blackpill for DiffusionGemma’s monitorability.</w:t>
       </w:r>
     </w:p>
     <w:p>
@@ -5725,18 +5420,18 @@
           <wp:inline>
             <wp:extent cx="5334000" cy="1619249"/>
             <wp:effectExtent b="0" l="0" r="0" t="0"/>
-            <wp:docPr descr="Post-hoc correlations" title="" id="75" name="Picture"/>
+            <wp:docPr descr="Post-hoc correlations" title="" id="77" name="Picture"/>
             <a:graphic>
               <a:graphicData uri="http://schemas.openxmlformats.org/drawingml/2006/picture">
                 <pic:pic>
                   <pic:nvPicPr>
-                    <pic:cNvPr descr="figs/figA8_posthoc_correlations.png" id="76" name="Picture"/>
+                    <pic:cNvPr descr="figs/figA8_posthoc_correlations.png" id="78" name="Picture"/>
                     <pic:cNvPicPr>
                       <a:picLocks noChangeArrowheads="1" noChangeAspect="1"/>
                     </pic:cNvPicPr>
                   </pic:nvPicPr>
                   <pic:blipFill>
-                    <a:blip r:embed="rId74"/>
+                    <a:blip r:embed="rId76"/>
                     <a:stretch>
                       <a:fillRect/>
                     </a:stretch>
@@ -5944,7 +5639,7 @@
           <w:i/>
           <w:iCs/>
         </w:rPr>
-        <w:t xml:space="preserve">problems from four task families: CRT-style intuition traps (crt), counting/enumeration (count), hard arithmetic/enumeration (hard), and multi-hop compute-then-transform chains (transform). Spearman</w:t>
+        <w:t xml:space="preserve">problems from four task families: cognitive-reflection-test problems that have a suggestive but wrong answer (crt), counting/enumeration (count), hard arithmetic/enumeration (hard), and multi-hop compute-then-transform chains (transform), see the code repository for details. Spearman</w:t>
       </w:r>
       <w:r>
         <w:rPr>
@@ -6025,18 +5720,18 @@
           <wp:inline>
             <wp:extent cx="5334000" cy="4036060"/>
             <wp:effectExtent b="0" l="0" r="0" t="0"/>
-            <wp:docPr descr="Post-hoc case study" title="" id="78" name="Picture"/>
+            <wp:docPr descr="Post-hoc case study" title="" id="80" name="Picture"/>
             <a:graphic>
               <a:graphicData uri="http://schemas.openxmlformats.org/drawingml/2006/picture">
                 <pic:pic>
                   <pic:nvPicPr>
-                    <pic:cNvPr descr="figs/figA8b_posthoc_case.png" id="79" name="Picture"/>
+                    <pic:cNvPr descr="figs/figA8b_posthoc_case.png" id="81" name="Picture"/>
                     <pic:cNvPicPr>
                       <a:picLocks noChangeArrowheads="1" noChangeAspect="1"/>
                     </pic:cNvPicPr>
                   </pic:nvPicPr>
                   <pic:blipFill>
-                    <a:blip r:embed="rId77"/>
+                    <a:blip r:embed="rId79"/>
                     <a:stretch>
                       <a:fillRect/>
                     </a:stretch>
@@ -6099,7 +5794,7 @@
         <w:t xml:space="preserve">Top row: normal rollout, model answer highlighted, with its commitment time. Bottom row: the susceptibility, measured like in the previous figure.</w:t>
       </w:r>
     </w:p>
-    <w:bookmarkStart w:id="83" w:name="Xabbf9ebb3c7fb0570cb1488d42cd03734ef9222"/>
+    <w:bookmarkStart w:id="85" w:name="Xabbf9ebb3c7fb0570cb1488d42cd03734ef9222"/>
     <w:p>
       <w:pPr>
         <w:pStyle w:val="Heading4"/>
@@ -6125,18 +5820,18 @@
           <wp:inline>
             <wp:extent cx="5334000" cy="2125265"/>
             <wp:effectExtent b="0" l="0" r="0" t="0"/>
-            <wp:docPr descr="Answer resolution" title="" id="81" name="Picture"/>
+            <wp:docPr descr="Answer resolution" title="" id="83" name="Picture"/>
             <a:graphic>
               <a:graphicData uri="http://schemas.openxmlformats.org/drawingml/2006/picture">
                 <pic:pic>
                   <pic:nvPicPr>
-                    <pic:cNvPr descr="figs/figA9_resolution.png" id="82" name="Picture"/>
+                    <pic:cNvPr descr="figs/figA9_resolution.png" id="84" name="Picture"/>
                     <pic:cNvPicPr>
                       <a:picLocks noChangeArrowheads="1" noChangeAspect="1"/>
                     </pic:cNvPicPr>
                   </pic:nvPicPr>
                   <pic:blipFill>
-                    <a:blip r:embed="rId80"/>
+                    <a:blip r:embed="rId82"/>
                     <a:stretch>
                       <a:fillRect/>
                     </a:stretch>
@@ -6196,7 +5891,7 @@
           <w:i/>
           <w:iCs/>
         </w:rPr>
-        <w:t xml:space="preserve">Mean token entropy of the answer positions (solid) and CoT positions (dashed) per denoising step, one rollout per battery problem, grouped by the measured susceptibility of the answer (</w:t>
+        <w:t xml:space="preserve">Mean token entropy of the answer positions (solid) and CoT positions (dashed) per denoising step, one rollout per battery problem, grouped by the susceptibility of the answer (</w:t>
       </w:r>
       <m:oMath>
         <m:r>
@@ -6252,25 +5947,18 @@
           <w:i/>
           <w:iCs/>
         </w:rPr>
-        <w:t xml:space="preserve">, faint = single problems, bold = group mean).</w:t>
-      </w:r>
-      <w:r>
-        <w:rPr>
-          <w:i/>
-          <w:iCs/>
-        </w:rPr>
-        <w:t xml:space="preserve"> </w:t>
-      </w:r>
-    </w:p>
-    <w:bookmarkEnd w:id="83"/>
-    <w:bookmarkEnd w:id="84"/>
-    <w:bookmarkStart w:id="88" w:name="Xd7c7dfb66314a32b0174c0001aa6561f67f2b90"/>
+        <w:t xml:space="preserve">, faint = single problems, bold = group mean). n is the number of tasks in each panel, taken from the previous figure.</w:t>
+      </w:r>
+    </w:p>
+    <w:bookmarkEnd w:id="85"/>
+    <w:bookmarkEnd w:id="86"/>
+    <w:bookmarkStart w:id="90" w:name="X750f5a405227149eb0381e6a9408fc28a798756"/>
     <w:p>
       <w:pPr>
         <w:pStyle w:val="Heading3"/>
       </w:pPr>
       <w:r>
-        <w:t xml:space="preserve">How much does DiffusionGemma use bidirectional attention?</w:t>
+        <w:t xml:space="preserve">How bidirectional are DiffusionGemma’s generations?</w:t>
       </w:r>
     </w:p>
     <w:p>
@@ -6278,7 +5966,7 @@
         <w:pStyle w:val="FirstParagraph"/>
       </w:pPr>
       <w:r>
-        <w:t xml:space="preserve">One of the differences in DiffusionGemma is that it has bidirectional attention. While some tasks relying on some form of logical induction require causal left-to-right generation, other task do not obviously require it. However, being a finetune of Gemma, it is unclear how much it will just inherit a bias towards causal generation vs actually using bidirectional generation.</w:t>
+        <w:t xml:space="preserve">One of the differences in DiffusionGemma is that it has bidirectional attention. While some tasks relying on some form of logical induction require causal left-to-right generation, other tasks do not obviously require it. However, being a finetune of Gemma, it is unclear how much it will just inherit a bias towards causal generation vs actually using bidirectional generation.</w:t>
       </w:r>
       <w:r>
         <w:t xml:space="preserve"> </w:t>
@@ -6288,18 +5976,18 @@
           <wp:inline>
             <wp:extent cx="5334000" cy="1889125"/>
             <wp:effectExtent b="0" l="0" r="0" t="0"/>
-            <wp:docPr descr="Commitment causality" title="" id="86" name="Picture"/>
+            <wp:docPr descr="Commitment causality" title="" id="88" name="Picture"/>
             <a:graphic>
               <a:graphicData uri="http://schemas.openxmlformats.org/drawingml/2006/picture">
                 <pic:pic>
                   <pic:nvPicPr>
-                    <pic:cNvPr descr="figs/figA11_commit_causality.png" id="87" name="Picture"/>
+                    <pic:cNvPr descr="figs/figA11_commit_causality.png" id="89" name="Picture"/>
                     <pic:cNvPicPr>
                       <a:picLocks noChangeArrowheads="1" noChangeAspect="1"/>
                     </pic:cNvPicPr>
                   </pic:nvPicPr>
                   <pic:blipFill>
-                    <a:blip r:embed="rId85"/>
+                    <a:blip r:embed="rId87"/>
                     <a:stretch>
                       <a:fillRect/>
                     </a:stretch>
@@ -6474,7 +6162,7 @@
           <w:i/>
           <w:iCs/>
         </w:rPr>
-        <w:t xml:space="preserve">= Spearman between the judge’s logical ordering of its own atom decomposition and the atoms’ positions in the text.</w:t>
+        <w:t xml:space="preserve">= Spearman between the judge’s logical ordering of its own atom decomposition and the atoms’ positions in the text. n denotes distinct task instances.</w:t>
       </w:r>
     </w:p>
     <w:p>
@@ -6482,7 +6170,7 @@
         <w:pStyle w:val="BodyText"/>
       </w:pPr>
       <w:r>
-        <w:t xml:space="preserve">We considered three tasks: GPQA, which involves logic-style problems and therefore shoudl require left-to-right generation,</w:t>
+        <w:t xml:space="preserve">We considered three tasks: GPQA, which involves logic-style problems and therefore should require left-to-right generation,</w:t>
       </w:r>
       <w:r>
         <w:t xml:space="preserve"> </w:t>
@@ -6495,7 +6183,7 @@
         <w:t xml:space="preserve">poem writing</w:t>
       </w:r>
       <w:r>
-        <w:t xml:space="preserve">, which has no clear left-to-rigth bias but only needs to satisfy a global structure, and</w:t>
+        <w:t xml:space="preserve">, which has no clear left-to-right bias but only needs to satisfy a global structure, and</w:t>
       </w:r>
       <w:r>
         <w:t xml:space="preserve"> </w:t>
@@ -6511,8 +6199,9 @@
         <w:t xml:space="preserve">, which requires the model to reverse its reasoning order.</w:t>
       </w:r>
     </w:p>
-    <w:bookmarkEnd w:id="88"/>
-    <w:bookmarkEnd w:id="89"/>
+    <w:bookmarkEnd w:id="90"/>
+    <w:bookmarkEnd w:id="91"/>
+    <w:bookmarkEnd w:id="92"/>
     <w:sectPr>
       <w:footnotePr>
         <w:numRestart w:val="eachSect"/>

</xml_diff>

<commit_message>
seasonal section: palindrome strings match the plotted run (All leaves fall when leaves fall all. / All for one and one for all.); early-and-late-ablation claim removed (sentence + caption parenthetical)
Co-Authored-By: Claude Fable 5 <noreply@anthropic.com>
</commit_message>
<xml_diff>
--- a/post.docx
+++ b/post.docx
@@ -3194,7 +3194,7 @@
         <w:rPr>
           <w:rStyle w:val="VerbatimChar"/>
         </w:rPr>
-        <w:t xml:space="preserve">fall leaves as soon as leaves fall</w:t>
+        <w:t xml:space="preserve">All leaves fall when leaves fall all.</w:t>
       </w:r>
       <w:r>
         <w:t xml:space="preserve">) and a well-known</w:t>
@@ -3219,7 +3219,7 @@
         <w:rPr>
           <w:rStyle w:val="VerbatimChar"/>
         </w:rPr>
-        <w:t xml:space="preserve">all for one and one for all</w:t>
+        <w:t xml:space="preserve">All for one and one for all.</w:t>
       </w:r>
       <w:r>
         <w:t xml:space="preserve">). We measure how the probability mass of these two typical outcomes, summed over positions, varies over the course of diffusion.</w:t>
@@ -3291,7 +3291,7 @@
           <w:i/>
           <w:iCs/>
         </w:rPr>
-        <w:t xml:space="preserve">Ablating a nascent contender can prevent takeover (during an intermediate step window).</w:t>
+        <w:t xml:space="preserve">Ablating a nascent contender can prevent takeover.</w:t>
       </w:r>
       <w:r>
         <w:rPr>
@@ -3475,7 +3475,7 @@
         <w:t xml:space="preserve">idiom</w:t>
       </w:r>
       <w:r>
-        <w:t xml:space="preserve">’s tokens, the transition can be prevented. Note however that early and late ablation do not have this effect.</w:t>
+        <w:t xml:space="preserve">’s tokens, the transition can be prevented.</w:t>
       </w:r>
     </w:p>
     <w:bookmarkEnd w:id="47"/>

</xml_diff>